<commit_message>
Implement act-based mining progression
</commit_message>
<xml_diff>
--- a/docs/Rocket_Rogue_Game_Design_Document.docx
+++ b/docs/Rocket_Rogue_Game_Design_Document.docx
@@ -5706,7 +5706,7 @@
           <w:i w:val="0"/>
           <w:sz w:val="22"/>
         </w:rPr>
-        <w:t>Mining is the landed version of overburn. The drone digs through chunked terrain under oxygen, heat, fuel, scanner cooldown, cargo, and drill integrity pressure. The player can stow payload, abort, or fail; the outcome feeds back into the same surface payload, hazard, artifact, and extraction model.</w:t>
+        <w:t>Mining remains one fuel-only run per surface loop. Acts 1/2/3 span Chapters 2-5/6-7/8-10, each progressing through Learn 1-3, Combine 4-6, Pressure 7-8, and Mastery 9-10. Combat is passive. Rich rewards share hard caps; guarantees persist until banked, then repeat caps shrink.</w:t>
       </w:r>
     </w:p>
     <w:tbl>
@@ -5978,13 +5978,13 @@
                 <w:rFonts w:ascii="Calibri" w:hAnsi="Calibri"/>
                 <w:sz w:val="18"/>
               </w:rPr>
-            </w:r>
-            <w:r>
-              <w:rPr>
-                <w:rFonts w:ascii="Calibri" w:hAnsi="Calibri"/>
-                <w:sz w:val="18"/>
-              </w:rPr>
-              <w:t>Short-run timer; baseline is 15 seconds before upgrades.</w:t>
+              <w:t>Short-run timer; baseline is 30 seconds before upgrades.</w:t>
+            </w:r>
+            <w:r>
+              <w:rPr>
+                <w:rFonts w:ascii="Calibri" w:hAnsi="Calibri"/>
+                <w:sz w:val="18"/>
+              </w:rPr>
             </w:r>
           </w:p>
         </w:tc>
@@ -6009,13 +6009,13 @@
                 <w:rFonts w:ascii="Calibri" w:hAnsi="Calibri"/>
                 <w:sz w:val="18"/>
               </w:rPr>
-            </w:r>
-            <w:r>
-              <w:rPr>
-                <w:rFonts w:ascii="Calibri" w:hAnsi="Calibri"/>
-                <w:sz w:val="18"/>
-              </w:rPr>
-              <w:t>Extensible by crew, Resource Drone, and field upgrades.</w:t>
+              <w:t>Crew, Resource Drones, and field upgrades can extend it, but total capacity is capped at 120 seconds.</w:t>
+            </w:r>
+            <w:r>
+              <w:rPr>
+                <w:rFonts w:ascii="Calibri" w:hAnsi="Calibri"/>
+                <w:sz w:val="18"/>
+              </w:rPr>
             </w:r>
           </w:p>
         </w:tc>
@@ -8565,7 +8565,7 @@
         <w:spacing w:before="0" w:after="120" w:line="264" w:lineRule="auto"/>
       </w:pPr>
       <w:r>
-        <w:t>Drone Ops is the loadout layer for mining. It begins as environmental support and becomes passive combat after post-solar hostile progression. The player equips drones into persistent bay slots, upgrades favorites from Mk I to Mk III, and compares synergies before the mining run starts.</w:t>
+        <w:t>Drone Ops is the mining loadout layer: environmental support in Act 1 and passive combat after Arkfall. Arkfall grants Mk I Attack and Defense drones and raises undersized bays to three slots without erasing stronger loadouts. Perimeter Coordination gates Mk II-III combat tuning and synergies; arena difficulty never scales from equipped drones.</w:t>
       </w:r>
     </w:p>
     <w:tbl>
@@ -9112,13 +9112,13 @@
                 <w:rFonts w:ascii="Calibri" w:hAnsi="Calibri"/>
                 <w:sz w:val="18"/>
               </w:rPr>
-            </w:r>
-            <w:r>
-              <w:rPr>
-                <w:rFonts w:ascii="Calibri" w:hAnsi="Calibri"/>
-                <w:sz w:val="18"/>
-              </w:rPr>
-              <w:t>Perimeter Drone Network</w:t>
+              <w:t>Arkfall Mk I; Coordination Mk II-III</w:t>
+            </w:r>
+            <w:r>
+              <w:rPr>
+                <w:rFonts w:ascii="Calibri" w:hAnsi="Calibri"/>
+                <w:sz w:val="18"/>
+              </w:rPr>
             </w:r>
           </w:p>
         </w:tc>
@@ -9207,13 +9207,13 @@
                 <w:rFonts w:ascii="Calibri" w:hAnsi="Calibri"/>
                 <w:sz w:val="18"/>
               </w:rPr>
-            </w:r>
-            <w:r>
-              <w:rPr>
-                <w:rFonts w:ascii="Calibri" w:hAnsi="Calibri"/>
-                <w:sz w:val="18"/>
-              </w:rPr>
-              <w:t>Perimeter Drone Network</w:t>
+              <w:t>Arkfall Mk I; Coordination Mk II-III</w:t>
+            </w:r>
+            <w:r>
+              <w:rPr>
+                <w:rFonts w:ascii="Calibri" w:hAnsi="Calibri"/>
+                <w:sz w:val="18"/>
+              </w:rPr>
             </w:r>
           </w:p>
         </w:tc>
@@ -10714,7 +10714,7 @@
         <w:pStyle w:val="ListBullet"/>
       </w:pPr>
       <w:r>
-        <w:t>Debug tools must never obstruct modal or mission-critical UI.</w:t>
+        <w:t>Debug tools must never obstruct modal or mission-critical UI. The Mining Arena Lab selects Act 1-3, difficulty 1-10, seed, and Campaign Expected, Saved Debug Loadout, or No Drones presets; replaying a seed must reproduce the same arena without writing progression.</w:t>
       </w:r>
     </w:p>
     <w:p>
@@ -12795,13 +12795,13 @@
                 <w:rFonts w:ascii="Calibri" w:hAnsi="Calibri"/>
                 <w:sz w:val="18"/>
               </w:rPr>
-            </w:r>
-            <w:r>
-              <w:rPr>
-                <w:rFonts w:ascii="Calibri" w:hAnsi="Calibri"/>
-                <w:sz w:val="18"/>
-              </w:rPr>
-              <w:t>docs/MINING_MINIGAME_PLAN.md</w:t>
+              <w:t>docs/MINING_MINIGAME_PLAN.md + MINING_COMBAT_PROGRESSION.md</w:t>
+            </w:r>
+            <w:r>
+              <w:rPr>
+                <w:rFonts w:ascii="Calibri" w:hAnsi="Calibri"/>
+                <w:sz w:val="18"/>
+              </w:rPr>
             </w:r>
           </w:p>
         </w:tc>
@@ -12826,13 +12826,13 @@
                 <w:rFonts w:ascii="Calibri" w:hAnsi="Calibri"/>
                 <w:sz w:val="18"/>
               </w:rPr>
-            </w:r>
-            <w:r>
-              <w:rPr>
-                <w:rFonts w:ascii="Calibri" w:hAnsi="Calibri"/>
-                <w:sz w:val="18"/>
-              </w:rPr>
-              <w:t>Mining goals, entry flow, fuel/oxygen rules, terrain/reward design, and hostile mining.</w:t>
+              <w:t>Mining entry flow, act/band gates, fuel/oxygen rules, rich caps, hostile progression, Arena Lab, and agent contracts.</w:t>
+            </w:r>
+            <w:r>
+              <w:rPr>
+                <w:rFonts w:ascii="Calibri" w:hAnsi="Calibri"/>
+                <w:sz w:val="18"/>
+              </w:rPr>
             </w:r>
           </w:p>
         </w:tc>

</xml_diff>

<commit_message>
Optimize native runtime and add OREBIT title screen
</commit_message>
<xml_diff>
--- a/docs/Rocket_Rogue_Game_Design_Document.docx
+++ b/docs/Rocket_Rogue_Game_Design_Document.docx
@@ -390,21 +390,8 @@
             <w:shd w:fill="FFFFFF"/>
           </w:tcPr>
           <w:p>
-            <w:pPr>
-              <w:spacing w:before="0" w:after="60" w:line="259" w:lineRule="auto"/>
-            </w:pPr>
-            <w:r>
-              <w:rPr>
-                <w:rFonts w:ascii="Calibri" w:hAnsi="Calibri"/>
-                <w:sz w:val="18"/>
-              </w:rPr>
-            </w:r>
-            <w:r>
-              <w:rPr>
-                <w:rFonts w:ascii="Calibri" w:hAnsi="Calibri"/>
-                <w:sz w:val="18"/>
-              </w:rPr>
-              <w:t>July 6, 2026</w:t>
+            <w:r>
+              <w:t>July 17, 2026</w:t>
             </w:r>
           </w:p>
         </w:tc>
@@ -522,11 +509,8 @@
             <w:shd w:fill="FFFFFF"/>
           </w:tcPr>
           <w:p>
-            <w:pPr>
-              <w:spacing w:before="0" w:after="60" w:line="259" w:lineRule="auto"/>
-            </w:pPr>
-            <w:r>
-              <w:t>Living GDD for the playable PC-first C++ game, WebGL build, and near-term production direction</w:t>
+            <w:r>
+              <w:t>Living GDD for the playable native Windows/Linux game, supported WebGL build, and near-term production direction</w:t>
             </w:r>
           </w:p>
         </w:tc>
@@ -1252,7 +1236,7 @@
         <w:spacing w:before="0" w:after="120" w:line="264" w:lineRule="auto"/>
       </w:pPr>
       <w:r>
-        <w:t>Rocket Rogue is a PC-first C++20 space-mining roguelite with a WebGL2 browser build for testing and sharing. It starts as a NASA-arcade launch gamble, then grows into landings, surface expeditions, direct-control mining, Drone Bay loadouts, and an Ark campaign beyond the solar system.</w:t>
+        <w:t>Rocket Rogue is a PC-first C++20 space-mining roguelite with genuine native x86-64 Windows and Linux builds through SDL 3 and OpenGL 3.3 Core, plus a separate Emscripten/WebGL2 browser build for testing and sharing. It starts as a NASA-arcade launch gamble, then grows into landings, surface expeditions, direct-control mining, Drone Bay loadouts, and an Ark campaign beyond the solar system.</w:t>
       </w:r>
     </w:p>
     <w:p>
@@ -1945,7 +1929,7 @@
         <w:spacing w:before="0" w:after="120" w:line="264" w:lineRule="auto"/>
       </w:pPr>
       <w:r>
-        <w:t>Primary audience: PC players who want roguelite pressure, ship and drone loadouts, aerospace fantasy, and mining/extraction decisions without real-money gambling mechanics. The target platform is Steam; the WebGL build exists to test and share the same core game.</w:t>
+        <w:t>Primary audience: PC players who want roguelite pressure, ship and drone loadouts, aerospace fantasy, and mining/extraction decisions without real-money gambling mechanics. The long-term target platform is Steam; current distribution uses portable native Windows/Linux archives and a separate WebGL build that tests and shares the same core game. Steamworks integration is future work, not part of the current platform layer.</w:t>
       </w:r>
     </w:p>
     <w:p>
@@ -2832,19 +2816,8 @@
             <w:shd w:fill="FFFFFF"/>
           </w:tcPr>
           <w:p>
-            <w:pPr>
-              <w:spacing w:before="0" w:after="20" w:line="240" w:lineRule="auto"/>
-            </w:pPr>
-            <w:r>
-              <w:rPr>
-                <w:sz w:val="17"/>
-              </w:rPr>
-            </w:r>
-            <w:r>
-              <w:rPr>
-                <w:sz w:val="17"/>
-              </w:rPr>
-              <w:t>90s arcade sprites and cleaned alpha assets cover planets, Ark states, rocket, thrust, explosion, drone, drill bit, and outer-system bodies.</w:t>
+            <w:r>
+              <w:t>90s arcade sprites and cleaned alpha assets cover solar-system bodies, Straylight states, shuttle/effects, the mining rig, six mini-drone roles, and post-solar planets.</w:t>
             </w:r>
           </w:p>
         </w:tc>
@@ -8978,21 +8951,8 @@
             <w:shd w:fill="FFFFFF"/>
           </w:tcPr>
           <w:p>
-            <w:pPr>
-              <w:spacing w:before="0" w:after="60" w:line="259" w:lineRule="auto"/>
-            </w:pPr>
-            <w:r>
-              <w:rPr>
-                <w:rFonts w:ascii="Calibri" w:hAnsi="Calibri"/>
-                <w:sz w:val="18"/>
-              </w:rPr>
-            </w:r>
-            <w:r>
-              <w:rPr>
-                <w:rFonts w:ascii="Calibri" w:hAnsi="Calibri"/>
-                <w:sz w:val="18"/>
-              </w:rPr>
-              <w:t>Stabilizer Drone</w:t>
+            <w:r>
+              <w:t>Hazard Drone</w:t>
             </w:r>
           </w:p>
         </w:tc>
@@ -9009,20 +8969,7 @@
             <w:shd w:fill="FFFFFF"/>
           </w:tcPr>
           <w:p>
-            <w:pPr>
-              <w:spacing w:before="0" w:after="60" w:line="259" w:lineRule="auto"/>
-            </w:pPr>
-            <w:r>
-              <w:rPr>
-                <w:rFonts w:ascii="Calibri" w:hAnsi="Calibri"/>
-                <w:sz w:val="18"/>
-              </w:rPr>
-            </w:r>
-            <w:r>
-              <w:rPr>
-                <w:rFonts w:ascii="Calibri" w:hAnsi="Calibri"/>
-                <w:sz w:val="18"/>
-              </w:rPr>
+            <w:r>
               <w:t>Drone Bay</w:t>
             </w:r>
           </w:p>
@@ -9040,21 +8987,8 @@
             <w:shd w:fill="FFFFFF"/>
           </w:tcPr>
           <w:p>
-            <w:pPr>
-              <w:spacing w:before="0" w:after="60" w:line="259" w:lineRule="auto"/>
-            </w:pPr>
-            <w:r>
-              <w:rPr>
-                <w:rFonts w:ascii="Calibri" w:hAnsi="Calibri"/>
-                <w:sz w:val="18"/>
-              </w:rPr>
-            </w:r>
-            <w:r>
-              <w:rPr>
-                <w:rFonts w:ascii="Calibri" w:hAnsi="Calibri"/>
-                <w:sz w:val="18"/>
-              </w:rPr>
-              <w:t>Reduces hard-rock bounce, chatter, and drill integrity loss.</w:t>
+            <w:r>
+              <w:t>Treats revealed thermal, cryo, toxic, and radiation pockets; Mk tiers expand affinity coverage, batch size, and refinement chance.</w:t>
             </w:r>
           </w:p>
         </w:tc>
@@ -10035,13 +9969,7 @@
         <w:spacing w:before="0" w:after="120" w:line="264" w:lineRule="auto"/>
       </w:pPr>
       <w:r>
-        <w:rPr>
-          <w:rFonts w:ascii="Calibri" w:hAnsi="Calibri"/>
-          <w:b w:val="0"/>
-          <w:i w:val="0"/>
-          <w:sz w:val="22"/>
-        </w:rPr>
-        <w:t>The current art pipeline uses magenta #ff00aa chroma-key source images, cleaned alpha PNGs, fixed packing sizes, and WebGL asset registration. The repo already includes planet sprites, operational and damaged Ark sprites, rocket/thrust/explosion sheets, mining drone and drill-bit sheets, and future outer-system planet/moon sprites.</w:t>
+        <w:t>Art uses #ff00aa source images, cleaned alpha PNGs, and fixed packing. The shared renderer registers 33 runtime textures; web loads asynchronously and native decodes through the texture service. Source, reference, and future art stays separate.</w:t>
       </w:r>
     </w:p>
     <w:tbl>
@@ -10192,20 +10120,7 @@
             <w:shd w:fill="FFFFFF"/>
           </w:tcPr>
           <w:p>
-            <w:pPr>
-              <w:spacing w:before="0" w:after="20" w:line="240" w:lineRule="auto"/>
-            </w:pPr>
-            <w:r>
-              <w:rPr>
-                <w:rFonts w:ascii="Calibri" w:hAnsi="Calibri"/>
-                <w:sz w:val="17"/>
-              </w:rPr>
-            </w:r>
-            <w:r>
-              <w:rPr>
-                <w:rFonts w:ascii="Calibri" w:hAnsi="Calibri"/>
-                <w:sz w:val="17"/>
-              </w:rPr>
+            <w:r>
               <w:t>Solar-system bodies</w:t>
             </w:r>
           </w:p>
@@ -10223,21 +10138,8 @@
             <w:shd w:fill="FFFFFF"/>
           </w:tcPr>
           <w:p>
-            <w:pPr>
-              <w:spacing w:before="0" w:after="20" w:line="240" w:lineRule="auto"/>
-            </w:pPr>
-            <w:r>
-              <w:rPr>
-                <w:rFonts w:ascii="Calibri" w:hAnsi="Calibri"/>
-                <w:sz w:val="17"/>
-              </w:rPr>
-            </w:r>
-            <w:r>
-              <w:rPr>
-                <w:rFonts w:ascii="Calibri" w:hAnsi="Calibri"/>
-                <w:sz w:val="17"/>
-              </w:rPr>
-              <w:t>earth, moon, mars, mercury, venus, jupiter, saturn, uranus, neptune</w:t>
+            <w:r>
+              <w:t>earth.png, moon.png, mars.png, mercury.png, venus.png, jupiter.png, saturn.png, uranus.png, neptune.png</w:t>
             </w:r>
           </w:p>
         </w:tc>
@@ -10254,20 +10156,7 @@
             <w:shd w:fill="FFFFFF"/>
           </w:tcPr>
           <w:p>
-            <w:pPr>
-              <w:spacing w:before="0" w:after="20" w:line="240" w:lineRule="auto"/>
-            </w:pPr>
-            <w:r>
-              <w:rPr>
-                <w:rFonts w:ascii="Calibri" w:hAnsi="Calibri"/>
-                <w:sz w:val="17"/>
-              </w:rPr>
-            </w:r>
-            <w:r>
-              <w:rPr>
-                <w:rFonts w:ascii="Calibri" w:hAnsi="Calibri"/>
-                <w:sz w:val="17"/>
-              </w:rPr>
+            <w:r>
               <w:t>Frontier ladder and destination presentation.</w:t>
             </w:r>
           </w:p>
@@ -10290,21 +10179,8 @@
             <w:shd w:fill="FFFFFF"/>
           </w:tcPr>
           <w:p>
-            <w:pPr>
-              <w:spacing w:before="0" w:after="20" w:line="240" w:lineRule="auto"/>
-            </w:pPr>
-            <w:r>
-              <w:rPr>
-                <w:rFonts w:ascii="Calibri" w:hAnsi="Calibri"/>
-                <w:sz w:val="17"/>
-              </w:rPr>
-            </w:r>
-            <w:r>
-              <w:rPr>
-                <w:rFonts w:ascii="Calibri" w:hAnsi="Calibri"/>
-                <w:sz w:val="17"/>
-              </w:rPr>
-              <w:t>Ark states</w:t>
+            <w:r>
+              <w:t>Solar backdrop</w:t>
             </w:r>
           </w:p>
         </w:tc>
@@ -10321,21 +10197,8 @@
             <w:shd w:fill="FFFFFF"/>
           </w:tcPr>
           <w:p>
-            <w:pPr>
-              <w:spacing w:before="0" w:after="20" w:line="240" w:lineRule="auto"/>
-            </w:pPr>
-            <w:r>
-              <w:rPr>
-                <w:rFonts w:ascii="Calibri" w:hAnsi="Calibri"/>
-                <w:sz w:val="17"/>
-              </w:rPr>
-            </w:r>
-            <w:r>
-              <w:rPr>
-                <w:rFonts w:ascii="Calibri" w:hAnsi="Calibri"/>
-                <w:sz w:val="17"/>
-              </w:rPr>
-              <w:t>ark-operational.png, ark-damaged.png</w:t>
+            <w:r>
+              <w:t>local-solar-bg-sheet.png</w:t>
             </w:r>
           </w:p>
         </w:tc>
@@ -10352,11 +10215,8 @@
             <w:shd w:fill="FFFFFF"/>
           </w:tcPr>
           <w:p>
-            <w:pPr>
-              <w:spacing w:before="0" w:after="20" w:line="240" w:lineRule="auto"/>
-            </w:pPr>
-            <w:r>
-              <w:t>Operational Straylight after Breakthrough and through Aaru Vale; damaged Straylight after Arkfall near Khepri Prime.</w:t>
+            <w:r>
+              <w:t>Animated local-system map backdrop.</w:t>
             </w:r>
           </w:p>
         </w:tc>
@@ -10378,21 +10238,8 @@
             <w:shd w:fill="FFFFFF"/>
           </w:tcPr>
           <w:p>
-            <w:pPr>
-              <w:spacing w:before="0" w:after="20" w:line="240" w:lineRule="auto"/>
-            </w:pPr>
-            <w:r>
-              <w:rPr>
-                <w:rFonts w:ascii="Calibri" w:hAnsi="Calibri"/>
-                <w:sz w:val="17"/>
-              </w:rPr>
-            </w:r>
-            <w:r>
-              <w:rPr>
-                <w:rFonts w:ascii="Calibri" w:hAnsi="Calibri"/>
-                <w:sz w:val="17"/>
-              </w:rPr>
-              <w:t>Flight sprites</w:t>
+            <w:r>
+              <w:t>Straylight states</w:t>
             </w:r>
           </w:p>
         </w:tc>
@@ -10409,21 +10256,8 @@
             <w:shd w:fill="FFFFFF"/>
           </w:tcPr>
           <w:p>
-            <w:pPr>
-              <w:spacing w:before="0" w:after="20" w:line="240" w:lineRule="auto"/>
-            </w:pPr>
-            <w:r>
-              <w:rPr>
-                <w:rFonts w:ascii="Calibri" w:hAnsi="Calibri"/>
-                <w:sz w:val="17"/>
-              </w:rPr>
-            </w:r>
-            <w:r>
-              <w:rPr>
-                <w:rFonts w:ascii="Calibri" w:hAnsi="Calibri"/>
-                <w:sz w:val="17"/>
-              </w:rPr>
-              <w:t>rocket.png, thrust-sheet.png, explosion-sheet.png</w:t>
+            <w:r>
+              <w:t>straylight-ark-operational.png, straylight-ark-damaged.png</w:t>
             </w:r>
           </w:p>
         </w:tc>
@@ -10440,21 +10274,8 @@
             <w:shd w:fill="FFFFFF"/>
           </w:tcPr>
           <w:p>
-            <w:pPr>
-              <w:spacing w:before="0" w:after="20" w:line="240" w:lineRule="auto"/>
-            </w:pPr>
-            <w:r>
-              <w:rPr>
-                <w:rFonts w:ascii="Calibri" w:hAnsi="Calibri"/>
-                <w:sz w:val="17"/>
-              </w:rPr>
-            </w:r>
-            <w:r>
-              <w:rPr>
-                <w:rFonts w:ascii="Calibri" w:hAnsi="Calibri"/>
-                <w:sz w:val="17"/>
-              </w:rPr>
-              <w:t>Launch, return, failure, and aerospace feedback.</w:t>
+            <w:r>
+              <w:t>Operational home state and post-Arkfall damaged state.</w:t>
             </w:r>
           </w:p>
         </w:tc>
@@ -10476,21 +10297,8 @@
             <w:shd w:fill="FFFFFF"/>
           </w:tcPr>
           <w:p>
-            <w:pPr>
-              <w:spacing w:before="0" w:after="20" w:line="240" w:lineRule="auto"/>
-            </w:pPr>
-            <w:r>
-              <w:rPr>
-                <w:rFonts w:ascii="Calibri" w:hAnsi="Calibri"/>
-                <w:sz w:val="17"/>
-              </w:rPr>
-            </w:r>
-            <w:r>
-              <w:rPr>
-                <w:rFonts w:ascii="Calibri" w:hAnsi="Calibri"/>
-                <w:sz w:val="17"/>
-              </w:rPr>
-              <w:t>Mining sprites</w:t>
+            <w:r>
+              <w:t>Shuttle and effects</w:t>
             </w:r>
           </w:p>
         </w:tc>
@@ -10507,21 +10315,8 @@
             <w:shd w:fill="FFFFFF"/>
           </w:tcPr>
           <w:p>
-            <w:pPr>
-              <w:spacing w:before="0" w:after="20" w:line="240" w:lineRule="auto"/>
-            </w:pPr>
-            <w:r>
-              <w:rPr>
-                <w:rFonts w:ascii="Calibri" w:hAnsi="Calibri"/>
-                <w:sz w:val="17"/>
-              </w:rPr>
-            </w:r>
-            <w:r>
-              <w:rPr>
-                <w:rFonts w:ascii="Calibri" w:hAnsi="Calibri"/>
-                <w:sz w:val="17"/>
-              </w:rPr>
-              <w:t>mining-drone.png, drill-bit-sheet.png</w:t>
+            <w:r>
+              <w:t>rocket-bay-closed.png, rocket-bay-open.png, thrust-sheet.png, explosion-sheet.png</w:t>
             </w:r>
           </w:p>
         </w:tc>
@@ -10538,21 +10333,8 @@
             <w:shd w:fill="FFFFFF"/>
           </w:tcPr>
           <w:p>
-            <w:pPr>
-              <w:spacing w:before="0" w:after="20" w:line="240" w:lineRule="auto"/>
-            </w:pPr>
-            <w:r>
-              <w:rPr>
-                <w:rFonts w:ascii="Calibri" w:hAnsi="Calibri"/>
-                <w:sz w:val="17"/>
-              </w:rPr>
-            </w:r>
-            <w:r>
-              <w:rPr>
-                <w:rFonts w:ascii="Calibri" w:hAnsi="Calibri"/>
-                <w:sz w:val="17"/>
-              </w:rPr>
-              <w:t>Direct-control mining and tactile digging feedback.</w:t>
+            <w:r>
+              <w:t>Launch, return, bay state, thrust, and failure feedback.</w:t>
             </w:r>
           </w:p>
         </w:tc>
@@ -10574,21 +10356,8 @@
             <w:shd w:fill="FFFFFF"/>
           </w:tcPr>
           <w:p>
-            <w:pPr>
-              <w:spacing w:before="0" w:after="20" w:line="240" w:lineRule="auto"/>
-            </w:pPr>
-            <w:r>
-              <w:rPr>
-                <w:rFonts w:ascii="Calibri" w:hAnsi="Calibri"/>
-                <w:sz w:val="17"/>
-              </w:rPr>
-            </w:r>
-            <w:r>
-              <w:rPr>
-                <w:rFonts w:ascii="Calibri" w:hAnsi="Calibri"/>
-                <w:sz w:val="17"/>
-              </w:rPr>
-              <w:t>Future systems</w:t>
+            <w:r>
+              <w:t>Mining and support drones</w:t>
             </w:r>
           </w:p>
         </w:tc>
@@ -10605,21 +10374,8 @@
             <w:shd w:fill="FFFFFF"/>
           </w:tcPr>
           <w:p>
-            <w:pPr>
-              <w:spacing w:before="0" w:after="20" w:line="240" w:lineRule="auto"/>
-            </w:pPr>
-            <w:r>
-              <w:rPr>
-                <w:rFonts w:ascii="Calibri" w:hAnsi="Calibri"/>
-                <w:sz w:val="17"/>
-              </w:rPr>
-            </w:r>
-            <w:r>
-              <w:rPr>
-                <w:rFonts w:ascii="Calibri" w:hAnsi="Calibri"/>
-                <w:sz w:val="17"/>
-              </w:rPr>
-              <w:t>outer-system planets and moons</w:t>
+            <w:r>
+              <w:t>mining-drone.png, drill-bit-sheet.png, mini-drone-{mining, resource, survey, hazard, attack, defense}.png</w:t>
             </w:r>
           </w:p>
         </w:tc>
@@ -10636,11 +10392,72 @@
             <w:shd w:fill="FFFFFF"/>
           </w:tcPr>
           <w:p>
-            <w:pPr>
-              <w:spacing w:before="0" w:after="20" w:line="240" w:lineRule="auto"/>
-            </w:pPr>
-            <w:r>
-              <w:t>Aaru Vale friendly resource system, Khepri Prime hostile system, Rift Belt, and post-solar Navigation map expansion.</w:t>
+            <w:r>
+              <w:t>Direct-control mining plus distinct autonomous support roles.</w:t>
+            </w:r>
+          </w:p>
+        </w:tc>
+      </w:tr>
+      <w:tr>
+        <w:tc>
+          <w:tcPr>
+            <w:tcW w:type="dxa" w:w="1900"/>
+          </w:tcPr>
+          <w:p>
+            <w:r>
+              <w:t>Post-solar bodies</w:t>
+            </w:r>
+          </w:p>
+        </w:tc>
+        <w:tc>
+          <w:tcPr>
+            <w:tcW w:type="dxa" w:w="3680"/>
+          </w:tcPr>
+          <w:p>
+            <w:r>
+              <w:t>outer-system-planet-01.png through -09.png; outer-system-moon-01.png through -10.png</w:t>
+            </w:r>
+          </w:p>
+        </w:tc>
+        <w:tc>
+          <w:tcPr>
+            <w:tcW w:type="dxa" w:w="3780"/>
+          </w:tcPr>
+          <w:p>
+            <w:r>
+              <w:t>Nine planets are runtime textures; ten moons remain future-route source art.</w:t>
+            </w:r>
+          </w:p>
+        </w:tc>
+      </w:tr>
+      <w:tr>
+        <w:tc>
+          <w:tcPr>
+            <w:tcW w:type="dxa" w:w="1900"/>
+          </w:tcPr>
+          <w:p>
+            <w:r>
+              <w:t>Source and reference</w:t>
+            </w:r>
+          </w:p>
+        </w:tc>
+        <w:tc>
+          <w:tcPr>
+            <w:tcW w:type="dxa" w:w="3680"/>
+          </w:tcPr>
+          <w:p>
+            <w:r>
+              <w:t>ark-operational.png, ark-damaged.png, rocket.png, local-solar-bg.png, chroma-key.png</w:t>
+            </w:r>
+          </w:p>
+        </w:tc>
+        <w:tc>
+          <w:tcPr>
+            <w:tcW w:type="dxa" w:w="3780"/>
+          </w:tcPr>
+          <w:p>
+            <w:r>
+              <w:t>Superseded source variants and the chroma-key reference; not registered at runtime.</w:t>
             </w:r>
           </w:p>
         </w:tc>
@@ -10880,20 +10697,7 @@
             <w:shd w:fill="FFFFFF"/>
           </w:tcPr>
           <w:p>
-            <w:pPr>
-              <w:spacing w:before="0" w:after="60" w:line="259" w:lineRule="auto"/>
-            </w:pPr>
-            <w:r>
-              <w:rPr>
-                <w:rFonts w:ascii="Calibri" w:hAnsi="Calibri"/>
-                <w:sz w:val="18"/>
-              </w:rPr>
-            </w:r>
-            <w:r>
-              <w:rPr>
-                <w:rFonts w:ascii="Calibri" w:hAnsi="Calibri"/>
-                <w:sz w:val="18"/>
-              </w:rPr>
+            <w:r>
               <w:t>src/core</w:t>
             </w:r>
           </w:p>
@@ -10911,21 +10715,8 @@
             <w:shd w:fill="FFFFFF"/>
           </w:tcPr>
           <w:p>
-            <w:pPr>
-              <w:spacing w:before="0" w:after="60" w:line="259" w:lineRule="auto"/>
-            </w:pPr>
-            <w:r>
-              <w:rPr>
-                <w:rFonts w:ascii="Calibri" w:hAnsi="Calibri"/>
-                <w:sz w:val="18"/>
-              </w:rPr>
-            </w:r>
-            <w:r>
-              <w:rPr>
-                <w:rFonts w:ascii="Calibri" w:hAnsi="Calibri"/>
-                <w:sz w:val="18"/>
-              </w:rPr>
-              <w:t>Deterministic game rules: content, RNG, progression, save data, flight tuning, research, mining, presentation helpers, and tests.</w:t>
+            <w:r>
+              <w:t>Portable deterministic rules: content, RNG, progression, saves, flight, research, mining, presentation helpers, and tuning. No platform APIs.</w:t>
             </w:r>
           </w:p>
         </w:tc>
@@ -10944,20 +10735,7 @@
             <w:shd w:fill="FFFFFF"/>
           </w:tcPr>
           <w:p>
-            <w:pPr>
-              <w:spacing w:before="0" w:after="60" w:line="259" w:lineRule="auto"/>
-            </w:pPr>
-            <w:r>
-              <w:rPr>
-                <w:rFonts w:ascii="Calibri" w:hAnsi="Calibri"/>
-                <w:sz w:val="18"/>
-              </w:rPr>
-            </w:r>
-            <w:r>
-              <w:rPr>
-                <w:rFonts w:ascii="Calibri" w:hAnsi="Calibri"/>
-                <w:sz w:val="18"/>
-              </w:rPr>
+            <w:r>
               <w:t>src/game</w:t>
             </w:r>
           </w:p>
@@ -10975,21 +10753,8 @@
             <w:shd w:fill="FFFFFF"/>
           </w:tcPr>
           <w:p>
-            <w:pPr>
-              <w:spacing w:before="0" w:after="60" w:line="259" w:lineRule="auto"/>
-            </w:pPr>
-            <w:r>
-              <w:rPr>
-                <w:rFonts w:ascii="Calibri" w:hAnsi="Calibri"/>
-                <w:sz w:val="18"/>
-              </w:rPr>
-            </w:r>
-            <w:r>
-              <w:rPr>
-                <w:rFonts w:ascii="Calibri" w:hAnsi="Calibri"/>
-                <w:sz w:val="18"/>
-              </w:rPr>
-              <w:t>Browser-session orchestration, screen transitions, launch/mining controls, panel HTML generation, and render snapshots.</w:t>
+            <w:r>
+              <w:t>Platform-neutral RocketGameApp, GameRunner, RmlUi behavior, panel generation, screen transitions, input actions, and render snapshots.</w:t>
             </w:r>
           </w:p>
         </w:tc>
@@ -11008,21 +10773,8 @@
             <w:shd w:fill="FFFFFF"/>
           </w:tcPr>
           <w:p>
-            <w:pPr>
-              <w:spacing w:before="0" w:after="60" w:line="259" w:lineRule="auto"/>
-            </w:pPr>
-            <w:r>
-              <w:rPr>
-                <w:rFonts w:ascii="Calibri" w:hAnsi="Calibri"/>
-                <w:sz w:val="18"/>
-              </w:rPr>
-            </w:r>
-            <w:r>
-              <w:rPr>
-                <w:rFonts w:ascii="Calibri" w:hAnsi="Calibri"/>
-                <w:sz w:val="18"/>
-              </w:rPr>
-              <w:t>src/render</w:t>
+            <w:r>
+              <w:t>src/input</w:t>
             </w:r>
           </w:p>
         </w:tc>
@@ -11039,21 +10791,8 @@
             <w:shd w:fill="FFFFFF"/>
           </w:tcPr>
           <w:p>
-            <w:pPr>
-              <w:spacing w:before="0" w:after="60" w:line="259" w:lineRule="auto"/>
-            </w:pPr>
-            <w:r>
-              <w:rPr>
-                <w:rFonts w:ascii="Calibri" w:hAnsi="Calibri"/>
-                <w:sz w:val="18"/>
-              </w:rPr>
-            </w:r>
-            <w:r>
-              <w:rPr>
-                <w:rFonts w:ascii="Calibri" w:hAnsi="Calibri"/>
-                <w:sz w:val="18"/>
-              </w:rPr>
-              <w:t>WebGL2 drawing, texture upload, procedural visuals, mining/flight render state. No gameplay decisions.</w:t>
+            <w:r>
+              <w:t>Controller sampling, tracking, active-source arbitration, prompt families, and routing shared by web and native hosts.</w:t>
             </w:r>
           </w:p>
         </w:tc>
@@ -11072,21 +10811,8 @@
             <w:shd w:fill="FFFFFF"/>
           </w:tcPr>
           <w:p>
-            <w:pPr>
-              <w:spacing w:before="0" w:after="60" w:line="259" w:lineRule="auto"/>
-            </w:pPr>
-            <w:r>
-              <w:rPr>
-                <w:rFonts w:ascii="Calibri" w:hAnsi="Calibri"/>
-                <w:sz w:val="18"/>
-              </w:rPr>
-            </w:r>
-            <w:r>
-              <w:rPr>
-                <w:rFonts w:ascii="Calibri" w:hAnsi="Calibri"/>
-                <w:sz w:val="18"/>
-              </w:rPr>
-              <w:t>src/platform</w:t>
+            <w:r>
+              <w:t>src/render</w:t>
             </w:r>
           </w:p>
         </w:tc>
@@ -11103,21 +10829,8 @@
             <w:shd w:fill="FFFFFF"/>
           </w:tcPr>
           <w:p>
-            <w:pPr>
-              <w:spacing w:before="0" w:after="60" w:line="259" w:lineRule="auto"/>
-            </w:pPr>
-            <w:r>
-              <w:rPr>
-                <w:rFonts w:ascii="Calibri" w:hAnsi="Calibri"/>
-                <w:sz w:val="18"/>
-              </w:rPr>
-            </w:r>
-            <w:r>
-              <w:rPr>
-                <w:rFonts w:ascii="Calibri" w:hAnsi="Calibri"/>
-                <w:sz w:val="18"/>
-              </w:rPr>
-              <w:t>Browser bridge for persistence and panel updates.</w:t>
+            <w:r>
+              <w:t>Shared OpenGL draw path and texture manifest with isolated GL API and GLSL dialect boundaries for WebGL2 and desktop GL 3.3 Core. No gameplay decisions.</w:t>
             </w:r>
           </w:p>
         </w:tc>
@@ -11136,21 +10849,8 @@
             <w:shd w:fill="FFFFFF"/>
           </w:tcPr>
           <w:p>
-            <w:pPr>
-              <w:spacing w:before="0" w:after="60" w:line="259" w:lineRule="auto"/>
-            </w:pPr>
-            <w:r>
-              <w:rPr>
-                <w:rFonts w:ascii="Calibri" w:hAnsi="Calibri"/>
-                <w:sz w:val="18"/>
-              </w:rPr>
-            </w:r>
-            <w:r>
-              <w:rPr>
-                <w:rFonts w:ascii="Calibri" w:hAnsi="Calibri"/>
-                <w:sz w:val="18"/>
-              </w:rPr>
-              <w:t>web</w:t>
+            <w:r>
+              <w:t>src/platform/AppServices.h</w:t>
             </w:r>
           </w:p>
         </w:tc>
@@ -11167,21 +10867,8 @@
             <w:shd w:fill="FFFFFF"/>
           </w:tcPr>
           <w:p>
-            <w:pPr>
-              <w:spacing w:before="0" w:after="60" w:line="259" w:lineRule="auto"/>
-            </w:pPr>
-            <w:r>
-              <w:rPr>
-                <w:rFonts w:ascii="Calibri" w:hAnsi="Calibri"/>
-                <w:sz w:val="18"/>
-              </w:rPr>
-            </w:r>
-            <w:r>
-              <w:rPr>
-                <w:rFonts w:ascii="Calibri" w:hAnsi="Calibri"/>
-                <w:sz w:val="18"/>
-              </w:rPr>
-              <w:t>HTML/CSS/JS shell, DOM event routing, and exported C++ action calls.</w:t>
+            <w:r>
+              <w:t>Injected save, preference, host, controller, texture, renderer, and UI contracts used by the shared application.</w:t>
             </w:r>
           </w:p>
         </w:tc>
@@ -11200,21 +10887,8 @@
             <w:shd w:fill="FFFFFF"/>
           </w:tcPr>
           <w:p>
-            <w:pPr>
-              <w:spacing w:before="0" w:after="60" w:line="259" w:lineRule="auto"/>
-            </w:pPr>
-            <w:r>
-              <w:rPr>
-                <w:rFonts w:ascii="Calibri" w:hAnsi="Calibri"/>
-                <w:sz w:val="18"/>
-              </w:rPr>
-            </w:r>
-            <w:r>
-              <w:rPr>
-                <w:rFonts w:ascii="Calibri" w:hAnsi="Calibri"/>
-                <w:sz w:val="18"/>
-              </w:rPr>
-              <w:t>docs/assets</w:t>
+            <w:r>
+              <w:t>src/platform/web</w:t>
             </w:r>
           </w:p>
         </w:tc>
@@ -11231,21 +10905,52 @@
             <w:shd w:fill="FFFFFF"/>
           </w:tcPr>
           <w:p>
-            <w:pPr>
-              <w:spacing w:before="0" w:after="60" w:line="259" w:lineRule="auto"/>
-            </w:pPr>
-            <w:r>
-              <w:rPr>
-                <w:rFonts w:ascii="Calibri" w:hAnsi="Calibri"/>
-                <w:sz w:val="18"/>
-              </w:rPr>
-            </w:r>
-            <w:r>
-              <w:rPr>
-                <w:rFonts w:ascii="Calibri" w:hAnsi="Calibri"/>
-                <w:sz w:val="18"/>
-              </w:rPr>
-              <w:t>Design docs, source extracts, art asset inventory, and generated deliverables.</w:t>
+            <w:r>
+              <w:t>Emscripten entry point, browser storage, asynchronous images, Web Gamepad, DOM bridge, and browser host behavior.</w:t>
+            </w:r>
+          </w:p>
+        </w:tc>
+      </w:tr>
+      <w:tr>
+        <w:tc>
+          <w:tcPr>
+            <w:tcW w:type="dxa" w:w="1550"/>
+          </w:tcPr>
+          <w:p>
+            <w:r>
+              <w:t>src/platform/sdl</w:t>
+            </w:r>
+          </w:p>
+        </w:tc>
+        <w:tc>
+          <w:tcPr>
+            <w:tcW w:type="dxa" w:w="7810"/>
+          </w:tcPr>
+          <w:p>
+            <w:r>
+              <w:t>SDL 3 window and GL context, input/gamepads, haptics, native storage, PNG decode, fullscreen, high-DPI metrics, and shutdown.</w:t>
+            </w:r>
+          </w:p>
+        </w:tc>
+      </w:tr>
+      <w:tr>
+        <w:tc>
+          <w:tcPr>
+            <w:tcW w:type="dxa" w:w="1550"/>
+          </w:tcPr>
+          <w:p>
+            <w:r>
+              <w:t>web</w:t>
+            </w:r>
+          </w:p>
+        </w:tc>
+        <w:tc>
+          <w:tcPr>
+            <w:tcW w:type="dxa" w:w="7810"/>
+          </w:tcPr>
+          <w:p>
+            <w:r>
+              <w:t>Browser shell, CSS, DOM fallback, accessibility mirror, and exported web action routing.</w:t>
             </w:r>
           </w:p>
         </w:tc>
@@ -11695,19 +11400,52 @@
             <w:shd w:fill="FFFFFF"/>
           </w:tcPr>
           <w:p>
-            <w:pPr>
-              <w:spacing w:before="0" w:after="20" w:line="240" w:lineRule="auto"/>
-            </w:pPr>
-            <w:r>
-              <w:rPr>
-                <w:sz w:val="17"/>
-              </w:rPr>
-            </w:r>
-            <w:r>
-              <w:rPr>
-                <w:sz w:val="17"/>
-              </w:rPr>
-              <w:t>Shared presentation helpers cover browser/native parity, modals, action IDs, and top-level metrics.</w:t>
+            <w:r>
+              <w:t>Shared presentation behavior covers native RmlUi and browser DOM fallback parity, modals, stable focus/action IDs, controls, and top-level metrics.</w:t>
+            </w:r>
+          </w:p>
+        </w:tc>
+      </w:tr>
+      <w:tr>
+        <w:tc>
+          <w:tcPr>
+            <w:tcW w:type="dxa" w:w="2200"/>
+          </w:tcPr>
+          <w:p>
+            <w:r>
+              <w:t>Application services</w:t>
+            </w:r>
+          </w:p>
+        </w:tc>
+        <w:tc>
+          <w:tcPr>
+            <w:tcW w:type="dxa" w:w="7160"/>
+          </w:tcPr>
+          <w:p>
+            <w:r>
+              <w:t>Fake services exercise RocketGameApp and GameRunner without browser globals, including fixed steps, game speed, saves, preferences, metrics, fullscreen, haptics, and shutdown.</w:t>
+            </w:r>
+          </w:p>
+        </w:tc>
+      </w:tr>
+      <w:tr>
+        <w:tc>
+          <w:tcPr>
+            <w:tcW w:type="dxa" w:w="2200"/>
+          </w:tcPr>
+          <w:p>
+            <w:r>
+              <w:t>Platform boundaries and packages</w:t>
+            </w:r>
+          </w:p>
+        </w:tc>
+        <w:tc>
+          <w:tcPr>
+            <w:tcW w:type="dxa" w:w="7160"/>
+          </w:tcPr>
+          <w:p>
+            <w:r>
+              <w:t>Automated checks confine browser/Emscripten symbols to web adapters and reject Electron, Chromium, Node, WASM, browser-shell, or missing-library leakage in native archives.</w:t>
             </w:r>
           </w:p>
         </w:tc>
@@ -13207,6 +12945,50 @@
                 <w:sz w:val="18"/>
               </w:rPr>
               <w:t>Art asset pipeline, Ark/planet/rocket/mining sprite inventory, and #ff00aa source cleanup convention.</w:t>
+            </w:r>
+          </w:p>
+        </w:tc>
+      </w:tr>
+      <w:tr>
+        <w:tc>
+          <w:tcPr>
+            <w:tcW w:type="dxa" w:w="3330"/>
+          </w:tcPr>
+          <w:p>
+            <w:r>
+              <w:t>docs/DESKTOP_BUILDS.md + CONTROLLER_SUPPORT.md</w:t>
+            </w:r>
+          </w:p>
+        </w:tc>
+        <w:tc>
+          <w:tcPr>
+            <w:tcW w:type="dxa" w:w="6030"/>
+          </w:tcPr>
+          <w:p>
+            <w:r>
+              <w:t>Native/web runtime boundaries, portable archives, save and preference locations, fullscreen/input behavior, controller routing, prompts, disconnects, and haptics.</w:t>
+            </w:r>
+          </w:p>
+        </w:tc>
+      </w:tr>
+      <w:tr>
+        <w:tc>
+          <w:tcPr>
+            <w:tcW w:type="dxa" w:w="3330"/>
+          </w:tcPr>
+          <w:p>
+            <w:r>
+              <w:t>CMakeLists.txt, CMakePresets.json, and release workflows</w:t>
+            </w:r>
+          </w:p>
+        </w:tc>
+        <w:tc>
+          <w:tcPr>
+            <w:tcW w:type="dxa" w:w="6030"/>
+          </w:tcPr>
+          <w:p>
+            <w:r>
+              <w:t>Reproducible web and Windows/Linux x86-64 builds, tests, package contents, symbols, dependency checks, and release artifacts.</w:t>
             </w:r>
           </w:p>
         </w:tc>

</xml_diff>

<commit_message>
Add outer planet campaign progression
</commit_message>
<xml_diff>
--- a/docs/Rocket_Rogue_Game_Design_Document.docx
+++ b/docs/Rocket_Rogue_Game_Design_Document.docx
@@ -1244,7 +1244,7 @@
         <w:spacing w:before="0" w:after="120" w:line="264" w:lineRule="auto"/>
       </w:pPr>
       <w:r>
-        <w:t>The fantasy is escalation. A fragile launch program becomes Straylight, a traveling survival base. The route runs through Moon, Mars, the Outer Planets, and Aaru Vale before Arkfall breaks the ship and the long push to New Earth begins.</w:t>
+        <w:t>The fantasy is escalation. A fragile launch program becomes Straylight, a traveling survival base. The mandatory route runs through Moon, Mars, Jupiter, Saturn, Uranus, and Neptune. Only after Neptune does the Straylight reveal take over the screen; Aaru Vale and Arkfall then begin the long push to New Earth.</w:t>
       </w:r>
     </w:p>
     <w:p>
@@ -2150,21 +2150,8 @@
             <w:shd w:fill="FFFFFF"/>
           </w:tcPr>
           <w:p>
-            <w:pPr>
-              <w:spacing w:before="0" w:after="20" w:line="240" w:lineRule="auto"/>
-            </w:pPr>
-            <w:r>
-              <w:rPr>
-                <w:rFonts w:ascii="Calibri" w:hAnsi="Calibri"/>
-                <w:sz w:val="17"/>
-              </w:rPr>
-            </w:r>
-            <w:r>
-              <w:rPr>
-                <w:rFonts w:ascii="Calibri" w:hAnsi="Calibri"/>
-                <w:sz w:val="17"/>
-              </w:rPr>
-              <w:t>Hidden crash point, telemetry channels, incidents, return/eject choices, mitigation actions, pressure, and tests are implemented.</w:t>
+            <w:r>
+              <w:t>Composite Instability, target-marker guidance, burn/failure debrief, telemetry, incidents, emergency actions, pressure, and tests are implemented.</w:t>
             </w:r>
           </w:p>
         </w:tc>
@@ -2542,21 +2529,8 @@
             <w:shd w:fill="FFFFFF"/>
           </w:tcPr>
           <w:p>
-            <w:pPr>
-              <w:spacing w:before="0" w:after="20" w:line="240" w:lineRule="auto"/>
-            </w:pPr>
-            <w:r>
-              <w:rPr>
-                <w:rFonts w:ascii="Calibri" w:hAnsi="Calibri"/>
-                <w:sz w:val="17"/>
-              </w:rPr>
-            </w:r>
-            <w:r>
-              <w:rPr>
-                <w:rFonts w:ascii="Calibri" w:hAnsi="Calibri"/>
-                <w:sz w:val="17"/>
-              </w:rPr>
-              <w:t>Direct-control drone mining, fog, terrain, ore, artifacts, oxygen, heat, integrity, fuel cadence, hostile terrain, enemies, and passive defense are implemented.</w:t>
+            <w:r>
+              <w:t>Direct-control mining, Toggle/Hold drilling, heat cutoff, scanner/tether/drone guidance, resources, oxygen, enemies, and passive defense are implemented.</w:t>
             </w:r>
           </w:p>
         </w:tc>
@@ -2728,11 +2702,8 @@
             <w:shd w:fill="FFFFFF"/>
           </w:tcPr>
           <w:p>
-            <w:pPr>
-              <w:spacing w:before="0" w:after="20" w:line="240" w:lineRule="auto"/>
-            </w:pPr>
-            <w:r>
-              <w:t>Ch. 1-7 playable; Ch. 8 placeholder; Ch. 9-10 still planned.</w:t>
+            <w:r>
+              <w:t>Solar bodies, Straylight states, shuttle/effects, mining rig, drones, and post-solar planets are in progress.</w:t>
             </w:r>
           </w:p>
         </w:tc>
@@ -2857,7 +2828,7 @@
         <w:spacing w:before="0" w:after="120" w:line="264" w:lineRule="auto"/>
       </w:pPr>
       <w:r>
-        <w:t>Humanity starts with one job: prove the rocket, push farther, and bring the crew home. Mars turns flight testing into research and extraction. The Outer Planets reveal Straylight, an operational but empty Ark beyond Neptune. Its first jump reaches Aaru Vale, a friendly resource system built for search, discovery, and mining without combat. The next jump fails near Khepri Prime. Arkfall damages Straylight and turns exploration into survival, repair, and route-finding.</w:t>
+        <w:t>Humanity starts with one job: prove the rocket, push farther, and bring the crew home. Mars turns flight testing into research and extraction. Jupiter, Saturn, Uranus, and Neptune are mandatory individual arrivals; successful arrival unlocks exactly the next world. Before Neptune there is no Straylight name, contact, silhouette, signal, art, or Ark-return framing. Successful Neptune arrival persists a full-screen discovery briefing whose sole Approach action identifies the derelict-but-operable Straylight as the expedition's first viable home and resumes Neptune Arrival Ops. Its first jump reaches Aaru Vale. The next jump fails near Khepri Prime, turning exploration into survival, repair, and route-finding.</w:t>
       </w:r>
     </w:p>
     <w:p>
@@ -3437,13 +3408,13 @@
                 <w:rFonts w:ascii="Calibri" w:hAnsi="Calibri"/>
                 <w:sz w:val="18"/>
               </w:rPr>
-            </w:r>
-            <w:r>
-              <w:rPr>
-                <w:rFonts w:ascii="Calibri" w:hAnsi="Calibri"/>
-                <w:sz w:val="18"/>
-              </w:rPr>
-              <w:t>Gate: advance to Outer Planets. Implemented.</w:t>
+              <w:t>Gate: advance to Jupiter. Implemented.</w:t>
+            </w:r>
+            <w:r>
+              <w:rPr>
+                <w:rFonts w:ascii="Calibri" w:hAnsi="Calibri"/>
+                <w:sz w:val="18"/>
+              </w:rPr>
             </w:r>
           </w:p>
         </w:tc>
@@ -3532,13 +3503,13 @@
                 <w:rFonts w:ascii="Calibri" w:hAnsi="Calibri"/>
                 <w:sz w:val="18"/>
               </w:rPr>
-            </w:r>
-            <w:r>
-              <w:rPr>
-                <w:rFonts w:ascii="Calibri" w:hAnsi="Calibri"/>
-                <w:sz w:val="18"/>
-              </w:rPr>
-              <w:t>Outer Planets and Ark discovery beyond Neptune; Ark is operational but empty.</w:t>
+              <w:t>Mandatory Jupiter, Saturn, Uranus, and Neptune arrivals; the saved full-screen Straylight discovery occurs only after Neptune.</w:t>
+            </w:r>
+            <w:r>
+              <w:rPr>
+                <w:rFonts w:ascii="Calibri" w:hAnsi="Calibri"/>
+                <w:sz w:val="18"/>
+              </w:rPr>
             </w:r>
           </w:p>
         </w:tc>
@@ -3563,13 +3534,13 @@
                 <w:rFonts w:ascii="Calibri" w:hAnsi="Calibri"/>
                 <w:sz w:val="18"/>
               </w:rPr>
-            </w:r>
-            <w:r>
-              <w:rPr>
-                <w:rFonts w:ascii="Calibri" w:hAnsi="Calibri"/>
-                <w:sz w:val="18"/>
-              </w:rPr>
-              <w:t>Gate: Ark found. Implemented through Ark discovery and chapter migration.</w:t>
+              <w:t>Gate: acknowledge Approach the Straylight. Implemented with persistent story state and Neptune Arrival Ops continuation.</w:t>
+            </w:r>
+            <w:r>
+              <w:rPr>
+                <w:rFonts w:ascii="Calibri" w:hAnsi="Calibri"/>
+                <w:sz w:val="18"/>
+              </w:rPr>
             </w:r>
           </w:p>
         </w:tc>
@@ -4377,7 +4348,7 @@
         <w:pStyle w:val="ListNumber"/>
       </w:pPr>
       <w:r>
-        <w:t>Progress from Earth to Moon, Mars, Outer Planets, Straylight discovery, Aaru Vale, Arkfall, and hostile Khepri Prime sorties.</w:t>
+        <w:t>Progress from Earth Orbit to Moon, Mars, Jupiter, Saturn, Uranus, and Neptune in order; acknowledge the Neptune-only Straylight discovery; then continue through Aaru Vale, Arkfall, Khepri Prime, and the Rift Belt.</w:t>
       </w:r>
     </w:p>
     <w:p>
@@ -4393,7 +4364,7 @@
         <w:spacing w:before="0" w:after="120" w:line="264" w:lineRule="auto"/>
       </w:pPr>
       <w:r>
-        <w:t>Launch is the primary pressure engine. The player watches multiplier, route progress, telemetry channels, return risk, and seeded incidents while deciding whether to return, overburn, cut engines, open the relief valve, jettison cargo, or eject. Upgrades make risk clearer and more survivable but never perfectly knowable.</w:t>
+        <w:t>Launch is the primary pressure engine. The yellow marker is a performance target, not a safety boundary. The player watches multiplier, route progress, system telemetry, a composite Instability warning, return risk, and seeded incidents while deciding whether to return, overburn, cut engines, open the relief valve, jettison cargo, or eject. Instability reaches at least 65% by 94% hidden-failure proximity and 90% by 98.5%; the debrief compares burn depth with the revealed failure point. Upgrades make risk clearer and more survivable but never perfectly knowable.</w:t>
       </w:r>
     </w:p>
     <w:tbl>
@@ -5673,13 +5644,7 @@
         <w:spacing w:before="0" w:after="120" w:line="264" w:lineRule="auto"/>
       </w:pPr>
       <w:r>
-        <w:rPr>
-          <w:rFonts w:ascii="Calibri" w:hAnsi="Calibri"/>
-          <w:b w:val="0"/>
-          <w:i w:val="0"/>
-          <w:sz w:val="22"/>
-        </w:rPr>
-        <w:t>Mining remains one fuel-only run per surface loop. Acts 1/2/3 span Chapters 2-5/6-7/8-10, each progressing through Learn 1-3, Combine 4-6, Pressure 7-8, and Mastery 9-10. Combat is passive. Rich rewards share hard caps; guarantees persist until banked, then repeat caps shrink.</w:t>
+        <w:t>Mining remains one fuel-only run per surface loop. Keyboard drilling defaults to Toggle with optional Hold; mouse and controller stay hold-based. Pause, focus loss, modals, screen changes, or preference changes release drilling. Heat locks at 100% and resets below 60%. Scanner feedback names discoveries, tethering is disabled without an exposed nearby target, and support drones act automatically. Acts 1/2/3 span Chapters 2-5/6-7/8-10 across Learn 1-3, Combine 4-6, Pressure 7-8, and Mastery 9-10.</w:t>
       </w:r>
     </w:p>
     <w:tbl>
@@ -9237,8 +9202,8 @@
       <w:r>
         <w:drawing>
           <wp:inline xmlns:a="http://schemas.openxmlformats.org/drawingml/2006/main" xmlns:pic="http://schemas.openxmlformats.org/drawingml/2006/picture">
-            <wp:extent cx="5806440" cy="1387094"/>
-            <wp:docPr id="2" name="Picture 2" title="Frontier planet art strip" descr="Labeled planet art strip showing Earth, Moon, Mars, Neptune, and placeholder outer-system planets for Aaru Vale and Khepri Prime."/>
+            <wp:extent cx="5989320" cy="1319076"/>
+            <wp:docPr id="2" name="Picture 2"/>
             <wp:cNvGraphicFramePr>
               <a:graphicFrameLocks noChangeAspect="1"/>
             </wp:cNvGraphicFramePr>
@@ -9246,11 +9211,11 @@
               <a:graphicData uri="http://schemas.openxmlformats.org/drawingml/2006/picture">
                 <pic:pic>
                   <pic:nvPicPr>
-                    <pic:cNvPr id="0" name="frontier-planet-strip.png"/>
+                    <pic:cNvPr id="0" name="solar-frontier-ladder.png"/>
                     <pic:cNvPicPr/>
                   </pic:nvPicPr>
                   <pic:blipFill>
-                    <a:blip r:embed="rId26"/>
+                    <a:blip r:embed="rId27"/>
                     <a:stretch>
                       <a:fillRect/>
                     </a:stretch>
@@ -9258,7 +9223,7 @@
                   <pic:spPr>
                     <a:xfrm>
                       <a:off x="0" y="0"/>
-                      <a:ext cx="5806440" cy="1387094"/>
+                      <a:ext cx="5989320" cy="1319076"/>
                     </a:xfrm>
                     <a:prstGeom prst="rect"/>
                   </pic:spPr>
@@ -9274,12 +9239,7 @@
         <w:jc w:val="center"/>
       </w:pPr>
       <w:r>
-        <w:rPr>
-          <w:i/>
-          <w:color w:val="526272"/>
-          <w:sz w:val="17"/>
-        </w:rPr>
-        <w:t>Planet art strip: current solar-system sprites plus placeholder outer-system bodies for Aaru Vale and Khepri Prime.</w:t>
+        <w:t>Solar frontier ladder: every planet is a distinct destination with its own arrival and completion state.</w:t>
       </w:r>
     </w:p>
     <w:tbl>
@@ -9306,6 +9266,7 @@
       <w:tr>
         <w:trPr>
           <w:tblHeader w:val="true"/>
+          <w:cantSplit/>
         </w:trPr>
         <w:tc>
           <w:tcPr>
@@ -9381,6 +9342,9 @@
         </w:tc>
       </w:tr>
       <w:tr>
+        <w:trPr>
+          <w:cantSplit/>
+        </w:trPr>
         <w:tc>
           <w:tcPr>
             <w:tcW w:type="dxa" w:w="1900"/>
@@ -9467,6 +9431,9 @@
         </w:tc>
       </w:tr>
       <w:tr>
+        <w:trPr>
+          <w:cantSplit/>
+        </w:trPr>
         <w:tc>
           <w:tcPr>
             <w:tcW w:type="dxa" w:w="1900"/>
@@ -9553,6 +9520,9 @@
         </w:tc>
       </w:tr>
       <w:tr>
+        <w:trPr>
+          <w:cantSplit/>
+        </w:trPr>
         <w:tc>
           <w:tcPr>
             <w:tcW w:type="dxa" w:w="1900"/>
@@ -9639,6 +9609,9 @@
         </w:tc>
       </w:tr>
       <w:tr>
+        <w:trPr>
+          <w:cantSplit/>
+        </w:trPr>
         <w:tc>
           <w:tcPr>
             <w:tcW w:type="dxa" w:w="1900"/>
@@ -9656,7 +9629,7 @@
               <w:spacing w:before="0" w:after="60" w:line="259" w:lineRule="auto"/>
             </w:pPr>
             <w:r>
-              <w:t>Outer Planets</w:t>
+              <w:t>Jupiter</w:t>
             </w:r>
           </w:p>
         </w:tc>
@@ -9698,7 +9671,7 @@
               <w:spacing w:before="0" w:after="60" w:line="259" w:lineRule="auto"/>
             </w:pPr>
             <w:r>
-              <w:t>Breakthrough and Ark discovery beyond Neptune.</w:t>
+              <w:t>First explicit outer-planet transfer; unlocks Saturn on successful arrival.</w:t>
             </w:r>
           </w:p>
         </w:tc>
@@ -9725,6 +9698,9 @@
         </w:tc>
       </w:tr>
       <w:tr>
+        <w:trPr>
+          <w:cantSplit/>
+        </w:trPr>
         <w:tc>
           <w:tcPr>
             <w:tcW w:type="dxa" w:w="1900"/>
@@ -9742,7 +9718,7 @@
               <w:spacing w:before="0" w:after="60" w:line="259" w:lineRule="auto"/>
             </w:pPr>
             <w:r>
-              <w:t>Aaru Vale</w:t>
+              <w:t>Saturn</w:t>
             </w:r>
           </w:p>
         </w:tc>
@@ -9784,7 +9760,7 @@
               <w:spacing w:before="0" w:after="60" w:line="259" w:lineRule="auto"/>
             </w:pPr>
             <w:r>
-              <w:t>Friendly post-solar resource system after Outer Planets; teaches search, discovery, and mining without combat.</w:t>
+              <w:t>Second explicit outer-planet transfer; unlocks Uranus on successful arrival.</w:t>
             </w:r>
           </w:p>
         </w:tc>
@@ -9811,6 +9787,9 @@
         </w:tc>
       </w:tr>
       <w:tr>
+        <w:trPr>
+          <w:cantSplit/>
+        </w:trPr>
         <w:tc>
           <w:tcPr>
             <w:tcW w:type="dxa" w:w="1900"/>
@@ -9828,7 +9807,7 @@
               <w:spacing w:before="0" w:after="60" w:line="259" w:lineRule="auto"/>
             </w:pPr>
             <w:r>
-              <w:t>Khepri Prime</w:t>
+              <w:t>Uranus</w:t>
             </w:r>
           </w:p>
         </w:tc>
@@ -9870,7 +9849,7 @@
               <w:spacing w:before="0" w:after="60" w:line="259" w:lineRule="auto"/>
             </w:pPr>
             <w:r>
-              <w:t>First hostile-system sortie from damaged Straylight after Arkfall.</w:t>
+              <w:t>Third explicit outer-planet transfer; unlocks Neptune on successful arrival.</w:t>
             </w:r>
           </w:p>
         </w:tc>
@@ -9891,15 +9870,282 @@
               <w:spacing w:before="0" w:after="60" w:line="259" w:lineRule="auto"/>
             </w:pPr>
             <w:r>
-              <w:t>Hostile contacts and passive defense allowed.</w:t>
+              <w:t>No enemies.</w:t>
             </w:r>
           </w:p>
         </w:tc>
       </w:tr>
       <w:tr>
+        <w:trPr>
+          <w:cantSplit/>
+        </w:trPr>
         <w:tc>
           <w:tcPr>
             <w:tcW w:type="dxa" w:w="1900"/>
+            <w:tcMar>
+              <w:top w:w="80" w:type="dxa"/>
+              <w:start w:w="120" w:type="dxa"/>
+              <w:bottom w:w="80" w:type="dxa"/>
+              <w:end w:w="120" w:type="dxa"/>
+            </w:tcMar>
+            <w:vAlign w:val="center"/>
+            <w:shd w:fill="FFFFFF"/>
+          </w:tcPr>
+          <w:p>
+            <w:pPr>
+              <w:spacing w:before="0" w:after="60" w:line="259" w:lineRule="auto"/>
+            </w:pPr>
+            <w:r>
+              <w:t>Neptune</w:t>
+            </w:r>
+          </w:p>
+        </w:tc>
+        <w:tc>
+          <w:tcPr>
+            <w:tcW w:type="dxa" w:w="650"/>
+            <w:tcMar>
+              <w:top w:w="80" w:type="dxa"/>
+              <w:start w:w="120" w:type="dxa"/>
+              <w:bottom w:w="80" w:type="dxa"/>
+              <w:end w:w="120" w:type="dxa"/>
+            </w:tcMar>
+            <w:vAlign w:val="center"/>
+            <w:shd w:fill="FFFFFF"/>
+          </w:tcPr>
+          <w:p>
+            <w:pPr>
+              <w:spacing w:before="0" w:after="60" w:line="259" w:lineRule="auto"/>
+            </w:pPr>
+            <w:r>
+              <w:t>6</w:t>
+            </w:r>
+          </w:p>
+        </w:tc>
+        <w:tc>
+          <w:tcPr>
+            <w:tcW w:type="dxa" w:w="4550"/>
+            <w:tcMar>
+              <w:top w:w="80" w:type="dxa"/>
+              <w:start w:w="120" w:type="dxa"/>
+              <w:bottom w:w="80" w:type="dxa"/>
+              <w:end w:w="120" w:type="dxa"/>
+            </w:tcMar>
+            <w:vAlign w:val="center"/>
+            <w:shd w:fill="FFFFFF"/>
+          </w:tcPr>
+          <w:p>
+            <w:pPr>
+              <w:spacing w:before="0" w:after="60" w:line="259" w:lineRule="auto"/>
+            </w:pPr>
+            <w:r>
+              <w:t>Final solar transfer. Success queues the blocking Straylight discovery; no Straylight content exists before it.</w:t>
+            </w:r>
+          </w:p>
+        </w:tc>
+        <w:tc>
+          <w:tcPr>
+            <w:tcW w:type="dxa" w:w="2260"/>
+            <w:tcMar>
+              <w:top w:w="80" w:type="dxa"/>
+              <w:start w:w="120" w:type="dxa"/>
+              <w:bottom w:w="80" w:type="dxa"/>
+              <w:end w:w="120" w:type="dxa"/>
+            </w:tcMar>
+            <w:vAlign w:val="center"/>
+            <w:shd w:fill="FFFFFF"/>
+          </w:tcPr>
+          <w:p>
+            <w:pPr>
+              <w:spacing w:before="0" w:after="60" w:line="259" w:lineRule="auto"/>
+            </w:pPr>
+            <w:r>
+              <w:t>No enemies.</w:t>
+            </w:r>
+          </w:p>
+        </w:tc>
+      </w:tr>
+      <w:tr>
+        <w:trPr>
+          <w:cantSplit/>
+        </w:trPr>
+        <w:tc>
+          <w:tcPr>
+            <w:tcW w:type="dxa" w:w="1900"/>
+            <w:tcMar>
+              <w:top w:w="80" w:type="dxa"/>
+              <w:start w:w="120" w:type="dxa"/>
+              <w:bottom w:w="80" w:type="dxa"/>
+              <w:end w:w="120" w:type="dxa"/>
+            </w:tcMar>
+            <w:vAlign w:val="center"/>
+            <w:shd w:fill="FFFFFF"/>
+          </w:tcPr>
+          <w:p>
+            <w:pPr>
+              <w:spacing w:before="0" w:after="60" w:line="259" w:lineRule="auto"/>
+            </w:pPr>
+            <w:r>
+              <w:t>Aaru Vale</w:t>
+            </w:r>
+          </w:p>
+        </w:tc>
+        <w:tc>
+          <w:tcPr>
+            <w:tcW w:type="dxa" w:w="650"/>
+            <w:tcMar>
+              <w:top w:w="80" w:type="dxa"/>
+              <w:start w:w="120" w:type="dxa"/>
+              <w:bottom w:w="80" w:type="dxa"/>
+              <w:end w:w="120" w:type="dxa"/>
+            </w:tcMar>
+            <w:vAlign w:val="center"/>
+            <w:shd w:fill="FFFFFF"/>
+          </w:tcPr>
+          <w:p>
+            <w:r>
+              <w:t>N/A</w:t>
+            </w:r>
+          </w:p>
+        </w:tc>
+        <w:tc>
+          <w:tcPr>
+            <w:tcW w:type="dxa" w:w="4550"/>
+            <w:tcMar>
+              <w:top w:w="80" w:type="dxa"/>
+              <w:start w:w="120" w:type="dxa"/>
+              <w:bottom w:w="80" w:type="dxa"/>
+              <w:end w:w="120" w:type="dxa"/>
+            </w:tcMar>
+            <w:vAlign w:val="center"/>
+            <w:shd w:fill="FFFFFF"/>
+          </w:tcPr>
+          <w:p>
+            <w:pPr>
+              <w:spacing w:before="0" w:after="60" w:line="259" w:lineRule="auto"/>
+            </w:pPr>
+            <w:r>
+              <w:t>Friendly resource system reached after the Straylight discovery; teaches Ark-scale search and mining without combat.</w:t>
+            </w:r>
+          </w:p>
+        </w:tc>
+        <w:tc>
+          <w:tcPr>
+            <w:tcW w:type="dxa" w:w="2260"/>
+            <w:tcMar>
+              <w:top w:w="80" w:type="dxa"/>
+              <w:start w:w="120" w:type="dxa"/>
+              <w:bottom w:w="80" w:type="dxa"/>
+              <w:end w:w="120" w:type="dxa"/>
+            </w:tcMar>
+            <w:vAlign w:val="center"/>
+            <w:shd w:fill="FFFFFF"/>
+          </w:tcPr>
+          <w:p>
+            <w:pPr>
+              <w:spacing w:before="0" w:after="60" w:line="259" w:lineRule="auto"/>
+            </w:pPr>
+            <w:r>
+              <w:t>No enemies.</w:t>
+            </w:r>
+          </w:p>
+        </w:tc>
+      </w:tr>
+      <w:tr>
+        <w:trPr>
+          <w:cantSplit/>
+        </w:trPr>
+        <w:tc>
+          <w:tcPr>
+            <w:tcW w:type="dxa" w:w="1900"/>
+            <w:tcMar>
+              <w:top w:w="80" w:type="dxa"/>
+              <w:start w:w="120" w:type="dxa"/>
+              <w:bottom w:w="80" w:type="dxa"/>
+              <w:end w:w="120" w:type="dxa"/>
+            </w:tcMar>
+            <w:vAlign w:val="center"/>
+            <w:shd w:fill="FFFFFF"/>
+          </w:tcPr>
+          <w:p>
+            <w:pPr>
+              <w:spacing w:before="0" w:after="60" w:line="259" w:lineRule="auto"/>
+            </w:pPr>
+            <w:r>
+              <w:t>Khepri Prime</w:t>
+            </w:r>
+          </w:p>
+        </w:tc>
+        <w:tc>
+          <w:tcPr>
+            <w:tcW w:type="dxa" w:w="650"/>
+            <w:tcMar>
+              <w:top w:w="80" w:type="dxa"/>
+              <w:start w:w="120" w:type="dxa"/>
+              <w:bottom w:w="80" w:type="dxa"/>
+              <w:end w:w="120" w:type="dxa"/>
+            </w:tcMar>
+            <w:vAlign w:val="center"/>
+            <w:shd w:fill="FFFFFF"/>
+          </w:tcPr>
+          <w:p>
+            <w:pPr>
+              <w:spacing w:before="0" w:after="60" w:line="259" w:lineRule="auto"/>
+            </w:pPr>
+            <w:r>
+              <w:t>7</w:t>
+            </w:r>
+          </w:p>
+        </w:tc>
+        <w:tc>
+          <w:tcPr>
+            <w:tcW w:type="dxa" w:w="4550"/>
+            <w:tcMar>
+              <w:top w:w="80" w:type="dxa"/>
+              <w:start w:w="120" w:type="dxa"/>
+              <w:bottom w:w="80" w:type="dxa"/>
+              <w:end w:w="120" w:type="dxa"/>
+            </w:tcMar>
+            <w:vAlign w:val="center"/>
+            <w:shd w:fill="FFFFFF"/>
+          </w:tcPr>
+          <w:p>
+            <w:pPr>
+              <w:spacing w:before="0" w:after="60" w:line="259" w:lineRule="auto"/>
+            </w:pPr>
+            <w:r>
+              <w:t>First hostile-system sortie from damaged Straylight after Arkfall.</w:t>
+            </w:r>
+          </w:p>
+        </w:tc>
+        <w:tc>
+          <w:tcPr>
+            <w:tcW w:type="dxa" w:w="2260"/>
+            <w:tcMar>
+              <w:top w:w="80" w:type="dxa"/>
+              <w:start w:w="120" w:type="dxa"/>
+              <w:bottom w:w="80" w:type="dxa"/>
+              <w:end w:w="120" w:type="dxa"/>
+            </w:tcMar>
+            <w:vAlign w:val="center"/>
+            <w:shd w:fill="FFFFFF"/>
+          </w:tcPr>
+          <w:p>
+            <w:pPr>
+              <w:spacing w:before="0" w:after="60" w:line="259" w:lineRule="auto"/>
+            </w:pPr>
+            <w:r>
+              <w:t>Hostile contacts and passive defense allowed.</w:t>
+            </w:r>
+          </w:p>
+        </w:tc>
+      </w:tr>
+      <w:tr>
+        <w:trPr>
+          <w:cantSplit/>
+        </w:trPr>
+        <w:tc>
+          <w:tcPr>
+            <w:tcW w:type="dxa" w:w="1900"/>
           </w:tcPr>
           <w:p>
             <w:r>
@@ -9913,7 +10159,7 @@
           </w:tcPr>
           <w:p>
             <w:r>
-              <w:t>6+</w:t>
+              <w:t>8</w:t>
             </w:r>
           </w:p>
         </w:tc>

</xml_diff>

<commit_message>
Refresh current design documentation
</commit_message>
<xml_diff>
--- a/docs/Rocket_Rogue_Game_Design_Document.docx
+++ b/docs/Rocket_Rogue_Game_Design_Document.docx
@@ -14,7 +14,7 @@
           <w:color w:val="0B2545"/>
           <w:sz w:val="56"/>
         </w:rPr>
-        <w:t>Rocket Rogue</w:t>
+        <w:t>OREBIT</w:t>
       </w:r>
     </w:p>
     <w:p>
@@ -247,6 +247,7 @@
                 <w:rFonts w:ascii="Calibri" w:hAnsi="Calibri"/>
                 <w:sz w:val="18"/>
               </w:rPr>
+              <w:t>Current title</w:t>
             </w:r>
             <w:r>
               <w:rPr>
@@ -255,7 +256,6 @@
                 <w:color w:val="0B2545"/>
                 <w:sz w:val="18"/>
               </w:rPr>
-              <w:t>Working title</w:t>
             </w:r>
           </w:p>
         </w:tc>
@@ -276,7 +276,7 @@
               <w:spacing w:before="0" w:after="60" w:line="259" w:lineRule="auto"/>
             </w:pPr>
             <w:r>
-              <w:t>Rocket Rogue, with Orebit and Straylight retained as earlier naming and design influences</w:t>
+              <w:t>OREBIT; Rocket Rogue remains the repository and legacy internal project name, while Straylight is the Ark</w:t>
             </w:r>
           </w:p>
         </w:tc>
@@ -391,7 +391,7 @@
           </w:tcPr>
           <w:p>
             <w:r>
-              <w:t>July 17, 2026</w:t>
+              <w:t>July 21, 2026</w:t>
             </w:r>
           </w:p>
         </w:tc>
@@ -451,13 +451,13 @@
                 <w:rFonts w:ascii="Calibri" w:hAnsi="Calibri"/>
                 <w:sz w:val="18"/>
               </w:rPr>
-            </w:r>
-            <w:r>
-              <w:rPr>
-                <w:rFonts w:ascii="Calibri" w:hAnsi="Calibri"/>
-                <w:sz w:val="18"/>
-              </w:rPr>
-              <w:t>Current repo docs, C++ core content, tests, art asset notes, and chapter checkpoint plan</w:t>
+              <w:t>Current repo docs, C++ core content, tests, art inventory, Vulkan architecture, onboarding, and chapter checkpoint plan</w:t>
+            </w:r>
+            <w:r>
+              <w:rPr>
+                <w:rFonts w:ascii="Calibri" w:hAnsi="Calibri"/>
+                <w:sz w:val="18"/>
+              </w:rPr>
             </w:r>
           </w:p>
         </w:tc>
@@ -510,7 +510,7 @@
           </w:tcPr>
           <w:p>
             <w:r>
-              <w:t>Living GDD for the playable native Windows/Linux game, supported WebGL build, and near-term production direction</w:t>
+              <w:t>Living GDD for the playable native Vulkan Windows/Linux game, supported WebGL2 build, and near-term production direction</w:t>
             </w:r>
           </w:p>
         </w:tc>
@@ -585,7 +585,7 @@
               <w:spacing w:before="0" w:after="0" w:line="264" w:lineRule="auto"/>
             </w:pPr>
             <w:r>
-              <w:t>Rocket Rogue is a chunky space-mining roguelite where every major action asks the player to trade safety margin for progress: burn longer, land deeper, mine with shared fuel, or risk the Ark to reach New Earth.</w:t>
+              <w:t>OREBIT is a chunky space-mining roguelite where every major action asks the player to trade safety margin for progress: burn longer, land deeper, mine with shared fuel, or risk the Ark to reach New Earth.</w:t>
             </w:r>
           </w:p>
         </w:tc>
@@ -946,13 +946,13 @@
                 <w:rFonts w:ascii="Calibri" w:hAnsi="Calibri"/>
                 <w:sz w:val="18"/>
               </w:rPr>
-            </w:r>
-            <w:r>
-              <w:rPr>
-                <w:rFonts w:ascii="Calibri" w:hAnsi="Calibri"/>
-                <w:sz w:val="18"/>
-              </w:rPr>
-              <w:t>Ship, crew, research, materials, drones, artifacts, legacy, and economy.</w:t>
+              <w:t>Permanent ship systems, crew, research, materials, drones, artifacts, legacy, and economy.</w:t>
+            </w:r>
+            <w:r>
+              <w:rPr>
+                <w:rFonts w:ascii="Calibri" w:hAnsi="Calibri"/>
+                <w:sz w:val="18"/>
+              </w:rPr>
             </w:r>
           </w:p>
         </w:tc>
@@ -1236,7 +1236,7 @@
         <w:spacing w:before="0" w:after="120" w:line="264" w:lineRule="auto"/>
       </w:pPr>
       <w:r>
-        <w:t>Rocket Rogue is a PC-first C++20 space-mining roguelite with genuine native x86-64 Windows and Linux builds through SDL 3 and OpenGL 3.3 Core, plus a separate Emscripten/WebGL2 browser build for testing and sharing. It starts as a NASA-arcade launch gamble, then grows into landings, surface expeditions, direct-control mining, Drone Bay loadouts, and an Ark campaign beyond the solar system.</w:t>
+        <w:t>OREBIT is a PC-first C++20 space-mining roguelite with genuine native x86-64 Windows and Linux builds through SDL 3 and direct Vulkan 1.3, plus a separate Emscripten/WebGL2 browser build for parity testing and sharing. It starts as a NASA-arcade launch gamble, then grows into permanent ship systems, landings, surface expeditions, direct-control mining, Drone Bay loadouts, and an Ark campaign beyond the solar system. The repository and some internal identifiers retain the Rocket Rogue project name.</w:t>
       </w:r>
     </w:p>
     <w:p>
@@ -1502,13 +1502,13 @@
                 <w:rFonts w:ascii="Calibri" w:hAnsi="Calibri"/>
                 <w:sz w:val="18"/>
               </w:rPr>
-            </w:r>
-            <w:r>
-              <w:rPr>
-                <w:rFonts w:ascii="Calibri" w:hAnsi="Calibri"/>
-                <w:sz w:val="18"/>
-              </w:rPr>
-              <w:t>Modules, damage, return margin, and repair costs define the launch program.</w:t>
+              <w:t>Permanent systems, expedition outages, return margin, and repair costs define the launch program.</w:t>
+            </w:r>
+            <w:r>
+              <w:rPr>
+                <w:rFonts w:ascii="Calibri" w:hAnsi="Calibri"/>
+                <w:sz w:val="18"/>
+              </w:rPr>
             </w:r>
           </w:p>
         </w:tc>
@@ -1533,13 +1533,13 @@
                 <w:rFonts w:ascii="Calibri" w:hAnsi="Calibri"/>
                 <w:sz w:val="18"/>
               </w:rPr>
-            </w:r>
-            <w:r>
-              <w:rPr>
-                <w:rFonts w:ascii="Calibri" w:hAnsi="Calibri"/>
-                <w:sz w:val="18"/>
-              </w:rPr>
-              <w:t>Core math belongs in rocket_core; UI renders prepared state instead of duplicating rules.</w:t>
+              <w:t>System ownership persists across replacement ships; current-expedition damage and availability stay explicit.</w:t>
+            </w:r>
+            <w:r>
+              <w:rPr>
+                <w:rFonts w:ascii="Calibri" w:hAnsi="Calibri"/>
+                <w:sz w:val="18"/>
+              </w:rPr>
             </w:r>
           </w:p>
         </w:tc>
@@ -2243,13 +2243,13 @@
                 <w:rFonts w:ascii="Calibri" w:hAnsi="Calibri"/>
                 <w:sz w:val="17"/>
               </w:rPr>
+              <w:t>Repair, recruit, train, rest, saved refit opportunities, permanent Reach/Control/Recovery tracks, randomized post-Moon offers, crew stress, and animal specialists are implemented.</w:t>
             </w:r>
             <w:r>
               <w:rPr>
                 <w:rFonts w:ascii="Calibri" w:hAnsi="Calibri"/>
                 <w:sz w:val="17"/>
               </w:rPr>
-              <w:t>Repair, recruit, train, rest, one-choice refit cards, crew stress, animal specialists, and module inventory are implemented.</w:t>
             </w:r>
           </w:p>
         </w:tc>
@@ -2341,13 +2341,13 @@
                 <w:rFonts w:ascii="Calibri" w:hAnsi="Calibri"/>
                 <w:sz w:val="17"/>
               </w:rPr>
+              <w:t>Flyby, orbit, landing gates, saved first-use briefs, rewards, slingshot boosts, and save resume behavior are implemented.</w:t>
             </w:r>
             <w:r>
               <w:rPr>
                 <w:rFonts w:ascii="Calibri" w:hAnsi="Calibri"/>
                 <w:sz w:val="17"/>
               </w:rPr>
-              <w:t>Flyby, orbit, landing gates, rewards, slingshot boosts, and save resume behavior are implemented.</w:t>
             </w:r>
           </w:p>
         </w:tc>
@@ -2530,7 +2530,7 @@
           </w:tcPr>
           <w:p>
             <w:r>
-              <w:t>Direct-control mining, Toggle/Hold drilling, heat cutoff, scanner/tether/drone guidance, resources, oxygen, enemies, and passive defense are implemented.</w:t>
+              <w:t>Direct-control mining, 30s baseline oxygen, Toggle/Hold drilling, return-to-ship banking, heat cutoff, artifact tethering/gates, deterministic Act/level rules, resources, enemies, and passive defense are implemented.</w:t>
             </w:r>
           </w:p>
         </w:tc>
@@ -2622,13 +2622,13 @@
                 <w:rFonts w:ascii="Calibri" w:hAnsi="Calibri"/>
                 <w:sz w:val="17"/>
               </w:rPr>
+              <w:t>Prospector Mk I contract, persistent loadouts, slot upgrades, Mk tuning, role synergies, passive combat forecast, and mining HUD support are implemented.</w:t>
             </w:r>
             <w:r>
               <w:rPr>
                 <w:rFonts w:ascii="Calibri" w:hAnsi="Calibri"/>
                 <w:sz w:val="17"/>
               </w:rPr>
-              <w:t>Persistent loadouts, slot upgrades, Mk tuning, role synergies, passive combat forecast, and mining HUD support are implemented.</w:t>
             </w:r>
           </w:p>
         </w:tc>
@@ -2685,7 +2685,7 @@
               <w:spacing w:before="0" w:after="20" w:line="240" w:lineRule="auto"/>
             </w:pPr>
             <w:r>
-              <w:t>Partly playable</w:t>
+              <w:t>Playable / expanding</w:t>
             </w:r>
           </w:p>
         </w:tc>
@@ -2703,7 +2703,7 @@
           </w:tcPr>
           <w:p>
             <w:r>
-              <w:t>Solar bodies, Straylight states, shuttle/effects, mining rig, drones, and post-solar planets are in progress.</w:t>
+              <w:t>Chapters 1-7, the Chapter 8 Rift Belt placeholder, Neptune-only Straylight discovery, Aaru Vale, Arkfall, Navigation, and hostile sorties are implemented; Chapters 9-10 remain future work.</w:t>
             </w:r>
           </w:p>
         </w:tc>
@@ -2788,7 +2788,7 @@
           </w:tcPr>
           <w:p>
             <w:r>
-              <w:t>90s arcade sprites and cleaned alpha assets cover solar-system bodies, Straylight states, shuttle/effects, the mining rig, six mini-drone roles, and post-solar planets.</w:t>
+              <w:t>90s arcade sprites and cleaned alpha assets cover solar-system bodies, Straylight states, shuttle/effects, the mining rig, six mini-drone roles, the heroic Capybara portrait, and post-solar planets.</w:t>
             </w:r>
           </w:p>
         </w:tc>
@@ -4324,7 +4324,7 @@
         <w:pStyle w:val="ListNumber"/>
       </w:pPr>
       <w:r>
-        <w:t>Choose one refit card, then repair, recruit, train, or rest before the next attempt.</w:t>
+        <w:t>Spend one saved refit opportunity on a permanent Reach, Control, or Recovery system - or keep the credits - then repair, recruit, train, or rest before the next attempt.</w:t>
       </w:r>
     </w:p>
     <w:p>
@@ -4543,13 +4543,13 @@
                 <w:rFonts w:ascii="Calibri" w:hAnsi="Calibri"/>
                 <w:sz w:val="18"/>
               </w:rPr>
-            </w:r>
-            <w:r>
-              <w:rPr>
-                <w:rFonts w:ascii="Calibri" w:hAnsi="Calibri"/>
-                <w:sz w:val="18"/>
-              </w:rPr>
-              <w:t>Ship modules</w:t>
+              <w:t>Permanent ship systems</w:t>
+            </w:r>
+            <w:r>
+              <w:rPr>
+                <w:rFonts w:ascii="Calibri" w:hAnsi="Calibri"/>
+                <w:sz w:val="18"/>
+              </w:rPr>
             </w:r>
           </w:p>
         </w:tc>
@@ -4636,13 +4636,13 @@
                 <w:rFonts w:ascii="Calibri" w:hAnsi="Calibri"/>
                 <w:sz w:val="18"/>
               </w:rPr>
-            </w:r>
-            <w:r>
-              <w:rPr>
-                <w:rFonts w:ascii="Calibri" w:hAnsi="Calibri"/>
-                <w:sz w:val="18"/>
-              </w:rPr>
-              <w:t>Build for reach, warning quality, survival, or reward.</w:t>
+              <w:t>Build enduring Reach, Control, Recovery, and later mining support while managing expedition outages.</w:t>
+            </w:r>
+            <w:r>
+              <w:rPr>
+                <w:rFonts w:ascii="Calibri" w:hAnsi="Calibri"/>
+                <w:sz w:val="18"/>
+              </w:rPr>
             </w:r>
           </w:p>
         </w:tc>
@@ -5030,7 +5030,7 @@
         <w:spacing w:before="0" w:after="120" w:line="264" w:lineRule="auto"/>
       </w:pPr>
       <w:r>
-        <w:t>Successful transfers open flyby, orbit, and landing operations. Mars is the first research frontier: arrival becomes a chance to spend materials, decode artifacts, start a surface expedition, and decide when to return home.</w:t>
+        <w:t>Successful transfers open flyby, orbit, and landing operations. Saved first-use briefs explain how flyby/orbit blueprints, landing, mining, mini-drones, and the Prospector contract feed permanent progression without repeating on later saves. Mars is the first research frontier: arrival becomes a chance to spend materials, decode artifacts, start a surface expedition, and decide when to return home.</w:t>
       </w:r>
     </w:p>
     <w:tbl>
@@ -5238,13 +5238,13 @@
                 <w:rFonts w:ascii="Calibri" w:hAnsi="Calibri"/>
                 <w:sz w:val="18"/>
               </w:rPr>
-            </w:r>
-            <w:r>
-              <w:rPr>
-                <w:rFonts w:ascii="Calibri" w:hAnsi="Calibri"/>
-                <w:sz w:val="18"/>
-              </w:rPr>
-              <w:t>Minigame rewards progression and slingshot boosts.</w:t>
+              <w:t>Saved first-use brief connects the minigame's rewards to blueprint progression and permanent shipyard upgrades.</w:t>
+            </w:r>
+            <w:r>
+              <w:rPr>
+                <w:rFonts w:ascii="Calibri" w:hAnsi="Calibri"/>
+                <w:sz w:val="18"/>
+              </w:rPr>
             </w:r>
           </w:p>
         </w:tc>
@@ -5333,13 +5333,13 @@
                 <w:rFonts w:ascii="Calibri" w:hAnsi="Calibri"/>
                 <w:sz w:val="18"/>
               </w:rPr>
-            </w:r>
-            <w:r>
-              <w:rPr>
-                <w:rFonts w:ascii="Calibri" w:hAnsi="Calibri"/>
-                <w:sz w:val="18"/>
-              </w:rPr>
-              <w:t>Orbit minigame grants science-style progression rewards.</w:t>
+              <w:t>Saved first-use brief connects orbit rewards to blueprint progression; perfect orbits show science and mission credits.</w:t>
+            </w:r>
+            <w:r>
+              <w:rPr>
+                <w:rFonts w:ascii="Calibri" w:hAnsi="Calibri"/>
+                <w:sz w:val="18"/>
+              </w:rPr>
             </w:r>
           </w:p>
         </w:tc>
@@ -5428,13 +5428,13 @@
                 <w:rFonts w:ascii="Calibri" w:hAnsi="Calibri"/>
                 <w:sz w:val="18"/>
               </w:rPr>
-            </w:r>
-            <w:r>
-              <w:rPr>
-                <w:rFonts w:ascii="Calibri" w:hAnsi="Calibri"/>
-                <w:sz w:val="18"/>
-              </w:rPr>
-              <w:t>Research phase and Surface Ops unlock from Mars onward.</w:t>
+              <w:t>Saved first-use brief introduces research and surface work from Mars onward.</w:t>
+            </w:r>
+            <w:r>
+              <w:rPr>
+                <w:rFonts w:ascii="Calibri" w:hAnsi="Calibri"/>
+                <w:sz w:val="18"/>
+              </w:rPr>
             </w:r>
           </w:p>
         </w:tc>
@@ -5618,13 +5618,13 @@
                 <w:rFonts w:ascii="Calibri" w:hAnsi="Calibri"/>
                 <w:sz w:val="18"/>
               </w:rPr>
-            </w:r>
-            <w:r>
-              <w:rPr>
-                <w:rFonts w:ascii="Calibri" w:hAnsi="Calibri"/>
-                <w:sz w:val="18"/>
-              </w:rPr>
-              <w:t>Survey, scan, push, one mining run, Drone Ops, extraction, hazard/events, bounded log.</w:t>
+              <w:t>Survey or Push Deeper prepares one fuel-only mining run; Drone Ops, gate forecasts, extraction, hazard/events, and a bounded log support the decision.</w:t>
+            </w:r>
+            <w:r>
+              <w:rPr>
+                <w:rFonts w:ascii="Calibri" w:hAnsi="Calibri"/>
+                <w:sz w:val="18"/>
+              </w:rPr>
             </w:r>
           </w:p>
         </w:tc>
@@ -5644,7 +5644,13 @@
         <w:spacing w:before="0" w:after="120" w:line="264" w:lineRule="auto"/>
       </w:pPr>
       <w:r>
-        <w:t>Mining remains one fuel-only run per surface loop. Keyboard drilling defaults to Toggle with optional Hold; mouse and controller stay hold-based. Pause, focus loss, modals, screen changes, or preference changes release drilling. Heat locks at 100% and resets below 60%. Scanner feedback names discoveries, tethering is disabled without an exposed nearby target, and support drones act automatically. Acts 1/2/3 span Chapters 2-5/6-7/8-10 across Learn 1-3, Combine 4-6, Pressure 7-8, and Mastery 9-10.</w:t>
+        <w:t>Mining remains one fuel-only run per surface loop and starts with 30 seconds of oxygen before crew, drone, and field upgrades, capped at 120 seconds. Keyboard drilling defaults to Toggle with optional Hold; mouse and controller stay hold-based. Pause, focus loss, modals, screen changes, or preference changes release drilling. Heat locks at 100% and resets below 60%. Scanner feedback names discoveries, exposed artifacts can be tethered, returning to the ship banks payload and refills oxygen, and support drones act automatically. Acts 1/2/3 span Chapters 2-5/6-7/8-10 across Learn 1-3, Combine 4-6, Pressure 7-8, and Mastery 9-10 without loadout-based difficulty scaling.</w:t>
+      </w:r>
+    </w:p>
+    <w:p>
+      <w:pPr/>
+      <w:r>
+        <w:t>Artifact sites use deterministic gates bound to the same Act, level, and seed as the arena. Surface Ops and Drone Ops forecast the direct capability, current readiness, and systemic alternatives; the loadout never changes arena difficulty. A fixed story site completes only when its specific artifact is delivered, banked, and survives Surface extraction.</w:t>
       </w:r>
     </w:p>
     <w:tbl>
@@ -6380,7 +6386,7 @@
         <w:spacing w:before="0" w:after="120" w:line="264" w:lineRule="auto"/>
       </w:pPr>
       <w:r>
-        <w:t>Ship progression runs through slots and refit choices. Post-mission rewards show three cards; the player installs one before hangar operations resume. Modules must state what threat they answer, what number they move, what they cost, and what they trade away.</w:t>
+        <w:t>Ship progression uses unique permanent systems and saved refit opportunities, not replacement parts or a persistent shop. Before the Moon, each useful flight offers the next unowned Reach, Control, and Recovery rank with explicit prerequisites and no reroll; after the Moon, randomized boards prefer one candidate from each role when possible. Buying a system applies its deltas once. Expedition damage can take it offline for the current ship, but ownership survives replacement. Later cards must state the threat answered, primary number moved, price, and tradeoff.</w:t>
       </w:r>
     </w:p>
     <w:tbl>
@@ -6427,6 +6433,7 @@
                 <w:color w:val="0B2545"/>
                 <w:sz w:val="19"/>
               </w:rPr>
+              <w:t>System family</w:t>
             </w:r>
             <w:r>
               <w:rPr>
@@ -6435,7 +6442,6 @@
                 <w:color w:val="0B2545"/>
                 <w:sz w:val="19"/>
               </w:rPr>
-              <w:t>Slot / Family</w:t>
             </w:r>
           </w:p>
         </w:tc>
@@ -7804,7 +7810,7 @@
         <w:spacing w:before="0" w:after="120" w:line="264" w:lineRule="auto"/>
       </w:pPr>
       <w:r>
-        <w:t>Research unlocks decisions, not just bigger numbers. Materials, blueprints, and artifacts open module families, crew facilities, surface tools, drone systems, and Ark repair hooks. Artifact research grants mechanical insight now; story payload comes later.</w:t>
+        <w:t>Research unlocks decisions, not just bigger numbers. Materials, blueprints, and artifacts open permanent system families, crew facilities, surface tools, drone systems, and Ark repair hooks. Artifact research grants mechanical insight now; story payload comes later.</w:t>
       </w:r>
     </w:p>
     <w:tbl>
@@ -8503,7 +8509,7 @@
         <w:spacing w:before="0" w:after="120" w:line="264" w:lineRule="auto"/>
       </w:pPr>
       <w:r>
-        <w:t>Drone Ops is the mining loadout layer: environmental support in Act 1 and passive combat after Arkfall. Arkfall grants Mk I Attack and Defense drones and raises undersized bays to three slots without erasing stronger loadouts. Perimeter Coordination gates Mk II-III combat tuning and synergies; arena difficulty never scales from equipped drones.</w:t>
+        <w:t>The first mining contract reserves 3 safely recovered Common Ore to fabricate the Prospector Mk I, permanently unlock one Mining Drone, and open one Drone Bay slot. Drone Support research adds Resource, Survey, and Hazard roles for Act 1; Arkfall grants Mk I Attack and Defense drones and raises undersized bays to three slots without erasing stronger loadouts. Perimeter Coordination gates Mk II-III combat tuning and synergies; arena difficulty never scales from equipped drones.</w:t>
       </w:r>
     </w:p>
     <w:tbl>
@@ -8680,13 +8686,13 @@
                 <w:rFonts w:ascii="Calibri" w:hAnsi="Calibri"/>
                 <w:sz w:val="18"/>
               </w:rPr>
-            </w:r>
-            <w:r>
-              <w:rPr>
-                <w:rFonts w:ascii="Calibri" w:hAnsi="Calibri"/>
-                <w:sz w:val="18"/>
-              </w:rPr>
-              <w:t>Drone Bay</w:t>
+              <w:t>Prospector Mk I contract</w:t>
+            </w:r>
+            <w:r>
+              <w:rPr>
+                <w:rFonts w:ascii="Calibri" w:hAnsi="Calibri"/>
+                <w:sz w:val="18"/>
+              </w:rPr>
             </w:r>
           </w:p>
         </w:tc>
@@ -8775,13 +8781,13 @@
                 <w:rFonts w:ascii="Calibri" w:hAnsi="Calibri"/>
                 <w:sz w:val="18"/>
               </w:rPr>
-            </w:r>
-            <w:r>
-              <w:rPr>
-                <w:rFonts w:ascii="Calibri" w:hAnsi="Calibri"/>
-                <w:sz w:val="18"/>
-              </w:rPr>
-              <w:t>Drone Bay</w:t>
+              <w:t>Drone Support Program</w:t>
+            </w:r>
+            <w:r>
+              <w:rPr>
+                <w:rFonts w:ascii="Calibri" w:hAnsi="Calibri"/>
+                <w:sz w:val="18"/>
+              </w:rPr>
             </w:r>
           </w:p>
         </w:tc>
@@ -8870,13 +8876,13 @@
                 <w:rFonts w:ascii="Calibri" w:hAnsi="Calibri"/>
                 <w:sz w:val="18"/>
               </w:rPr>
-            </w:r>
-            <w:r>
-              <w:rPr>
-                <w:rFonts w:ascii="Calibri" w:hAnsi="Calibri"/>
-                <w:sz w:val="18"/>
-              </w:rPr>
-              <w:t>Drone Bay</w:t>
+              <w:t>Drone Support Program</w:t>
+            </w:r>
+            <w:r>
+              <w:rPr>
+                <w:rFonts w:ascii="Calibri" w:hAnsi="Calibri"/>
+                <w:sz w:val="18"/>
+              </w:rPr>
             </w:r>
           </w:p>
         </w:tc>
@@ -8935,7 +8941,7 @@
           </w:tcPr>
           <w:p>
             <w:r>
-              <w:t>Drone Bay</w:t>
+              <w:t>Drone Support Program</w:t>
             </w:r>
           </w:p>
         </w:tc>
@@ -9163,7 +9169,7 @@
         <w:spacing w:before="0" w:after="120" w:line="264" w:lineRule="auto"/>
       </w:pPr>
       <w:r>
-        <w:t>The game can hurt the player without dead-ending the campaign. Vehicles lose modules. Astronauts die or come home injured. Memorials persist. Rescue costs bite. Records, unlocks, blueprints, facilities, artifacts, and drones keep the program moving.</w:t>
+        <w:t>The game can hurt the player without dead-ending the campaign. Ships can be lost and installed systems can go offline for the expedition, but permanent ownership survives replacement. Astronauts die or come home injured. Memorials persist. Rescue costs bite. Records, unlocks, blueprints, facilities, artifacts, drones, and saved onboarding state keep the program moving.</w:t>
       </w:r>
     </w:p>
     <w:p>
@@ -10215,7 +10221,7 @@
         <w:spacing w:before="0" w:after="120" w:line="264" w:lineRule="auto"/>
       </w:pPr>
       <w:r>
-        <w:t>Art uses #ff00aa source images, cleaned alpha PNGs, and fixed packing. The shared renderer registers 33 runtime textures; web loads asynchronously and native decodes through the texture service. Source, reference, and future art stays separate.</w:t>
+        <w:t>Art uses #ff00aa source images, cleaned alpha PNGs, and deterministic atlas packing. The texture manifest registers 34 runtime textures, including the heroic Capybara portrait; web loads asynchronously and native decodes through the texture service before each backend draws shared scene packets. Source, reference, and future art stays separate.</w:t>
       </w:r>
     </w:p>
     <w:tbl>
@@ -10704,6 +10710,38 @@
           <w:p>
             <w:r>
               <w:t>Superseded source variants and the chroma-key reference; not registered at runtime.</w:t>
+            </w:r>
+          </w:p>
+        </w:tc>
+      </w:tr>
+      <w:tr>
+        <w:tc>
+          <w:tcPr>
+            <w:tcW w:type="dxa" w:w="1900"/>
+          </w:tcPr>
+          <w:p>
+            <w:r>
+              <w:t>Crew portraits</w:t>
+            </w:r>
+          </w:p>
+        </w:tc>
+        <w:tc>
+          <w:tcPr>
+            <w:tcW w:type="dxa" w:w="3680"/>
+          </w:tcPr>
+          <w:p>
+            <w:r>
+              <w:t>heroic-capybara.png</w:t>
+            </w:r>
+          </w:p>
+        </w:tc>
+        <w:tc>
+          <w:tcPr>
+            <w:tcW w:type="dxa" w:w="3780"/>
+          </w:tcPr>
+          <w:p>
+            <w:r>
+              <w:t>Campaign introduction portrait and animal-crew presentation.</w:t>
             </w:r>
           </w:p>
         </w:tc>
@@ -11076,7 +11114,7 @@
           </w:tcPr>
           <w:p>
             <w:r>
-              <w:t>Shared OpenGL draw path and texture manifest with isolated GL API and GLSL dialect boundaries for WebGL2 and desktop GL 3.3 Core. No gameplay decisions.</w:t>
+              <w:t>Backend-neutral SceneComposer/ScenePacket data plus a direct Vulkan 1.3 native backend, Vulkan RmlUi host, and WebGL2 browser backend. Rendering never decides gameplay outcomes.</w:t>
             </w:r>
           </w:p>
         </w:tc>
@@ -11174,7 +11212,7 @@
           </w:tcPr>
           <w:p>
             <w:r>
-              <w:t>SDL 3 window and GL context, input/gamepads, haptics, native storage, PNG decode, fullscreen, high-DPI metrics, and shutdown.</w:t>
+              <w:t>SDL 3 window and Vulkan surface, input/gamepads, haptics, native storage, PNG decode, fullscreen, high-DPI metrics, and shutdown.</w:t>
             </w:r>
           </w:p>
         </w:tc>
@@ -11216,7 +11254,7 @@
         <w:spacing w:before="0" w:after="120" w:line="264" w:lineRule="auto"/>
       </w:pPr>
       <w:r>
-        <w:t>The current save format is versioned, line-based, and dependency-free. SaveSchema owns field keys and delimiters. New gameplay fields default safely when missing, round trip through tests, and migrate legacy state into the highest valid monotonic chapter without rolling back player progress.</w:t>
+        <w:t>The current save format is version 4, line-based, and dependency-free. Version 3 introduced saved refit entitlements and offer IDs; version 4 adds acknowledged activity briefs, Prospector Common Ore progress, and persistent Drone Bay migration. SaveSchema owns field keys and delimiters. New gameplay fields default safely when missing, round trip through tests, and migrate legacy state into the highest valid monotonic chapter without rolling back player progress.</w:t>
       </w:r>
     </w:p>
     <w:p>
@@ -11232,7 +11270,7 @@
         <w:spacing w:before="0" w:after="120" w:line="264" w:lineRule="auto"/>
       </w:pPr>
       <w:r>
-        <w:t>Core tests are design contracts for launch outcomes, telemetry, crew stress, economy, research, Surface Ops, mining, drone builds, Ark campaign, saves, panel presentation, and content IDs. Future systems need tests for the rules players touch: gates, costs, availability, rewards, chapter advancement, and save/load compatibility.</w:t>
+        <w:t>Core tests are design contracts for launch outcomes, telemetry, crew stress, economy, permanent refits, saved onboarding, Prospector progression, research, Surface Ops, deterministic mining/gates, drone builds, Ark campaign, saves, panel presentation, and content IDs. Future systems need tests for the rules players touch: gates, costs, availability, rewards, chapter advancement, and save/load compatibility.</w:t>
       </w:r>
     </w:p>
     <w:tbl>
@@ -11453,13 +11491,13 @@
                 <w:rFonts w:ascii="Calibri" w:hAnsi="Calibri"/>
                 <w:sz w:val="17"/>
               </w:rPr>
+              <w:t>Mining requires Survey/Push preparation, spends shared fuel, runs once, blocks further survey/push, starts at 30s oxygen, honors deterministic Act/level/gate rules, banks/leaves/aborts/fails correctly, and persists through save/load.</w:t>
             </w:r>
             <w:r>
               <w:rPr>
                 <w:rFonts w:ascii="Calibri" w:hAnsi="Calibri"/>
                 <w:sz w:val="17"/>
               </w:rPr>
-              <w:t>Mining spends fuel, runs once, blocks further survey/push, stows/aborts/fails correctly, and persists through save/load.</w:t>
             </w:r>
           </w:p>
         </w:tc>
@@ -11520,13 +11558,13 @@
                 <w:rFonts w:ascii="Calibri" w:hAnsi="Calibri"/>
                 <w:sz w:val="17"/>
               </w:rPr>
+              <w:t>Prospector completion, persistent unlocks, slots, loadouts, tuning, synergies, combat forecast, capability forecasts, and passive combat outcomes.</w:t>
             </w:r>
             <w:r>
               <w:rPr>
                 <w:rFonts w:ascii="Calibri" w:hAnsi="Calibri"/>
                 <w:sz w:val="17"/>
               </w:rPr>
-              <w:t>Unlocks, slots, loadouts, tuning, synergies, combat forecast, and passive combat outcomes.</w:t>
             </w:r>
           </w:p>
         </w:tc>
@@ -11691,7 +11729,7 @@
           </w:tcPr>
           <w:p>
             <w:r>
-              <w:t>Automated checks confine browser/Emscripten symbols to web adapters and reject Electron, Chromium, Node, WASM, browser-shell, or missing-library leakage in native archives.</w:t>
+              <w:t>Automated checks confine browser/Emscripten symbols to web adapters and reject Electron, Chromium, Node, WASM, browser-shell, OpenGL fallback, or missing-library leakage in native Vulkan archives.</w:t>
             </w:r>
           </w:p>
         </w:tc>
@@ -13235,6 +13273,50 @@
           <w:p>
             <w:r>
               <w:t>Reproducible web and Windows/Linux x86-64 builds, tests, package contents, symbols, dependency checks, and release artifacts.</w:t>
+            </w:r>
+          </w:p>
+        </w:tc>
+      </w:tr>
+      <w:tr>
+        <w:tc>
+          <w:tcPr>
+            <w:tcW w:type="dxa" w:w="3330"/>
+          </w:tcPr>
+          <w:p>
+            <w:r>
+              <w:t>docs/VULKAN_MIGRATION_REPORT.md</w:t>
+            </w:r>
+          </w:p>
+        </w:tc>
+        <w:tc>
+          <w:tcPr>
+            <w:tcW w:type="dxa" w:w="6030"/>
+          </w:tcPr>
+          <w:p>
+            <w:r>
+              <w:t>Direct Vulkan 1.3 requirements, native render architecture, pipeline/cache behavior, and acceptance boundary.</w:t>
+            </w:r>
+          </w:p>
+        </w:tc>
+      </w:tr>
+      <w:tr>
+        <w:tc>
+          <w:tcPr>
+            <w:tcW w:type="dxa" w:w="3330"/>
+          </w:tcPr>
+          <w:p>
+            <w:r>
+              <w:t>docs/STEAM_RELEASE_READINESS.md</w:t>
+            </w:r>
+          </w:p>
+        </w:tc>
+        <w:tc>
+          <w:tcPr>
+            <w:tcW w:type="dxa" w:w="6030"/>
+          </w:tcPr>
+          <w:p>
+            <w:r>
+              <w:t>Current OREBIT commercial title, Steam/Deck gates, release positioning, and creative ownership constraints.</w:t>
             </w:r>
           </w:p>
         </w:tc>

</xml_diff>

<commit_message>
Ship explicit campaign progression
</commit_message>
<xml_diff>
--- a/docs/Rocket_Rogue_Game_Design_Document.docx
+++ b/docs/Rocket_Rogue_Game_Design_Document.docx
@@ -44,7 +44,7 @@
           <w:color w:val="555555"/>
           <w:sz w:val="25"/>
         </w:rPr>
-        <w:t>Press-your-luck spaceflight, surface mining, Ark campaign progression, and passive-drone survival</w:t>
+        <w:t>Press-your-luck spaceflight, surface mining, Ark campaign progression, and active-actor swarm survival</w:t>
       </w:r>
     </w:p>
     <w:p>
@@ -391,7 +391,7 @@
           </w:tcPr>
           <w:p>
             <w:r>
-              <w:t>July 21, 2026</w:t>
+              <w:t>July 26, 2026</w:t>
             </w:r>
           </w:p>
         </w:tc>
@@ -451,13 +451,7 @@
                 <w:rFonts w:ascii="Calibri" w:hAnsi="Calibri"/>
                 <w:sz w:val="18"/>
               </w:rPr>
-              <w:t>Current repo docs, C++ core content, tests, art inventory, Vulkan architecture, onboarding, and chapter checkpoint plan</w:t>
-            </w:r>
-            <w:r>
-              <w:rPr>
-                <w:rFonts w:ascii="Calibri" w:hAnsi="Calibri"/>
-                <w:sz w:val="18"/>
-              </w:rPr>
+              <w:t>Current repo docs, C++ core content, tests, art inventory, Vulkan/WebGL2 architecture, controller support, the approved EVA/swarm design, and the Solar Jetman reference manuals</w:t>
             </w:r>
           </w:p>
         </w:tc>
@@ -510,7 +504,7 @@
           </w:tcPr>
           <w:p>
             <w:r>
-              <w:t>Living GDD for the playable native Vulkan Windows/Linux game, supported WebGL2 build, and near-term production direction</w:t>
+              <w:t>Living GDD for the playable native Vulkan Windows/Linux game and WebGL2 build, including the current Jetpack EVA and transferable mini-drone swarm production slice</w:t>
             </w:r>
           </w:p>
         </w:tc>
@@ -1245,6 +1239,26 @@
       </w:pPr>
       <w:r>
         <w:t>The fantasy is escalation. A fragile launch program becomes Straylight, a traveling survival base. The mandatory route runs through Moon, Mars, Jupiter, Saturn, Uranus, and Neptune. Only after Neptune does the Straylight reveal take over the screen; Aaru Vale and Arkfall then begin the long push to New Earth.</w:t>
+      </w:r>
+    </w:p>
+    <w:p>
+      <w:pPr>
+        <w:pStyle w:val="Heading2"/>
+      </w:pPr>
+      <w:r>
+        <w:t>Mechanical Touchstone: Solar Jetman</w:t>
+      </w:r>
+    </w:p>
+    <w:p>
+      <w:pPr/>
+      <w:r>
+        <w:t>Solar Jetman is the mechanical touchstone for destination gravity, inertia, distinct vehicle-versus-pilot roles, towing burden, vulnerable recovery after vehicle loss, and physically returning discoveries to safety. OREBIT uses that relationship internally as a mechanical reference, not as a story, character, or visual license.</w:t>
+      </w:r>
+    </w:p>
+    <w:p>
+      <w:pPr/>
+      <w:r>
+        <w:t>References: Original NES manual - https://www.gamingalexandria.com/highquality/NES/Solar%20Jetman/Solar%20Jetman%20-%20Manual%20%28Searchable%29.pdf ; official Rare Replay manual - https://dlassets-ssl.xboxlive.com/public/content/367297b7-c6a3-4496-83ad-cb70c52ce8cd/GameManual/2e5e2560-e901-414b-87fa-081a07f24c6c/en-SA/index.html#SolarJetman . OREBIT deliberately differs through voluntary EVA, twin-stick aiming, hand-drilled terrain, support drones, suit-only passages, explicit tether control, and an artifact-only exception to the suit's zero-cargo rule.</w:t>
       </w:r>
     </w:p>
     <w:p>
@@ -2506,13 +2520,7 @@
                 <w:rFonts w:ascii="Calibri" w:hAnsi="Calibri"/>
                 <w:sz w:val="17"/>
               </w:rPr>
-            </w:r>
-            <w:r>
-              <w:rPr>
-                <w:rFonts w:ascii="Calibri" w:hAnsi="Calibri"/>
-                <w:sz w:val="17"/>
-              </w:rPr>
-              <w:t>Playable</w:t>
+              <w:t>Playable / validation</w:t>
             </w:r>
           </w:p>
         </w:tc>
@@ -2530,7 +2538,7 @@
           </w:tcPr>
           <w:p>
             <w:r>
-              <w:t>Direct-control mining, 30s baseline oxygen, Toggle/Hold drilling, return-to-ship banking, heat cutoff, artifact tethering/gates, deterministic Act/level rules, resources, enemies, and passive defense are implemented.</w:t>
+              <w:t>Direct-control mining now supports Rig and Jetpack operator modes, destination gravity and inertia, twin-stick aim, sidearm and hand drill actions, artifact tethering, loose chunks, suit-only routes, emergency ejection, and active-actor HUD/effects. Physical Steam Deck control and readability remain a release gate.</w:t>
             </w:r>
           </w:p>
         </w:tc>
@@ -2591,13 +2599,7 @@
                 <w:rFonts w:ascii="Calibri" w:hAnsi="Calibri"/>
                 <w:sz w:val="17"/>
               </w:rPr>
-            </w:r>
-            <w:r>
-              <w:rPr>
-                <w:rFonts w:ascii="Calibri" w:hAnsi="Calibri"/>
-                <w:sz w:val="17"/>
-              </w:rPr>
-              <w:t>Playable</w:t>
+              <w:t>Playable / validation</w:t>
             </w:r>
           </w:p>
         </w:tc>
@@ -2622,13 +2624,7 @@
                 <w:rFonts w:ascii="Calibri" w:hAnsi="Calibri"/>
                 <w:sz w:val="17"/>
               </w:rPr>
-              <w:t>Prospector Mk I contract, persistent loadouts, slot upgrades, Mk tuning, role synergies, passive combat forecast, and mining HUD support are implemented.</w:t>
-            </w:r>
-            <w:r>
-              <w:rPr>
-                <w:rFonts w:ascii="Calibri" w:hAnsi="Calibri"/>
-                <w:sz w:val="17"/>
-              </w:rPr>
+              <w:t>Prospector progression and persistent loadouts remain in place. Equipped mini drones are independent world entities whose logical anchor transfers to the controlled rig or operator; they follow, orbit, defend, perform bounded sorties, and preserve haul, shields, cooldowns, and formation identity across actor and depth transitions.</w:t>
             </w:r>
           </w:p>
         </w:tc>
@@ -2788,7 +2784,7 @@
           </w:tcPr>
           <w:p>
             <w:r>
-              <w:t>90s arcade sprites and cleaned alpha assets cover solar-system bodies, Straylight states, shuttle/effects, the mining rig, six mini-drone roles, the heroic Capybara portrait, and post-solar planets.</w:t>
+              <w:t>90s arcade sprites and cleaned alpha assets cover solar-system bodies, Straylight states, shuttle/effects, the mining rig, six mini-drone roles, the heroic Capybara portrait, and the static jetpack Capybara operator. Authored operator animation remains future work.</w:t>
             </w:r>
           </w:p>
         </w:tc>
@@ -2828,7 +2824,7 @@
         <w:spacing w:before="0" w:after="120" w:line="264" w:lineRule="auto"/>
       </w:pPr>
       <w:r>
-        <w:t>Humanity starts with one job: prove the rocket, push farther, and bring the crew home. Mars turns flight testing into research and extraction. Jupiter, Saturn, Uranus, and Neptune are mandatory individual arrivals; successful arrival unlocks exactly the next world. Before Neptune there is no Straylight name, contact, silhouette, signal, art, or Ark-return framing. Successful Neptune arrival persists a full-screen discovery briefing whose sole Approach action identifies the derelict-but-operable Straylight as the expedition's first viable home and resumes Neptune Arrival Ops. Its first jump reaches Aaru Vale. The next jump fails near Khepri Prime, turning exploration into survival, repair, and route-finding.</w:t>
+        <w:t>Humanity starts with one job: prove the rocket, push farther, and bring the crew home. The Moon preserves that proving-flight story while adding an explicit 3-Common-Ore Prospector contract. Mars turns the lesson into research, extraction, and a claimed second Drone Bay slot. Jupiter remains the stable travel destination, but landed work takes place on Io: its inert regolith pays nothing, its Thermal lava is the only ore source, and Hazard Mk I opens a layered artifact site. A claimed Perfect Jupiter slingshot permanently opens the one-way Saturn route. Saturn, Uranus, and Neptune then remain mandatory individual arrivals. Before Neptune there is no Straylight name, contact, silhouette, signal, art, or Ark-return framing. Successful Neptune arrival persists a full-screen discovery briefing whose sole Approach action identifies the derelict-but-operable Straylight as the expedition's first viable home and resumes Neptune Arrival Ops. Its first jump reaches Aaru Vale. The next jump fails near Khepri Prime, turning exploration into survival, repair, and route-finding.</w:t>
       </w:r>
     </w:p>
     <w:p>
@@ -4332,7 +4328,7 @@
         <w:pStyle w:val="ListNumber"/>
       </w:pPr>
       <w:r>
-        <w:t>When reaching Mars or beyond, resolve arrival operations, research, surface decisions, mining, and extraction.</w:t>
+        <w:t>When reaching the Moon or beyond, resolve arrival operations, the current mandatory campaign objective, surface decisions, mining, and extraction; broader research begins at Mars.</w:t>
       </w:r>
     </w:p>
     <w:p>
@@ -4348,7 +4344,7 @@
         <w:pStyle w:val="ListNumber"/>
       </w:pPr>
       <w:r>
-        <w:t>Progress from Earth Orbit to Moon, Mars, Jupiter, Saturn, Uranus, and Neptune in order; acknowledge the Neptune-only Straylight discovery; then continue through Aaru Vale, Arkfall, Khepri Prime, and the Rift Belt.</w:t>
+        <w:t>Progress from Earth Orbit to Moon, Mars, Jupiter/Io, Saturn, Uranus, and Neptune in order. Claim the Moon Prospector contract, Mars bay expansion, safely extracted Io artifact, and Perfect Jupiter slingshot instead of advancing those beats implicitly; acknowledge the Neptune-only Straylight discovery; then continue through Aaru Vale, Arkfall, Khepri Prime, and the Rift Belt.</w:t>
       </w:r>
     </w:p>
     <w:p>
@@ -5030,7 +5026,7 @@
         <w:spacing w:before="0" w:after="120" w:line="264" w:lineRule="auto"/>
       </w:pPr>
       <w:r>
-        <w:t>Successful transfers open flyby, orbit, and landing operations. Saved first-use briefs explain how flyby/orbit blueprints, landing, mining, mini-drones, and the Prospector contract feed permanent progression without repeating on later saves. Mars is the first research frontier: arrival becomes a chance to spend materials, decode artifacts, start a surface expedition, and decide when to return home.</w:t>
+        <w:t>Successful transfers open flyby, orbit, and landing operations. Optional activities retain saved first-use help, while campaign beats use mandatory non-dismissible briefings, visible LOCKED/ACTIVE/READY TO CLAIM/COMPLETE objectives, and named claim actions. The Moon requires 3 safely delivered local Common Ore before Install Prospector Mk I grants the unique Mining Support Drone and Slot 1. Mars requires 4 local Common Ore before Fabricate Drone Bay Slot 2 opens an empty specialist slot. Io commissions Hazard Mk I, stages two four-segment lava seals around a minor artifact, and awards one player-selected Support Drone upgrade credit after safe extraction. A dedicated Perfect Jupiter Flyby then opens Saturn. Mars remains the first broad research frontier.</w:t>
       </w:r>
     </w:p>
     <w:tbl>
@@ -5644,13 +5640,13 @@
         <w:spacing w:before="0" w:after="120" w:line="264" w:lineRule="auto"/>
       </w:pPr>
       <w:r>
-        <w:t>Mining remains one fuel-only run per surface loop and starts with 30 seconds of oxygen before crew, drone, and field upgrades, capped at 120 seconds. Keyboard drilling defaults to Toggle with optional Hold; mouse and controller stay hold-based. Pause, focus loss, modals, screen changes, or preference changes release drilling. Heat locks at 100% and resets below 60%. Scanner feedback names discoveries, exposed artifacts can be tethered, returning to the ship banks payload and refills oxygen, and support drones act automatically. Acts 1/2/3 span Chapters 2-5/6-7/8-10 across Learn 1-3, Combine 4-6, Pressure 7-8, and Mastery 9-10 without loadout-based difficulty scaling.</w:t>
+        <w:t>Mining remains one fuel-only deployment per surface loop and begins in the player-controlled Mining Rig; autonomous bay units are Support Drones. Ordinary Regolith breaks only to make a path and never yields material. Common Ore uses a gray/silver body and shimmer, while gold marks Rare Ore. Io uses a destination-specific Thermal lava rule: no Cryo or direct ore deposits, deterministic lava-to-Common treatment, and a 60-second baseline for its fixed artifact introduction while normal missions retain 30 seconds. Both rig and operator use inertial fixed-step movement under vector-valued destination gravity. The rig moves at 7.2 cells/s maximum with 14 cells/s2 acceleration, 20 cells/s2 braking, and a 0.48-cell collider. The suit moves at 4.6 cells/s maximum with 28 cells/s2 acceleration, 24 cells/s2 braking, and a 0.25-cell collider. Base gravity is 6 cells/s2 multiplied by the destination's gravity scale; direction and strength are stored separately so later local or inverted fields do not require a state redesign.</w:t>
       </w:r>
     </w:p>
     <w:p>
       <w:pPr/>
       <w:r>
-        <w:t>Artifact sites use deterministic gates bound to the same Act, level, and seed as the arena. Surface Ops and Drone Ops forecast the direct capability, current readiness, and systemic alternatives; the loadout never changes arena difficulty. A fixed story site completes only when its specific artifact is delivered, banked, and survives Surface extraction.</w:t>
+        <w:t>Rig controls remain unchanged. In EVA, WASD or the left stick thrusts; the mouse or right stick aims independently; left click or R2/RT fires the automatic sidearm; right click or L2/LT runs the hand drill; E/X scans; T/Y toggles the artifact tether; and F immediately exits or enters. Holding A for 0.6 seconds exits or enters with an EXIT/ENTER progress ring around the rig, while a shorter A release retains the existing bank/leave action. Held actions clear on pause, modal entry, focus loss, disconnect, and input-source switching.</w:t>
       </w:r>
     </w:p>
     <w:tbl>
@@ -6336,6 +6332,30 @@
       </w:tr>
     </w:tbl>
     <w:p/>
+    <w:p>
+      <w:pPr/>
+      <w:r>
+        <w:t>The suit has fixed equipment and no upgrades, ammunition, propellant, or fall damage. Its 1.2-cell hand drill uses 45% of base rig power and the existing heat model; scanner and tether use base radius and range without rig bonuses. The infinite sidearm deals 2.4 damage to the first valid hit within 8 cells, fires immediately and every 0.18 seconds, never pierces or critically hits, and caps terrain output at 30% of the hand drill. It cannot damage the rig, shuttle, artifact, or mini drones.</w:t>
+      </w:r>
+    </w:p>
+    <w:p>
+      <w:pPr/>
+      <w:r>
+        <w:t>The suit carries no ore: freed ore and suit-killed enemy rewards become loose chunks for the rig or Mining/Resource mini drones. The artifact is the one exception. Normal and heavy masses still apply, the suit has zero free tow buffer, and speed cannot fall below 55%. The tethered mass swings under gravity and transfers bounded force/fuel cost, with enough thrust guaranteed to prevent gravity or tether softlocks.</w:t>
+      </w:r>
+    </w:p>
+    <w:p>
+      <w:pPr/>
+      <w:r>
+        <w:t>Suit-only passages admit the operator and mini drones but block the rig and artifact. The operator may change depth while the parked rig stays on its layer; the operator, validly tethered artifact, and swarm transition together. Runs start in the rig. Exit needs a safe adjacent suit position; entry needs the same layer within 1.25 cells. Rig destruction emergency-ejects the operator safely and disables the wreck before combat updates. Cargo stays with the wreck, banked payload stays safe, and an operator-tethered artifact stays attached.</w:t>
+      </w:r>
+    </w:p>
+    <w:p>
+      <w:pPr/>
+      <w:r>
+        <w:t>Normal extraction requires a functioning rig and operator in the return zone. After emergency ejection, the shuttle ends the deployment safely and may bank a physically delivered artifact. Zero suit integrity releases the tether, freezes the swarm, and ends the run; shuttle repair spends banked Common material.</w:t>
+      </w:r>
+    </w:p>
     <w:p>
       <w:pPr>
         <w:pStyle w:val="Heading2"/>
@@ -7810,7 +7830,7 @@
         <w:spacing w:before="0" w:after="120" w:line="264" w:lineRule="auto"/>
       </w:pPr>
       <w:r>
-        <w:t>Research unlocks decisions, not just bigger numbers. Materials, blueprints, and artifacts open permanent system families, crew facilities, surface tools, drone systems, and Ark repair hooks. Artifact research grants mechanical insight now; story payload comes later.</w:t>
+        <w:t>Research unlocks decisions, not just bigger numbers. Materials, blueprints, and artifacts open permanent system families, crew facilities, surface tools, Support Drone systems, and Ark repair hooks. The Io minor artifact is explicitly not Ark-repair progress: safe extraction grants one persistent Drone Upgrade Credit that the player applies to an owned Mk I or Mk II Support Drone. Other artifact research grants mechanical insight now; larger story payload comes later.</w:t>
       </w:r>
     </w:p>
     <w:tbl>
@@ -8501,7 +8521,7 @@
         <w:pStyle w:val="Heading2"/>
       </w:pPr>
       <w:r>
-        <w:t>Drone Bay And Passive Defense</w:t>
+        <w:t>Drone Bay And Active-Actor Defense</w:t>
       </w:r>
     </w:p>
     <w:p>
@@ -8509,7 +8529,7 @@
         <w:spacing w:before="0" w:after="120" w:line="264" w:lineRule="auto"/>
       </w:pPr>
       <w:r>
-        <w:t>The first mining contract reserves 3 safely recovered Common Ore to fabricate the Prospector Mk I, permanently unlock one Mining Drone, and open one Drone Bay slot. Drone Support research adds Resource, Survey, and Hazard roles for Act 1; Arkfall grants Mk I Attack and Defense drones and raises undersized bays to three slots without erasing stronger loadouts. Perimeter Coordination gates Mk II-III combat tuning and synergies; arena difficulty never scales from equipped drones.</w:t>
+        <w:t>The Moon mining contract reserves 3 safely delivered lunar Common Ore until the player explicitly installs Prospector Mk I, permanently owns/equips the unique Mining Support Drone, and opens Slot 1. Mars reserves 4 local Common Ore until the player explicitly fabricates empty Slot 2. Resource and Survey remain Mars research unlocks; Hazard is commissioned separately on Io and fills Slot 2 only when it is empty. Support Drone types are unique and cannot be duplicated across slots. The equipped swarm belongs to the player rather than the Mining Rig: every drone defaults to the ControlledActor anchor and resolves each fixed step to the rig or operator currently controlled. Explicit Rig and Operator bindings remain internal hooks for later scripted behavior, not a player-facing configuration.</w:t>
       </w:r>
     </w:p>
     <w:tbl>
@@ -9048,13 +9068,7 @@
                 <w:rFonts w:ascii="Calibri" w:hAnsi="Calibri"/>
                 <w:sz w:val="18"/>
               </w:rPr>
-            </w:r>
-            <w:r>
-              <w:rPr>
-                <w:rFonts w:ascii="Calibri" w:hAnsi="Calibri"/>
-                <w:sz w:val="18"/>
-              </w:rPr>
-              <w:t>Passive shots, crits, area control, and enemy slowdown after Arkfall.</w:t>
+              <w:t>Active-actor-centered shots, target priority, critical-hit tuning, area control, and enemy slowdown after Arkfall.</w:t>
             </w:r>
           </w:p>
         </w:tc>
@@ -9143,19 +9157,37 @@
                 <w:rFonts w:ascii="Calibri" w:hAnsi="Calibri"/>
                 <w:sz w:val="18"/>
               </w:rPr>
-            </w:r>
-            <w:r>
-              <w:rPr>
-                <w:rFonts w:ascii="Calibri" w:hAnsi="Calibri"/>
-                <w:sz w:val="18"/>
-              </w:rPr>
-              <w:t>Shields, reactive armor, counter-hits, and hazard/enemy damage relief.</w:t>
+              <w:t>Orbits and intercepts damage around the controlled actor, with shields, reactive armor, counter-hits, and hazard/enemy damage relief.</w:t>
             </w:r>
           </w:p>
         </w:tc>
       </w:tr>
     </w:tbl>
     <w:p/>
+    <w:p>
+      <w:pPr/>
+      <w:r>
+        <w:t>Mini drones remain independently simulated world entities. A same-layer anchor transfer never teleports them: position, velocity, haul, shield charge, recharge, cooldowns, stable formation slot, and orbit phase persist while cell assignments and layer-local targets clear. Non-combat roles enter Returning; Attack and Defense roles reacquire around the new actor on the next update. Following and defending outrank finishing a remote task, and no drone returns to a parked or destroyed rig.</w:t>
+      </w:r>
+    </w:p>
+    <w:p>
+      <w:pPr/>
+      <w:r>
+        <w:t>Idle and returning drones orbit at 0.45 radians/s around a center led by 0.18 seconds of anchor velocity. Role radii are Mining 1.6 cells, Resource 2.05, Hazard 1.9, Defense 2.7, Attack 3.35, and Survey 3.4; stable same-role slots spread evenly and alternating rings counter-rotate. Normal return speed is 5.6 cells/s, increasing to 8.5 cells/s beyond a 4.5-cell leash. Blocked goals compress radially toward the anchor, and small drone colliders pass suit-only passages while avoiding terrain and one another.</w:t>
+      </w:r>
+    </w:p>
+    <w:p>
+      <w:pPr/>
+      <w:r>
+        <w:t>Task search, target scoring, field of view, shield arcs, scanner origins, collision clearance, and combat/support effects use the resolved active-actor frame. Attack drones choose threats near that anchor; Defense drones intercept damage there before routing any remainder to rig health or suit integrity. Mining, Resource, Survey, and Hazard roles make bounded sorties. A hauling drone detaches to unload only when the active actor is on the entry layer near the shuttle; otherwise it preserves its haul and follows.</w:t>
+      </w:r>
+    </w:p>
+    <w:p>
+      <w:pPr/>
+      <w:r>
+        <w:t>Cross-depth transitions rebuild deterministic formation positions around the active actor while preserving haul, shields, cooldowns, and orbit phase and clearing local targets and combat visuals. Artifact tether ownership is separate from mini-drone anchoring: an anchor transfer never attaches, releases, or modifies the artifact, and drones do not collide with the tether line.</w:t>
+      </w:r>
+    </w:p>
     <w:p>
       <w:pPr>
         <w:pStyle w:val="Heading2"/>
@@ -10205,7 +10237,7 @@
         <w:spacing w:before="0" w:after="120" w:line="264" w:lineRule="auto"/>
       </w:pPr>
       <w:r>
-        <w:t>USG direction frames destinations around Danger, Durability, and Value. Object and resource presentation shows Weight, Durability, and Value, plus whether an object is tetherable, collectible, destructible, or a hazard. This model guides generated planets, moons, anomalies, boss planets, and Ark repair locations.</w:t>
+        <w:t>USG direction frames destinations around Danger, Durability, and Value. Each destination also has a gravity identity applied to both rig and operator: Earth Orbit 0.15, Moon 0.35, Mars 0.60, Jupiter 1.15, Saturn 0.95, Uranus 0.80, Neptune 1.05, Khepri Prime 1.20, and Rift Belt 0.25, multiplying the 6 cells/s2 base field. Initial fields pull downward, but gravity is stored as a vector so local anomalies can redirect it later. Object and resource presentation continues to show Weight, Durability, Value, tetherability, and blocking behavior; gravity now helps each destination change traversal, towing, and recovery without changing the core resource grammar.</w:t>
       </w:r>
     </w:p>
     <w:p>
@@ -10221,7 +10253,7 @@
         <w:spacing w:before="0" w:after="120" w:line="264" w:lineRule="auto"/>
       </w:pPr>
       <w:r>
-        <w:t>Art uses #ff00aa source images, cleaned alpha PNGs, and deterministic atlas packing. The texture manifest registers 34 runtime textures, including the heroic Capybara portrait; web loads asynchronously and native decodes through the texture service before each backend draws shared scene packets. Source, reference, and future art stays separate.</w:t>
+        <w:t>Art uses #ff00aa sources, tolerant cleanup, verified alpha, and deterministic packing. The manifest has 35 runtime textures, including the heroic portrait and static jetpack operator; missing JetpackCapybara art or registration fails without fallback. Vulkan and WebGL2 share the atlas/header.</w:t>
       </w:r>
     </w:p>
     <w:tbl>
@@ -10651,13 +10683,16 @@
         </w:tc>
       </w:tr>
       <w:tr>
+        <w:trPr>
+          <w:cantSplit/>
+        </w:trPr>
         <w:tc>
           <w:tcPr>
             <w:tcW w:type="dxa" w:w="1900"/>
           </w:tcPr>
           <w:p>
             <w:r>
-              <w:t>Post-solar bodies</w:t>
+              <w:t>Post-solar and character sources</w:t>
             </w:r>
           </w:p>
         </w:tc>
@@ -10667,7 +10702,7 @@
           </w:tcPr>
           <w:p>
             <w:r>
-              <w:t>outer-system-planet-01.png through -09.png; outer-system-moon-01.png through -10.png</w:t>
+              <w:t>outer-system art; Ark/rocket/bg/chroma sources; heroic-capybara.png; jetpack-capybara.png</w:t>
             </w:r>
           </w:p>
         </w:tc>
@@ -10677,71 +10712,7 @@
           </w:tcPr>
           <w:p>
             <w:r>
-              <w:t>Nine planets are runtime textures; ten moons remain future-route source art.</w:t>
-            </w:r>
-          </w:p>
-        </w:tc>
-      </w:tr>
-      <w:tr>
-        <w:tc>
-          <w:tcPr>
-            <w:tcW w:type="dxa" w:w="1900"/>
-          </w:tcPr>
-          <w:p>
-            <w:r>
-              <w:t>Source and reference</w:t>
-            </w:r>
-          </w:p>
-        </w:tc>
-        <w:tc>
-          <w:tcPr>
-            <w:tcW w:type="dxa" w:w="3680"/>
-          </w:tcPr>
-          <w:p>
-            <w:r>
-              <w:t>ark-operational.png, ark-damaged.png, rocket.png, local-solar-bg.png, chroma-key.png</w:t>
-            </w:r>
-          </w:p>
-        </w:tc>
-        <w:tc>
-          <w:tcPr>
-            <w:tcW w:type="dxa" w:w="3780"/>
-          </w:tcPr>
-          <w:p>
-            <w:r>
-              <w:t>Superseded source variants and the chroma-key reference; not registered at runtime.</w:t>
-            </w:r>
-          </w:p>
-        </w:tc>
-      </w:tr>
-      <w:tr>
-        <w:tc>
-          <w:tcPr>
-            <w:tcW w:type="dxa" w:w="1900"/>
-          </w:tcPr>
-          <w:p>
-            <w:r>
-              <w:t>Crew portraits</w:t>
-            </w:r>
-          </w:p>
-        </w:tc>
-        <w:tc>
-          <w:tcPr>
-            <w:tcW w:type="dxa" w:w="3680"/>
-          </w:tcPr>
-          <w:p>
-            <w:r>
-              <w:t>heroic-capybara.png</w:t>
-            </w:r>
-          </w:p>
-        </w:tc>
-        <w:tc>
-          <w:tcPr>
-            <w:tcW w:type="dxa" w:w="3780"/>
-          </w:tcPr>
-          <w:p>
-            <w:r>
-              <w:t>Campaign introduction portrait and animal-crew presentation.</w:t>
+              <w:t>Runtime/future post-solar art, source references, portrait, and static EVA operator; animation remains future work.</w:t>
             </w:r>
           </w:p>
         </w:tc>
@@ -10758,13 +10729,13 @@
           <w:cols w:space="720"/>
           <w:titlePg/>
           <w:docGrid w:linePitch="360"/>
-          <w:type w:val="continuous"/>
         </w:sectPr>
       </w:pPr>
     </w:p>
     <w:p>
       <w:pPr>
         <w:pStyle w:val="Heading1"/>
+        <w:pageBreakBefore w:val="0"/>
       </w:pPr>
       <w:r>
         <w:t>6. UX, Art, And Audio Direction</w:t>
@@ -10791,7 +10762,7 @@
         <w:pStyle w:val="ListBullet"/>
       </w:pPr>
       <w:r>
-        <w:t>Do not hide tradeoffs: shared fuel, Ark fuel, oxygen, return risk, extraction pressure, and drone availability stay visible.</w:t>
+        <w:t>Do not hide tradeoffs or goals: shared fuel, Ark fuel, oxygen, return risk, extraction pressure, Support Drone availability, carried/aboard/delivered contract ore, Io lava-seal stages, artifact recovery, and the Perfect-required Saturn slingshot stay visible.</w:t>
       </w:r>
     </w:p>
     <w:p>
@@ -10832,6 +10803,12 @@
       </w:pPr>
       <w:r>
         <w:t>The visual direction is chunky, blocky, geometric, colorful, and retro arcade with modern polish. The game looks like a hands-on space program, not a spreadsheet. Sprites must read as real game objects at speed; placeholders are acceptable only when ownership, role, state, and threat level remain clear.</w:t>
+      </w:r>
+    </w:p>
+    <w:p>
+      <w:pPr/>
+      <w:r>
+        <w:t>Mining presentation shows the parked rig, static operator, independently moving mini drones, reticle, tracer, tether, thrust, and anchor-centered shield/scanner effects. Shared HUD fields include controlled mode, gravity, suit integrity, drill heat, tether burden, loose-chunk count, drone parent status, and 'Suit carry: 0'. Native RmlUi and web prompts use the same vocabulary and action state.</w:t>
       </w:r>
     </w:p>
     <w:p>
@@ -11114,7 +11091,7 @@
           </w:tcPr>
           <w:p>
             <w:r>
-              <w:t>Backend-neutral SceneComposer/ScenePacket data plus a direct Vulkan 1.3 native backend, Vulkan RmlUi host, and WebGL2 browser backend. Rendering never decides gameplay outcomes.</w:t>
+              <w:t>Backend-neutral SceneComposer/ScenePacket data plus a direct Vulkan 1.3 native backend, Vulkan RmlUi host, and WebGL2 browser backend. Rendering never decides gameplay and centers reticle, tracer, tether, thrust, shield, scanner, projectile, and damage effects on the active actor.</w:t>
             </w:r>
           </w:p>
         </w:tc>
@@ -11234,7 +11211,7 @@
           </w:tcPr>
           <w:p>
             <w:r>
-              <w:t>Browser shell, CSS, DOM fallback, accessibility mirror, and exported web action routing.</w:t>
+              <w:t>Browser shell, CSS, accessibility mirror, exported web action routing, and the WebGL2 scene host.</w:t>
             </w:r>
           </w:p>
         </w:tc>
@@ -11242,8 +11219,15 @@
     </w:tbl>
     <w:p/>
     <w:p>
+      <w:pPr/>
+      <w:r>
+        <w:t>Mining uses MiningOperatorMode with separate rig/operator state, MiningLooseChunk records, actor mobility profiles, and vector gravity. Each MiningMiniDroneAgent stores an additive anchor target, stable formation slot, and orbit phase. A centralized resolver produces a transient MiniDroneAnchorFrame containing actor identity, position, velocity, facing, collider, depth, and validity. Coordinators and SceneComposer receive that frame instead of reading rig coordinates.</w:t>
+      </w:r>
+    </w:p>
+    <w:p>
       <w:pPr>
         <w:pStyle w:val="Heading2"/>
+        <w:pageBreakBefore/>
       </w:pPr>
       <w:r>
         <w:t>Save And Migration Rules</w:t>
@@ -11254,7 +11238,7 @@
         <w:spacing w:before="0" w:after="120" w:line="264" w:lineRule="auto"/>
       </w:pPr>
       <w:r>
-        <w:t>The current save format is version 4, line-based, and dependency-free. Version 3 introduced saved refit entitlements and offer IDs; version 4 adds acknowledged activity briefs, Prospector Common Ore progress, and persistent Drone Bay migration. SaveSchema owns field keys and delimiters. New gameplay fields default safely when missing, round trip through tests, and migrate legacy state into the highest valid monotonic chapter without rolling back player progress.</w:t>
+        <w:t>The current save format is version 7, line-based, and dependency-free. Version 6 persists operator/rig state, loose chunks, disabled-rig state, mini-drone anchors, formations, positions, velocities, haul, shields, and cooldowns. Version 7 adds explicit Moon/Mars contract claims, Io Hazard/artifact progression, layered lava-seal runtime state, Drone Upgrade Credits, Flyby purpose, first slingshot-failure acknowledgement, and the permanent Saturn route gate. Migration preserves owned drones and upgrades, deduplicates free repeated loadout references, backfills earlier milestones that old saves cannot revisit, and never rolls Saturn-or-later campaigns backward. Validation rejects malformed enum/range data and round-trip tests protect the additive schema.</w:t>
       </w:r>
     </w:p>
     <w:p>
@@ -11270,7 +11254,7 @@
         <w:spacing w:before="0" w:after="120" w:line="264" w:lineRule="auto"/>
       </w:pPr>
       <w:r>
-        <w:t>Core tests are design contracts for launch outcomes, telemetry, crew stress, economy, permanent refits, saved onboarding, Prospector progression, research, Surface Ops, deterministic mining/gates, drone builds, Ark campaign, saves, panel presentation, and content IDs. Future systems need tests for the rules players touch: gates, costs, availability, rewards, chapter advancement, and save/load compatibility.</w:t>
+        <w:t>Core tests are design contracts for launch outcomes, progression, research, Surface Ops, deterministic mining, Rig/EVA physics, destination gravity, loose chunks, tether burden, suit passages, emergency recovery, and save migration. Swarm tests cover mixed six-role formations, smooth actor transfers, cancellation with haul preservation, active-actor targeting and shield interception, catch-up, compressed formations, collision separation, shuttle restrictions, cross-depth preservation, wreck avoidance, tether independence, failure freeze, and active-actor render effects. Release validation includes atlas checks, core/native tests, web tests/build, sanity checks, native Release, 1280x800 visual review, and a physical Steam Deck control/readability pass.</w:t>
       </w:r>
     </w:p>
     <w:tbl>
@@ -11491,13 +11475,7 @@
                 <w:rFonts w:ascii="Calibri" w:hAnsi="Calibri"/>
                 <w:sz w:val="17"/>
               </w:rPr>
-              <w:t>Mining requires Survey/Push preparation, spends shared fuel, runs once, blocks further survey/push, starts at 30s oxygen, honors deterministic Act/level/gate rules, banks/leaves/aborts/fails correctly, and persists through save/load.</w:t>
-            </w:r>
-            <w:r>
-              <w:rPr>
-                <w:rFonts w:ascii="Calibri" w:hAnsi="Calibri"/>
-                <w:sz w:val="17"/>
-              </w:rPr>
+              <w:t>Mining requires prepared Surface Ops and shared fuel; tests cover oxygen/heat, rig and suit mobility, vector gravity, twin-stick aim, sidearm/drill/scanner/tether behavior, loose chunks, suit-only passages, depth transitions, recovery, extraction, and deterministic artifact gates.</w:t>
             </w:r>
           </w:p>
         </w:tc>
@@ -11558,13 +11536,7 @@
                 <w:rFonts w:ascii="Calibri" w:hAnsi="Calibri"/>
                 <w:sz w:val="17"/>
               </w:rPr>
-              <w:t>Prospector completion, persistent unlocks, slots, loadouts, tuning, synergies, combat forecast, capability forecasts, and passive combat outcomes.</w:t>
-            </w:r>
-            <w:r>
-              <w:rPr>
-                <w:rFonts w:ascii="Calibri" w:hAnsi="Calibri"/>
-                <w:sz w:val="17"/>
-              </w:rPr>
+              <w:t>Prospector progression, persistent loadouts, unique orbit slots, smooth Rig-Operator-Rig transfer, task cancellation, haul/shield/cooldown preservation, active-actor Attack/Defense behavior, catch-up/leashes, collision separation, shuttle delivery, cross-depth transfer, and ejection from a wreck.</w:t>
             </w:r>
           </w:p>
         </w:tc>
@@ -11685,12 +11657,15 @@
           </w:tcPr>
           <w:p>
             <w:r>
-              <w:t>Shared presentation behavior covers native RmlUi and browser DOM fallback parity, modals, stable focus/action IDs, controls, and top-level metrics.</w:t>
+              <w:t>Shared presentation behavior covers native RmlUi and web UI parity, modals, stable focus/action IDs, one mining viewport transform, active-actor HUD/effects, controller hold/tap semantics, and top-level metrics.</w:t>
             </w:r>
           </w:p>
         </w:tc>
       </w:tr>
       <w:tr>
+        <w:trPr>
+          <w:cantSplit/>
+        </w:trPr>
         <w:tc>
           <w:tcPr>
             <w:tcW w:type="dxa" w:w="2200"/>
@@ -11713,6 +11688,9 @@
         </w:tc>
       </w:tr>
       <w:tr>
+        <w:trPr>
+          <w:cantSplit/>
+        </w:trPr>
         <w:tc>
           <w:tcPr>
             <w:tcW w:type="dxa" w:w="2200"/>
@@ -12182,7 +12160,7 @@
               <w:spacing w:before="0" w:after="60" w:line="259" w:lineRule="auto"/>
             </w:pPr>
             <w:r>
-              <w:t>Khepri Prime/Rift maps, passive-drone combat reads, rewards, and recovery paths play differently from Aaru Vale.</w:t>
+              <w:t>Khepri Prime/Rift maps, active-actor-centered swarm combat reads, rewards, and recovery paths play differently from Aaru Vale.</w:t>
             </w:r>
           </w:p>
         </w:tc>
@@ -12473,6 +12451,7 @@
       <w:tr>
         <w:trPr>
           <w:tblHeader w:val="true"/>
+          <w:cantSplit/>
         </w:trPr>
         <w:tc>
           <w:tcPr>
@@ -12540,6 +12519,9 @@
         </w:tc>
       </w:tr>
       <w:tr>
+        <w:trPr>
+          <w:cantSplit/>
+        </w:trPr>
         <w:tc>
           <w:tcPr>
             <w:tcW w:type="dxa" w:w="3330"/>
@@ -12604,6 +12586,9 @@
         </w:tc>
       </w:tr>
       <w:tr>
+        <w:trPr>
+          <w:cantSplit/>
+        </w:trPr>
         <w:tc>
           <w:tcPr>
             <w:tcW w:type="dxa" w:w="3330"/>
@@ -12668,6 +12653,9 @@
         </w:tc>
       </w:tr>
       <w:tr>
+        <w:trPr>
+          <w:cantSplit/>
+        </w:trPr>
         <w:tc>
           <w:tcPr>
             <w:tcW w:type="dxa" w:w="3330"/>
@@ -12732,6 +12720,9 @@
         </w:tc>
       </w:tr>
       <w:tr>
+        <w:trPr>
+          <w:cantSplit/>
+        </w:trPr>
         <w:tc>
           <w:tcPr>
             <w:tcW w:type="dxa" w:w="3330"/>
@@ -12796,6 +12787,9 @@
         </w:tc>
       </w:tr>
       <w:tr>
+        <w:trPr>
+          <w:cantSplit/>
+        </w:trPr>
         <w:tc>
           <w:tcPr>
             <w:tcW w:type="dxa" w:w="3330"/>
@@ -12860,6 +12854,9 @@
         </w:tc>
       </w:tr>
       <w:tr>
+        <w:trPr>
+          <w:cantSplit/>
+        </w:trPr>
         <w:tc>
           <w:tcPr>
             <w:tcW w:type="dxa" w:w="3330"/>
@@ -12912,18 +12909,15 @@
                 <w:rFonts w:ascii="Calibri" w:hAnsi="Calibri"/>
                 <w:sz w:val="18"/>
               </w:rPr>
-            </w:r>
-            <w:r>
-              <w:rPr>
-                <w:rFonts w:ascii="Calibri" w:hAnsi="Calibri"/>
-                <w:sz w:val="18"/>
-              </w:rPr>
-              <w:t>Drone roles, slot/tuning progression, synergies, passive combat, and HUD expectations.</w:t>
+              <w:t>Drone roles, slot/tuning progression, synergies, transferable active-actor anchoring, formations, bounded sorties, combat/support behavior, and HUD expectations.</w:t>
             </w:r>
           </w:p>
         </w:tc>
       </w:tr>
       <w:tr>
+        <w:trPr>
+          <w:cantSplit/>
+        </w:trPr>
         <w:tc>
           <w:tcPr>
             <w:tcW w:type="dxa" w:w="3330"/>
@@ -12945,13 +12939,7 @@
                 <w:rFonts w:ascii="Calibri" w:hAnsi="Calibri"/>
                 <w:sz w:val="18"/>
               </w:rPr>
-            </w:r>
-            <w:r>
-              <w:rPr>
-                <w:rFonts w:ascii="Calibri" w:hAnsi="Calibri"/>
-                <w:sz w:val="18"/>
-              </w:rPr>
-              <w:t>docs/AGENT_DESIGN_CONTEXT.md</w:t>
+              <w:t>docs/AGENT_DESIGN_CONTEXT.md + Solar Jetman manuals</w:t>
             </w:r>
           </w:p>
         </w:tc>
@@ -12976,18 +12964,15 @@
                 <w:rFonts w:ascii="Calibri" w:hAnsi="Calibri"/>
                 <w:sz w:val="18"/>
               </w:rPr>
-            </w:r>
-            <w:r>
-              <w:rPr>
-                <w:rFonts w:ascii="Calibri" w:hAnsi="Calibri"/>
-                <w:sz w:val="18"/>
-              </w:rPr>
-              <w:t>Design priority order, art direction, animal crew direction, and Ark/base progression.</w:t>
+              <w:t>Design priorities, art/crew/Ark direction, and the internal gravity, inertia, towing, vehicle/pilot, recovery, and physical-delivery touchstone.</w:t>
             </w:r>
           </w:p>
         </w:tc>
       </w:tr>
       <w:tr>
+        <w:trPr>
+          <w:cantSplit/>
+        </w:trPr>
         <w:tc>
           <w:tcPr>
             <w:tcW w:type="dxa" w:w="3330"/>
@@ -13042,6 +13027,9 @@
         </w:tc>
       </w:tr>
       <w:tr>
+        <w:trPr>
+          <w:cantSplit/>
+        </w:trPr>
         <w:tc>
           <w:tcPr>
             <w:tcW w:type="dxa" w:w="3330"/>
@@ -13106,6 +13094,9 @@
         </w:tc>
       </w:tr>
       <w:tr>
+        <w:trPr>
+          <w:cantSplit/>
+        </w:trPr>
         <w:tc>
           <w:tcPr>
             <w:tcW w:type="dxa" w:w="3330"/>
@@ -13158,18 +13149,15 @@
                 <w:rFonts w:ascii="Calibri" w:hAnsi="Calibri"/>
                 <w:sz w:val="18"/>
               </w:rPr>
-            </w:r>
-            <w:r>
-              <w:rPr>
-                <w:rFonts w:ascii="Calibri" w:hAnsi="Calibri"/>
-                <w:sz w:val="18"/>
-              </w:rPr>
-              <w:t>Implemented content, tuning, chapter state, save fields, presentation helpers, and regression coverage.</w:t>
+              <w:t>Implemented content, tuning, chapters, Rig/EVA mining, transferable mini-drone anchors, save version 6 fields, presentation helpers, and regression coverage.</w:t>
             </w:r>
           </w:p>
         </w:tc>
       </w:tr>
       <w:tr>
+        <w:trPr>
+          <w:cantSplit/>
+        </w:trPr>
         <w:tc>
           <w:tcPr>
             <w:tcW w:type="dxa" w:w="3330"/>
@@ -13222,18 +13210,15 @@
                 <w:rFonts w:ascii="Calibri" w:hAnsi="Calibri"/>
                 <w:sz w:val="18"/>
               </w:rPr>
-            </w:r>
-            <w:r>
-              <w:rPr>
-                <w:rFonts w:ascii="Calibri" w:hAnsi="Calibri"/>
-                <w:sz w:val="18"/>
-              </w:rPr>
-              <w:t>Art asset pipeline, Ark/planet/rocket/mining sprite inventory, and #ff00aa source cleanup convention.</w:t>
+              <w:t>Art pipeline, Ark/planet/rocket/mining sprites, jetpack Capybara operator art, runtime manifest, atlas generation, and #ff00aa source cleanup convention.</w:t>
             </w:r>
           </w:p>
         </w:tc>
       </w:tr>
       <w:tr>
+        <w:trPr>
+          <w:cantSplit/>
+        </w:trPr>
         <w:tc>
           <w:tcPr>
             <w:tcW w:type="dxa" w:w="3330"/>
@@ -13256,13 +13241,16 @@
         </w:tc>
       </w:tr>
       <w:tr>
+        <w:trPr>
+          <w:cantSplit/>
+        </w:trPr>
         <w:tc>
           <w:tcPr>
             <w:tcW w:type="dxa" w:w="3330"/>
           </w:tcPr>
           <w:p>
             <w:r>
-              <w:t>CMakeLists.txt, CMakePresets.json, and release workflows</w:t>
+              <w:t>Build, Vulkan, and Steam release sources</w:t>
             </w:r>
           </w:p>
         </w:tc>
@@ -13272,51 +13260,7 @@
           </w:tcPr>
           <w:p>
             <w:r>
-              <w:t>Reproducible web and Windows/Linux x86-64 builds, tests, package contents, symbols, dependency checks, and release artifacts.</w:t>
-            </w:r>
-          </w:p>
-        </w:tc>
-      </w:tr>
-      <w:tr>
-        <w:tc>
-          <w:tcPr>
-            <w:tcW w:type="dxa" w:w="3330"/>
-          </w:tcPr>
-          <w:p>
-            <w:r>
-              <w:t>docs/VULKAN_MIGRATION_REPORT.md</w:t>
-            </w:r>
-          </w:p>
-        </w:tc>
-        <w:tc>
-          <w:tcPr>
-            <w:tcW w:type="dxa" w:w="6030"/>
-          </w:tcPr>
-          <w:p>
-            <w:r>
-              <w:t>Direct Vulkan 1.3 requirements, native render architecture, pipeline/cache behavior, and acceptance boundary.</w:t>
-            </w:r>
-          </w:p>
-        </w:tc>
-      </w:tr>
-      <w:tr>
-        <w:tc>
-          <w:tcPr>
-            <w:tcW w:type="dxa" w:w="3330"/>
-          </w:tcPr>
-          <w:p>
-            <w:r>
-              <w:t>docs/STEAM_RELEASE_READINESS.md</w:t>
-            </w:r>
-          </w:p>
-        </w:tc>
-        <w:tc>
-          <w:tcPr>
-            <w:tcW w:type="dxa" w:w="6030"/>
-          </w:tcPr>
-          <w:p>
-            <w:r>
-              <w:t>Current OREBIT commercial title, Steam/Deck gates, release positioning, and creative ownership constraints.</w:t>
+              <w:t>Reproducible native/web builds, Vulkan acceptance, package/dependency checks, Steam/Deck gates, release positioning, and creative ownership.</w:t>
             </w:r>
           </w:p>
         </w:tc>

</xml_diff>

<commit_message>
Unify RmlUi panels and refine mining drones
</commit_message>
<xml_diff>
--- a/docs/Rocket_Rogue_Game_Design_Document.docx
+++ b/docs/Rocket_Rogue_Game_Design_Document.docx
@@ -2824,7 +2824,7 @@
         <w:spacing w:before="0" w:after="120" w:line="264" w:lineRule="auto"/>
       </w:pPr>
       <w:r>
-        <w:t>Humanity starts with one job: prove the rocket, push farther, and bring the crew home. The Moon preserves that proving-flight story while adding an explicit 3-Common-Ore Prospector contract. Mars turns the lesson into research, extraction, and a claimed second Drone Bay slot. Jupiter remains the stable travel destination, but landed work takes place on Io: its inert regolith pays nothing, its Thermal lava is the only ore source, and Hazard Mk I opens a layered artifact site. A claimed Perfect Jupiter slingshot permanently opens the one-way Saturn route. Saturn, Uranus, and Neptune then remain mandatory individual arrivals. Before Neptune there is no Straylight name, contact, silhouette, signal, art, or Ark-return framing. Successful Neptune arrival persists a full-screen discovery briefing whose sole Approach action identifies the derelict-but-operable Straylight as the expedition's first viable home and resumes Neptune Arrival Ops. Its first jump reaches Aaru Vale. The next jump fails near Khepri Prime, turning exploration into survival, repair, and route-finding.</w:t>
+        <w:t>Humanity starts with one job: prove the rocket, push farther, and bring the crew home. The Moon preserves that proving-flight story while adding an explicit 30-Common-Ore Prospector contract. Mars turns the lesson into repeated 30-second pressure mining with oxygen, drill heat, integrity, repairs, cargo, return decisions, research, extraction, and a claimed second Drone Bay slot. Jupiter remains the stable travel destination, but landed work takes place on Io: its inert regolith pays nothing, its Thermal lava is the only ore source, and Hazard Mk I opens a layered artifact site. A claimed Perfect Jupiter slingshot permanently opens the one-way Saturn route. Saturn, Uranus, and Neptune then remain mandatory individual arrivals. Before Neptune there is no Straylight name, contact, silhouette, signal, art, or Ark-return framing. Successful Neptune arrival persists a full-screen discovery briefing whose sole Approach action identifies the derelict-but-operable Straylight as the expedition's first viable home and resumes Neptune Arrival Ops. Its first jump reaches Aaru Vale. The next jump fails near Khepri Prime, turning exploration into survival, repair, and route-finding.</w:t>
       </w:r>
     </w:p>
     <w:p>
@@ -5026,7 +5026,7 @@
         <w:spacing w:before="0" w:after="120" w:line="264" w:lineRule="auto"/>
       </w:pPr>
       <w:r>
-        <w:t>Successful transfers open flyby, orbit, and landing operations. Optional activities retain saved first-use help, while campaign beats use mandatory non-dismissible briefings, visible LOCKED/ACTIVE/READY TO CLAIM/COMPLETE objectives, and named claim actions. The Moon requires 3 safely delivered local Common Ore before Install Prospector Mk I grants the unique Mining Support Drone and Slot 1. Mars requires 4 local Common Ore before Fabricate Drone Bay Slot 2 opens an empty specialist slot. Io commissions Hazard Mk I, stages two four-segment lava seals around a minor artifact, and awards one player-selected Support Drone upgrade credit after safe extraction. A dedicated Perfect Jupiter Flyby then opens Saturn. Mars remains the first broad research frontier.</w:t>
+        <w:t>Successful transfers open flyby, orbit, and landing operations. Optional activities retain saved first-use help, while campaign beats use mandatory non-dismissible briefings, visible LOCKED/ACTIVE/READY TO CLAIM/COMPLETE objectives, and named claim actions. The Moon requires 30 safely delivered local Common Ore before Install Prospector Mk I grants the unique Mining Support Drone and Slot 1. Mars requires 40 local Common Ore before Fabricate Drone Bay Slot 2 opens an empty specialist slot; its briefing explicitly introduces oxygen, drill heat, integrity wear, field repairs, cargo, and the return decision. Io commissions Hazard Mk I, stages two four-segment lava seals around a minor artifact, and awards one player-selected Support Drone upgrade credit after safe extraction. A dedicated Perfect Jupiter Flyby then opens Saturn. Mars remains the first broad research frontier.</w:t>
       </w:r>
     </w:p>
     <w:tbl>
@@ -8529,7 +8529,7 @@
         <w:spacing w:before="0" w:after="120" w:line="264" w:lineRule="auto"/>
       </w:pPr>
       <w:r>
-        <w:t>The Moon mining contract reserves 3 safely delivered lunar Common Ore until the player explicitly installs Prospector Mk I, permanently owns/equips the unique Mining Support Drone, and opens Slot 1. Mars reserves 4 local Common Ore until the player explicitly fabricates empty Slot 2. Resource and Survey remain Mars research unlocks; Hazard is commissioned separately on Io and fills Slot 2 only when it is empty. Support Drone types are unique and cannot be duplicated across slots. The equipped swarm belongs to the player rather than the Mining Rig: every drone defaults to the ControlledActor anchor and resolves each fixed step to the rig or operator currently controlled. Explicit Rig and Operator bindings remain internal hooks for later scripted behavior, not a player-facing configuration.</w:t>
+        <w:t>The Moon mining contract reserves 30 safely delivered lunar Common Ore until the player explicitly installs Prospector Mk I, permanently owns/equips the unique Mining Support Drone, and opens Slot 1. Mars reserves 40 local Common Ore until the player explicitly fabricates empty Slot 2. Moon remains a simple excavation-and-return lesson; Mars turns the extended contract into repeated oxygen, heat, integrity, repair, cargo, and return cycles. Resource and Survey remain Mars research unlocks; Hazard is commissioned separately on Io and fills Slot 2 only when it is empty. Support Drone types are unique and cannot be duplicated across slots. The equipped swarm belongs to the player rather than the Mining Rig: every drone defaults to the ControlledActor anchor and resolves each fixed step to the rig or operator currently controlled. Explicit Rig and Operator bindings remain internal hooks for later scripted behavior, not a player-facing configuration.</w:t>
       </w:r>
     </w:p>
     <w:tbl>

</xml_diff>

<commit_message>
Implement scenario framework and mining progression
</commit_message>
<xml_diff>
--- a/docs/Rocket_Rogue_Game_Design_Document.docx
+++ b/docs/Rocket_Rogue_Game_Design_Document.docx
@@ -4344,7 +4344,7 @@
         <w:pStyle w:val="ListNumber"/>
       </w:pPr>
       <w:r>
-        <w:t>Progress from Earth Orbit to Moon, Mars, Jupiter/Io, Saturn, Uranus, and Neptune in order. Claim the Moon Prospector contract, Mars bay expansion, safely extracted Io artifact, and Perfect Jupiter slingshot instead of advancing those beats implicitly; acknowledge the Neptune-only Straylight discovery; then continue through Aaru Vale, Arkfall, Khepri Prime, and the Rift Belt.</w:t>
+        <w:t>Progress from Earth Orbit to Moon, Mars, Jupiter/Io, Saturn, Uranus, and Neptune in order. Moon, Mars, Io, and the Saturn transfer are authored scenario definitions: each owns its briefing, visible objective, explicit claim, reward preview, and route key. The delivery, reward, cocoon, Flyby, and route systems remain generic so future authored or procedural scenarios can compose the same mechanics without a new campaign-specific code path.</w:t>
       </w:r>
     </w:p>
     <w:p>
@@ -5026,7 +5026,7 @@
         <w:spacing w:before="0" w:after="120" w:line="264" w:lineRule="auto"/>
       </w:pPr>
       <w:r>
-        <w:t>Successful transfers open flyby, orbit, and landing operations. Optional activities retain saved first-use help, while campaign beats use mandatory non-dismissible briefings, visible LOCKED/ACTIVE/READY TO CLAIM/COMPLETE objectives, and named claim actions. The Moon requires 30 safely delivered local Common Ore before Install Prospector Mk I grants the unique Mining Support Drone and Slot 1. Mars requires 40 local Common Ore before Fabricate Drone Bay Slot 2 opens an empty specialist slot; its briefing explicitly introduces oxygen, drill heat, integrity wear, field repairs, cargo, and the return decision. Io commissions Hazard Mk I, stages two four-segment lava seals around a minor artifact, and awards one player-selected Support Drone upgrade credit after safe extraction. A dedicated Perfect Jupiter Flyby then opens Saturn. Mars remains the first broad research frontier.</w:t>
+        <w:t>Successful transfers open flyby, orbit, and landing operations. Optional activities retain saved first-use help, while authored campaign steps use mandatory non-dismissible briefings, visible LOCKED/ACTIVE/READY TO CLAIM/COMPLETE objectives, and named claim actions. The Moon requires 30 safely delivered local Common Ore before Install Prospector Mk I grants the first Mining Support Drone, Slot 1, and the Mars route key. Mars requires 40 local Common Ore before Fabricate Drone Bay Slot 2 opens an empty specialist slot and grants the Jupiter route key; its briefing explicitly introduces oxygen, drill heat, integrity wear, field repairs, cargo, and the return decision. Io commissions Hazard Mk I, launches a configured two-layer lava cocoon around a protected objective, and awards one player-selected Support Drone upgrade credit after safe extraction. A dedicated Perfect Jupiter Flyby scenario then makes the Saturn route claimable. A route that has an authored unlock requirement never adds a hidden Flight Data requirement after that key is claimed. Mars remains the first broad research frontier.</w:t>
       </w:r>
     </w:p>
     <w:tbl>
@@ -5640,7 +5640,7 @@
         <w:spacing w:before="0" w:after="120" w:line="264" w:lineRule="auto"/>
       </w:pPr>
       <w:r>
-        <w:t>Mining remains one fuel-only deployment per surface loop and begins in the player-controlled Mining Rig; autonomous bay units are Support Drones. Ordinary Regolith breaks only to make a path and never yields material. Common Ore uses a gray/silver body and shimmer, while gold marks Rare Ore. Io uses a destination-specific Thermal lava rule: no Cryo or direct ore deposits, deterministic lava-to-Common treatment, and a 60-second baseline for its fixed artifact introduction while normal missions retain 30 seconds. Both rig and operator use inertial fixed-step movement under vector-valued destination gravity. The rig moves at 7.2 cells/s maximum with 14 cells/s2 acceleration, 20 cells/s2 braking, and a 0.48-cell collider. The suit moves at 4.6 cells/s maximum with 28 cells/s2 acceleration, 24 cells/s2 braking, and a 0.25-cell collider. Base gravity is 6 cells/s2 multiplied by the destination's gravity scale; direction and strength are stored separately so later local or inverted fields do not require a state redesign.</w:t>
+        <w:t>Mining remains one fuel-only deployment per surface loop and begins in the player-controlled Mining Rig; autonomous bay units are Support Drones. Ordinary Regolith breaks only to make a path and never yields material. Common Ore uses a gray/silver body and shimmer, while gold marks Rare Ore. The Io scenario configures a Thermal-lava site: no Cryo or direct ore deposits, deterministic lava-to-Common treatment, and a 60-second baseline for its introductory protected-objective recovery while normal missions retain 30 seconds. Layered cocoons are reusable site definitions: layers define their patterns, reveal triggers, hazard affinity, drilling rule, presentation label, and protected-objective adapter; mechanics do not recognize an artifact or destination ID. Both rig and operator use inertial fixed-step movement under vector-valued destination gravity. The rig moves at 7.2 cells/s maximum with 14 cells/s2 acceleration, 20 cells/s2 braking, and a 0.48-cell collider. The suit moves at 4.6 cells/s maximum with 28 cells/s2 acceleration, 24 cells/s2 braking, and a 0.25-cell collider. Base gravity is 6 cells/s2 multiplied by the destination's gravity scale; direction and strength are stored separately so later local or inverted fields do not require a state redesign.</w:t>
       </w:r>
     </w:p>
     <w:p>
@@ -7830,7 +7830,7 @@
         <w:spacing w:before="0" w:after="120" w:line="264" w:lineRule="auto"/>
       </w:pPr>
       <w:r>
-        <w:t>Research unlocks decisions, not just bigger numbers. Materials, blueprints, and artifacts open permanent system families, crew facilities, surface tools, Support Drone systems, and Ark repair hooks. The Io minor artifact is explicitly not Ark-repair progress: safe extraction grants one persistent Drone Upgrade Credit that the player applies to an owned Mk I or Mk II Support Drone. Other artifact research grants mechanical insight now; larger story payload comes later.</w:t>
+        <w:t>Research unlocks decisions, not just bigger numbers. Materials, blueprints, and artifacts open permanent system families, crew facilities, surface tools, Support Drone systems, and Ark repair hooks. A protected-objective adapter determines a payload's reward: the current Io minor artifact is explicitly not Ark-repair progress and safe extraction grants one persistent Drone Upgrade Credit that the player applies to an owned Mk I or Mk II Support Drone. Other protected objectives can award different rewards without changing cocoon discovery, mining, or extraction mechanics.</w:t>
       </w:r>
     </w:p>
     <w:tbl>
@@ -8529,7 +8529,7 @@
         <w:spacing w:before="0" w:after="120" w:line="264" w:lineRule="auto"/>
       </w:pPr>
       <w:r>
-        <w:t>The Moon mining contract reserves 30 safely delivered lunar Common Ore until the player explicitly installs Prospector Mk I, permanently owns/equips the unique Mining Support Drone, and opens Slot 1. Mars reserves 40 local Common Ore until the player explicitly fabricates empty Slot 2. Moon remains a simple excavation-and-return lesson; Mars turns the extended contract into repeated oxygen, heat, integrity, repair, cargo, and return cycles. Resource and Survey remain Mars research unlocks; Hazard is commissioned separately on Io and fills Slot 2 only when it is empty. Support Drone types are unique and cannot be duplicated across slots. The equipped swarm belongs to the player rather than the Mining Rig: every drone defaults to the ControlledActor anchor and resolves each fixed step to the rig or operator currently controlled. Explicit Rig and Operator bindings remain internal hooks for later scripted behavior, not a player-facing configuration.</w:t>
+        <w:t>The Moon mining contract reserves 30 safely delivered lunar Common Ore until the player explicitly installs Prospector Mk I, permanently owns the first Mining Support Drone, opens Slot 1, and receives the Mars route key. Mars reserves 40 local Common Ore until the player explicitly fabricates empty Slot 2 and receives the Jupiter route key. Moon remains a simple excavation-and-return lesson; Mars turns the extended contract into repeated oxygen, heat, integrity, repair, cargo, and return cycles. Resource and Survey remain research unlocks; Hazard is commissioned by the Io scenario. A bay can equip multiple owned frames of the same role when the player has paid to build those copies; slots preserve individual frame identity and upgrade level. Hazard Drones cross terrain directly to avoid route traps, but they only target cells the player has revealed.</w:t>
       </w:r>
     </w:p>
     <w:tbl>
@@ -8961,7 +8961,7 @@
           </w:tcPr>
           <w:p>
             <w:r>
-              <w:t>Drone Support Program</w:t>
+              <w:t>Io Volcanic Descent scenario</w:t>
             </w:r>
           </w:p>
         </w:tc>
@@ -8979,7 +8979,7 @@
           </w:tcPr>
           <w:p>
             <w:r>
-              <w:t>Treats revealed thermal, cryo, toxic, and radiation pockets; Mk tiers expand affinity coverage, batch size, and refinement chance.</w:t>
+              <w:t>Treats player-revealed Thermal, Cryo, toxic, and radiation hazards. It flies directly through terrain to prevent path traps; Mk tiers expand affinity coverage, batch size, and treatment speed.</w:t>
             </w:r>
           </w:p>
         </w:tc>
@@ -9173,7 +9173,7 @@
     <w:p>
       <w:pPr/>
       <w:r>
-        <w:t>Idle and returning drones orbit at 0.45 radians/s around a center led by 0.18 seconds of anchor velocity. Role radii are Mining 1.6 cells, Resource 2.05, Hazard 1.9, Defense 2.7, Attack 3.35, and Survey 3.4; stable same-role slots spread evenly and alternating rings counter-rotate. Normal return speed is 5.6 cells/s, increasing to 8.5 cells/s beyond a 4.5-cell leash. Blocked goals compress radially toward the anchor, and small drone colliders pass suit-only passages while avoiding terrain and one another.</w:t>
+        <w:t>Idle and returning drones orbit at 0.45 radians/s around a center led by 0.18 seconds of anchor velocity. Role radii are Mining 1.6 cells, Resource 2.05, Hazard 1.9, Defense 2.7, Attack 3.35, and Survey 3.4; stable same-role slots spread evenly and alternating rings counter-rotate. Normal return speed is 5.6 cells/s, increasing to 8.5 cells/s beyond a 4.5-cell leash. Mining, Resource, Survey, Attack, and Defense preserve terrain collision and routing. Hazard uses a dedicated collisionless direct-travel path, rendered with a transit shimmer when crossing solid terrain, and returns to formation instead of idling when no revealed hazard is eligible.</w:t>
       </w:r>
     </w:p>
     <w:p>
@@ -9709,7 +9709,7 @@
               <w:spacing w:before="0" w:after="60" w:line="259" w:lineRule="auto"/>
             </w:pPr>
             <w:r>
-              <w:t>First explicit outer-planet transfer; unlocks Saturn on successful arrival.</w:t>
+              <w:t>Jupiter-system arrival leads to the configured Io recovery scenario; a claimed Perfect slingshot opens Saturn.</w:t>
             </w:r>
           </w:p>
         </w:tc>
@@ -10762,7 +10762,7 @@
         <w:pStyle w:val="ListBullet"/>
       </w:pPr>
       <w:r>
-        <w:t>Do not hide tradeoffs or goals: shared fuel, Ark fuel, oxygen, return risk, extraction pressure, Support Drone availability, carried/aboard/delivered contract ore, Io lava-seal stages, artifact recovery, and the Perfect-required Saturn slingshot stay visible.</w:t>
+        <w:t>Do not hide tradeoffs or goals: shared fuel, Ark fuel, oxygen, return risk, extraction pressure, Support Drone availability, carried/aboard/delivered contract ore, configured cocoon layers, protected-objective recovery, and the Perfect-required Saturn slingshot stay visible. The shared objective strip always identifies the authored scenario step, numeric or segmented progress, next action, and reward preview; text and icons communicate state in addition to color.</w:t>
       </w:r>
     </w:p>
     <w:p>
@@ -10977,7 +10977,7 @@
           </w:tcPr>
           <w:p>
             <w:r>
-              <w:t>Portable deterministic rules: content, RNG, progression, saves, flight, research, mining, presentation helpers, and tuning. No platform APIs.</w:t>
+              <w:t>Portable deterministic rules: versioned content, authored/procedural scenarios, RNG, progression, saves, flight, research, mining, objective/reward routing, presentation helpers, and tuning. No platform APIs.</w:t>
             </w:r>
           </w:p>
         </w:tc>
@@ -11221,7 +11221,21 @@
     <w:p>
       <w:pPr/>
       <w:r>
-        <w:t>Mining uses MiningOperatorMode with separate rig/operator state, MiningLooseChunk records, actor mobility profiles, and vector gravity. Each MiningMiniDroneAgent stores an additive anchor target, stable formation slot, and orbit phase. A centralized resolver produces a transient MiniDroneAnchorFrame containing actor identity, position, velocity, facing, collider, depth, and validity. Coordinators and SceneComposer receive that frame instead of reading rig coordinates.</w:t>
+        <w:t>Mining uses MiningOperatorMode with separate rig/operator state, MiningLooseChunk records, actor mobility profiles, and vector gravity. Each MiningMiniDroneAgent stores an additive anchor target, stable formation slot, and orbit phase. A centralized resolver produces a transient MiniDroneAnchorFrame containing actor identity, position, velocity, facing, collider, depth, and validity. Coordinators and SceneComposer receive that frame instead of reading rig coordinates. Scenario instances select a generic mining-site definition and protected-objective adapter; the mining engine receives resolved site data rather than a campaign or destination name.</w:t>
+      </w:r>
+    </w:p>
+    <w:p>
+      <w:pPr>
+        <w:pStyle w:val="Heading2"/>
+      </w:pPr>
+      <w:r>
+        <w:t>Scenario Authoring Framework</w:t>
+      </w:r>
+    </w:p>
+    <w:p>
+      <w:pPr/>
+      <w:r>
+        <w:t>ScenarioDefinition is a versioned content record with eligibility, presentation, ordered or dependency-linked steps, activity configuration, completion rules, claim policy, and rewards. ScenarioInstance persists its authored or procedural source, definition ID/version, deterministic seed, resolved parameters, acknowledgements, progress, claims, and awarded reward IDs. ScenarioEvent records authoritative delivery, activity completion, protected-payload extraction, Flyby grade, equipment assignment, and abort results. ScenarioReward grants Support Drone frames, bay slots, upgrade credits, inventory resources, unlock keys, or route access. Both native RmlUi and WebAssembly consume the same scenario presentation/actions. Future content selects an existing activity and objective adapter; it must not add code branches that compare story copy, scenario IDs, or destination IDs inside reusable mining, Flyby, reward, or route mechanics.</w:t>
       </w:r>
     </w:p>
     <w:p>
@@ -11238,7 +11252,7 @@
         <w:spacing w:before="0" w:after="120" w:line="264" w:lineRule="auto"/>
       </w:pPr>
       <w:r>
-        <w:t>The current save format is version 7, line-based, and dependency-free. Version 6 persists operator/rig state, loose chunks, disabled-rig state, mini-drone anchors, formations, positions, velocities, haul, shields, and cooldowns. Version 7 adds explicit Moon/Mars contract claims, Io Hazard/artifact progression, layered lava-seal runtime state, Drone Upgrade Credits, Flyby purpose, first slingshot-failure acknowledgement, and the permanent Saturn route gate. Migration preserves owned drones and upgrades, deduplicates free repeated loadout references, backfills earlier milestones that old saves cannot revisit, and never rolls Saturn-or-later campaigns backward. Validation rejects malformed enum/range data and round-trip tests protect the additive schema.</w:t>
+        <w:t>The current save format is version 9, line-based, and dependency-free. Version 9 persists scenario instances, definition versions, deterministic procedural seeds and resolved parameters, step counters, acknowledgements, claim/completion state, awarded reward IDs, generic mining-site progress, cocoon layer indices, protected-objective state, and generic Flyby challenge state. Migration maps legacy Moon/Mars/Io/Saturn fields into the corresponding scenario steps, preserves partial delivery/treatment/extraction progress, awards no duplicate reward, keeps completed routes open, and never rolls later campaigns backward. Content definitions are immutable per version; behavior changes require a versioned migration rather than silently redefining a saved scenario.</w:t>
       </w:r>
     </w:p>
     <w:p>
@@ -11254,7 +11268,7 @@
         <w:spacing w:before="0" w:after="120" w:line="264" w:lineRule="auto"/>
       </w:pPr>
       <w:r>
-        <w:t>Core tests are design contracts for launch outcomes, progression, research, Surface Ops, deterministic mining, Rig/EVA physics, destination gravity, loose chunks, tether burden, suit passages, emergency recovery, and save migration. Swarm tests cover mixed six-role formations, smooth actor transfers, cancellation with haul preservation, active-actor targeting and shield interception, catch-up, compressed formations, collision separation, shuttle restrictions, cross-depth preservation, wreck avoidance, tether independence, failure freeze, and active-actor render effects. Release validation includes atlas checks, core/native tests, web tests/build, sanity checks, native Release, 1280x800 visual review, and a physical Steam Deck control/readability pass.</w:t>
+        <w:t>Core tests are design contracts for launch outcomes, generic scenario events/actions/rewards, route-key evaluation, dependency-linked steps, deterministic procedural instances, reusable multi-layer cocoons, protected-objective adapters, progression, research, Surface Ops, deterministic mining, Rig/EVA physics, destination gravity, loose chunks, tether burden, suit passages, emergency recovery, and v9 save migration. Swarm tests cover mixed six-role formations, smooth actor transfers, cancellation with haul preservation, active-actor targeting and shield interception, catch-up, compressed formations, collision separation, shuttle restrictions, cross-depth preservation, wreck avoidance, tether independence, failure freeze, collisionless Hazard traversal, revealed-only targeting, shared treatment assistance, and active-actor render effects. Release validation includes atlas checks, core/native tests, web tests/build, sanity checks, native Release, 1280x800 visual review, and a physical Steam Deck control/readability pass.</w:t>
       </w:r>
     </w:p>
     <w:tbl>
@@ -11475,7 +11489,7 @@
                 <w:rFonts w:ascii="Calibri" w:hAnsi="Calibri"/>
                 <w:sz w:val="17"/>
               </w:rPr>
-              <w:t>Mining requires prepared Surface Ops and shared fuel; tests cover oxygen/heat, rig and suit mobility, vector gravity, twin-stick aim, sidearm/drill/scanner/tether behavior, loose chunks, suit-only passages, depth transitions, recovery, extraction, and deterministic artifact gates.</w:t>
+              <w:t>Mining requires prepared Surface Ops and shared fuel; tests cover oxygen/heat, rig and suit mobility, vector gravity, twin-stick aim, sidearm/drill/scanner/tether behavior, loose chunks, suit-only passages, depth transitions, recovery, extraction, resolved authored/procedural mining sites, layered cocoon reveal/excavation, and protected-objective gates.</w:t>
             </w:r>
           </w:p>
         </w:tc>
@@ -11536,7 +11550,7 @@
                 <w:rFonts w:ascii="Calibri" w:hAnsi="Calibri"/>
                 <w:sz w:val="17"/>
               </w:rPr>
-              <w:t>Prospector progression, persistent loadouts, unique orbit slots, smooth Rig-Operator-Rig transfer, task cancellation, haul/shield/cooldown preservation, active-actor Attack/Defense behavior, catch-up/leashes, collision separation, shuttle delivery, cross-depth transfer, and ejection from a wreck.</w:t>
+              <w:t>Prospector progression, persistent loadouts, paid duplicate frames, unique orbit slots, smooth Rig-Operator-Rig transfer, task cancellation, haul/shield/cooldown preservation, active-actor Attack/Defense behavior, catch-up/leashes, collision separation, collisionless Hazard travel with revealed-only targeting, shuttle delivery, cross-depth transfer, and ejection from a wreck.</w:t>
             </w:r>
           </w:p>
         </w:tc>
@@ -11657,7 +11671,7 @@
           </w:tcPr>
           <w:p>
             <w:r>
-              <w:t>Shared presentation behavior covers native RmlUi and web UI parity, modals, stable focus/action IDs, one mining viewport transform, active-actor HUD/effects, controller hold/tap semantics, and top-level metrics.</w:t>
+              <w:t>Shared scenario presentation behavior covers native RmlUi and web UI parity, mandatory modals, stable scenario/action/focus IDs, one mining viewport transform, active-actor HUD/effects, controller hold/tap semantics, and top-level metrics.</w:t>
             </w:r>
           </w:p>
         </w:tc>
@@ -13149,7 +13163,7 @@
                 <w:rFonts w:ascii="Calibri" w:hAnsi="Calibri"/>
                 <w:sz w:val="18"/>
               </w:rPr>
-              <w:t>Implemented content, tuning, chapters, Rig/EVA mining, transferable mini-drone anchors, save version 6 fields, presentation helpers, and regression coverage.</w:t>
+              <w:t>Implemented versioned content, scenario framework, route-key evaluation, Rig/EVA mining, reusable cocoon/protected-objective adapters, transferable mini-drone anchors, save v9 migration, presentation helpers, and regression coverage.</w:t>
             </w:r>
           </w:p>
         </w:tc>

</xml_diff>

<commit_message>
Rework launch curriculum and surface operations
</commit_message>
<xml_diff>
--- a/docs/Rocket_Rogue_Game_Design_Document.docx
+++ b/docs/Rocket_Rogue_Game_Design_Document.docx
@@ -109,6 +109,7 @@
       <w:tr>
         <w:trPr>
           <w:tblHeader w:val="true"/>
+          <w:cantSplit/>
         </w:trPr>
         <w:tc>
           <w:tcPr>
@@ -160,6 +161,9 @@
         </w:tc>
       </w:tr>
       <w:tr>
+        <w:trPr>
+          <w:cantSplit/>
+        </w:trPr>
         <w:tc>
           <w:tcPr>
             <w:tcW w:type="dxa" w:w="1850"/>
@@ -226,6 +230,9 @@
         </w:tc>
       </w:tr>
       <w:tr>
+        <w:trPr>
+          <w:cantSplit/>
+        </w:trPr>
         <w:tc>
           <w:tcPr>
             <w:tcW w:type="dxa" w:w="1850"/>
@@ -282,6 +289,9 @@
         </w:tc>
       </w:tr>
       <w:tr>
+        <w:trPr>
+          <w:cantSplit/>
+        </w:trPr>
         <w:tc>
           <w:tcPr>
             <w:tcW w:type="dxa" w:w="1850"/>
@@ -344,6 +354,9 @@
         </w:tc>
       </w:tr>
       <w:tr>
+        <w:trPr>
+          <w:cantSplit/>
+        </w:trPr>
         <w:tc>
           <w:tcPr>
             <w:tcW w:type="dxa" w:w="1850"/>
@@ -391,12 +404,15 @@
           </w:tcPr>
           <w:p>
             <w:r>
-              <w:t>July 26, 2026</w:t>
+              <w:t>August 11, 2026</w:t>
             </w:r>
           </w:p>
         </w:tc>
       </w:tr>
       <w:tr>
+        <w:trPr>
+          <w:cantSplit/>
+        </w:trPr>
         <w:tc>
           <w:tcPr>
             <w:tcW w:type="dxa" w:w="1850"/>
@@ -451,12 +467,15 @@
                 <w:rFonts w:ascii="Calibri" w:hAnsi="Calibri"/>
                 <w:sz w:val="18"/>
               </w:rPr>
-              <w:t>Current repo docs, C++ core content, tests, art inventory, Vulkan/WebGL2 architecture, controller support, the approved EVA/swarm design, and the Solar Jetman reference manuals</w:t>
+              <w:t>Current repo docs, C++ core content, tests, art inventory, the four-lesson launch curriculum, Vulkan/WebGL2 architecture, controller support, the approved EVA/swarm design, and the Solar Jetman reference manuals</w:t>
             </w:r>
           </w:p>
         </w:tc>
       </w:tr>
       <w:tr>
+        <w:trPr>
+          <w:cantSplit/>
+        </w:trPr>
         <w:tc>
           <w:tcPr>
             <w:tcW w:type="dxa" w:w="1850"/>
@@ -504,7 +523,7 @@
           </w:tcPr>
           <w:p>
             <w:r>
-              <w:t>Living GDD for the playable native Vulkan Windows/Linux game and WebGL2 build, including the current Jetpack EVA and transferable mini-drone swarm production slice</w:t>
+              <w:t>Living GDD for the playable native Vulkan Windows/Linux game and WebGL2 build, including the Fuel/Controls/Temperature/Hull launch curriculum, asteroid belt, Jetpack EVA, and transferable Support Drone swarm</w:t>
             </w:r>
           </w:p>
         </w:tc>
@@ -532,6 +551,7 @@
       <w:tr>
         <w:trPr>
           <w:tblHeader w:val="true"/>
+          <w:cantSplit/>
         </w:trPr>
         <w:tc>
           <w:tcPr>
@@ -562,6 +582,9 @@
         </w:tc>
       </w:tr>
       <w:tr>
+        <w:trPr>
+          <w:cantSplit/>
+        </w:trPr>
         <w:tc>
           <w:tcPr>
             <w:tcW w:type="dxa" w:w="9360"/>
@@ -629,6 +652,7 @@
       <w:tr>
         <w:trPr>
           <w:tblHeader w:val="true"/>
+          <w:cantSplit/>
         </w:trPr>
         <w:tc>
           <w:tcPr>
@@ -696,6 +720,9 @@
         </w:tc>
       </w:tr>
       <w:tr>
+        <w:trPr>
+          <w:cantSplit/>
+        </w:trPr>
         <w:tc>
           <w:tcPr>
             <w:tcW w:type="dxa" w:w="2100"/>
@@ -760,6 +787,9 @@
         </w:tc>
       </w:tr>
       <w:tr>
+        <w:trPr>
+          <w:cantSplit/>
+        </w:trPr>
         <w:tc>
           <w:tcPr>
             <w:tcW w:type="dxa" w:w="2100"/>
@@ -824,6 +854,9 @@
         </w:tc>
       </w:tr>
       <w:tr>
+        <w:trPr>
+          <w:cantSplit/>
+        </w:trPr>
         <w:tc>
           <w:tcPr>
             <w:tcW w:type="dxa" w:w="2100"/>
@@ -888,6 +921,9 @@
         </w:tc>
       </w:tr>
       <w:tr>
+        <w:trPr>
+          <w:cantSplit/>
+        </w:trPr>
         <w:tc>
           <w:tcPr>
             <w:tcW w:type="dxa" w:w="2100"/>
@@ -952,6 +988,9 @@
         </w:tc>
       </w:tr>
       <w:tr>
+        <w:trPr>
+          <w:cantSplit/>
+        </w:trPr>
         <w:tc>
           <w:tcPr>
             <w:tcW w:type="dxa" w:w="2100"/>
@@ -1016,6 +1055,9 @@
         </w:tc>
       </w:tr>
       <w:tr>
+        <w:trPr>
+          <w:cantSplit/>
+        </w:trPr>
         <w:tc>
           <w:tcPr>
             <w:tcW w:type="dxa" w:w="2100"/>
@@ -1080,6 +1122,9 @@
         </w:tc>
       </w:tr>
       <w:tr>
+        <w:trPr>
+          <w:cantSplit/>
+        </w:trPr>
         <w:tc>
           <w:tcPr>
             <w:tcW w:type="dxa" w:w="2100"/>
@@ -1144,6 +1189,9 @@
         </w:tc>
       </w:tr>
       <w:tr>
+        <w:trPr>
+          <w:cantSplit/>
+        </w:trPr>
         <w:tc>
           <w:tcPr>
             <w:tcW w:type="dxa" w:w="2100"/>
@@ -1230,7 +1278,7 @@
         <w:spacing w:before="0" w:after="120" w:line="264" w:lineRule="auto"/>
       </w:pPr>
       <w:r>
-        <w:t>OREBIT is a PC-first C++20 space-mining roguelite with genuine native x86-64 Windows and Linux builds through SDL 3 and direct Vulkan 1.3, plus a separate Emscripten/WebGL2 browser build for parity testing and sharing. It starts as a NASA-arcade launch gamble, then grows into permanent ship systems, landings, surface expeditions, direct-control mining, Drone Bay loadouts, and an Ark campaign beyond the solar system. The repository and some internal identifiers retain the Rocket Rogue project name.</w:t>
+        <w:t>OREBIT is a PC-first C++20 space-mining roguelite with genuine native x86-64 Windows and Linux builds through SDL 3 and direct Vulkan 1.3, plus a separate Emscripten/WebGL2 browser build for parity testing and sharing. It starts with a four-lesson launch curriculum—Fuel, Flight Controls, Temperature, and Hull—then grows into permanent ship systems, landings, surface expeditions, direct-control mining, Drone Bay loadouts, and an Ark campaign beyond the solar system. The repository and some internal identifiers retain the Rocket Rogue project name.</w:t>
       </w:r>
     </w:p>
     <w:p>
@@ -1292,6 +1340,7 @@
       <w:tr>
         <w:trPr>
           <w:tblHeader w:val="true"/>
+          <w:cantSplit/>
         </w:trPr>
         <w:tc>
           <w:tcPr>
@@ -1391,6 +1440,9 @@
         </w:tc>
       </w:tr>
       <w:tr>
+        <w:trPr>
+          <w:cantSplit/>
+        </w:trPr>
         <w:tc>
           <w:tcPr>
             <w:tcW w:type="dxa" w:w="1750"/>
@@ -1412,13 +1464,13 @@
                 <w:rFonts w:ascii="Calibri" w:hAnsi="Calibri"/>
                 <w:sz w:val="18"/>
               </w:rPr>
-            </w:r>
-            <w:r>
-              <w:rPr>
-                <w:rFonts w:ascii="Calibri" w:hAnsi="Calibri"/>
-                <w:sz w:val="18"/>
-              </w:rPr>
-              <w:t>Hidden-risk launch tension</w:t>
+              <w:t>Progressive launch mastery</w:t>
+            </w:r>
+            <w:r>
+              <w:rPr>
+                <w:rFonts w:ascii="Calibri" w:hAnsi="Calibri"/>
+                <w:sz w:val="18"/>
+              </w:rPr>
             </w:r>
           </w:p>
         </w:tc>
@@ -1437,7 +1489,7 @@
           <w:p>
             <w:pPr/>
             <w:r>
-              <w:t>The player sees warnings and trends, never certainty.</w:t>
+              <w:t>Each route teaches one visible system before combining it with earlier lessons.</w:t>
             </w:r>
           </w:p>
         </w:tc>
@@ -1458,12 +1510,15 @@
               <w:spacing w:before="0" w:after="60" w:line="259" w:lineRule="auto"/>
             </w:pPr>
             <w:r>
-              <w:t>Telemetry hints, incidents, and pressure modifiers must stay clear but incomplete.</w:t>
+              <w:t>Fuel, controls, temperature, and hull must fail from readable player decisions, never a hidden live roll.</w:t>
             </w:r>
           </w:p>
         </w:tc>
       </w:tr>
       <w:tr>
+        <w:trPr>
+          <w:cantSplit/>
+        </w:trPr>
         <w:tc>
           <w:tcPr>
             <w:tcW w:type="dxa" w:w="1750"/>
@@ -1559,6 +1614,9 @@
         </w:tc>
       </w:tr>
       <w:tr>
+        <w:trPr>
+          <w:cantSplit/>
+        </w:trPr>
         <w:tc>
           <w:tcPr>
             <w:tcW w:type="dxa" w:w="1750"/>
@@ -1654,6 +1712,9 @@
         </w:tc>
       </w:tr>
       <w:tr>
+        <w:trPr>
+          <w:cantSplit/>
+        </w:trPr>
         <w:tc>
           <w:tcPr>
             <w:tcW w:type="dxa" w:w="1750"/>
@@ -1749,6 +1810,9 @@
         </w:tc>
       </w:tr>
       <w:tr>
+        <w:trPr>
+          <w:cantSplit/>
+        </w:trPr>
         <w:tc>
           <w:tcPr>
             <w:tcW w:type="dxa" w:w="1750"/>
@@ -1834,6 +1898,9 @@
         </w:tc>
       </w:tr>
       <w:tr>
+        <w:trPr>
+          <w:cantSplit/>
+        </w:trPr>
         <w:tc>
           <w:tcPr>
             <w:tcW w:type="dxa" w:w="1750"/>
@@ -2110,13 +2177,13 @@
                 <w:rFonts w:ascii="Calibri" w:hAnsi="Calibri"/>
                 <w:sz w:val="17"/>
               </w:rPr>
+              <w:t>Launch curriculum</w:t>
             </w:r>
             <w:r>
               <w:rPr>
                 <w:rFonts w:ascii="Calibri" w:hAnsi="Calibri"/>
                 <w:sz w:val="17"/>
               </w:rPr>
-              <w:t>Launch and telemetry</w:t>
             </w:r>
           </w:p>
         </w:tc>
@@ -2165,7 +2232,7 @@
           </w:tcPr>
           <w:p>
             <w:r>
-              <w:t>Composite Instability, target-marker guidance, burn/failure debrief, telemetry, incidents, emergency actions, pressure, and tests are implemented.</w:t>
+              <w:t>Moon Fuel Survey, Controls Calibration, Mars thermal qualification, Jupiter asteroid belt, staged HUD, direct upgrades, and deterministic outcomes are implemented.</w:t>
             </w:r>
           </w:p>
         </w:tc>
@@ -2257,7 +2324,7 @@
                 <w:rFonts w:ascii="Calibri" w:hAnsi="Calibri"/>
                 <w:sz w:val="17"/>
               </w:rPr>
-              <w:t>Repair, recruit, train, rest, saved refit opportunities, permanent Reach/Control/Recovery tracks, randomized post-Moon offers, crew stress, and animal specialists are implemented.</w:t>
+              <w:t>Direct Launch Upgrade rows, tutorial-safe economy, repair/recruit/train/rest operations, crew stress, and animal specialists are implemented.</w:t>
             </w:r>
             <w:r>
               <w:rPr>
@@ -2784,7 +2851,7 @@
           </w:tcPr>
           <w:p>
             <w:r>
-              <w:t>90s arcade sprites and cleaned alpha assets cover solar-system bodies, Straylight states, shuttle/effects, the mining rig, six mini-drone roles, the heroic Capybara portrait, and the static jetpack Capybara operator. Authored operator animation remains future work.</w:t>
+              <w:t>90s arcade sprites and cleaned alpha assets cover solar-system bodies, Straylight states, shuttle/effects, the mining rig, six Support Drone roles, the Capybara art, POI arrow, and reusable asteroid.</w:t>
             </w:r>
           </w:p>
         </w:tc>
@@ -2824,7 +2891,7 @@
         <w:spacing w:before="0" w:after="120" w:line="264" w:lineRule="auto"/>
       </w:pPr>
       <w:r>
-        <w:t>Humanity starts with one job: prove the rocket, push farther, and bring the crew home. The Moon preserves that proving-flight story while adding an explicit 30-Common-Ore Prospector contract. Mars turns the lesson into repeated 30-second pressure mining with oxygen, drill heat, integrity, repairs, cargo, return decisions, research, extraction, and a claimed second Drone Bay slot. Jupiter remains the stable travel destination, but landed work takes place on Io: its inert regolith pays nothing, its Thermal lava is the only ore source, and Hazard Mk I opens a layered artifact site. A claimed Perfect Jupiter slingshot permanently opens the one-way Saturn route. Saturn, Uranus, and Neptune then remain mandatory individual arrivals. Before Neptune there is no Straylight name, contact, silhouette, signal, art, or Ark-return framing. Successful Neptune arrival persists a full-screen discovery briefing whose sole Approach action identifies the derelict-but-operable Straylight as the expedition's first viable home and resumes Neptune Arrival Ops. Its first jump reaches Aaru Vale. The next jump fails near Khepri Prime, turning exploration into survival, repair, and route-finding.</w:t>
+        <w:t>Humanity starts with one job: reach for the Moon with a rocket that cannot yet make the trip. A 10-unit tank can collect data halfway out and return; Fuel Tanks I raises capacity to the 15 units required for Moon transit and insertion. A second calibration teaches deliberately loose controls before Flight Controls I. Mars then introduces engine-cut cooling, and Jupiter introduces hull damage through a guaranteed-steerable asteroid belt. The Moon Prospector and Mars Bay Expansion contracts remain the story gates that open the Mars and Jupiter routes.</w:t>
       </w:r>
     </w:p>
     <w:p>
@@ -2907,6 +2974,7 @@
       <w:tr>
         <w:trPr>
           <w:tblHeader w:val="true"/>
+          <w:cantSplit/>
         </w:trPr>
         <w:tc>
           <w:tcPr>
@@ -3038,6 +3106,9 @@
         </w:tc>
       </w:tr>
       <w:tr>
+        <w:trPr>
+          <w:cantSplit/>
+        </w:trPr>
         <w:tc>
           <w:tcPr>
             <w:tcW w:type="dxa" w:w="520"/>
@@ -3121,13 +3192,13 @@
                 <w:rFonts w:ascii="Calibri" w:hAnsi="Calibri"/>
                 <w:sz w:val="18"/>
               </w:rPr>
-            </w:r>
-            <w:r>
-              <w:rPr>
-                <w:rFonts w:ascii="Calibri" w:hAnsi="Calibri"/>
-                <w:sz w:val="18"/>
-              </w:rPr>
-              <w:t>Earth Orbit tutorial/proving loop; learn telemetry, return risk, refit, and hangar recovery.</w:t>
+              <w:t>Moon-bound Fuel Survey, Flight Controls Calibration, and the first true transfer; Earth Orbit is hidden compatibility state.</w:t>
+            </w:r>
+            <w:r>
+              <w:rPr>
+                <w:rFonts w:ascii="Calibri" w:hAnsi="Calibri"/>
+                <w:sz w:val="18"/>
+              </w:rPr>
             </w:r>
           </w:p>
         </w:tc>
@@ -3152,18 +3223,21 @@
                 <w:rFonts w:ascii="Calibri" w:hAnsi="Calibri"/>
                 <w:sz w:val="18"/>
               </w:rPr>
-            </w:r>
-            <w:r>
-              <w:rPr>
-                <w:rFonts w:ascii="Calibri" w:hAnsi="Calibri"/>
-                <w:sz w:val="18"/>
-              </w:rPr>
-              <w:t>Gate: advance to Moon. Implemented as new-game chapter.</w:t>
+              <w:t>Gate: arrive at Moon after installing Fuel Tanks I and Flight Controls I. Implemented as new-game chapter.</w:t>
+            </w:r>
+            <w:r>
+              <w:rPr>
+                <w:rFonts w:ascii="Calibri" w:hAnsi="Calibri"/>
+                <w:sz w:val="18"/>
+              </w:rPr>
             </w:r>
           </w:p>
         </w:tc>
       </w:tr>
       <w:tr>
+        <w:trPr>
+          <w:cantSplit/>
+        </w:trPr>
         <w:tc>
           <w:tcPr>
             <w:tcW w:type="dxa" w:w="520"/>
@@ -3247,13 +3321,13 @@
                 <w:rFonts w:ascii="Calibri" w:hAnsi="Calibri"/>
                 <w:sz w:val="18"/>
               </w:rPr>
-            </w:r>
-            <w:r>
-              <w:rPr>
-                <w:rFonts w:ascii="Calibri" w:hAnsi="Calibri"/>
-                <w:sz w:val="18"/>
-              </w:rPr>
-              <w:t>Moon arrival, flyby/orbit/landing phase; route pressure increases while still teaching the program.</w:t>
+              <w:t>Moon arrival, flyby/orbit/landing phase, Prospector contract, and reveal of the Mars thermal lesson.</w:t>
+            </w:r>
+            <w:r>
+              <w:rPr>
+                <w:rFonts w:ascii="Calibri" w:hAnsi="Calibri"/>
+                <w:sz w:val="18"/>
+              </w:rPr>
             </w:r>
           </w:p>
         </w:tc>
@@ -3290,6 +3364,9 @@
         </w:tc>
       </w:tr>
       <w:tr>
+        <w:trPr>
+          <w:cantSplit/>
+        </w:trPr>
         <w:tc>
           <w:tcPr>
             <w:tcW w:type="dxa" w:w="520"/>
@@ -3416,6 +3493,9 @@
         </w:tc>
       </w:tr>
       <w:tr>
+        <w:trPr>
+          <w:cantSplit/>
+        </w:trPr>
         <w:tc>
           <w:tcPr>
             <w:tcW w:type="dxa" w:w="520"/>
@@ -3542,6 +3622,9 @@
         </w:tc>
       </w:tr>
       <w:tr>
+        <w:trPr>
+          <w:cantSplit/>
+        </w:trPr>
         <w:tc>
           <w:tcPr>
             <w:tcW w:type="dxa" w:w="520"/>
@@ -3629,6 +3712,9 @@
         </w:tc>
       </w:tr>
       <w:tr>
+        <w:trPr>
+          <w:cantSplit/>
+        </w:trPr>
         <w:tc>
           <w:tcPr>
             <w:tcW w:type="dxa" w:w="520"/>
@@ -3729,6 +3815,9 @@
         </w:tc>
       </w:tr>
       <w:tr>
+        <w:trPr>
+          <w:cantSplit/>
+        </w:trPr>
         <w:tc>
           <w:tcPr>
             <w:tcW w:type="dxa" w:w="520"/>
@@ -3835,6 +3924,9 @@
         </w:tc>
       </w:tr>
       <w:tr>
+        <w:trPr>
+          <w:cantSplit/>
+        </w:trPr>
         <w:tc>
           <w:tcPr>
             <w:tcW w:type="dxa" w:w="520"/>
@@ -3961,6 +4053,9 @@
         </w:tc>
       </w:tr>
       <w:tr>
+        <w:trPr>
+          <w:cantSplit/>
+        </w:trPr>
         <w:tc>
           <w:tcPr>
             <w:tcW w:type="dxa" w:w="520"/>
@@ -4087,6 +4182,9 @@
         </w:tc>
       </w:tr>
       <w:tr>
+        <w:trPr>
+          <w:cantSplit/>
+        </w:trPr>
         <w:tc>
           <w:tcPr>
             <w:tcW w:type="dxa" w:w="520"/>
@@ -4304,7 +4402,7 @@
         <w:pStyle w:val="ListNumber"/>
       </w:pPr>
       <w:r>
-        <w:t>Launch a proving flight or frontier transfer using hidden-risk telemetry and emergency tradeoff actions.</w:t>
+        <w:t>Fly the current launch lesson or frontier transfer with only the systems already taught: Fuel, then controls, then Temperature, then Hull.</w:t>
       </w:r>
     </w:p>
     <w:p>
@@ -4312,7 +4410,7 @@
         <w:pStyle w:val="ListNumber"/>
       </w:pPr>
       <w:r>
-        <w:t>Return, eject, or arrive; bank credits, blueprints, flight data, and consequences.</w:t>
+        <w:t>Turn around and actively fly home, complete the destination insertion, or trigger an explicit training rescue or flight failure; bank only the reward earned by that outcome.</w:t>
       </w:r>
     </w:p>
     <w:p>
@@ -4320,7 +4418,7 @@
         <w:pStyle w:val="ListNumber"/>
       </w:pPr>
       <w:r>
-        <w:t>Spend one saved refit opportunity on a permanent Reach, Control, or Recovery system - or keep the credits - then repair, recruit, train, or rest before the next attempt.</w:t>
+        <w:t>Install the direct Launch rank unlocked by the lesson or keep the credits; normal repair, recruit, train, and rest operations resume after the opening curriculum.</w:t>
       </w:r>
     </w:p>
     <w:p>
@@ -4344,7 +4442,7 @@
         <w:pStyle w:val="ListNumber"/>
       </w:pPr>
       <w:r>
-        <w:t>Progress from Earth Orbit to Moon, Mars, Jupiter/Io, Saturn, Uranus, and Neptune in order. Moon, Mars, Io, and the Saturn transfer are authored scenario definitions: each owns its briefing, visible objective, explicit claim, reward preview, and route key. The delivery, reward, cocoon, Flyby, and route systems remain generic so future authored or procedural scenarios can compose the same mechanics without a new campaign-specific code path.</w:t>
+        <w:t>Progress from Moon to Mars, Jupiter/Io, Saturn, Uranus, and Neptune in order. Earth Orbit remains only as a hidden version-9 save origin. Moon, Mars, Io, and the Saturn transfer are authored scenario definitions: each owns its briefing, visible objective, explicit claim, reward preview, and route key. The delivery, reward, cocoon, Flyby, and route systems remain generic so future authored or procedural scenarios can compose the same mechanics without a new campaign-specific code path.</w:t>
       </w:r>
     </w:p>
     <w:p>
@@ -4360,7 +4458,7 @@
         <w:spacing w:before="0" w:after="120" w:line="264" w:lineRule="auto"/>
       </w:pPr>
       <w:r>
-        <w:t>Launch is the primary pressure engine. The yellow marker is a performance target, not a safety boundary. The player watches multiplier, route progress, system telemetry, a composite Instability warning, return risk, and seeded incidents while deciding whether to return, overburn, cut engines, open the relief valve, jettison cargo, or eject. Instability reaches at least 65% by 94% hidden-failure proximity and 90% by 98.5%; the debrief compares burn depth with the revealed failure point. Upgrades make risk clearer and more survivable but never perfectly knowable.</w:t>
+        <w:t>Launch is a progressive skill curriculum. Fuel Survey runs centered at fixed 60% throttle with only Fuel visible: five units reach the halfway light and the remaining five return home, while Moon arrival visibly requires 10 transit fuel plus a 5-unit insertion reserve. Flight Controls Calibration then reveals persistent throttle and the corridor; input direction is always honored, while momentum, right-side oversteer, and seeded throttle-increase kicks teach correction before Flight Controls I. Mars reveals Temperature and the sole system action, Engines Off/On: cutting engines stops fuel and thrust, always cools the ship, preserves throttle, and lets coasting decay to zero. Jupiter reveals Hull plus ten seeded asteroids in five rows, each blocking two of three lanes with a guaranteed steerable opening. Pressure, relief valves, cargo jettison, manual eject, telemetry incidents, and hidden live crash rolls are absent. Training failures resolve as non-destructive rescues; skilled engine cuts or no-hit belt flying can bypass Cooling or Hull purchases.</w:t>
       </w:r>
     </w:p>
     <w:tbl>
@@ -4387,6 +4485,7 @@
       <w:tr>
         <w:trPr>
           <w:tblHeader w:val="true"/>
+          <w:cantSplit/>
         </w:trPr>
         <w:tc>
           <w:tcPr>
@@ -4518,6 +4617,9 @@
         </w:tc>
       </w:tr>
       <w:tr>
+        <w:trPr>
+          <w:cantSplit/>
+        </w:trPr>
         <w:tc>
           <w:tcPr>
             <w:tcW w:type="dxa" w:w="1900"/>
@@ -4539,7 +4641,7 @@
                 <w:rFonts w:ascii="Calibri" w:hAnsi="Calibri"/>
                 <w:sz w:val="18"/>
               </w:rPr>
-              <w:t>Permanent ship systems</w:t>
+              <w:t>Launch upgrades</w:t>
             </w:r>
             <w:r>
               <w:rPr>
@@ -4570,13 +4672,13 @@
                 <w:rFonts w:ascii="Calibri" w:hAnsi="Calibri"/>
                 <w:sz w:val="18"/>
               </w:rPr>
-            </w:r>
-            <w:r>
-              <w:rPr>
-                <w:rFonts w:ascii="Calibri" w:hAnsi="Calibri"/>
-                <w:sz w:val="18"/>
-              </w:rPr>
-              <w:t>Volatility, heat, pressure, damage, fuel imbalance.</w:t>
+              <w:t>Fuel range, control chaos, powered heat, and asteroid impacts.</w:t>
+            </w:r>
+            <w:r>
+              <w:rPr>
+                <w:rFonts w:ascii="Calibri" w:hAnsi="Calibri"/>
+                <w:sz w:val="18"/>
+              </w:rPr>
             </w:r>
           </w:p>
         </w:tc>
@@ -4601,13 +4703,13 @@
                 <w:rFonts w:ascii="Calibri" w:hAnsi="Calibri"/>
                 <w:sz w:val="18"/>
               </w:rPr>
-            </w:r>
-            <w:r>
-              <w:rPr>
-                <w:rFonts w:ascii="Calibri" w:hAnsi="Calibri"/>
-                <w:sz w:val="18"/>
-              </w:rPr>
-              <w:t>Thrust, cooling, sensors, hull, escape, payout, mining support.</w:t>
+              <w:t>Fuel Tanks, Flight Controls, Engine Cooling, and Hull Plating.</w:t>
+            </w:r>
+            <w:r>
+              <w:rPr>
+                <w:rFonts w:ascii="Calibri" w:hAnsi="Calibri"/>
+                <w:sz w:val="18"/>
+              </w:rPr>
             </w:r>
           </w:p>
         </w:tc>
@@ -4632,7 +4734,7 @@
                 <w:rFonts w:ascii="Calibri" w:hAnsi="Calibri"/>
                 <w:sz w:val="18"/>
               </w:rPr>
-              <w:t>Build enduring Reach, Control, Recovery, and later mining support while managing expedition outages.</w:t>
+              <w:t>Buy predictable 22-credit safety margin or rely on skill where the route allows it.</w:t>
             </w:r>
             <w:r>
               <w:rPr>
@@ -4644,6 +4746,9 @@
         </w:tc>
       </w:tr>
       <w:tr>
+        <w:trPr>
+          <w:cantSplit/>
+        </w:trPr>
         <w:tc>
           <w:tcPr>
             <w:tcW w:type="dxa" w:w="1900"/>
@@ -4696,13 +4801,13 @@
                 <w:rFonts w:ascii="Calibri" w:hAnsi="Calibri"/>
                 <w:sz w:val="18"/>
               </w:rPr>
-            </w:r>
-            <w:r>
-              <w:rPr>
-                <w:rFonts w:ascii="Calibri" w:hAnsi="Calibri"/>
-                <w:sz w:val="18"/>
-              </w:rPr>
-              <w:t>Stress cancels effective training and worsens NAV/ABORT pressure.</w:t>
+              <w:t>Stress and training affect crew and non-launch systems, not hidden launch odds.</w:t>
+            </w:r>
+            <w:r>
+              <w:rPr>
+                <w:rFonts w:ascii="Calibri" w:hAnsi="Calibri"/>
+                <w:sz w:val="18"/>
+              </w:rPr>
             </w:r>
           </w:p>
         </w:tc>
@@ -4727,13 +4832,13 @@
                 <w:rFonts w:ascii="Calibri" w:hAnsi="Calibri"/>
                 <w:sz w:val="18"/>
               </w:rPr>
-            </w:r>
-            <w:r>
-              <w:rPr>
-                <w:rFonts w:ascii="Calibri" w:hAnsi="Calibri"/>
-                <w:sz w:val="18"/>
-              </w:rPr>
-              <w:t>Training improves launch performance and survival odds.</w:t>
+              <w:t>Training, recovery, and class identity remain visible outside the direct Launch tracks.</w:t>
+            </w:r>
+            <w:r>
+              <w:rPr>
+                <w:rFonts w:ascii="Calibri" w:hAnsi="Calibri"/>
+                <w:sz w:val="18"/>
+              </w:rPr>
             </w:r>
           </w:p>
         </w:tc>
@@ -4758,18 +4863,21 @@
                 <w:rFonts w:ascii="Calibri" w:hAnsi="Calibri"/>
                 <w:sz w:val="18"/>
               </w:rPr>
-            </w:r>
-            <w:r>
-              <w:rPr>
-                <w:rFonts w:ascii="Calibri" w:hAnsi="Calibri"/>
-                <w:sz w:val="18"/>
-              </w:rPr>
-              <w:t>Train, rest, recruit, or accept a compromised pilot.</w:t>
+              <w:t>Train, rest, recruit, or accept a compromised specialist for later operations.</w:t>
+            </w:r>
+            <w:r>
+              <w:rPr>
+                <w:rFonts w:ascii="Calibri" w:hAnsi="Calibri"/>
+                <w:sz w:val="18"/>
+              </w:rPr>
             </w:r>
           </w:p>
         </w:tc>
       </w:tr>
       <w:tr>
+        <w:trPr>
+          <w:cantSplit/>
+        </w:trPr>
         <w:tc>
           <w:tcPr>
             <w:tcW w:type="dxa" w:w="1900"/>
@@ -4791,13 +4899,13 @@
                 <w:rFonts w:ascii="Calibri" w:hAnsi="Calibri"/>
                 <w:sz w:val="18"/>
               </w:rPr>
-            </w:r>
-            <w:r>
-              <w:rPr>
-                <w:rFonts w:ascii="Calibri" w:hAnsi="Calibri"/>
-                <w:sz w:val="18"/>
-              </w:rPr>
-              <w:t>Telemetry incidents</w:t>
+              <w:t>Qualification hazards</w:t>
+            </w:r>
+            <w:r>
+              <w:rPr>
+                <w:rFonts w:ascii="Calibri" w:hAnsi="Calibri"/>
+                <w:sz w:val="18"/>
+              </w:rPr>
             </w:r>
           </w:p>
         </w:tc>
@@ -4822,13 +4930,13 @@
                 <w:rFonts w:ascii="Calibri" w:hAnsi="Calibri"/>
                 <w:sz w:val="18"/>
               </w:rPr>
-            </w:r>
-            <w:r>
-              <w:rPr>
-                <w:rFonts w:ascii="Calibri" w:hAnsi="Calibri"/>
-                <w:sz w:val="18"/>
-              </w:rPr>
-              <w:t>Short pulses on TEMP, PRESS, VIB, NAV, MIX, or ABORT.</w:t>
+              <w:t>Seeded throttle kicks, heat buildup, and a traversable asteroid belt.</w:t>
+            </w:r>
+            <w:r>
+              <w:rPr>
+                <w:rFonts w:ascii="Calibri" w:hAnsi="Calibri"/>
+                <w:sz w:val="18"/>
+              </w:rPr>
             </w:r>
           </w:p>
         </w:tc>
@@ -4849,7 +4957,7 @@
               <w:spacing w:before="0" w:after="60" w:line="259" w:lineRule="auto"/>
             </w:pPr>
             <w:r>
-              <w:t>Short reaction windows before final danger.</w:t>
+              <w:t>One taught mechanic and one direct upgrade unlock per lesson.</w:t>
             </w:r>
           </w:p>
         </w:tc>
@@ -4874,18 +4982,21 @@
                 <w:rFonts w:ascii="Calibri" w:hAnsi="Calibri"/>
                 <w:sz w:val="18"/>
               </w:rPr>
-            </w:r>
-            <w:r>
-              <w:rPr>
-                <w:rFonts w:ascii="Calibri" w:hAnsi="Calibri"/>
-                <w:sz w:val="18"/>
-              </w:rPr>
-              <w:t>Mitigate now or keep burning for better outcomes.</w:t>
+              <w:t>Correct course, cut engines, or steer through the open lane.</w:t>
+            </w:r>
+            <w:r>
+              <w:rPr>
+                <w:rFonts w:ascii="Calibri" w:hAnsi="Calibri"/>
+                <w:sz w:val="18"/>
+              </w:rPr>
             </w:r>
           </w:p>
         </w:tc>
       </w:tr>
       <w:tr>
+        <w:trPr>
+          <w:cantSplit/>
+        </w:trPr>
         <w:tc>
           <w:tcPr>
             <w:tcW w:type="dxa" w:w="1900"/>
@@ -4907,13 +5018,13 @@
                 <w:rFonts w:ascii="Calibri" w:hAnsi="Calibri"/>
                 <w:sz w:val="18"/>
               </w:rPr>
-            </w:r>
-            <w:r>
-              <w:rPr>
-                <w:rFonts w:ascii="Calibri" w:hAnsi="Calibri"/>
-                <w:sz w:val="18"/>
-              </w:rPr>
-              <w:t>Overburn</w:t>
+              <w:t>Press your luck</w:t>
+            </w:r>
+            <w:r>
+              <w:rPr>
+                <w:rFonts w:ascii="Calibri" w:hAnsi="Calibri"/>
+                <w:sz w:val="18"/>
+              </w:rPr>
             </w:r>
           </w:p>
         </w:tc>
@@ -4938,13 +5049,13 @@
                 <w:rFonts w:ascii="Calibri" w:hAnsi="Calibri"/>
                 <w:sz w:val="18"/>
               </w:rPr>
-            </w:r>
-            <w:r>
-              <w:rPr>
-                <w:rFonts w:ascii="Calibri" w:hAnsi="Calibri"/>
-                <w:sz w:val="18"/>
-              </w:rPr>
-              <w:t>Higher crash/return/damage/stress risk.</w:t>
+              <w:t>High throttle spends fuel and heat margin; long exposure increases correction and belt demands.</w:t>
+            </w:r>
+            <w:r>
+              <w:rPr>
+                <w:rFonts w:ascii="Calibri" w:hAnsi="Calibri"/>
+                <w:sz w:val="18"/>
+              </w:rPr>
             </w:r>
           </w:p>
         </w:tc>
@@ -4969,13 +5080,13 @@
                 <w:rFonts w:ascii="Calibri" w:hAnsi="Calibri"/>
                 <w:sz w:val="18"/>
               </w:rPr>
-            </w:r>
-            <w:r>
-              <w:rPr>
-                <w:rFonts w:ascii="Calibri" w:hAnsi="Calibri"/>
-                <w:sz w:val="18"/>
-              </w:rPr>
-              <w:t>Better payout, blueprints, readiness, and refit shelves.</w:t>
+              <w:t>Faster transfers and preserved route reserve.</w:t>
+            </w:r>
+            <w:r>
+              <w:rPr>
+                <w:rFonts w:ascii="Calibri" w:hAnsi="Calibri"/>
+                <w:sz w:val="18"/>
+              </w:rPr>
             </w:r>
           </w:p>
         </w:tc>
@@ -5000,13 +5111,13 @@
                 <w:rFonts w:ascii="Calibri" w:hAnsi="Calibri"/>
                 <w:sz w:val="18"/>
               </w:rPr>
-            </w:r>
-            <w:r>
-              <w:rPr>
-                <w:rFonts w:ascii="Calibri" w:hAnsi="Calibri"/>
-                <w:sz w:val="18"/>
-              </w:rPr>
-              <w:t>Leave at data goal or push for better gains.</w:t>
+              <w:t>Accelerate, cool, turn around, or continue based on visible state.</w:t>
+            </w:r>
+            <w:r>
+              <w:rPr>
+                <w:rFonts w:ascii="Calibri" w:hAnsi="Calibri"/>
+                <w:sz w:val="18"/>
+              </w:rPr>
             </w:r>
           </w:p>
         </w:tc>
@@ -5052,6 +5163,7 @@
       <w:tr>
         <w:trPr>
           <w:tblHeader w:val="true"/>
+          <w:cantSplit/>
         </w:trPr>
         <w:tc>
           <w:tcPr>
@@ -5151,6 +5263,9 @@
         </w:tc>
       </w:tr>
       <w:tr>
+        <w:trPr>
+          <w:cantSplit/>
+        </w:trPr>
         <w:tc>
           <w:tcPr>
             <w:tcW w:type="dxa" w:w="1350"/>
@@ -5246,6 +5361,9 @@
         </w:tc>
       </w:tr>
       <w:tr>
+        <w:trPr>
+          <w:cantSplit/>
+        </w:trPr>
         <w:tc>
           <w:tcPr>
             <w:tcW w:type="dxa" w:w="1350"/>
@@ -5341,6 +5459,9 @@
         </w:tc>
       </w:tr>
       <w:tr>
+        <w:trPr>
+          <w:cantSplit/>
+        </w:trPr>
         <w:tc>
           <w:tcPr>
             <w:tcW w:type="dxa" w:w="1350"/>
@@ -5436,6 +5557,9 @@
         </w:tc>
       </w:tr>
       <w:tr>
+        <w:trPr>
+          <w:cantSplit/>
+        </w:trPr>
         <w:tc>
           <w:tcPr>
             <w:tcW w:type="dxa" w:w="1350"/>
@@ -5531,6 +5655,9 @@
         </w:tc>
       </w:tr>
       <w:tr>
+        <w:trPr>
+          <w:cantSplit/>
+        </w:trPr>
         <w:tc>
           <w:tcPr>
             <w:tcW w:type="dxa" w:w="1350"/>
@@ -5672,6 +5799,7 @@
       <w:tr>
         <w:trPr>
           <w:tblHeader w:val="true"/>
+          <w:cantSplit/>
         </w:trPr>
         <w:tc>
           <w:tcPr>
@@ -5771,6 +5899,9 @@
         </w:tc>
       </w:tr>
       <w:tr>
+        <w:trPr>
+          <w:cantSplit/>
+        </w:trPr>
         <w:tc>
           <w:tcPr>
             <w:tcW w:type="dxa" w:w="1750"/>
@@ -5866,6 +5997,9 @@
         </w:tc>
       </w:tr>
       <w:tr>
+        <w:trPr>
+          <w:cantSplit/>
+        </w:trPr>
         <w:tc>
           <w:tcPr>
             <w:tcW w:type="dxa" w:w="1750"/>
@@ -5961,6 +6095,9 @@
         </w:tc>
       </w:tr>
       <w:tr>
+        <w:trPr>
+          <w:cantSplit/>
+        </w:trPr>
         <w:tc>
           <w:tcPr>
             <w:tcW w:type="dxa" w:w="1750"/>
@@ -6056,6 +6193,9 @@
         </w:tc>
       </w:tr>
       <w:tr>
+        <w:trPr>
+          <w:cantSplit/>
+        </w:trPr>
         <w:tc>
           <w:tcPr>
             <w:tcW w:type="dxa" w:w="1750"/>
@@ -6151,6 +6291,9 @@
         </w:tc>
       </w:tr>
       <w:tr>
+        <w:trPr>
+          <w:cantSplit/>
+        </w:trPr>
         <w:tc>
           <w:tcPr>
             <w:tcW w:type="dxa" w:w="1750"/>
@@ -6246,6 +6389,9 @@
         </w:tc>
       </w:tr>
       <w:tr>
+        <w:trPr>
+          <w:cantSplit/>
+        </w:trPr>
         <w:tc>
           <w:tcPr>
             <w:tcW w:type="dxa" w:w="1750"/>
@@ -6406,7 +6552,7 @@
         <w:spacing w:before="0" w:after="120" w:line="264" w:lineRule="auto"/>
       </w:pPr>
       <w:r>
-        <w:t>Ship progression uses unique permanent systems and saved refit opportunities, not replacement parts or a persistent shop. Before the Moon, each useful flight offers the next unowned Reach, Control, and Recovery rank with explicit prerequisites and no reroll; after the Moon, randomized boards prefer one candidate from each role when possible. Buying a system applies its deltas once. Expedition damage can take it offline for the current ship, but ownership survives replacement. Later cards must state the threat answered, primary number moved, price, and tradeoff.</w:t>
+        <w:t>Launch progression uses four direct permanent tracks rather than the retired Reach/Control/Recovery proving ladder. Fuel Tanks, Flight Controls, Engine Cooling, and Hull Plating each have three predictable ranks at 22 credits. Lesson results expose only the newly taught upgrade; Ship Details always shows current rank, next numerical effect, Install, and Keep Credits. Other permanent systems remain available to Flyby, Orbit, Mining, crew, and later research without changing live launch survival.</w:t>
       </w:r>
     </w:p>
     <w:tbl>
@@ -6432,6 +6578,7 @@
       <w:tr>
         <w:trPr>
           <w:tblHeader w:val="true"/>
+          <w:cantSplit/>
         </w:trPr>
         <w:tc>
           <w:tcPr>
@@ -6531,6 +6678,9 @@
         </w:tc>
       </w:tr>
       <w:tr>
+        <w:trPr>
+          <w:cantSplit/>
+        </w:trPr>
         <w:tc>
           <w:tcPr>
             <w:tcW w:type="dxa" w:w="1550"/>
@@ -6552,13 +6702,13 @@
                 <w:rFonts w:ascii="Calibri" w:hAnsi="Calibri"/>
                 <w:sz w:val="18"/>
               </w:rPr>
-            </w:r>
-            <w:r>
-              <w:rPr>
-                <w:rFonts w:ascii="Calibri" w:hAnsi="Calibri"/>
-                <w:sz w:val="18"/>
-              </w:rPr>
-              <w:t>Engine</w:t>
+              <w:t>Fuel Tanks</w:t>
+            </w:r>
+            <w:r>
+              <w:rPr>
+                <w:rFonts w:ascii="Calibri" w:hAnsi="Calibri"/>
+                <w:sz w:val="18"/>
+              </w:rPr>
             </w:r>
           </w:p>
         </w:tc>
@@ -6583,13 +6733,13 @@
                 <w:rFonts w:ascii="Calibri" w:hAnsi="Calibri"/>
                 <w:sz w:val="18"/>
               </w:rPr>
-            </w:r>
-            <w:r>
-              <w:rPr>
-                <w:rFonts w:ascii="Calibri" w:hAnsi="Calibri"/>
-                <w:sz w:val="18"/>
-              </w:rPr>
-              <w:t>Reach, exposure time, volatility, surface drilling hooks.</w:t>
+              <w:t>Capacity: 10 / 15 / 20 / 25 fuel.</w:t>
+            </w:r>
+            <w:r>
+              <w:rPr>
+                <w:rFonts w:ascii="Calibri" w:hAnsi="Calibri"/>
+                <w:sz w:val="18"/>
+              </w:rPr>
             </w:r>
           </w:p>
         </w:tc>
@@ -6614,18 +6764,21 @@
                 <w:rFonts w:ascii="Calibri" w:hAnsi="Calibri"/>
                 <w:sz w:val="18"/>
               </w:rPr>
-            </w:r>
-            <w:r>
-              <w:rPr>
-                <w:rFonts w:ascii="Calibri" w:hAnsi="Calibri"/>
-                <w:sz w:val="18"/>
-              </w:rPr>
-              <w:t>Sparrow Engine, Kestrel Engine, Nova Drive, Regolith Auger.</w:t>
+              <w:t>Rank I after Fuel Survey; II with Mars; III with Jupiter.</w:t>
+            </w:r>
+            <w:r>
+              <w:rPr>
+                <w:rFonts w:ascii="Calibri" w:hAnsi="Calibri"/>
+                <w:sz w:val="18"/>
+              </w:rPr>
             </w:r>
           </w:p>
         </w:tc>
       </w:tr>
       <w:tr>
+        <w:trPr>
+          <w:cantSplit/>
+        </w:trPr>
         <w:tc>
           <w:tcPr>
             <w:tcW w:type="dxa" w:w="1550"/>
@@ -6647,13 +6800,13 @@
                 <w:rFonts w:ascii="Calibri" w:hAnsi="Calibri"/>
                 <w:sz w:val="18"/>
               </w:rPr>
-            </w:r>
-            <w:r>
-              <w:rPr>
-                <w:rFonts w:ascii="Calibri" w:hAnsi="Calibri"/>
-                <w:sz w:val="18"/>
-              </w:rPr>
-              <w:t>Fuel</w:t>
+              <w:t>Flight Controls</w:t>
+            </w:r>
+            <w:r>
+              <w:rPr>
+                <w:rFonts w:ascii="Calibri" w:hAnsi="Calibri"/>
+                <w:sz w:val="18"/>
+              </w:rPr>
             </w:r>
           </w:p>
         </w:tc>
@@ -6678,13 +6831,13 @@
                 <w:rFonts w:ascii="Calibri" w:hAnsi="Calibri"/>
                 <w:sz w:val="18"/>
               </w:rPr>
-            </w:r>
-            <w:r>
-              <w:rPr>
-                <w:rFonts w:ascii="Calibri" w:hAnsi="Calibri"/>
-                <w:sz w:val="18"/>
-              </w:rPr>
-              <w:t>Return margin, pressure stability, long-haul capacity, mining yield hooks.</w:t>
+              <w:t>Chaos: 1.00 / 0.55 / 0.20 / 0.00.</w:t>
+            </w:r>
+            <w:r>
+              <w:rPr>
+                <w:rFonts w:ascii="Calibri" w:hAnsi="Calibri"/>
+                <w:sz w:val="18"/>
+              </w:rPr>
             </w:r>
           </w:p>
         </w:tc>
@@ -6709,18 +6862,21 @@
                 <w:rFonts w:ascii="Calibri" w:hAnsi="Calibri"/>
                 <w:sz w:val="18"/>
               </w:rPr>
-            </w:r>
-            <w:r>
-              <w:rPr>
-                <w:rFonts w:ascii="Calibri" w:hAnsi="Calibri"/>
-                <w:sz w:val="18"/>
-              </w:rPr>
-              <w:t>Stable Tank, Slush Tank, Deep Reservoir, Ore Sorter.</w:t>
+              <w:t>Rank I after calibration; II after Moon; III after Mars.</w:t>
+            </w:r>
+            <w:r>
+              <w:rPr>
+                <w:rFonts w:ascii="Calibri" w:hAnsi="Calibri"/>
+                <w:sz w:val="18"/>
+              </w:rPr>
             </w:r>
           </w:p>
         </w:tc>
       </w:tr>
       <w:tr>
+        <w:trPr>
+          <w:cantSplit/>
+        </w:trPr>
         <w:tc>
           <w:tcPr>
             <w:tcW w:type="dxa" w:w="1550"/>
@@ -6742,13 +6898,13 @@
                 <w:rFonts w:ascii="Calibri" w:hAnsi="Calibri"/>
                 <w:sz w:val="18"/>
               </w:rPr>
-            </w:r>
-            <w:r>
-              <w:rPr>
-                <w:rFonts w:ascii="Calibri" w:hAnsi="Calibri"/>
-                <w:sz w:val="18"/>
-              </w:rPr>
-              <w:t>Hull</w:t>
+              <w:t>Engine Cooling</w:t>
+            </w:r>
+            <w:r>
+              <w:rPr>
+                <w:rFonts w:ascii="Calibri" w:hAnsi="Calibri"/>
+                <w:sz w:val="18"/>
+              </w:rPr>
             </w:r>
           </w:p>
         </w:tc>
@@ -6773,13 +6929,13 @@
                 <w:rFonts w:ascii="Calibri" w:hAnsi="Calibri"/>
                 <w:sz w:val="18"/>
               </w:rPr>
-            </w:r>
-            <w:r>
-              <w:rPr>
-                <w:rFonts w:ascii="Calibri" w:hAnsi="Calibri"/>
-                <w:sz w:val="18"/>
-              </w:rPr>
-              <w:t>Damage tolerance, repair economics, hard-surface durability.</w:t>
+              <w:t>Powered heat: 100% / 88% / 76% / 64%; engine-off cooling: 10% / 14% / 18% / 22% per second.</w:t>
+            </w:r>
+            <w:r>
+              <w:rPr>
+                <w:rFonts w:ascii="Calibri" w:hAnsi="Calibri"/>
+                <w:sz w:val="18"/>
+              </w:rPr>
             </w:r>
           </w:p>
         </w:tc>
@@ -6804,18 +6960,21 @@
                 <w:rFonts w:ascii="Calibri" w:hAnsi="Calibri"/>
                 <w:sz w:val="18"/>
               </w:rPr>
-            </w:r>
-            <w:r>
-              <w:rPr>
-                <w:rFonts w:ascii="Calibri" w:hAnsi="Calibri"/>
-                <w:sz w:val="18"/>
-              </w:rPr>
-              <w:t>Patchwork Hull, Titanium Rib, Ablative Skin, Diamond Bearings.</w:t>
+              <w:t>Rank I after thermal qualification; II after Mars; III after Jupiter.</w:t>
+            </w:r>
+            <w:r>
+              <w:rPr>
+                <w:rFonts w:ascii="Calibri" w:hAnsi="Calibri"/>
+                <w:sz w:val="18"/>
+              </w:rPr>
             </w:r>
           </w:p>
         </w:tc>
       </w:tr>
       <w:tr>
+        <w:trPr>
+          <w:cantSplit/>
+        </w:trPr>
         <w:tc>
           <w:tcPr>
             <w:tcW w:type="dxa" w:w="1550"/>
@@ -6837,13 +6996,13 @@
                 <w:rFonts w:ascii="Calibri" w:hAnsi="Calibri"/>
                 <w:sz w:val="18"/>
               </w:rPr>
-            </w:r>
-            <w:r>
-              <w:rPr>
-                <w:rFonts w:ascii="Calibri" w:hAnsi="Calibri"/>
-                <w:sz w:val="18"/>
-              </w:rPr>
-              <w:t>Cooling</w:t>
+              <w:t>Hull Plating</w:t>
+            </w:r>
+            <w:r>
+              <w:rPr>
+                <w:rFonts w:ascii="Calibri" w:hAnsi="Calibri"/>
+                <w:sz w:val="18"/>
+              </w:rPr>
             </w:r>
           </w:p>
         </w:tc>
@@ -6868,13 +7027,13 @@
                 <w:rFonts w:ascii="Calibri" w:hAnsi="Calibri"/>
                 <w:sz w:val="18"/>
               </w:rPr>
-            </w:r>
-            <w:r>
-              <w:rPr>
-                <w:rFonts w:ascii="Calibri" w:hAnsi="Calibri"/>
-                <w:sz w:val="18"/>
-              </w:rPr>
-              <w:t>Heat control and overburn/mine endurance.</w:t>
+              <w:t>HP: 100 / 125 / 150 / 175; impact multiplier: 1.00 / 0.80 / 0.65 / 0.50.</w:t>
+            </w:r>
+            <w:r>
+              <w:rPr>
+                <w:rFonts w:ascii="Calibri" w:hAnsi="Calibri"/>
+                <w:sz w:val="18"/>
+              </w:rPr>
             </w:r>
           </w:p>
         </w:tc>
@@ -6899,203 +7058,13 @@
                 <w:rFonts w:ascii="Calibri" w:hAnsi="Calibri"/>
                 <w:sz w:val="18"/>
               </w:rPr>
-            </w:r>
-            <w:r>
-              <w:rPr>
-                <w:rFonts w:ascii="Calibri" w:hAnsi="Calibri"/>
-                <w:sz w:val="18"/>
-              </w:rPr>
-              <w:t>Radiator Vanes, Cryo Loop, Sacrificial Heat Sink, Coolant Sleeve.</w:t>
-            </w:r>
-          </w:p>
-        </w:tc>
-      </w:tr>
-      <w:tr>
-        <w:tc>
-          <w:tcPr>
-            <w:tcW w:type="dxa" w:w="1550"/>
-            <w:tcMar>
-              <w:top w:w="80" w:type="dxa"/>
-              <w:start w:w="120" w:type="dxa"/>
-              <w:bottom w:w="80" w:type="dxa"/>
-              <w:end w:w="120" w:type="dxa"/>
-            </w:tcMar>
-            <w:vAlign w:val="center"/>
-            <w:shd w:fill="FFFFFF"/>
-          </w:tcPr>
-          <w:p>
-            <w:pPr>
-              <w:spacing w:before="0" w:after="60" w:line="259" w:lineRule="auto"/>
-            </w:pPr>
-            <w:r>
-              <w:rPr>
-                <w:rFonts w:ascii="Calibri" w:hAnsi="Calibri"/>
-                <w:sz w:val="18"/>
-              </w:rPr>
-            </w:r>
-            <w:r>
-              <w:rPr>
-                <w:rFonts w:ascii="Calibri" w:hAnsi="Calibri"/>
-                <w:sz w:val="18"/>
-              </w:rPr>
-              <w:t>Sensors</w:t>
-            </w:r>
-          </w:p>
-        </w:tc>
-        <w:tc>
-          <w:tcPr>
-            <w:tcW w:type="dxa" w:w="3900"/>
-            <w:tcMar>
-              <w:top w:w="80" w:type="dxa"/>
-              <w:start w:w="120" w:type="dxa"/>
-              <w:bottom w:w="80" w:type="dxa"/>
-              <w:end w:w="120" w:type="dxa"/>
-            </w:tcMar>
-            <w:vAlign w:val="center"/>
-            <w:shd w:fill="FFFFFF"/>
-          </w:tcPr>
-          <w:p>
-            <w:pPr>
-              <w:spacing w:before="0" w:after="60" w:line="259" w:lineRule="auto"/>
-            </w:pPr>
-            <w:r>
-              <w:rPr>
-                <w:rFonts w:ascii="Calibri" w:hAnsi="Calibri"/>
-                <w:sz w:val="18"/>
-              </w:rPr>
-            </w:r>
-            <w:r>
-              <w:rPr>
-                <w:rFonts w:ascii="Calibri" w:hAnsi="Calibri"/>
-                <w:sz w:val="18"/>
-              </w:rPr>
-              <w:t>Warning quality, pressure uncertainty, mining scan width.</w:t>
-            </w:r>
-          </w:p>
-        </w:tc>
-        <w:tc>
-          <w:tcPr>
-            <w:tcW w:type="dxa" w:w="3910"/>
-            <w:tcMar>
-              <w:top w:w="80" w:type="dxa"/>
-              <w:start w:w="120" w:type="dxa"/>
-              <w:bottom w:w="80" w:type="dxa"/>
-              <w:end w:w="120" w:type="dxa"/>
-            </w:tcMar>
-            <w:vAlign w:val="center"/>
-            <w:shd w:fill="FFFFFF"/>
-          </w:tcPr>
-          <w:p>
-            <w:pPr>
-              <w:spacing w:before="0" w:after="60" w:line="259" w:lineRule="auto"/>
-            </w:pPr>
-            <w:r>
-              <w:rPr>
-                <w:rFonts w:ascii="Calibri" w:hAnsi="Calibri"/>
-                <w:sz w:val="18"/>
-              </w:rPr>
-            </w:r>
-            <w:r>
-              <w:rPr>
-                <w:rFonts w:ascii="Calibri" w:hAnsi="Calibri"/>
-                <w:sz w:val="18"/>
-              </w:rPr>
-              <w:t>Analog Telemetry, Hazard Radar, Predictive Guidance, Surface Mapper.</w:t>
-            </w:r>
-          </w:p>
-        </w:tc>
-      </w:tr>
-      <w:tr>
-        <w:tc>
-          <w:tcPr>
-            <w:tcW w:type="dxa" w:w="1550"/>
-            <w:tcMar>
-              <w:top w:w="80" w:type="dxa"/>
-              <w:start w:w="120" w:type="dxa"/>
-              <w:bottom w:w="80" w:type="dxa"/>
-              <w:end w:w="120" w:type="dxa"/>
-            </w:tcMar>
-            <w:vAlign w:val="center"/>
-            <w:shd w:fill="FFFFFF"/>
-          </w:tcPr>
-          <w:p>
-            <w:pPr>
-              <w:spacing w:before="0" w:after="60" w:line="259" w:lineRule="auto"/>
-            </w:pPr>
-            <w:r>
-              <w:rPr>
-                <w:rFonts w:ascii="Calibri" w:hAnsi="Calibri"/>
-                <w:sz w:val="18"/>
-              </w:rPr>
-            </w:r>
-            <w:r>
-              <w:rPr>
-                <w:rFonts w:ascii="Calibri" w:hAnsi="Calibri"/>
-                <w:sz w:val="18"/>
-              </w:rPr>
-              <w:t>Escape</w:t>
-            </w:r>
-          </w:p>
-        </w:tc>
-        <w:tc>
-          <w:tcPr>
-            <w:tcW w:type="dxa" w:w="3900"/>
-            <w:tcMar>
-              <w:top w:w="80" w:type="dxa"/>
-              <w:start w:w="120" w:type="dxa"/>
-              <w:bottom w:w="80" w:type="dxa"/>
-              <w:end w:w="120" w:type="dxa"/>
-            </w:tcMar>
-            <w:vAlign w:val="center"/>
-            <w:shd w:fill="FFFFFF"/>
-          </w:tcPr>
-          <w:p>
-            <w:pPr>
-              <w:spacing w:before="0" w:after="60" w:line="259" w:lineRule="auto"/>
-            </w:pPr>
-            <w:r>
-              <w:rPr>
-                <w:rFonts w:ascii="Calibri" w:hAnsi="Calibri"/>
-                <w:sz w:val="18"/>
-              </w:rPr>
-            </w:r>
-            <w:r>
-              <w:rPr>
-                <w:rFonts w:ascii="Calibri" w:hAnsi="Calibri"/>
-                <w:sz w:val="18"/>
-              </w:rPr>
-              <w:t>Ejection and crew survival outcomes.</w:t>
-            </w:r>
-          </w:p>
-        </w:tc>
-        <w:tc>
-          <w:tcPr>
-            <w:tcW w:type="dxa" w:w="3910"/>
-            <w:tcMar>
-              <w:top w:w="80" w:type="dxa"/>
-              <w:start w:w="120" w:type="dxa"/>
-              <w:bottom w:w="80" w:type="dxa"/>
-              <w:end w:w="120" w:type="dxa"/>
-            </w:tcMar>
-            <w:vAlign w:val="center"/>
-            <w:shd w:fill="FFFFFF"/>
-          </w:tcPr>
-          <w:p>
-            <w:pPr>
-              <w:spacing w:before="0" w:after="60" w:line="259" w:lineRule="auto"/>
-            </w:pPr>
-            <w:r>
-              <w:rPr>
-                <w:rFonts w:ascii="Calibri" w:hAnsi="Calibri"/>
-                <w:sz w:val="18"/>
-              </w:rPr>
-            </w:r>
-            <w:r>
-              <w:rPr>
-                <w:rFonts w:ascii="Calibri" w:hAnsi="Calibri"/>
-                <w:sz w:val="18"/>
-              </w:rPr>
-              <w:t>Spring Capsule, Abort Tower, Phoenix Pod.</w:t>
+              <w:t>Rank I after belt survey; II after Jupiter; III after Saturn.</w:t>
+            </w:r>
+            <w:r>
+              <w:rPr>
+                <w:rFonts w:ascii="Calibri" w:hAnsi="Calibri"/>
+                <w:sz w:val="18"/>
+              </w:rPr>
             </w:r>
           </w:p>
         </w:tc>
@@ -7121,7 +7090,7 @@
           <w:i w:val="0"/>
           <w:sz w:val="22"/>
         </w:rPr>
-        <w:t>Crew are animal specialists with class identity, training, stress, injury, death, and memorial consequences. Training improves performance; stress cancels effective training and raises NAV/ABORT pressure. Replacement recruitment prevents dead-roster soft locks while preserving loss.</w:t>
+        <w:t>Crew are animal specialists with class identity, training, stress, injury, death, and memorial consequences. Training and stress continue to shape crew and non-launch systems, but neither creates a hidden launch survival roll. Replacement recruitment prevents dead-roster soft locks while preserving loss.</w:t>
       </w:r>
     </w:p>
     <w:tbl>
@@ -7147,6 +7116,7 @@
       <w:tr>
         <w:trPr>
           <w:tblHeader w:val="true"/>
+          <w:cantSplit/>
         </w:trPr>
         <w:tc>
           <w:tcPr>
@@ -7246,6 +7216,9 @@
         </w:tc>
       </w:tr>
       <w:tr>
+        <w:trPr>
+          <w:cantSplit/>
+        </w:trPr>
         <w:tc>
           <w:tcPr>
             <w:tcW w:type="dxa" w:w="2100"/>
@@ -7341,6 +7314,9 @@
         </w:tc>
       </w:tr>
       <w:tr>
+        <w:trPr>
+          <w:cantSplit/>
+        </w:trPr>
         <w:tc>
           <w:tcPr>
             <w:tcW w:type="dxa" w:w="2100"/>
@@ -7436,6 +7412,9 @@
         </w:tc>
       </w:tr>
       <w:tr>
+        <w:trPr>
+          <w:cantSplit/>
+        </w:trPr>
         <w:tc>
           <w:tcPr>
             <w:tcW w:type="dxa" w:w="2100"/>
@@ -7531,6 +7510,9 @@
         </w:tc>
       </w:tr>
       <w:tr>
+        <w:trPr>
+          <w:cantSplit/>
+        </w:trPr>
         <w:tc>
           <w:tcPr>
             <w:tcW w:type="dxa" w:w="2100"/>
@@ -7626,6 +7608,9 @@
         </w:tc>
       </w:tr>
       <w:tr>
+        <w:trPr>
+          <w:cantSplit/>
+        </w:trPr>
         <w:tc>
           <w:tcPr>
             <w:tcW w:type="dxa" w:w="2100"/>
@@ -7721,6 +7706,9 @@
         </w:tc>
       </w:tr>
       <w:tr>
+        <w:trPr>
+          <w:cantSplit/>
+        </w:trPr>
         <w:tc>
           <w:tcPr>
             <w:tcW w:type="dxa" w:w="2100"/>
@@ -7856,6 +7844,7 @@
       <w:tr>
         <w:trPr>
           <w:tblHeader w:val="true"/>
+          <w:cantSplit/>
         </w:trPr>
         <w:tc>
           <w:tcPr>
@@ -7955,6 +7944,9 @@
         </w:tc>
       </w:tr>
       <w:tr>
+        <w:trPr>
+          <w:cantSplit/>
+        </w:trPr>
         <w:tc>
           <w:tcPr>
             <w:tcW w:type="dxa" w:w="2200"/>
@@ -8050,6 +8042,9 @@
         </w:tc>
       </w:tr>
       <w:tr>
+        <w:trPr>
+          <w:cantSplit/>
+        </w:trPr>
         <w:tc>
           <w:tcPr>
             <w:tcW w:type="dxa" w:w="2200"/>
@@ -8071,13 +8066,13 @@
                 <w:rFonts w:ascii="Calibri" w:hAnsi="Calibri"/>
                 <w:sz w:val="18"/>
               </w:rPr>
-            </w:r>
-            <w:r>
-              <w:rPr>
-                <w:rFonts w:ascii="Calibri" w:hAnsi="Calibri"/>
-                <w:sz w:val="18"/>
-              </w:rPr>
-              <w:t>Frontier readiness</w:t>
+              <w:t>Launch lesson state</w:t>
+            </w:r>
+            <w:r>
+              <w:rPr>
+                <w:rFonts w:ascii="Calibri" w:hAnsi="Calibri"/>
+                <w:sz w:val="18"/>
+              </w:rPr>
             </w:r>
           </w:p>
         </w:tc>
@@ -8102,13 +8097,13 @@
                 <w:rFonts w:ascii="Calibri" w:hAnsi="Calibri"/>
                 <w:sz w:val="18"/>
               </w:rPr>
-            </w:r>
-            <w:r>
-              <w:rPr>
-                <w:rFonts w:ascii="Calibri" w:hAnsi="Calibri"/>
-                <w:sz w:val="18"/>
-              </w:rPr>
-              <w:t>Useful proving profiles and transfer data.</w:t>
+              <w:t>Qualified Fuel, Controls, Temperature, and Asteroid returns.</w:t>
+            </w:r>
+            <w:r>
+              <w:rPr>
+                <w:rFonts w:ascii="Calibri" w:hAnsi="Calibri"/>
+                <w:sz w:val="18"/>
+              </w:rPr>
             </w:r>
           </w:p>
         </w:tc>
@@ -8133,18 +8128,21 @@
                 <w:rFonts w:ascii="Calibri" w:hAnsi="Calibri"/>
                 <w:sz w:val="18"/>
               </w:rPr>
-            </w:r>
-            <w:r>
-              <w:rPr>
-                <w:rFonts w:ascii="Calibri" w:hAnsi="Calibri"/>
-                <w:sz w:val="18"/>
-              </w:rPr>
-              <w:t>Gate to the next solar-system frontier.</w:t>
+              <w:t>Unlocks one direct Launch Upgrade and the next taught transfer gate.</w:t>
+            </w:r>
+            <w:r>
+              <w:rPr>
+                <w:rFonts w:ascii="Calibri" w:hAnsi="Calibri"/>
+                <w:sz w:val="18"/>
+              </w:rPr>
             </w:r>
           </w:p>
         </w:tc>
       </w:tr>
       <w:tr>
+        <w:trPr>
+          <w:cantSplit/>
+        </w:trPr>
         <w:tc>
           <w:tcPr>
             <w:tcW w:type="dxa" w:w="2200"/>
@@ -8230,6 +8228,9 @@
         </w:tc>
       </w:tr>
       <w:tr>
+        <w:trPr>
+          <w:cantSplit/>
+        </w:trPr>
         <w:tc>
           <w:tcPr>
             <w:tcW w:type="dxa" w:w="2200"/>
@@ -8325,6 +8326,9 @@
         </w:tc>
       </w:tr>
       <w:tr>
+        <w:trPr>
+          <w:cantSplit/>
+        </w:trPr>
         <w:tc>
           <w:tcPr>
             <w:tcW w:type="dxa" w:w="2200"/>
@@ -8420,6 +8424,9 @@
         </w:tc>
       </w:tr>
       <w:tr>
+        <w:trPr>
+          <w:cantSplit/>
+        </w:trPr>
         <w:tc>
           <w:tcPr>
             <w:tcW w:type="dxa" w:w="2200"/>
@@ -8555,6 +8562,7 @@
       <w:tr>
         <w:trPr>
           <w:tblHeader w:val="true"/>
+          <w:cantSplit/>
         </w:trPr>
         <w:tc>
           <w:tcPr>
@@ -8654,6 +8662,9 @@
         </w:tc>
       </w:tr>
       <w:tr>
+        <w:trPr>
+          <w:cantSplit/>
+        </w:trPr>
         <w:tc>
           <w:tcPr>
             <w:tcW w:type="dxa" w:w="1800"/>
@@ -8749,6 +8760,9 @@
         </w:tc>
       </w:tr>
       <w:tr>
+        <w:trPr>
+          <w:cantSplit/>
+        </w:trPr>
         <w:tc>
           <w:tcPr>
             <w:tcW w:type="dxa" w:w="1800"/>
@@ -8844,6 +8858,9 @@
         </w:tc>
       </w:tr>
       <w:tr>
+        <w:trPr>
+          <w:cantSplit/>
+        </w:trPr>
         <w:tc>
           <w:tcPr>
             <w:tcW w:type="dxa" w:w="1800"/>
@@ -8929,6 +8946,9 @@
         </w:tc>
       </w:tr>
       <w:tr>
+        <w:trPr>
+          <w:cantSplit/>
+        </w:trPr>
         <w:tc>
           <w:tcPr>
             <w:tcW w:type="dxa" w:w="1800"/>
@@ -8985,6 +9005,9 @@
         </w:tc>
       </w:tr>
       <w:tr>
+        <w:trPr>
+          <w:cantSplit/>
+        </w:trPr>
         <w:tc>
           <w:tcPr>
             <w:tcW w:type="dxa" w:w="1800"/>
@@ -9074,6 +9097,9 @@
         </w:tc>
       </w:tr>
       <w:tr>
+        <w:trPr>
+          <w:cantSplit/>
+        </w:trPr>
         <w:tc>
           <w:tcPr>
             <w:tcW w:type="dxa" w:w="1800"/>
@@ -9238,46 +9264,7 @@
         <w:jc w:val="center"/>
       </w:pPr>
       <w:r>
-        <w:drawing>
-          <wp:inline xmlns:a="http://schemas.openxmlformats.org/drawingml/2006/main" xmlns:pic="http://schemas.openxmlformats.org/drawingml/2006/picture">
-            <wp:extent cx="5989320" cy="1319076"/>
-            <wp:docPr id="2" name="Picture 2"/>
-            <wp:cNvGraphicFramePr>
-              <a:graphicFrameLocks noChangeAspect="1"/>
-            </wp:cNvGraphicFramePr>
-            <a:graphic>
-              <a:graphicData uri="http://schemas.openxmlformats.org/drawingml/2006/picture">
-                <pic:pic>
-                  <pic:nvPicPr>
-                    <pic:cNvPr id="0" name="solar-frontier-ladder.png"/>
-                    <pic:cNvPicPr/>
-                  </pic:nvPicPr>
-                  <pic:blipFill>
-                    <a:blip r:embed="rId27"/>
-                    <a:stretch>
-                      <a:fillRect/>
-                    </a:stretch>
-                  </pic:blipFill>
-                  <pic:spPr>
-                    <a:xfrm>
-                      <a:off x="0" y="0"/>
-                      <a:ext cx="5989320" cy="1319076"/>
-                    </a:xfrm>
-                    <a:prstGeom prst="rect"/>
-                  </pic:spPr>
-                </pic:pic>
-              </a:graphicData>
-            </a:graphic>
-          </wp:inline>
-        </w:drawing>
-      </w:r>
-    </w:p>
-    <w:p>
-      <w:pPr>
-        <w:jc w:val="center"/>
-      </w:pPr>
-      <w:r>
-        <w:t>Solar frontier ladder: every planet is a distinct destination with its own arrival and completion state.</w:t>
+        <w:t>The visible solar frontier begins at the Moon and continues through Mars, Jupiter, Saturn, Uranus, and Neptune; every destination has its own arrival and completion state.</w:t>
       </w:r>
     </w:p>
     <w:tbl>
@@ -9400,7 +9387,7 @@
               <w:spacing w:before="0" w:after="60" w:line="259" w:lineRule="auto"/>
             </w:pPr>
             <w:r>
-              <w:t>Earth Orbit</w:t>
+              <w:t>Moon</w:t>
             </w:r>
           </w:p>
         </w:tc>
@@ -9421,7 +9408,7 @@
               <w:spacing w:before="0" w:after="60" w:line="259" w:lineRule="auto"/>
             </w:pPr>
             <w:r>
-              <w:t>0</w:t>
+              <w:t>1</w:t>
             </w:r>
           </w:p>
         </w:tc>
@@ -9442,7 +9429,7 @@
               <w:spacing w:before="0" w:after="60" w:line="259" w:lineRule="auto"/>
             </w:pPr>
             <w:r>
-              <w:t>Tutorial/proving loop and first risk/reward learning.</w:t>
+              <w:t>First visible target; launch Fuel/Controls curriculum, Lunar Program arrival, and Prospector route gate.</w:t>
             </w:r>
           </w:p>
         </w:tc>
@@ -9489,7 +9476,7 @@
               <w:spacing w:before="0" w:after="60" w:line="259" w:lineRule="auto"/>
             </w:pPr>
             <w:r>
-              <w:t>Moon</w:t>
+              <w:t>Mars</w:t>
             </w:r>
           </w:p>
         </w:tc>
@@ -9510,7 +9497,7 @@
               <w:spacing w:before="0" w:after="60" w:line="259" w:lineRule="auto"/>
             </w:pPr>
             <w:r>
-              <w:t>1</w:t>
+              <w:t>2</w:t>
             </w:r>
           </w:p>
         </w:tc>
@@ -9531,7 +9518,7 @@
               <w:spacing w:before="0" w:after="60" w:line="259" w:lineRule="auto"/>
             </w:pPr>
             <w:r>
-              <w:t>Lunar Program arrival and route-risk escalation.</w:t>
+              <w:t>Thermal qualification, first research, Surface Ops, mining, artifacts, and materials.</w:t>
             </w:r>
           </w:p>
         </w:tc>
@@ -9552,7 +9539,7 @@
               <w:spacing w:before="0" w:after="60" w:line="259" w:lineRule="auto"/>
             </w:pPr>
             <w:r>
-              <w:t>No enemies.</w:t>
+              <w:t>Environmental hazards only.</w:t>
             </w:r>
           </w:p>
         </w:tc>
@@ -9578,7 +9565,7 @@
               <w:spacing w:before="0" w:after="60" w:line="259" w:lineRule="auto"/>
             </w:pPr>
             <w:r>
-              <w:t>Mars</w:t>
+              <w:t>Jupiter</w:t>
             </w:r>
           </w:p>
         </w:tc>
@@ -9599,7 +9586,7 @@
               <w:spacing w:before="0" w:after="60" w:line="259" w:lineRule="auto"/>
             </w:pPr>
             <w:r>
-              <w:t>2</w:t>
+              <w:t>3</w:t>
             </w:r>
           </w:p>
         </w:tc>
@@ -9620,96 +9607,7 @@
               <w:spacing w:before="0" w:after="60" w:line="259" w:lineRule="auto"/>
             </w:pPr>
             <w:r>
-              <w:t>First research, Surface Ops, mining, artifacts, and materials.</w:t>
-            </w:r>
-          </w:p>
-        </w:tc>
-        <w:tc>
-          <w:tcPr>
-            <w:tcW w:type="dxa" w:w="2260"/>
-            <w:tcMar>
-              <w:top w:w="80" w:type="dxa"/>
-              <w:start w:w="120" w:type="dxa"/>
-              <w:bottom w:w="80" w:type="dxa"/>
-              <w:end w:w="120" w:type="dxa"/>
-            </w:tcMar>
-            <w:vAlign w:val="center"/>
-            <w:shd w:fill="FFFFFF"/>
-          </w:tcPr>
-          <w:p>
-            <w:pPr>
-              <w:spacing w:before="0" w:after="60" w:line="259" w:lineRule="auto"/>
-            </w:pPr>
-            <w:r>
-              <w:t>Environmental hazards only.</w:t>
-            </w:r>
-          </w:p>
-        </w:tc>
-      </w:tr>
-      <w:tr>
-        <w:trPr>
-          <w:cantSplit/>
-        </w:trPr>
-        <w:tc>
-          <w:tcPr>
-            <w:tcW w:type="dxa" w:w="1900"/>
-            <w:tcMar>
-              <w:top w:w="80" w:type="dxa"/>
-              <w:start w:w="120" w:type="dxa"/>
-              <w:bottom w:w="80" w:type="dxa"/>
-              <w:end w:w="120" w:type="dxa"/>
-            </w:tcMar>
-            <w:vAlign w:val="center"/>
-            <w:shd w:fill="FFFFFF"/>
-          </w:tcPr>
-          <w:p>
-            <w:pPr>
-              <w:spacing w:before="0" w:after="60" w:line="259" w:lineRule="auto"/>
-            </w:pPr>
-            <w:r>
-              <w:t>Jupiter</w:t>
-            </w:r>
-          </w:p>
-        </w:tc>
-        <w:tc>
-          <w:tcPr>
-            <w:tcW w:type="dxa" w:w="650"/>
-            <w:tcMar>
-              <w:top w:w="80" w:type="dxa"/>
-              <w:start w:w="120" w:type="dxa"/>
-              <w:bottom w:w="80" w:type="dxa"/>
-              <w:end w:w="120" w:type="dxa"/>
-            </w:tcMar>
-            <w:vAlign w:val="center"/>
-            <w:shd w:fill="FFFFFF"/>
-          </w:tcPr>
-          <w:p>
-            <w:pPr>
-              <w:spacing w:before="0" w:after="60" w:line="259" w:lineRule="auto"/>
-            </w:pPr>
-            <w:r>
-              <w:t>3</w:t>
-            </w:r>
-          </w:p>
-        </w:tc>
-        <w:tc>
-          <w:tcPr>
-            <w:tcW w:type="dxa" w:w="4550"/>
-            <w:tcMar>
-              <w:top w:w="80" w:type="dxa"/>
-              <w:start w:w="120" w:type="dxa"/>
-              <w:bottom w:w="80" w:type="dxa"/>
-              <w:end w:w="120" w:type="dxa"/>
-            </w:tcMar>
-            <w:vAlign w:val="center"/>
-            <w:shd w:fill="FFFFFF"/>
-          </w:tcPr>
-          <w:p>
-            <w:pPr>
-              <w:spacing w:before="0" w:after="60" w:line="259" w:lineRule="auto"/>
-            </w:pPr>
-            <w:r>
-              <w:t>Jupiter-system arrival leads to the configured Io recovery scenario; a claimed Perfect slingshot opens Saturn.</w:t>
+              <w:t>Asteroid-belt qualification leads to the configured Io recovery scenario; a claimed Perfect slingshot opens Saturn.</w:t>
             </w:r>
           </w:p>
         </w:tc>
@@ -10253,7 +10151,7 @@
         <w:spacing w:before="0" w:after="120" w:line="264" w:lineRule="auto"/>
       </w:pPr>
       <w:r>
-        <w:t>Art uses #ff00aa sources, tolerant cleanup, verified alpha, and deterministic packing. The manifest has 35 runtime textures, including the heroic portrait and static jetpack operator; missing JetpackCapybara art or registration fails without fallback. Vulkan and WebGL2 share the atlas/header.</w:t>
+        <w:t>Art uses #ff00aa sources, tolerant cleanup, verified alpha, and deterministic packing. The manifest has 37 runtime textures, including the Jetpack Capybara, POI guidance arrow, and reusable asteroid; missing art or registration fails without fallback. Vulkan and WebGL2 share every metadata-declared atlas page and generated header.</w:t>
       </w:r>
     </w:p>
     <w:tbl>
@@ -10600,7 +10498,7 @@
           </w:tcPr>
           <w:p>
             <w:r>
-              <w:t>rocket-bay-closed.png, rocket-bay-open.png, thrust-sheet.png, explosion-sheet.png</w:t>
+              <w:t>rocket-bay-closed.png, rocket-bay-open.png, thrust-sheet.png, explosion-sheet.png, asteroid.png</w:t>
             </w:r>
           </w:p>
         </w:tc>
@@ -10618,7 +10516,7 @@
           </w:tcPr>
           <w:p>
             <w:r>
-              <w:t>Launch, return, bay state, thrust, and failure feedback.</w:t>
+              <w:t>Launch, return, bay state, thrust, failure feedback, and scaled/rotated Jupiter-belt obstacles.</w:t>
             </w:r>
           </w:p>
         </w:tc>
@@ -10824,7 +10722,7 @@
         <w:spacing w:before="0" w:after="120" w:line="264" w:lineRule="auto"/>
       </w:pPr>
       <w:r>
-        <w:t>Audio sharpens tension without smothering decisions: telemetry alarms, pressure pulses, engine strain, relief valve/jettison feedback, drill resistance, scanner pings, drone shots, shield hits, and Ark jump/disaster beats. Music can stay energetic and space-arcade, with calmer Ark-home cues while Straylight searches Aaru Vale before Arkfall.</w:t>
+        <w:t>Audio sharpens tension without smothering decisions: fuel warnings, control-response kicks, engine strain and cutoff, thermal alarms, asteroid impacts, drill resistance, scanner pings, drone shots, shield hits, and Ark jump/disaster beats. Music can stay energetic and space-arcade, with calmer Ark-home cues while Straylight searches Aaru Vale before Arkfall.</w:t>
       </w:r>
     </w:p>
     <w:p>
@@ -10878,6 +10776,7 @@
       <w:tr>
         <w:trPr>
           <w:tblHeader w:val="true"/>
+          <w:cantSplit/>
         </w:trPr>
         <w:tc>
           <w:tcPr>
@@ -10945,6 +10844,9 @@
         </w:tc>
       </w:tr>
       <w:tr>
+        <w:trPr>
+          <w:cantSplit/>
+        </w:trPr>
         <w:tc>
           <w:tcPr>
             <w:tcW w:type="dxa" w:w="1550"/>
@@ -10983,6 +10885,9 @@
         </w:tc>
       </w:tr>
       <w:tr>
+        <w:trPr>
+          <w:cantSplit/>
+        </w:trPr>
         <w:tc>
           <w:tcPr>
             <w:tcW w:type="dxa" w:w="1550"/>
@@ -11021,6 +10926,9 @@
         </w:tc>
       </w:tr>
       <w:tr>
+        <w:trPr>
+          <w:cantSplit/>
+        </w:trPr>
         <w:tc>
           <w:tcPr>
             <w:tcW w:type="dxa" w:w="1550"/>
@@ -11059,6 +10967,9 @@
         </w:tc>
       </w:tr>
       <w:tr>
+        <w:trPr>
+          <w:cantSplit/>
+        </w:trPr>
         <w:tc>
           <w:tcPr>
             <w:tcW w:type="dxa" w:w="1550"/>
@@ -11097,6 +11008,9 @@
         </w:tc>
       </w:tr>
       <w:tr>
+        <w:trPr>
+          <w:cantSplit/>
+        </w:trPr>
         <w:tc>
           <w:tcPr>
             <w:tcW w:type="dxa" w:w="1550"/>
@@ -11135,6 +11049,9 @@
         </w:tc>
       </w:tr>
       <w:tr>
+        <w:trPr>
+          <w:cantSplit/>
+        </w:trPr>
         <w:tc>
           <w:tcPr>
             <w:tcW w:type="dxa" w:w="1550"/>
@@ -11173,6 +11090,9 @@
         </w:tc>
       </w:tr>
       <w:tr>
+        <w:trPr>
+          <w:cantSplit/>
+        </w:trPr>
         <w:tc>
           <w:tcPr>
             <w:tcW w:type="dxa" w:w="1550"/>
@@ -11195,6 +11115,9 @@
         </w:tc>
       </w:tr>
       <w:tr>
+        <w:trPr>
+          <w:cantSplit/>
+        </w:trPr>
         <w:tc>
           <w:tcPr>
             <w:tcW w:type="dxa" w:w="1550"/>
@@ -11252,7 +11175,7 @@
         <w:spacing w:before="0" w:after="120" w:line="264" w:lineRule="auto"/>
       </w:pPr>
       <w:r>
-        <w:t>The current save format is version 9, line-based, and dependency-free. Version 9 persists scenario instances, definition versions, deterministic procedural seeds and resolved parameters, step counters, acknowledgements, claim/completion state, awarded reward IDs, generic mining-site progress, cocoon layer indices, protected-objective state, and generic Flyby challenge state. Migration maps legacy Moon/Mars/Io/Saturn fields into the corresponding scenario steps, preserves partial delivery/treatment/extraction progress, awards no duplicate reward, keeps completed routes open, and never rolls later campaigns backward. Content definitions are immutable per version; behavior changes require a versioned migration rather than silently redefining a saved scenario.</w:t>
+        <w:t>The current save format is version 10, line-based, and dependency-free. It retains version 9 scenario, mining-site, cocoon, protected-objective, and Support Drone state while adding Launch Upgrade ranks and completion for Fuel, Controls, Temperature, and Asteroids. Migration keeps earth_orbit at internal index 0, sends a truly pristine v9 campaign to the zero-credit Moon tutorial, maps progressed Earth saves conservatively, grants location-appropriate minimum ranks to Moon-or-later saves, and converts retired proving-card ownership before unknown IDs are pruned. Active flight and asteroid layouts remain session-only.</w:t>
       </w:r>
     </w:p>
     <w:p>
@@ -11268,7 +11191,7 @@
         <w:spacing w:before="0" w:after="120" w:line="264" w:lineRule="auto"/>
       </w:pPr>
       <w:r>
-        <w:t>Core tests are design contracts for launch outcomes, generic scenario events/actions/rewards, route-key evaluation, dependency-linked steps, deterministic procedural instances, reusable multi-layer cocoons, protected-objective adapters, progression, research, Surface Ops, deterministic mining, Rig/EVA physics, destination gravity, loose chunks, tether burden, suit passages, emergency recovery, and v9 save migration. Swarm tests cover mixed six-role formations, smooth actor transfers, cancellation with haul preservation, active-actor targeting and shield interception, catch-up, compressed formations, collision separation, shuttle restrictions, cross-depth preservation, wreck avoidance, tether independence, failure freeze, collisionless Hazard traversal, revealed-only targeting, shared treatment assistance, and active-actor render effects. Release validation includes atlas checks, core/native tests, web tests/build, sanity checks, native Release, 1280x800 visual review, and a physical Steam Deck control/readability pass.</w:t>
+        <w:t>Core tests are design contracts for exact 5-out/5-back survey fuel, insertion reserve, throttle range, seeded control repeatability and monotonic rank improvement, engine-off cooling and coast decay, deterministic traversable asteroid belts, swept impacts, rank-based hull damage, training-rescue economy, version-10 migration, generic scenario events/actions/rewards, route-key evaluation, Surface Ops, deterministic mining, Rig/EVA physics, and Support Drone behavior. Large seeded policies must prove no random or impossible early-route deaths while ignored warnings, unmanaged controls, full-throttle heat, and repeated impacts still fail.</w:t>
       </w:r>
     </w:p>
     <w:tbl>
@@ -11422,13 +11345,13 @@
                 <w:rFonts w:ascii="Calibri" w:hAnsi="Calibri"/>
                 <w:sz w:val="17"/>
               </w:rPr>
+              <w:t>New games start Moon-bound with zero credits; four lesson milestones, direct ranks, route gates, version-10 migration, and no chapter rollback are covered.</w:t>
             </w:r>
             <w:r>
               <w:rPr>
                 <w:rFonts w:ascii="Calibri" w:hAnsi="Calibri"/>
                 <w:sz w:val="17"/>
               </w:rPr>
-              <w:t>New games start at Chapter 1; chapters advance through destinations/Ark jumps/sorties; no rollback.</w:t>
             </w:r>
           </w:p>
         </w:tc>
@@ -11722,6 +11645,31 @@
           <w:p>
             <w:r>
               <w:t>Automated checks confine browser/Emscripten symbols to web adapters and reject Electron, Chromium, Node, WASM, browser-shell, OpenGL fallback, or missing-library leakage in native Vulkan archives.</w:t>
+            </w:r>
+          </w:p>
+        </w:tc>
+      </w:tr>
+      <w:tr>
+        <w:trPr>
+          <w:cantSplit/>
+        </w:trPr>
+        <w:tc>
+          <w:tcPr>
+            <w:tcW w:type="dxa" w:w="2200"/>
+          </w:tcPr>
+          <w:p>
+            <w:r>
+              <w:t>Launch curriculum</w:t>
+            </w:r>
+          </w:p>
+        </w:tc>
+        <w:tc>
+          <w:tcPr>
+            <w:tcW w:type="dxa" w:w="7160"/>
+          </w:tcPr>
+          <w:p>
+            <w:r>
+              <w:t>Exact survey fuel, reserves, throttle tradeoffs, control repeatability, cooling, coast decay, traversable belts, swept collisions, hull ranks, staged UI/input, tutorial economy, and 5,000-seed policies per early destination.</w:t>
             </w:r>
           </w:p>
         </w:tc>
@@ -11780,6 +11728,7 @@
       <w:tr>
         <w:trPr>
           <w:tblHeader w:val="true"/>
+          <w:cantSplit/>
         </w:trPr>
         <w:tc>
           <w:tcPr>
@@ -11879,6 +11828,9 @@
         </w:tc>
       </w:tr>
       <w:tr>
+        <w:trPr>
+          <w:cantSplit/>
+        </w:trPr>
         <w:tc>
           <w:tcPr>
             <w:tcW w:type="dxa" w:w="1650"/>
@@ -11954,6 +11906,9 @@
         </w:tc>
       </w:tr>
       <w:tr>
+        <w:trPr>
+          <w:cantSplit/>
+        </w:trPr>
         <w:tc>
           <w:tcPr>
             <w:tcW w:type="dxa" w:w="1650"/>
@@ -12010,6 +11965,9 @@
         </w:tc>
       </w:tr>
       <w:tr>
+        <w:trPr>
+          <w:cantSplit/>
+        </w:trPr>
         <w:tc>
           <w:tcPr>
             <w:tcW w:type="dxa" w:w="1650"/>
@@ -12095,6 +12053,9 @@
         </w:tc>
       </w:tr>
       <w:tr>
+        <w:trPr>
+          <w:cantSplit/>
+        </w:trPr>
         <w:tc>
           <w:tcPr>
             <w:tcW w:type="dxa" w:w="1650"/>
@@ -12180,6 +12141,9 @@
         </w:tc>
       </w:tr>
       <w:tr>
+        <w:trPr>
+          <w:cantSplit/>
+        </w:trPr>
         <w:tc>
           <w:tcPr>
             <w:tcW w:type="dxa" w:w="1650"/>
@@ -12275,6 +12239,9 @@
         </w:tc>
       </w:tr>
       <w:tr>
+        <w:trPr>
+          <w:cantSplit/>
+        </w:trPr>
         <w:tc>
           <w:tcPr>
             <w:tcW w:type="dxa" w:w="1650"/>

</xml_diff>

<commit_message>
Polish progression and mining operations
</commit_message>
<xml_diff>
--- a/docs/Rocket_Rogue_Game_Design_Document.docx
+++ b/docs/Rocket_Rogue_Game_Design_Document.docx
@@ -44,7 +44,7 @@
           <w:color w:val="555555"/>
           <w:sz w:val="25"/>
         </w:rPr>
-        <w:t>Press-your-luck spaceflight, surface mining, Ark campaign progression, and active-actor swarm survival</w:t>
+        <w:t>Fly farther. Dig deeper. Survive with Dynamic Drone Companions at your side.</w:t>
       </w:r>
     </w:p>
     <w:p>
@@ -404,7 +404,7 @@
           </w:tcPr>
           <w:p>
             <w:r>
-              <w:t>August 11, 2026</w:t>
+              <w:t>August 15, 2026</w:t>
             </w:r>
           </w:p>
         </w:tc>
@@ -467,7 +467,7 @@
                 <w:rFonts w:ascii="Calibri" w:hAnsi="Calibri"/>
                 <w:sz w:val="18"/>
               </w:rPr>
-              <w:t>Current repo docs, C++ core content, tests, art inventory, the four-lesson launch curriculum, Vulkan/WebGL2 architecture, controller support, the approved EVA/swarm design, and the Solar Jetman reference manuals</w:t>
+              <w:t>Current repo docs, C++ core content, tests, art inventory, the four-lesson launch curriculum, Vulkan/WebGL2 architecture, controller support, the approved Dynamic Drone Companions design, and the Solar Jetman reference manuals</w:t>
             </w:r>
           </w:p>
         </w:tc>
@@ -523,7 +523,7 @@
           </w:tcPr>
           <w:p>
             <w:r>
-              <w:t>Living GDD for the playable native Vulkan Windows/Linux game and WebGL2 build, including the Fuel/Controls/Temperature/Hull launch curriculum, asteroid belt, Jetpack EVA, and transferable Support Drone swarm</w:t>
+              <w:t>Living GDD for the playable native Vulkan Windows/Linux game and WebGL2 build, including the Fuel/Controls/Temperature/Hull launch curriculum, asteroid belt, Jetpack EVA, and Dynamic Drone Companions</w:t>
             </w:r>
           </w:p>
         </w:tc>
@@ -602,7 +602,7 @@
               <w:spacing w:before="0" w:after="0" w:line="264" w:lineRule="auto"/>
             </w:pPr>
             <w:r>
-              <w:t>OREBIT is a chunky space-mining roguelite where every major action asks the player to trade safety margin for progress: burn longer, land deeper, mine with shared fuel, or risk the Ark to reach New Earth.</w:t>
+              <w:t>OREBIT is a chunky space-mining roguelite about burrowing critters who trade safety margin for progress: burn longer, preserve transfer fuel for the rig, land deeper, or risk the Ark to reach New Earth.</w:t>
             </w:r>
           </w:p>
         </w:tc>
@@ -1278,7 +1278,7 @@
         <w:spacing w:before="0" w:after="120" w:line="264" w:lineRule="auto"/>
       </w:pPr>
       <w:r>
-        <w:t>OREBIT is a PC-first C++20 space-mining roguelite with genuine native x86-64 Windows and Linux builds through SDL 3 and direct Vulkan 1.3, plus a separate Emscripten/WebGL2 browser build for parity testing and sharing. It starts with a four-lesson launch curriculum—Fuel, Flight Controls, Temperature, and Hull—then grows into permanent ship systems, landings, surface expeditions, direct-control mining, Drone Bay loadouts, and an Ark campaign beyond the solar system. The repository and some internal identifiers retain the Rocket Rogue project name.</w:t>
+        <w:t>OREBIT is a chunky, colorful space-mining roguelite about a scrappy civilization of burrowing critters pushing its fragile space program farther than it was ever meant to go. Players launch under pressure, improvise around shrinking margins, descend into strange worlds, and decide how much danger to accept before bringing their crew, discoveries, and ore home.</w:t>
       </w:r>
     </w:p>
     <w:p>
@@ -1286,7 +1286,7 @@
         <w:spacing w:before="0" w:after="120" w:line="264" w:lineRule="auto"/>
       </w:pPr>
       <w:r>
-        <w:t>The fantasy is escalation. A fragile launch program becomes Straylight, a traveling survival base. The mandatory route runs through Moon, Mars, Jupiter, Saturn, Uranus, and Neptune. Only after Neptune does the Straylight reveal take over the screen; Aaru Vale and Arkfall then begin the long push to New Earth.</w:t>
+        <w:t>The promise is transformation. A single underpowered rocket grows into a capable expedition, then into Straylight: a traveling survival base carrying a burrowing civilization beyond the solar system in search of New Earth. Direct-control flight and mining expand into deeper exploration, ship and drone buildcraft, dangerous recoveries, and Dynamic Drone Companions that turn a lonely frontier into a living team.</w:t>
       </w:r>
     </w:p>
     <w:p>
@@ -1736,13 +1736,13 @@
                 <w:rFonts w:ascii="Calibri" w:hAnsi="Calibri"/>
                 <w:sz w:val="18"/>
               </w:rPr>
-            </w:r>
-            <w:r>
-              <w:rPr>
-                <w:rFonts w:ascii="Calibri" w:hAnsi="Calibri"/>
-                <w:sz w:val="18"/>
-              </w:rPr>
               <w:t>Mining as landed overburn</w:t>
+            </w:r>
+            <w:r>
+              <w:rPr>
+                <w:rFonts w:ascii="Calibri" w:hAnsi="Calibri"/>
+                <w:sz w:val="18"/>
+              </w:rPr>
             </w:r>
           </w:p>
         </w:tc>
@@ -1767,13 +1767,13 @@
                 <w:rFonts w:ascii="Calibri" w:hAnsi="Calibri"/>
                 <w:sz w:val="18"/>
               </w:rPr>
-            </w:r>
-            <w:r>
-              <w:rPr>
-                <w:rFonts w:ascii="Calibri" w:hAnsi="Calibri"/>
-                <w:sz w:val="18"/>
-              </w:rPr>
-              <w:t>The mining drone offers value under oxygen, fuel, heat, terrain, and later enemy pressure.</w:t>
+              <w:t>The Mining Rig offers value under oxygen, rig fuel, heat, terrain, and later enemy pressure.</w:t>
+            </w:r>
+            <w:r>
+              <w:rPr>
+                <w:rFonts w:ascii="Calibri" w:hAnsi="Calibri"/>
+                <w:sz w:val="18"/>
+              </w:rPr>
             </w:r>
           </w:p>
         </w:tc>
@@ -1798,13 +1798,13 @@
                 <w:rFonts w:ascii="Calibri" w:hAnsi="Calibri"/>
                 <w:sz w:val="18"/>
               </w:rPr>
-            </w:r>
-            <w:r>
-              <w:rPr>
-                <w:rFonts w:ascii="Calibri" w:hAnsi="Calibri"/>
-                <w:sz w:val="18"/>
-              </w:rPr>
-              <w:t>Mining remains one fuel-gated run per surface loop and resolves back into Surface Ops.</w:t>
+              <w:t>Mining remains one rig-fuel-gated run per surface loop and resolves back into Surface Ops; the return stage is never spendable.</w:t>
+            </w:r>
+            <w:r>
+              <w:rPr>
+                <w:rFonts w:ascii="Calibri" w:hAnsi="Calibri"/>
+                <w:sz w:val="18"/>
+              </w:rPr>
             </w:r>
           </w:p>
         </w:tc>
@@ -2010,7 +2010,7 @@
         <w:spacing w:before="0" w:after="120" w:line="264" w:lineRule="auto"/>
       </w:pPr>
       <w:r>
-        <w:t>Primary audience: PC players who want roguelite pressure, ship and drone loadouts, aerospace fantasy, and mining/extraction decisions without real-money gambling mechanics. The long-term target platform is Steam; current distribution uses portable native Windows/Linux archives and a separate WebGL build that tests and shares the same core game. Steamworks integration is future work, not part of the current platform layer.</w:t>
+        <w:t>Primary audience: PC players who want roguelite pressure, distinctive critter crews, ship and drone loadouts, aerospace fantasy, and mining/extraction decisions without real-money gambling mechanics. The long-term target platform is Steam; current distribution uses portable native Windows/Linux archives and a separate WebGL build that tests and shares the same core game. Steamworks integration is future work, not part of the current platform layer.</w:t>
       </w:r>
     </w:p>
     <w:p>
@@ -2232,7 +2232,7 @@
           </w:tcPr>
           <w:p>
             <w:r>
-              <w:t>Moon Fuel Survey, Controls Calibration, Mars thermal qualification, Jupiter asteroid belt, staged HUD, direct upgrades, and deterministic outcomes are implemented.</w:t>
+              <w:t>Moon Fuel Survey, Controls Calibration, Mars thermal qualification, Jupiter asteroid belt, staged HUD, Refit-driven upgrades, and deterministic outcomes are implemented.</w:t>
             </w:r>
           </w:p>
         </w:tc>
@@ -2324,13 +2324,7 @@
                 <w:rFonts w:ascii="Calibri" w:hAnsi="Calibri"/>
                 <w:sz w:val="17"/>
               </w:rPr>
-              <w:t>Direct Launch Upgrade rows, tutorial-safe economy, repair/recruit/train/rest operations, crew stress, and animal specialists are implemented.</w:t>
-            </w:r>
-            <w:r>
-              <w:rPr>
-                <w:rFonts w:ascii="Calibri" w:hAnsi="Calibri"/>
-                <w:sz w:val="17"/>
-              </w:rPr>
+              <w:t>Refit offers, installed-rank reporting, tutorial-safe economy, repair/recruit/train/rest operations, crew stress, and burrowing-critter specialists are implemented.</w:t>
             </w:r>
           </w:p>
         </w:tc>
@@ -2605,7 +2599,7 @@
           </w:tcPr>
           <w:p>
             <w:r>
-              <w:t>Direct-control mining now supports Rig and Jetpack operator modes, destination gravity and inertia, twin-stick aim, sidearm and hand drill actions, artifact tethering, loose chunks, suit-only routes, emergency ejection, and active-actor HUD/effects. Physical Steam Deck control and readability remain a release gate.</w:t>
+              <w:t>Direct-control mining now supports Rig and Jetpack operator modes, destination gravity and inertia, twin-stick aim, sidearm and hand drill actions, artifact tethering, loose chunks, suit-only routes, emergency ejection, and HUD/effects centered on the controlled character. Physical Steam Deck control and readability remain a release gate.</w:t>
             </w:r>
           </w:p>
         </w:tc>
@@ -2891,7 +2885,7 @@
         <w:spacing w:before="0" w:after="120" w:line="264" w:lineRule="auto"/>
       </w:pPr>
       <w:r>
-        <w:t>Humanity starts with one job: reach for the Moon with a rocket that cannot yet make the trip. A 10-unit tank can collect data halfway out and return; Fuel Tanks I raises capacity to the 15 units required for Moon transit and insertion. A second calibration teaches deliberately loose controls before Flight Controls I. Mars then introduces engine-cut cooling, and Jupiter introduces hull damage through a guaranteed-steerable asteroid belt. The Moon Prospector and Mars Bay Expansion contracts remain the story gates that open the Mars and Jupiter routes.</w:t>
+        <w:t>OREBIT begins with a civilization of burrowing critters looking up from their tunnels and reaching for the Moon. Each successful expedition brings home the knowledge, materials, and confidence to travel farther, land on harsher worlds, and uncover discoveries that reshape the mission. What starts as a grounded return-to-Earth space program becomes a survival odyssey aboard Straylight, with a crew of critter specialists and their drone companions pushing through the unknown toward New Earth.</w:t>
       </w:r>
     </w:p>
     <w:p>
@@ -2907,7 +2901,7 @@
         <w:pStyle w:val="ListBullet"/>
       </w:pPr>
       <w:r>
-        <w:t>Grounded aerospace pressure first: machinery, telemetry, crew stress, and resource margins drive the early drama.</w:t>
+        <w:t>Grounded aerospace pressure first: resourceful critters face dangerous machinery, hard telemetry, crew stress, and shrinking resource margins.</w:t>
       </w:r>
     </w:p>
     <w:p>
@@ -4410,7 +4404,7 @@
         <w:pStyle w:val="ListNumber"/>
       </w:pPr>
       <w:r>
-        <w:t>Turn around and actively fly home, complete the destination insertion, or trigger an explicit training rescue or flight failure; bank only the reward earned by that outcome.</w:t>
+        <w:t>Turn around and actively fly home, complete the destination transfer, or trigger an explicit training rescue or flight failure; validate only the telemetry and reward earned by that outcome.</w:t>
       </w:r>
     </w:p>
     <w:p>
@@ -4418,7 +4412,7 @@
         <w:pStyle w:val="ListNumber"/>
       </w:pPr>
       <w:r>
-        <w:t>Install the direct Launch rank unlocked by the lesson or keep the credits; normal repair, recruit, train, and rest operations resume after the opening curriculum.</w:t>
+        <w:t>Use Refit to install the permanent rank unlocked by the lesson or keep the credits; normal repair, recruit, train, and rest operations resume after the opening curriculum.</w:t>
       </w:r>
     </w:p>
     <w:p>
@@ -4458,7 +4452,7 @@
         <w:spacing w:before="0" w:after="120" w:line="264" w:lineRule="auto"/>
       </w:pPr>
       <w:r>
-        <w:t>Launch is a progressive skill curriculum. Fuel Survey runs centered at fixed 60% throttle with only Fuel visible: five units reach the halfway light and the remaining five return home, while Moon arrival visibly requires 10 transit fuel plus a 5-unit insertion reserve. Flight Controls Calibration then reveals persistent throttle and the corridor; input direction is always honored, while momentum, right-side oversteer, and seeded throttle-increase kicks teach correction before Flight Controls I. Mars reveals Temperature and the sole system action, Engines Off/On: cutting engines stops fuel and thrust, always cools the ship, preserves throttle, and lets coasting decay to zero. Jupiter reveals Hull plus ten seeded asteroids in five rows, each blocking two of three lanes with a guaranteed steerable opening. Pressure, relief valves, cargo jettison, manual eject, telemetry incidents, and hidden live crash rolls are absent. Training failures resolve as non-destructive rescues; skilled engine cuts or no-hit belt flying can bypass Cooling or Hull purchases.</w:t>
+        <w:t>Launch is a progressive skill curriculum. Fuel Survey runs centered at fixed 60% throttle with only Transfer fuel visible: five units reach the halfway light and the remaining five return home. Flight Controls Calibration then reveals persistent throttle and the corridor; input direction is always honored, while momentum, right-side oversteer, and seeded throttle-increase kicks teach correction before Flight Controls I. The Moon route requires 15 transfer capacity, Mars requires 20, and Jupiter requires 25. Transfer fuel may reach exactly zero on the destination frame; fuel exhausted before destination still fails. Mars reveals Temperature and Engines Off/On, while Jupiter reveals Hull and a guaranteed-steerable asteroid belt. Pressure, relief valves, cargo jettison, manual eject, telemetry incidents, and hidden live crash rolls are absent. Training failures resolve as non-destructive rescues; skilled engine cuts or no-hit belt flying can bypass Cooling or Hull purchases.</w:t>
       </w:r>
     </w:p>
     <w:tbl>
@@ -4672,7 +4666,7 @@
                 <w:rFonts w:ascii="Calibri" w:hAnsi="Calibri"/>
                 <w:sz w:val="18"/>
               </w:rPr>
-              <w:t>Fuel range, control chaos, powered heat, and asteroid impacts.</w:t>
+              <w:t>Fuel range, flight instability, powered heat, and asteroid impacts.</w:t>
             </w:r>
             <w:r>
               <w:rPr>
@@ -4734,7 +4728,7 @@
                 <w:rFonts w:ascii="Calibri" w:hAnsi="Calibri"/>
                 <w:sz w:val="18"/>
               </w:rPr>
-              <w:t>Buy predictable 22-credit safety margin or rely on skill where the route allows it.</w:t>
+              <w:t>Buy predictable permanent margin through Refit: Common ranks cost 22 credits, while Prototype Fuel Tanks III costs 92.</w:t>
             </w:r>
             <w:r>
               <w:rPr>
@@ -4832,7 +4826,7 @@
                 <w:rFonts w:ascii="Calibri" w:hAnsi="Calibri"/>
                 <w:sz w:val="18"/>
               </w:rPr>
-              <w:t>Training, recovery, and class identity remain visible outside the direct Launch tracks.</w:t>
+              <w:t>Training, recovery, and class identity remain visible outside the launch-system tracks.</w:t>
             </w:r>
             <w:r>
               <w:rPr>
@@ -4957,7 +4951,7 @@
               <w:spacing w:before="0" w:after="60" w:line="259" w:lineRule="auto"/>
             </w:pPr>
             <w:r>
-              <w:t>One taught mechanic and one direct upgrade unlock per lesson.</w:t>
+              <w:t>One taught mechanic and one permanent Refit track unlock per lesson.</w:t>
             </w:r>
           </w:p>
         </w:tc>
@@ -5080,7 +5074,7 @@
                 <w:rFonts w:ascii="Calibri" w:hAnsi="Calibri"/>
                 <w:sz w:val="18"/>
               </w:rPr>
-              <w:t>Faster transfers and preserved route reserve.</w:t>
+              <w:t>Faster transfers and more transfer fuel remaining for the rig.</w:t>
             </w:r>
             <w:r>
               <w:rPr>
@@ -5137,7 +5131,7 @@
         <w:spacing w:before="0" w:after="120" w:line="264" w:lineRule="auto"/>
       </w:pPr>
       <w:r>
-        <w:t>Successful transfers open flyby, orbit, and landing operations. Optional activities retain saved first-use help, while authored campaign steps use mandatory non-dismissible briefings, visible LOCKED/ACTIVE/READY TO CLAIM/COMPLETE objectives, and named claim actions. The Moon requires 30 safely delivered local Common Ore before Install Prospector Mk I grants the first Mining Support Drone, Slot 1, and the Mars route key. Mars requires 40 local Common Ore before Fabricate Drone Bay Slot 2 opens an empty specialist slot and grants the Jupiter route key; its briefing explicitly introduces oxygen, drill heat, integrity wear, field repairs, cargo, and the return decision. Io commissions Hazard Mk I, launches a configured two-layer lava cocoon around a protected objective, and awards one player-selected Support Drone upgrade credit after safe extraction. A dedicated Perfect Jupiter Flyby scenario then makes the Saturn route claimable. A route that has an authored unlock requirement never adds a hidden Flight Data requirement after that key is claimed. Mars remains the first broad research frontier.</w:t>
+        <w:t>Successful transfers open flyby, orbit, and landing operations without discarding the exact transfer fuel remaining or installed capacity. Arrival Ops previews Transfer fuel remaining, Rig fuel after landing, and Return stage readiness. Optional activities retain saved first-use help, while authored campaign steps use mandatory non-dismissible briefings, visible LOCKED/ACTIVE/READY TO CLAIM/COMPLETE objectives, and named claim actions. The Moon requires 30 safely delivered local Common Ore before Install Prospector Mk I grants the first Mining Support Drone, Slot 1, and the Mars route key. Mars requires 40 local Common Ore before Fabricate Drone Bay Slot 2 opens an empty specialist slot and grants the Jupiter route key; its briefing explicitly introduces oxygen, drill heat, integrity wear, field repairs, cargo, and the return decision. Io commissions Hazard Mk I, launches a configured two-layer lava cocoon around a protected objective, and awards one player-selected Support Drone upgrade credit after safe extraction. A dedicated Perfect Jupiter Flyby scenario then makes the Saturn route claimable. Mars remains the first broad research frontier.</w:t>
       </w:r>
     </w:p>
     <w:tbl>
@@ -5741,7 +5735,7 @@
                 <w:rFonts w:ascii="Calibri" w:hAnsi="Calibri"/>
                 <w:sz w:val="18"/>
               </w:rPr>
-              <w:t>Survey or Push Deeper prepares one fuel-only mining run; Drone Ops, gate forecasts, extraction, hazard/events, and a bounded log support the decision.</w:t>
+              <w:t>Survey or Push Deeper prepares one rig-fuel mining run; Drone Ops, gate forecasts, extraction, hazard/events, and a bounded log support the decision.</w:t>
             </w:r>
             <w:r>
               <w:rPr>
@@ -5767,13 +5761,13 @@
         <w:spacing w:before="0" w:after="120" w:line="264" w:lineRule="auto"/>
       </w:pPr>
       <w:r>
-        <w:t>Mining remains one fuel-only deployment per surface loop and begins in the player-controlled Mining Rig; autonomous bay units are Support Drones. Ordinary Regolith breaks only to make a path and never yields material. Common Ore uses a gray/silver body and shimmer, while gold marks Rare Ore. The Io scenario configures a Thermal-lava site: no Cryo or direct ore deposits, deterministic lava-to-Common treatment, and a 60-second baseline for its introductory protected-objective recovery while normal missions retain 30 seconds. Layered cocoons are reusable site definitions: layers define their patterns, reveal triggers, hazard affinity, drilling rule, presentation label, and protected-objective adapter; mechanics do not recognize an artifact or destination ID. Both rig and operator use inertial fixed-step movement under vector-valued destination gravity. The rig moves at 7.2 cells/s maximum with 14 cells/s2 acceleration, 20 cells/s2 braking, and a 0.48-cell collider. The suit moves at 4.6 cells/s maximum with 28 cells/s2 acceleration, 24 cells/s2 braking, and a 0.25-cell collider. Base gravity is 6 cells/s2 multiplied by the destination's gravity scale; direction and strength are stored separately so later local or inverted fields do not require a state redesign.</w:t>
+        <w:t>Mining remains one rig-fuel deployment per surface loop and begins in the player-controlled Mining Rig; autonomous bay units are Support Drones. Each pre-Ark landing combines an isolated 3-unit expedition pack with the exact transfer fuel remaining at touchdown. Ark-era landings debit up to 3 pack units from the Ark reserve once, then add the transfer remainder. Deployment spends 1 rig fuel and each completed 15-second operating cycle spends 1 more; depletion away from the ship triggers emergency recall without touching the protected return stage. Ordinary Regolith breaks only to make a path and never yields material. Common Ore uses a gray/silver body and shimmer, while gold marks Rare Ore. The Io scenario configures a Thermal-lava site with a 60-second oxygen baseline while normal missions retain 30 seconds. Both rig and operator use inertial fixed-step movement under vector-valued destination gravity.</w:t>
       </w:r>
     </w:p>
     <w:p>
       <w:pPr/>
       <w:r>
-        <w:t>Rig controls remain unchanged. In EVA, WASD or the left stick thrusts; the mouse or right stick aims independently; left click or R2/RT fires the automatic sidearm; right click or L2/LT runs the hand drill; E/X scans; T/Y toggles the artifact tether; and F immediately exits or enters. Holding A for 0.6 seconds exits or enters with an EXIT/ENTER progress ring around the rig, while a shorter A release retains the existing bank/leave action. Held actions clear on pause, modal entry, focus loss, disconnect, and input-source switching.</w:t>
+        <w:t>Rig controls remain unchanged. In EVA, WASD or the left stick thrusts; the mouse or right stick aims independently; left click or R2/RT fires the automatic sidearm; right click or L2/LT runs the hand drill; E/X scans; T/Y toggles the artifact tether; and F immediately exits or enters. Holding A for 0.6 seconds exits or enters with an EXIT/ENTER progress ring around the rig, while a shorter A release retains the existing stow/leave action. Held actions clear on pause, modal entry, focus loss, disconnect, and input-source switching.</w:t>
       </w:r>
     </w:p>
     <w:tbl>
@@ -5923,13 +5917,13 @@
                 <w:rFonts w:ascii="Calibri" w:hAnsi="Calibri"/>
                 <w:sz w:val="18"/>
               </w:rPr>
-            </w:r>
-            <w:r>
-              <w:rPr>
-                <w:rFonts w:ascii="Calibri" w:hAnsi="Calibri"/>
-                <w:sz w:val="18"/>
-              </w:rPr>
-              <w:t>Shared fuel / Ark fuel</w:t>
+              <w:t>Transfer fuel / Rig fuel / Return stage</w:t>
+            </w:r>
+            <w:r>
+              <w:rPr>
+                <w:rFonts w:ascii="Calibri" w:hAnsi="Calibri"/>
+                <w:sz w:val="18"/>
+              </w:rPr>
             </w:r>
           </w:p>
         </w:tc>
@@ -5954,13 +5948,13 @@
                 <w:rFonts w:ascii="Calibri" w:hAnsi="Calibri"/>
                 <w:sz w:val="18"/>
               </w:rPr>
-            </w:r>
-            <w:r>
-              <w:rPr>
-                <w:rFonts w:ascii="Calibri" w:hAnsi="Calibri"/>
-                <w:sz w:val="18"/>
-              </w:rPr>
-              <w:t>Deployment and ongoing run cadence.</w:t>
+              <w:t>Arrival surplus, 1-unit deployment, and 15-second operating-cycle cadence.</w:t>
+            </w:r>
+            <w:r>
+              <w:rPr>
+                <w:rFonts w:ascii="Calibri" w:hAnsi="Calibri"/>
+                <w:sz w:val="18"/>
+              </w:rPr>
             </w:r>
           </w:p>
         </w:tc>
@@ -5985,13 +5979,13 @@
                 <w:rFonts w:ascii="Calibri" w:hAnsi="Calibri"/>
                 <w:sz w:val="18"/>
               </w:rPr>
-            </w:r>
-            <w:r>
-              <w:rPr>
-                <w:rFonts w:ascii="Calibri" w:hAnsi="Calibri"/>
-                <w:sz w:val="18"/>
-              </w:rPr>
-              <w:t>Must be visible as the shuttle-vs-drone tradeoff.</w:t>
+              <w:t>Arrival Ops previews all three pools; Surface Ops and Mining show fractional Rig fuel while the return stage remains READY/RESERVED.</w:t>
+            </w:r>
+            <w:r>
+              <w:rPr>
+                <w:rFonts w:ascii="Calibri" w:hAnsi="Calibri"/>
+                <w:sz w:val="18"/>
+              </w:rPr>
             </w:r>
           </w:p>
         </w:tc>
@@ -6493,13 +6487,13 @@
     <w:p>
       <w:pPr/>
       <w:r>
-        <w:t>Suit-only passages admit the operator and mini drones but block the rig and artifact. The operator may change depth while the parked rig stays on its layer; the operator, validly tethered artifact, and swarm transition together. Runs start in the rig. Exit needs a safe adjacent suit position; entry needs the same layer within 1.25 cells. Rig destruction emergency-ejects the operator safely and disables the wreck before combat updates. Cargo stays with the wreck, banked payload stays safe, and an operator-tethered artifact stays attached.</w:t>
+        <w:t>Suit-only passages admit the operator and Support Drones but block the rig and artifact. The operator may change depth while the parked rig stays on its layer; the operator, validly tethered artifact, and drone companions transition together. Runs start in the rig. Exit needs a safe adjacent suit position; entry needs the same layer within 1.25 cells. Rig destruction emergency-ejects the operator safely and disables the wreck before combat updates. Cargo stays with the wreck, stowed ship payload stays safe, and an operator-tethered artifact stays attached.</w:t>
       </w:r>
     </w:p>
     <w:p>
       <w:pPr/>
       <w:r>
-        <w:t>Normal extraction requires a functioning rig and operator in the return zone. After emergency ejection, the shuttle ends the deployment safely and may bank a physically delivered artifact. Zero suit integrity releases the tether, freezes the swarm, and ends the run; shuttle repair spends banked Common material.</w:t>
+        <w:t>Normal extraction requires a functioning rig and operator in the return zone. After emergency ejection, the shuttle ends the deployment safely and may secure a physically delivered artifact. Zero suit integrity releases the tether, recalls the drone companions, and ends the run; shuttle repair spends stowed Common material.</w:t>
       </w:r>
     </w:p>
     <w:p>
@@ -6515,7 +6509,7 @@
         <w:spacing w:before="0" w:after="120" w:line="264" w:lineRule="auto"/>
       </w:pPr>
       <w:r>
-        <w:t>After Arkfall near Khepri Prime, Navigation becomes the mission-selection layer. The player chooses local destinations from the damaged Ark, spends Ark fuel, prepares a shuttle sortie, flies the press-your-luck transfer, lands or orbits, mines/researches under hostile pressure, then returns to the Ark with fuel, materials, artifacts, and repair leads.</w:t>
+        <w:t>After Arkfall near Khepri Prime, Navigation becomes the mission-selection layer. The player chooses local destinations from the damaged Ark, spends Ark fuel on the sortie, loads up to 3 additional units into the expedition rig pack, flies the press-your-luck transfer, lands or orbits, mines/researches under hostile pressure, then returns to the Ark with recovered fuel, materials, artifacts, and repair leads. The return stage stays independent of Ark and rig fuel.</w:t>
       </w:r>
     </w:p>
     <w:p>
@@ -6552,7 +6546,7 @@
         <w:spacing w:before="0" w:after="120" w:line="264" w:lineRule="auto"/>
       </w:pPr>
       <w:r>
-        <w:t>Launch progression uses four direct permanent tracks rather than the retired Reach/Control/Recovery proving ladder. Fuel Tanks, Flight Controls, Engine Cooling, and Hull Plating each have three predictable ranks at 22 credits. Lesson results expose only the newly taught upgrade; Ship Details always shows current rank, next numerical effect, Install, and Keep Credits. Other permanent systems remain available to Flyby, Orbit, Mining, crew, and later research without changing live launch survival.</w:t>
+        <w:t>Launch progression uses four direct permanent tracks rather than the retired Reach/Control/Recovery proving ladder. Fuel Tanks, Flight Controls, Engine Cooling, and Hull Plating each have three predictable ranks purchased through Refit. Common ranks cost 22 credits; Fuel Tanks III is a 92-credit Prototype. Fuel Tanks II is a taught post-Moon offer, while Fuel Tanks III is pinned after the first Mars contract until purchased. Ship Details reports installed ranks and transfer capacity but is not a parallel storefront. Cooling, Controls, and Hull may appear in ordinary three-choice Refits and add margin without becoming launch blockers.</w:t>
       </w:r>
     </w:p>
     <w:tbl>
@@ -6764,7 +6758,7 @@
                 <w:rFonts w:ascii="Calibri" w:hAnsi="Calibri"/>
                 <w:sz w:val="18"/>
               </w:rPr>
-              <w:t>Rank I after Fuel Survey; II with Mars; III with Jupiter.</w:t>
+              <w:t>Rank I after Fuel Survey; II is the taught 22-credit post-Moon Refit; III is the pinned 92-credit Prototype after the first Mars contract.</w:t>
             </w:r>
             <w:r>
               <w:rPr>
@@ -6831,7 +6825,7 @@
                 <w:rFonts w:ascii="Calibri" w:hAnsi="Calibri"/>
                 <w:sz w:val="18"/>
               </w:rPr>
-              <w:t>Chaos: 1.00 / 0.55 / 0.20 / 0.00.</w:t>
+              <w:t>Flight instability: 1.00 / 0.55 / 0.20 / 0.00.</w:t>
             </w:r>
             <w:r>
               <w:rPr>
@@ -7090,7 +7084,7 @@
           <w:i w:val="0"/>
           <w:sz w:val="22"/>
         </w:rPr>
-        <w:t>Crew are animal specialists with class identity, training, stress, injury, death, and memorial consequences. Training and stress continue to shape crew and non-launch systems, but neither creates a hidden launch survival roll. Replacement recruitment prevents dead-roster soft locks while preserving loss.</w:t>
+        <w:t>The crew are burrowing critter specialists with class identity, training, stress, injury, death, and memorial consequences. Species-inspired roles give the roster warmth and personality. Training and stress continue to shape crew and non-launch systems, but neither creates a hidden launch survival roll. Replacement recruitment prevents dead-roster soft locks while preserving loss.</w:t>
       </w:r>
     </w:p>
     <w:tbl>
@@ -8128,7 +8122,7 @@
                 <w:rFonts w:ascii="Calibri" w:hAnsi="Calibri"/>
                 <w:sz w:val="18"/>
               </w:rPr>
-              <w:t>Unlocks one direct Launch Upgrade and the next taught transfer gate.</w:t>
+              <w:t>Unlocks one permanent Refit track and the next taught transfer gate.</w:t>
             </w:r>
             <w:r>
               <w:rPr>
@@ -8448,13 +8442,13 @@
                 <w:rFonts w:ascii="Calibri" w:hAnsi="Calibri"/>
                 <w:sz w:val="18"/>
               </w:rPr>
-            </w:r>
-            <w:r>
-              <w:rPr>
-                <w:rFonts w:ascii="Calibri" w:hAnsi="Calibri"/>
-                <w:sz w:val="18"/>
-              </w:rPr>
-              <w:t>Shared fuel / Ark fuel</w:t>
+              <w:t>Transfer fuel / expedition pack / Rig fuel</w:t>
+            </w:r>
+            <w:r>
+              <w:rPr>
+                <w:rFonts w:ascii="Calibri" w:hAnsi="Calibri"/>
+                <w:sz w:val="18"/>
+              </w:rPr>
             </w:r>
           </w:p>
         </w:tc>
@@ -8479,13 +8473,13 @@
                 <w:rFonts w:ascii="Calibri" w:hAnsi="Calibri"/>
                 <w:sz w:val="18"/>
               </w:rPr>
-            </w:r>
-            <w:r>
-              <w:rPr>
-                <w:rFonts w:ascii="Calibri" w:hAnsi="Calibri"/>
-                <w:sz w:val="18"/>
-              </w:rPr>
-              <w:t>Surface expedition reserve and Ark reserve.</w:t>
+              <w:t>Transfer remainder, isolated 3-unit pack or Ark-loaded pack, and the derived spendable pool.</w:t>
+            </w:r>
+            <w:r>
+              <w:rPr>
+                <w:rFonts w:ascii="Calibri" w:hAnsi="Calibri"/>
+                <w:sz w:val="18"/>
+              </w:rPr>
             </w:r>
           </w:p>
         </w:tc>
@@ -8510,13 +8504,13 @@
                 <w:rFonts w:ascii="Calibri" w:hAnsi="Calibri"/>
                 <w:sz w:val="18"/>
               </w:rPr>
-            </w:r>
-            <w:r>
-              <w:rPr>
-                <w:rFonts w:ascii="Calibri" w:hAnsi="Calibri"/>
-                <w:sz w:val="18"/>
-              </w:rPr>
-              <w:t>Mining deployment/cadence, shuttle routes, Navigation sorties.</w:t>
+              <w:t>Mining deployment/cadence and arrival efficiency; Navigation uses Ark reserve separately and the return stage remains protected.</w:t>
+            </w:r>
+            <w:r>
+              <w:rPr>
+                <w:rFonts w:ascii="Calibri" w:hAnsi="Calibri"/>
+                <w:sz w:val="18"/>
+              </w:rPr>
             </w:r>
           </w:p>
         </w:tc>
@@ -8528,7 +8522,7 @@
         <w:pStyle w:val="Heading2"/>
       </w:pPr>
       <w:r>
-        <w:t>Drone Bay And Active-Actor Defense</w:t>
+        <w:t>Drone Bay And Dynamic Drone Companions</w:t>
       </w:r>
     </w:p>
     <w:p>
@@ -8686,13 +8680,13 @@
                 <w:rFonts w:ascii="Calibri" w:hAnsi="Calibri"/>
                 <w:sz w:val="18"/>
               </w:rPr>
-            </w:r>
-            <w:r>
-              <w:rPr>
-                <w:rFonts w:ascii="Calibri" w:hAnsi="Calibri"/>
-                <w:sz w:val="18"/>
-              </w:rPr>
-              <w:t>Mining Drone</w:t>
+              <w:t>Mining Support Drone</w:t>
+            </w:r>
+            <w:r>
+              <w:rPr>
+                <w:rFonts w:ascii="Calibri" w:hAnsi="Calibri"/>
+                <w:sz w:val="18"/>
+              </w:rPr>
             </w:r>
           </w:p>
         </w:tc>
@@ -9091,7 +9085,7 @@
                 <w:rFonts w:ascii="Calibri" w:hAnsi="Calibri"/>
                 <w:sz w:val="18"/>
               </w:rPr>
-              <w:t>Active-actor-centered shots, target priority, critical-hit tuning, area control, and enemy slowdown after Arkfall.</w:t>
+              <w:t>Fights beside the controlled character with target priority, critical-hit tuning, area control, and enemy slowdown after Arkfall.</w:t>
             </w:r>
           </w:p>
         </w:tc>
@@ -9205,7 +9199,7 @@
     <w:p>
       <w:pPr/>
       <w:r>
-        <w:t>Task search, target scoring, field of view, shield arcs, scanner origins, collision clearance, and combat/support effects use the resolved active-actor frame. Attack drones choose threats near that anchor; Defense drones intercept damage there before routing any remainder to rig health or suit integrity. Mining, Resource, Survey, and Hazard roles make bounded sorties. A hauling drone detaches to unload only when the active actor is on the entry layer near the shuttle; otherwise it preserves its haul and follows.</w:t>
+        <w:t>The implementation resolves an active-actor frame - the currently controlled rig or EVA operator - for task search, target scoring, field of view, shield arcs, scanner origins, collision clearance, and combat/support effects. Attack drones choose threats near that anchor; Defense drones intercept damage there before routing any remainder to rig health or suit integrity. Mining, Resource, Survey, and Hazard roles make bounded sorties. A hauling drone detaches to unload only when the active actor is on the entry layer near the shuttle; otherwise it preserves its haul and follows.</w:t>
       </w:r>
     </w:p>
     <w:p>
@@ -9227,7 +9221,7 @@
         <w:spacing w:before="0" w:after="120" w:line="264" w:lineRule="auto"/>
       </w:pPr>
       <w:r>
-        <w:t>The game can hurt the player without dead-ending the campaign. Ships can be lost and installed systems can go offline for the expedition, but permanent ownership survives replacement. Astronauts die or come home injured. Memorials persist. Rescue costs bite. Records, unlocks, blueprints, facilities, artifacts, drones, and saved onboarding state keep the program moving.</w:t>
+        <w:t>The game can hurt the player without dead-ending the campaign. Ships can be lost and installed systems can go offline for the expedition, but permanent ownership survives replacement. Crew members can die or come home injured. Memorials persist. Rescue costs bite. Records, unlocks, blueprints, facilities, artifacts, drones, and saved onboarding state keep the program moving.</w:t>
       </w:r>
     </w:p>
     <w:p>
@@ -9246,6 +9240,7 @@
     <w:p>
       <w:pPr>
         <w:pStyle w:val="Heading1"/>
+        <w:pageBreakBefore w:val="0"/>
       </w:pPr>
       <w:r>
         <w:t>5. Content Inventory</w:t>
@@ -10660,7 +10655,7 @@
         <w:pStyle w:val="ListBullet"/>
       </w:pPr>
       <w:r>
-        <w:t>Do not hide tradeoffs or goals: shared fuel, Ark fuel, oxygen, return risk, extraction pressure, Support Drone availability, carried/aboard/delivered contract ore, configured cocoon layers, protected-objective recovery, and the Perfect-required Saturn slingshot stay visible. The shared objective strip always identifies the authored scenario step, numeric or segmented progress, next action, and reward preview; text and icons communicate state in addition to color.</w:t>
+        <w:t>Do not hide tradeoffs or goals: Transfer fuel, the 3-unit expedition pack, Rig fuel, the reserved return stage, Ark reserve fuel, oxygen, extraction pressure, Support Drone availability, carried/aboard/delivered contract ore, configured cocoon layers, protected-objective recovery, and the Perfect-required Saturn slingshot stay visible. The shared objective strip always identifies the authored scenario step, numeric or segmented progress, next action, and reward preview; text and icons communicate state in addition to color.</w:t>
       </w:r>
     </w:p>
     <w:p>
@@ -10879,7 +10874,7 @@
           </w:tcPr>
           <w:p>
             <w:r>
-              <w:t>Portable deterministic rules: versioned content, authored/procedural scenarios, RNG, progression, saves, flight, research, mining, objective/reward routing, presentation helpers, and tuning. No platform APIs.</w:t>
+              <w:t>Portable deterministic C++20 rules: versioned content, authored/procedural scenarios, RNG, progression, saves, flight, research, mining, objective/reward routing, presentation helpers, and tuning. No platform APIs.</w:t>
             </w:r>
           </w:p>
         </w:tc>
@@ -11084,7 +11079,7 @@
           </w:tcPr>
           <w:p>
             <w:r>
-              <w:t>Emscripten entry point, browser storage, asynchronous images, Web Gamepad, DOM bridge, and browser host behavior.</w:t>
+              <w:t>Emscripten/WebGL2 browser target: browser storage, asynchronous images, Web Gamepad, DOM bridge, and browser host behavior.</w:t>
             </w:r>
           </w:p>
         </w:tc>
@@ -11109,7 +11104,7 @@
           </w:tcPr>
           <w:p>
             <w:r>
-              <w:t>SDL 3 window and Vulkan surface, input/gamepads, haptics, native storage, PNG decode, fullscreen, high-DPI metrics, and shutdown.</w:t>
+              <w:t>Native x86-64 Windows/Linux target: SDL 3 window and Vulkan surface, input/gamepads, haptics, native storage, PNG decode, fullscreen, high-DPI metrics, and shutdown.</w:t>
             </w:r>
           </w:p>
         </w:tc>
@@ -11164,7 +11159,7 @@
     <w:p>
       <w:pPr>
         <w:pStyle w:val="Heading2"/>
-        <w:pageBreakBefore/>
+        <w:pageBreakBefore w:val="0"/>
       </w:pPr>
       <w:r>
         <w:t>Save And Migration Rules</w:t>
@@ -11175,7 +11170,7 @@
         <w:spacing w:before="0" w:after="120" w:line="264" w:lineRule="auto"/>
       </w:pPr>
       <w:r>
-        <w:t>The current save format is version 10, line-based, and dependency-free. It retains version 9 scenario, mining-site, cocoon, protected-objective, and Support Drone state while adding Launch Upgrade ranks and completion for Fuel, Controls, Temperature, and Asteroids. Migration keeps earth_orbit at internal index 0, sends a truly pristine v9 campaign to the zero-credit Moon tutorial, maps progressed Earth saves conservatively, grants location-appropriate minimum ranks to Moon-or-later saves, and converts retired proving-card ownership before unknown IDs are pruned. Active flight and asteroid layouts remain session-only.</w:t>
+        <w:t>The current save format is version 11, line-based, and dependency-free. It retains version 10 scenario, mining-site, cocoon, protected-objective, Support Drone, launch-upgrade, and lesson state while adding double-precision Arrival Ops transfer fuel/capacity and Surface Ops rig-fuel capacity, remaining fuel, recovered transfer fuel, and expedition-pack fuel. Version 10 active expeditions migrate from the former 30-unit surface pool to nominal route-derived rig fuel while preserving the percentage consumed; active Mining runs remain active. Version 10 Arrival Ops receives the calibrated route remainder and installed transfer capacity. Earlier migrations continue to run in order before the version 11 fuel conversion.</w:t>
       </w:r>
     </w:p>
     <w:p>
@@ -11191,7 +11186,7 @@
         <w:spacing w:before="0" w:after="120" w:line="264" w:lineRule="auto"/>
       </w:pPr>
       <w:r>
-        <w:t>Core tests are design contracts for exact 5-out/5-back survey fuel, insertion reserve, throttle range, seeded control repeatability and monotonic rank improvement, engine-off cooling and coast decay, deterministic traversable asteroid belts, swept impacts, rank-based hull damage, training-rescue economy, version-10 migration, generic scenario events/actions/rewards, route-key evaluation, Surface Ops, deterministic mining, Rig/EVA physics, and Support Drone behavior. Large seeded policies must prove no random or impossible early-route deaths while ignored warnings, unmanaged controls, full-throttle heat, and repeated impacts still fail.</w:t>
+        <w:t>Core tests are design contracts for exact survey fuel, zero-at-touchdown success, early transfer-fuel exhaustion, Arrival Ops save/load and flyby/orbit preservation, 3/5/8-unit rig-fuel derivation, deployment and 15-second cycle consumption, tank-driven endurance, Ark pack debit, protected return readiness, version-11 round trips, active version-10 Surface/Mining migration, generic scenario events/actions/rewards, route-key evaluation, deterministic mining, Rig/EVA physics, and Support Drone behavior. Large seeded policies must prove no random or impossible early-route deaths while ignored warnings, unmanaged controls, full-throttle heat, and repeated impacts still fail.</w:t>
       </w:r>
     </w:p>
     <w:tbl>
@@ -11345,7 +11340,7 @@
                 <w:rFonts w:ascii="Calibri" w:hAnsi="Calibri"/>
                 <w:sz w:val="17"/>
               </w:rPr>
-              <w:t>New games start Moon-bound with zero credits; four lesson milestones, direct ranks, route gates, version-10 migration, and no chapter rollback are covered.</w:t>
+              <w:t>New games start Moon-bound with zero credits; four lesson milestones, permanent Refit purchases, route gates, version-10 migration, and no chapter rollback are covered.</w:t>
             </w:r>
             <w:r>
               <w:rPr>
@@ -11412,7 +11407,7 @@
                 <w:rFonts w:ascii="Calibri" w:hAnsi="Calibri"/>
                 <w:sz w:val="17"/>
               </w:rPr>
-              <w:t>Mining requires prepared Surface Ops and shared fuel; tests cover oxygen/heat, rig and suit mobility, vector gravity, twin-stick aim, sidearm/drill/scanner/tether behavior, loose chunks, suit-only passages, depth transitions, recovery, extraction, resolved authored/procedural mining sites, layered cocoon reveal/excavation, and protected-objective gates.</w:t>
+              <w:t>Mining requires prepared Surface Ops and at least 1 rig fuel; tests cover transfer-to-rig derivation, protected return readiness, oxygen/heat, rig and suit mobility, vector gravity, twin-stick aim, sidearm/drill/scanner/tether behavior, loose chunks, suit-only passages, depth transitions, recovery, extraction, resolved authored/procedural mining sites, layered cocoon reveal/excavation, and protected-objective gates.</w:t>
             </w:r>
           </w:p>
         </w:tc>
@@ -11669,7 +11664,7 @@
           </w:tcPr>
           <w:p>
             <w:r>
-              <w:t>Exact survey fuel, reserves, throttle tradeoffs, control repeatability, cooling, coast decay, traversable belts, swept collisions, hull ranks, staged UI/input, tutorial economy, and 5,000-seed policies per early destination.</w:t>
+              <w:t>Exact survey fuel, zero-at-touchdown handling, Arrival Ops persistence, transfer-to-rig derivation, throttle tradeoffs, control repeatability, cooling, coast decay, traversable belts, swept collisions, hull ranks, staged UI/input, tutorial economy, and 5,000-seed policies per early destination.</w:t>
             </w:r>
           </w:p>
         </w:tc>
@@ -11692,6 +11687,7 @@
     <w:p>
       <w:pPr>
         <w:pStyle w:val="Heading1"/>
+        <w:pageBreakBefore w:val="0"/>
       </w:pPr>
       <w:r>
         <w:t>8. Roadmap And Open Questions</w:t>
@@ -12135,7 +12131,7 @@
               <w:spacing w:before="0" w:after="60" w:line="259" w:lineRule="auto"/>
             </w:pPr>
             <w:r>
-              <w:t>Khepri Prime/Rift maps, active-actor-centered swarm combat reads, rewards, and recovery paths play differently from Aaru Vale.</w:t>
+              <w:t>Khepri Prime/Rift maps, Dynamic Drone Companion combat, rewards, and recovery paths play differently from Aaru Vale.</w:t>
             </w:r>
           </w:p>
         </w:tc>
@@ -12367,7 +12363,7 @@
         <w:pStyle w:val="ListBullet"/>
       </w:pPr>
       <w:r>
-        <w:t>What artifact tone should the game settle on: ancient alien mystery, lost human infrastructure, cosmic horror, or grounded scientific anomaly?</w:t>
+        <w:t>What artifact tone should the game settle on: ancient alien mystery, lost precursor infrastructure, cosmic horror, or grounded scientific anomaly?</w:t>
       </w:r>
     </w:p>
     <w:p>
@@ -12391,7 +12387,7 @@
         <w:pStyle w:val="ListBullet"/>
       </w:pPr>
       <w:r>
-        <w:t>How should the animal crew abilities become more active without breaking the current launch and mining loops?</w:t>
+        <w:t>How should the critter crew abilities become more active without breaking the current launch and mining loops?</w:t>
       </w:r>
     </w:p>
     <w:p>
@@ -13002,7 +12998,7 @@
               <w:spacing w:before="0" w:after="60" w:line="259" w:lineRule="auto"/>
             </w:pPr>
             <w:r>
-              <w:t>Primary direction: planet/resource pillars, chunky Ark/Straylight art, animal classes, passive defense.</w:t>
+              <w:t>Primary direction: planet/resource pillars, chunky Ark/Straylight art, critter classes, passive defense.</w:t>
             </w:r>
           </w:p>
         </w:tc>
@@ -13130,7 +13126,7 @@
                 <w:rFonts w:ascii="Calibri" w:hAnsi="Calibri"/>
                 <w:sz w:val="18"/>
               </w:rPr>
-              <w:t>Implemented versioned content, scenario framework, route-key evaluation, Rig/EVA mining, reusable cocoon/protected-objective adapters, transferable mini-drone anchors, save v9 migration, presentation helpers, and regression coverage.</w:t>
+              <w:t>Implemented versioned content, scenario framework, route-key evaluation, Rig/EVA mining, reusable cocoon/protected-objective adapters, transferable Support Drone anchors, save-v11 transfer/rig-fuel migration, presentation helpers, and regression coverage.</w:t>
             </w:r>
           </w:p>
         </w:tc>

</xml_diff>

<commit_message>
Add Uranus to Neptune story beat
</commit_message>
<xml_diff>
--- a/docs/Rocket_Rogue_Game_Design_Document.docx
+++ b/docs/Rocket_Rogue_Game_Design_Document.docx
@@ -52,40 +52,7 @@
         <w:spacing w:before="0" w:after="200" w:line="264" w:lineRule="auto"/>
         <w:jc w:val="center"/>
       </w:pPr>
-      <w:r>
-        <w:drawing>
-          <wp:inline xmlns:a="http://schemas.openxmlformats.org/drawingml/2006/main" xmlns:pic="http://schemas.openxmlformats.org/drawingml/2006/picture">
-            <wp:extent cx="4480560" cy="4480560"/>
-            <wp:docPr id="1" name="Picture 1" title="Operational Ark" descr="Operational Ark sprite used for the Breakthrough and Straylight campaign state."/>
-            <wp:cNvGraphicFramePr>
-              <a:graphicFrameLocks noChangeAspect="1"/>
-            </wp:cNvGraphicFramePr>
-            <a:graphic>
-              <a:graphicData uri="http://schemas.openxmlformats.org/drawingml/2006/picture">
-                <pic:pic>
-                  <pic:nvPicPr>
-                    <pic:cNvPr id="0" name="ark-operational.png"/>
-                    <pic:cNvPicPr/>
-                  </pic:nvPicPr>
-                  <pic:blipFill>
-                    <a:blip r:embed="rId10"/>
-                    <a:stretch>
-                      <a:fillRect/>
-                    </a:stretch>
-                  </pic:blipFill>
-                  <pic:spPr>
-                    <a:xfrm>
-                      <a:off x="0" y="0"/>
-                      <a:ext cx="4480560" cy="4480560"/>
-                    </a:xfrm>
-                    <a:prstGeom prst="rect"/>
-                  </pic:spPr>
-                </pic:pic>
-              </a:graphicData>
-            </a:graphic>
-          </wp:inline>
-        </w:drawing>
-      </w:r>
+      <w:r/>
     </w:p>
     <w:tbl>
       <w:tblPr>
@@ -404,7 +371,7 @@
           </w:tcPr>
           <w:p>
             <w:r>
-              <w:t>August 15, 2026</w:t>
+              <w:t>August 31, 2026</w:t>
             </w:r>
           </w:p>
         </w:tc>
@@ -467,7 +434,7 @@
                 <w:rFonts w:ascii="Calibri" w:hAnsi="Calibri"/>
                 <w:sz w:val="18"/>
               </w:rPr>
-              <w:t>Current repo docs, C++ core content, tests, art inventory, the four-lesson launch curriculum, Vulkan/WebGL2 architecture, controller support, the approved Dynamic Drone Companions design, and the Solar Jetman reference manuals</w:t>
+              <w:t>Current repo docs, C++ core content and tests, the four-lesson launch curriculum, explicit solar route transits, save-v15 fresh-campaign policy, independent Rig/EVA oxygen, progressive artifacts, Expedition XP, Vulkan/WebGL2 architecture, controller support, the approved Dynamic Drone Companions design, and the Solar Jetman reference manuals.</w:t>
             </w:r>
           </w:p>
         </w:tc>
@@ -523,7 +490,7 @@
           </w:tcPr>
           <w:p>
             <w:r>
-              <w:t>Living GDD for the playable native Vulkan Windows/Linux game and WebGL2 build, including the Fuel/Controls/Temperature/Hull launch curriculum, asteroid belt, Jetpack EVA, and Dynamic Drone Companions</w:t>
+              <w:t>Living GDD for the playable native Vulkan Windows/Linux game and WebGL2 build. It covers the launch curriculum, committed Arrival paths, Surface Ops, direct Rig/EVA mining, deterministic artifact progression, solar campaign gates through Straylight, post-solar body generation, and Dynamic Drone Companions.</w:t>
             </w:r>
           </w:p>
         </w:tc>
@@ -610,9 +577,7 @@
     </w:tbl>
     <w:p/>
     <w:p>
-      <w:r>
-        <w:br w:type="page"/>
-      </w:r>
+      <w:r/>
     </w:p>
     <w:p>
       <w:pPr>
@@ -1871,7 +1836,7 @@
                 <w:rFonts w:ascii="Calibri" w:hAnsi="Calibri"/>
                 <w:sz w:val="18"/>
               </w:rPr>
-              <w:t>Loss matters, but records, blueprints, research, drones, and facilities survive.</w:t>
+              <w:t>Loss matters, but records, Research Data, research, drones, and facilities survive.</w:t>
             </w:r>
           </w:p>
         </w:tc>
@@ -2016,6 +1981,7 @@
     <w:p>
       <w:pPr>
         <w:pStyle w:val="Heading2"/>
+        <w:pageBreakBefore/>
       </w:pPr>
       <w:r>
         <w:t>Current Build Status</w:t>
@@ -2179,12 +2145,6 @@
               </w:rPr>
               <w:t>Launch curriculum</w:t>
             </w:r>
-            <w:r>
-              <w:rPr>
-                <w:rFonts w:ascii="Calibri" w:hAnsi="Calibri"/>
-                <w:sz w:val="17"/>
-              </w:rPr>
-            </w:r>
           </w:p>
         </w:tc>
         <w:tc>
@@ -2208,12 +2168,6 @@
                 <w:rFonts w:ascii="Calibri" w:hAnsi="Calibri"/>
                 <w:sz w:val="17"/>
               </w:rPr>
-            </w:r>
-            <w:r>
-              <w:rPr>
-                <w:rFonts w:ascii="Calibri" w:hAnsi="Calibri"/>
-                <w:sz w:val="17"/>
-              </w:rPr>
               <w:t>Playable</w:t>
             </w:r>
           </w:p>
@@ -2232,7 +2186,10 @@
           </w:tcPr>
           <w:p>
             <w:r>
-              <w:t>Moon Fuel Survey, Controls Calibration, Mars thermal qualification, Jupiter asteroid belt, staged HUD, Refit-driven upgrades, and deterministic outcomes are implemented.</w:t>
+              <w:rPr>
+                <w:sz w:val="17"/>
+              </w:rPr>
+              <w:t>Fuel Survey, Controls Calibration, Mars thermal qualification, Jupiter asteroid belt, Jupiter transfer-margin choices, staged HUD, permanent Refit ranks, and deterministic outcomes are implemented.</w:t>
             </w:r>
           </w:p>
         </w:tc>
@@ -2354,12 +2311,6 @@
                 <w:rFonts w:ascii="Calibri" w:hAnsi="Calibri"/>
                 <w:sz w:val="17"/>
               </w:rPr>
-            </w:r>
-            <w:r>
-              <w:rPr>
-                <w:rFonts w:ascii="Calibri" w:hAnsi="Calibri"/>
-                <w:sz w:val="17"/>
-              </w:rPr>
               <w:t>Arrival operations</w:t>
             </w:r>
           </w:p>
@@ -2385,13 +2336,7 @@
                 <w:rFonts w:ascii="Calibri" w:hAnsi="Calibri"/>
                 <w:sz w:val="17"/>
               </w:rPr>
-            </w:r>
-            <w:r>
-              <w:rPr>
-                <w:rFonts w:ascii="Calibri" w:hAnsi="Calibri"/>
-                <w:sz w:val="17"/>
-              </w:rPr>
-              <w:t>Playable</w:t>
+              <w:t>Playable / clarity pass</w:t>
             </w:r>
           </w:p>
         </w:tc>
@@ -2416,13 +2361,7 @@
                 <w:rFonts w:ascii="Calibri" w:hAnsi="Calibri"/>
                 <w:sz w:val="17"/>
               </w:rPr>
-              <w:t>Flyby, orbit, landing gates, saved first-use briefs, rewards, slingshot boosts, and save resume behavior are implemented.</w:t>
-            </w:r>
-            <w:r>
-              <w:rPr>
-                <w:rFonts w:ascii="Calibri" w:hAnsi="Calibri"/>
-                <w:sz w:val="17"/>
-              </w:rPr>
+              <w:t>Each visit commits to Pass Through, Orbit Capture, or Direct Descent. Saved physical route legs support recovery and reapproach. Authored Jupiter and Saturn departures are explicit; Uranus still needs a dedicated authored Neptune-departure briefing.</w:t>
             </w:r>
           </w:p>
         </w:tc>
@@ -2452,12 +2391,6 @@
                 <w:rFonts w:ascii="Calibri" w:hAnsi="Calibri"/>
                 <w:sz w:val="17"/>
               </w:rPr>
-            </w:r>
-            <w:r>
-              <w:rPr>
-                <w:rFonts w:ascii="Calibri" w:hAnsi="Calibri"/>
-                <w:sz w:val="17"/>
-              </w:rPr>
               <w:t>Research and Surface Ops</w:t>
             </w:r>
           </w:p>
@@ -2483,12 +2416,6 @@
                 <w:rFonts w:ascii="Calibri" w:hAnsi="Calibri"/>
                 <w:sz w:val="17"/>
               </w:rPr>
-            </w:r>
-            <w:r>
-              <w:rPr>
-                <w:rFonts w:ascii="Calibri" w:hAnsi="Calibri"/>
-                <w:sz w:val="17"/>
-              </w:rPr>
               <w:t>Playable</w:t>
             </w:r>
           </w:p>
@@ -2514,13 +2441,7 @@
                 <w:rFonts w:ascii="Calibri" w:hAnsi="Calibri"/>
                 <w:sz w:val="17"/>
               </w:rPr>
-            </w:r>
-            <w:r>
-              <w:rPr>
-                <w:rFonts w:ascii="Calibri" w:hAnsi="Calibri"/>
-                <w:sz w:val="17"/>
-              </w:rPr>
-              <w:t>Mars+ research, materials, artifacts, field upgrades, surface sites, hazard events, scan, push, extract, and logs are implemented.</w:t>
+              <w:t>Materials, artifacts, field upgrades, Surface actions, persistent depth-system ranks, Expedition XP choices, Support Drone grafts/synergies, and visible hazard and return tradeoffs are implemented.</w:t>
             </w:r>
           </w:p>
         </w:tc>
@@ -2550,12 +2471,6 @@
                 <w:rFonts w:ascii="Calibri" w:hAnsi="Calibri"/>
                 <w:sz w:val="17"/>
               </w:rPr>
-            </w:r>
-            <w:r>
-              <w:rPr>
-                <w:rFonts w:ascii="Calibri" w:hAnsi="Calibri"/>
-                <w:sz w:val="17"/>
-              </w:rPr>
               <w:t>Mining</w:t>
             </w:r>
           </w:p>
@@ -2599,7 +2514,10 @@
           </w:tcPr>
           <w:p>
             <w:r>
-              <w:t>Direct-control mining now supports Rig and Jetpack operator modes, destination gravity and inertia, twin-stick aim, sidearm and hand drill actions, artifact tethering, loose chunks, suit-only routes, emergency ejection, and HUD/effects centered on the controlled character. Physical Steam Deck control and readability remain a release gate.</w:t>
+              <w:rPr>
+                <w:sz w:val="17"/>
+              </w:rPr>
+              <w:t>Direct Rig/EVA control, independent oxygen reserves, free ship service, deterministic progression-artifact placement, one-layer Io recovery, three-slice triangulation, artifact towing protections, suit-only routes, enemies, depth caching, and emergency ejection are implemented. Steam Deck control/readability remains a release gate.</w:t>
             </w:r>
           </w:p>
         </w:tc>
@@ -2629,12 +2547,6 @@
                 <w:rFonts w:ascii="Calibri" w:hAnsi="Calibri"/>
                 <w:sz w:val="17"/>
               </w:rPr>
-            </w:r>
-            <w:r>
-              <w:rPr>
-                <w:rFonts w:ascii="Calibri" w:hAnsi="Calibri"/>
-                <w:sz w:val="17"/>
-              </w:rPr>
               <w:t>Drone Bay</w:t>
             </w:r>
           </w:p>
@@ -2685,7 +2597,7 @@
                 <w:rFonts w:ascii="Calibri" w:hAnsi="Calibri"/>
                 <w:sz w:val="17"/>
               </w:rPr>
-              <w:t>Prospector progression and persistent loadouts remain in place. Equipped mini drones are independent world entities whose logical anchor transfers to the controlled rig or operator; they follow, orbit, defend, perform bounded sorties, and preserve haul, shields, cooldowns, and formation identity across actor and depth transitions.</w:t>
+              <w:t>Persistent frames/loadouts and independent world agents are implemented. Expedition XP can temporarily rank the Rig, all copies of a Drone type, individual slots, or a named synergy; combat offers remain hidden until the first hostile encounter.</w:t>
             </w:r>
           </w:p>
         </w:tc>
@@ -2715,12 +2627,6 @@
                 <w:rFonts w:ascii="Calibri" w:hAnsi="Calibri"/>
                 <w:sz w:val="17"/>
               </w:rPr>
-            </w:r>
-            <w:r>
-              <w:rPr>
-                <w:rFonts w:ascii="Calibri" w:hAnsi="Calibri"/>
-                <w:sz w:val="17"/>
-              </w:rPr>
               <w:t>Ark campaign chapters</w:t>
             </w:r>
           </w:p>
@@ -2742,6 +2648,9 @@
               <w:spacing w:before="0" w:after="20" w:line="240" w:lineRule="auto"/>
             </w:pPr>
             <w:r>
+              <w:rPr>
+                <w:sz w:val="17"/>
+              </w:rPr>
               <w:t>Playable / expanding</w:t>
             </w:r>
           </w:p>
@@ -2760,7 +2669,10 @@
           </w:tcPr>
           <w:p>
             <w:r>
-              <w:t>Chapters 1-7, the Chapter 8 Rift Belt placeholder, Neptune-only Straylight discovery, Aaru Vale, Arkfall, Navigation, and hostile sorties are implemented; Chapters 9-10 remain future work.</w:t>
+              <w:rPr>
+                <w:sz w:val="17"/>
+              </w:rPr>
+              <w:t>Chapters 1-7, physical Jupiter-to-Saturn and Saturn-to-Uranus transfers, Neptune-only Straylight discovery, Aaru Vale, Arkfall, Navigation, and hostile sorties are implemented; the Uranus-to-Neptune story handoff and Chapters 9-10 need further authored content.</w:t>
             </w:r>
           </w:p>
         </w:tc>
@@ -2790,12 +2702,6 @@
                 <w:rFonts w:ascii="Calibri" w:hAnsi="Calibri"/>
                 <w:sz w:val="17"/>
               </w:rPr>
-            </w:r>
-            <w:r>
-              <w:rPr>
-                <w:rFonts w:ascii="Calibri" w:hAnsi="Calibri"/>
-                <w:sz w:val="17"/>
-              </w:rPr>
               <w:t>Art direction</w:t>
             </w:r>
           </w:p>
@@ -2821,12 +2727,6 @@
                 <w:rFonts w:ascii="Calibri" w:hAnsi="Calibri"/>
                 <w:sz w:val="17"/>
               </w:rPr>
-            </w:r>
-            <w:r>
-              <w:rPr>
-                <w:rFonts w:ascii="Calibri" w:hAnsi="Calibri"/>
-                <w:sz w:val="17"/>
-              </w:rPr>
               <w:t>In progress</w:t>
             </w:r>
           </w:p>
@@ -2845,7 +2745,10 @@
           </w:tcPr>
           <w:p>
             <w:r>
-              <w:t>90s arcade sprites and cleaned alpha assets cover solar-system bodies, Straylight states, shuttle/effects, the mining rig, six Support Drone roles, the Capybara art, POI arrow, and reusable asteroid.</w:t>
+              <w:rPr>
+                <w:sz w:val="17"/>
+              </w:rPr>
+              <w:t>The 78-texture runtime manifest includes destination geology, a dedicated artifact sprite, attached red/orange ship thrust, six Support Drone roles, five biome variants for six enemy families, and deterministic post-solar geology. Animation and final Deck-scale polish continue.</w:t>
             </w:r>
           </w:p>
         </w:tc>
@@ -2854,6 +2757,7 @@
     <w:p/>
     <w:p>
       <w:pPr>
+        <w:spacing w:before="0" w:after="0" w:lineRule="exact" w:line="20"/>
         <w:sectPr>
           <w:footerReference w:type="default" r:id="rId9"/>
           <w:pgSz w:w="12240" w:h="15840"/>
@@ -2863,6 +2767,11 @@
           <w:docGrid w:linePitch="360"/>
         </w:sectPr>
       </w:pPr>
+      <w:r>
+        <w:rPr>
+          <w:sz w:val="2"/>
+        </w:rPr>
+      </w:r>
     </w:p>
     <w:p>
       <w:pPr>
@@ -3511,12 +3420,6 @@
                 <w:rFonts w:ascii="Calibri" w:hAnsi="Calibri"/>
                 <w:sz w:val="18"/>
               </w:rPr>
-            </w:r>
-            <w:r>
-              <w:rPr>
-                <w:rFonts w:ascii="Calibri" w:hAnsi="Calibri"/>
-                <w:sz w:val="18"/>
-              </w:rPr>
               <w:t>4</w:t>
             </w:r>
           </w:p>
@@ -3542,12 +3445,6 @@
                 <w:rFonts w:ascii="Calibri" w:hAnsi="Calibri"/>
                 <w:sz w:val="18"/>
               </w:rPr>
-            </w:r>
-            <w:r>
-              <w:rPr>
-                <w:rFonts w:ascii="Calibri" w:hAnsi="Calibri"/>
-                <w:sz w:val="18"/>
-              </w:rPr>
               <w:t>Breakthrough</w:t>
             </w:r>
           </w:p>
@@ -3573,13 +3470,7 @@
                 <w:rFonts w:ascii="Calibri" w:hAnsi="Calibri"/>
                 <w:sz w:val="18"/>
               </w:rPr>
-              <w:t>Mandatory Jupiter, Saturn, Uranus, and Neptune arrivals; the saved full-screen Straylight discovery occurs only after Neptune.</w:t>
-            </w:r>
-            <w:r>
-              <w:rPr>
-                <w:rFonts w:ascii="Calibri" w:hAnsi="Calibri"/>
-                <w:sz w:val="18"/>
-              </w:rPr>
+              <w:t>Io artifact recovery, a dedicated Perfect Jupiter departure, Saturn artifact recovery, the Uranus route, Neptune arrival, and the saved Straylight discovery.</w:t>
             </w:r>
           </w:p>
         </w:tc>
@@ -3604,13 +3495,7 @@
                 <w:rFonts w:ascii="Calibri" w:hAnsi="Calibri"/>
                 <w:sz w:val="18"/>
               </w:rPr>
-              <w:t>Gate: acknowledge Approach the Straylight. Implemented with persistent story state and Neptune Arrival Ops continuation.</w:t>
-            </w:r>
-            <w:r>
-              <w:rPr>
-                <w:rFonts w:ascii="Calibri" w:hAnsi="Calibri"/>
-                <w:sz w:val="18"/>
-              </w:rPr>
+              <w:t>Gate: acknowledge Approach the Straylight after successful Neptune arrival. Implemented, with a remaining Uranus-departure clarity task.</w:t>
             </w:r>
           </w:p>
         </w:tc>
@@ -4335,7 +4220,7 @@
         <w:pStyle w:val="ListBullet"/>
       </w:pPr>
       <w:r>
-        <w:t>Chapter state is monotonic: once the player reaches a chapter, failures, reloads, or legacy migration cannot roll it backward.</w:t>
+        <w:t>Chapter state is monotonic within an accepted version-15 campaign: failures and reloads cannot roll it backward.</w:t>
       </w:r>
     </w:p>
     <w:p>
@@ -4343,7 +4228,7 @@
         <w:pStyle w:val="ListBullet"/>
       </w:pPr>
       <w:r>
-        <w:t>Migration reads destination tier, CampaignMilestone, ArkCondition, Ark jump flags, navigation system ID, and hostile-system sortie success.</w:t>
+        <w:t>Campaign migration is intentionally disabled at the version-15 boundary. Older, future-version, and malformed campaign payloads are cleared at startup and replaced with a fresh version-15 campaign; preferences remain separate.</w:t>
       </w:r>
     </w:p>
     <w:p>
@@ -4356,6 +4241,7 @@
     </w:p>
     <w:p>
       <w:pPr>
+        <w:spacing w:before="0" w:after="0" w:line="20" w:lineRule="exact"/>
         <w:sectPr>
           <w:headerReference w:type="default" r:id="rId11"/>
           <w:footerReference w:type="default" r:id="rId12"/>
@@ -4366,7 +4252,1025 @@
           <w:docGrid w:linePitch="360"/>
         </w:sectPr>
       </w:pPr>
+      <w:r>
+        <w:rPr>
+          <w:sz w:val="2"/>
+        </w:rPr>
+      </w:r>
     </w:p>
+    <w:p>
+      <w:pPr>
+        <w:pStyle w:val="Heading2"/>
+        <w:pageBreakBefore w:val="0"/>
+      </w:pPr>
+      <w:r>
+        <w:t>Solar Progression Gate Map</w:t>
+      </w:r>
+    </w:p>
+    <w:tbl>
+      <w:tblPr>
+        <w:tblW w:type="dxa" w:w="9360"/>
+        <w:tblLook w:firstColumn="1" w:firstRow="1" w:lastColumn="0" w:lastRow="0" w:noHBand="0" w:noVBand="1" w:val="04A0"/>
+        <w:tblInd w:w="120" w:type="dxa"/>
+        <w:tblLayout w:type="fixed"/>
+        <w:tblBorders>
+          <w:top w:val="single" w:sz="4" w:space="0" w:color="B8C2CC"/>
+          <w:left w:val="single" w:sz="4" w:space="0" w:color="B8C2CC"/>
+          <w:bottom w:val="single" w:sz="4" w:space="0" w:color="B8C2CC"/>
+          <w:right w:val="single" w:sz="4" w:space="0" w:color="B8C2CC"/>
+          <w:insideH w:val="single" w:sz="4" w:space="0" w:color="B8C2CC"/>
+          <w:insideV w:val="single" w:sz="4" w:space="0" w:color="B8C2CC"/>
+        </w:tblBorders>
+      </w:tblPr>
+      <w:tblGrid>
+        <w:gridCol w:w="1584"/>
+        <w:gridCol w:w="2160"/>
+        <w:gridCol w:w="3744"/>
+        <w:gridCol w:w="1872"/>
+      </w:tblGrid>
+      <w:tr>
+        <w:trPr>
+          <w:tblHeader w:val="true"/>
+          <w:cantSplit/>
+        </w:trPr>
+        <w:tc>
+          <w:tcPr>
+            <w:tcW w:type="dxa" w:w="1584"/>
+            <w:tcMar>
+              <w:top w:w="80" w:type="dxa"/>
+              <w:start w:w="120" w:type="dxa"/>
+              <w:bottom w:w="80" w:type="dxa"/>
+              <w:end w:w="120" w:type="dxa"/>
+            </w:tcMar>
+            <w:vAlign w:val="center"/>
+            <w:shd w:fill="F2F4F7"/>
+          </w:tcPr>
+          <w:p>
+            <w:pPr>
+              <w:keepNext w:val="0"/>
+              <w:keepLines w:val="0"/>
+              <w:spacing w:before="0" w:after="0"/>
+            </w:pPr>
+            <w:r>
+              <w:rPr>
+                <w:sz w:val="17"/>
+              </w:rPr>
+              <w:t>Stage</w:t>
+            </w:r>
+          </w:p>
+        </w:tc>
+        <w:tc>
+          <w:tcPr>
+            <w:tcW w:type="dxa" w:w="2160"/>
+            <w:tcMar>
+              <w:top w:w="80" w:type="dxa"/>
+              <w:start w:w="120" w:type="dxa"/>
+              <w:bottom w:w="80" w:type="dxa"/>
+              <w:end w:w="120" w:type="dxa"/>
+            </w:tcMar>
+            <w:vAlign w:val="center"/>
+            <w:shd w:fill="F2F4F7"/>
+          </w:tcPr>
+          <w:p>
+            <w:pPr>
+              <w:keepNext w:val="0"/>
+              <w:keepLines w:val="0"/>
+              <w:spacing w:before="0" w:after="0"/>
+            </w:pPr>
+            <w:r>
+              <w:rPr>
+                <w:sz w:val="17"/>
+              </w:rPr>
+              <w:t>Mission</w:t>
+            </w:r>
+          </w:p>
+        </w:tc>
+        <w:tc>
+          <w:tcPr>
+            <w:tcW w:type="dxa" w:w="3744"/>
+            <w:tcMar>
+              <w:top w:w="80" w:type="dxa"/>
+              <w:start w:w="120" w:type="dxa"/>
+              <w:bottom w:w="80" w:type="dxa"/>
+              <w:end w:w="120" w:type="dxa"/>
+            </w:tcMar>
+            <w:vAlign w:val="center"/>
+            <w:shd w:fill="F2F4F7"/>
+          </w:tcPr>
+          <w:p>
+            <w:pPr>
+              <w:keepNext w:val="0"/>
+              <w:keepLines w:val="0"/>
+              <w:spacing w:before="0" w:after="0"/>
+            </w:pPr>
+            <w:r>
+              <w:rPr>
+                <w:sz w:val="17"/>
+              </w:rPr>
+              <w:t>Gate / key</w:t>
+            </w:r>
+          </w:p>
+        </w:tc>
+        <w:tc>
+          <w:tcPr>
+            <w:tcW w:type="dxa" w:w="1872"/>
+            <w:tcMar>
+              <w:top w:w="80" w:type="dxa"/>
+              <w:start w:w="120" w:type="dxa"/>
+              <w:bottom w:w="80" w:type="dxa"/>
+              <w:end w:w="120" w:type="dxa"/>
+            </w:tcMar>
+            <w:vAlign w:val="center"/>
+            <w:shd w:fill="F2F4F7"/>
+          </w:tcPr>
+          <w:p>
+            <w:pPr>
+              <w:keepNext w:val="0"/>
+              <w:keepLines w:val="0"/>
+              <w:spacing w:before="0" w:after="0"/>
+            </w:pPr>
+            <w:r>
+              <w:rPr>
+                <w:sz w:val="17"/>
+              </w:rPr>
+              <w:t>Next movement</w:t>
+            </w:r>
+          </w:p>
+        </w:tc>
+      </w:tr>
+      <w:tr>
+        <w:trPr>
+          <w:cantSplit/>
+        </w:trPr>
+        <w:tc>
+          <w:tcPr>
+            <w:tcW w:type="dxa" w:w="1584"/>
+            <w:tcMar>
+              <w:top w:w="80" w:type="dxa"/>
+              <w:start w:w="120" w:type="dxa"/>
+              <w:bottom w:w="80" w:type="dxa"/>
+              <w:end w:w="120" w:type="dxa"/>
+            </w:tcMar>
+            <w:vAlign w:val="center"/>
+            <w:shd w:fill="FFFFFF"/>
+          </w:tcPr>
+          <w:p>
+            <w:pPr>
+              <w:keepNext w:val="0"/>
+              <w:keepLines w:val="0"/>
+              <w:spacing w:before="0" w:after="0" w:line="259" w:lineRule="auto"/>
+            </w:pPr>
+            <w:r>
+              <w:rPr>
+                <w:sz w:val="17"/>
+              </w:rPr>
+              <w:t>Earth program</w:t>
+            </w:r>
+          </w:p>
+        </w:tc>
+        <w:tc>
+          <w:tcPr>
+            <w:tcW w:type="dxa" w:w="2160"/>
+            <w:tcMar>
+              <w:top w:w="80" w:type="dxa"/>
+              <w:start w:w="120" w:type="dxa"/>
+              <w:bottom w:w="80" w:type="dxa"/>
+              <w:end w:w="120" w:type="dxa"/>
+            </w:tcMar>
+            <w:vAlign w:val="center"/>
+            <w:shd w:fill="FFFFFF"/>
+          </w:tcPr>
+          <w:p>
+            <w:pPr>
+              <w:keepNext w:val="0"/>
+              <w:keepLines w:val="0"/>
+              <w:spacing w:before="0" w:after="0"/>
+            </w:pPr>
+            <w:r>
+              <w:rPr>
+                <w:sz w:val="17"/>
+              </w:rPr>
+              <w:t>Fuel + Controls</w:t>
+            </w:r>
+          </w:p>
+        </w:tc>
+        <w:tc>
+          <w:tcPr>
+            <w:tcW w:type="dxa" w:w="3744"/>
+            <w:tcMar>
+              <w:top w:w="80" w:type="dxa"/>
+              <w:start w:w="120" w:type="dxa"/>
+              <w:bottom w:w="80" w:type="dxa"/>
+              <w:end w:w="120" w:type="dxa"/>
+            </w:tcMar>
+            <w:vAlign w:val="center"/>
+            <w:shd w:fill="FFFFFF"/>
+          </w:tcPr>
+          <w:p>
+            <w:pPr>
+              <w:keepNext w:val="0"/>
+              <w:keepLines w:val="0"/>
+              <w:spacing w:before="0" w:after="0" w:line="259" w:lineRule="auto"/>
+            </w:pPr>
+            <w:r>
+              <w:rPr>
+                <w:sz w:val="17"/>
+              </w:rPr>
+              <w:t>Install Fuel Tanks I and Flight Controls I.</w:t>
+            </w:r>
+          </w:p>
+        </w:tc>
+        <w:tc>
+          <w:tcPr>
+            <w:tcW w:type="dxa" w:w="1872"/>
+            <w:tcMar>
+              <w:top w:w="80" w:type="dxa"/>
+              <w:start w:w="120" w:type="dxa"/>
+              <w:bottom w:w="80" w:type="dxa"/>
+              <w:end w:w="120" w:type="dxa"/>
+            </w:tcMar>
+            <w:vAlign w:val="center"/>
+            <w:shd w:fill="FFFFFF"/>
+          </w:tcPr>
+          <w:p>
+            <w:pPr>
+              <w:keepNext w:val="0"/>
+              <w:keepLines w:val="0"/>
+              <w:spacing w:before="0" w:after="0" w:line="259" w:lineRule="auto"/>
+            </w:pPr>
+            <w:r>
+              <w:rPr>
+                <w:sz w:val="17"/>
+              </w:rPr>
+              <w:t>Launch to the Moon; Capture Orbit, then Land.</w:t>
+            </w:r>
+          </w:p>
+        </w:tc>
+      </w:tr>
+      <w:tr>
+        <w:trPr>
+          <w:cantSplit/>
+        </w:trPr>
+        <w:tc>
+          <w:tcPr>
+            <w:tcW w:type="dxa" w:w="1584"/>
+            <w:tcMar>
+              <w:top w:w="80" w:type="dxa"/>
+              <w:start w:w="120" w:type="dxa"/>
+              <w:bottom w:w="80" w:type="dxa"/>
+              <w:end w:w="120" w:type="dxa"/>
+            </w:tcMar>
+            <w:vAlign w:val="center"/>
+            <w:shd w:fill="FFFFFF"/>
+          </w:tcPr>
+          <w:p>
+            <w:pPr>
+              <w:keepNext w:val="0"/>
+              <w:keepLines w:val="0"/>
+              <w:spacing w:before="0" w:after="0" w:line="259" w:lineRule="auto"/>
+            </w:pPr>
+            <w:r>
+              <w:rPr>
+                <w:sz w:val="17"/>
+              </w:rPr>
+              <w:t>Moon</w:t>
+            </w:r>
+          </w:p>
+        </w:tc>
+        <w:tc>
+          <w:tcPr>
+            <w:tcW w:type="dxa" w:w="2160"/>
+            <w:tcMar>
+              <w:top w:w="80" w:type="dxa"/>
+              <w:start w:w="120" w:type="dxa"/>
+              <w:bottom w:w="80" w:type="dxa"/>
+              <w:end w:w="120" w:type="dxa"/>
+            </w:tcMar>
+            <w:vAlign w:val="center"/>
+            <w:shd w:fill="FFFFFF"/>
+          </w:tcPr>
+          <w:p>
+            <w:pPr>
+              <w:keepNext w:val="0"/>
+              <w:keepLines w:val="0"/>
+              <w:spacing w:before="0" w:after="0"/>
+            </w:pPr>
+            <w:r>
+              <w:rPr>
+                <w:sz w:val="17"/>
+              </w:rPr>
+              <w:t>Lunar Prospector</w:t>
+            </w:r>
+          </w:p>
+        </w:tc>
+        <w:tc>
+          <w:tcPr>
+            <w:tcW w:type="dxa" w:w="3744"/>
+            <w:tcMar>
+              <w:top w:w="80" w:type="dxa"/>
+              <w:start w:w="120" w:type="dxa"/>
+              <w:bottom w:w="80" w:type="dxa"/>
+              <w:end w:w="120" w:type="dxa"/>
+            </w:tcMar>
+            <w:vAlign w:val="center"/>
+            <w:shd w:fill="FFFFFF"/>
+          </w:tcPr>
+          <w:p>
+            <w:pPr>
+              <w:keepNext w:val="0"/>
+              <w:keepLines w:val="0"/>
+              <w:spacing w:before="0" w:after="0" w:line="259" w:lineRule="auto"/>
+            </w:pPr>
+            <w:r>
+              <w:rPr>
+                <w:sz w:val="17"/>
+              </w:rPr>
+              <w:t>Deliver 30 Moon Common Ore. Claim Drone Ops, Slot 1, 20 Common, and the Mars route; Prospector fabrication is the taught first Drone purchase. Install Fuel Tanks II.</w:t>
+            </w:r>
+          </w:p>
+        </w:tc>
+        <w:tc>
+          <w:tcPr>
+            <w:tcW w:type="dxa" w:w="1872"/>
+            <w:tcMar>
+              <w:top w:w="80" w:type="dxa"/>
+              <w:start w:w="120" w:type="dxa"/>
+              <w:bottom w:w="80" w:type="dxa"/>
+              <w:end w:w="120" w:type="dxa"/>
+            </w:tcMar>
+            <w:vAlign w:val="center"/>
+            <w:shd w:fill="FFFFFF"/>
+          </w:tcPr>
+          <w:p>
+            <w:pPr>
+              <w:keepNext w:val="0"/>
+              <w:keepLines w:val="0"/>
+              <w:spacing w:before="0" w:after="0" w:line="259" w:lineRule="auto"/>
+            </w:pPr>
+            <w:r>
+              <w:rPr>
+                <w:sz w:val="17"/>
+              </w:rPr>
+              <w:t>Fly Moon -&gt; Mars.</w:t>
+            </w:r>
+          </w:p>
+        </w:tc>
+      </w:tr>
+      <w:tr>
+        <w:trPr>
+          <w:cantSplit/>
+        </w:trPr>
+        <w:tc>
+          <w:tcPr>
+            <w:tcW w:type="dxa" w:w="1584"/>
+            <w:tcMar>
+              <w:top w:w="80" w:type="dxa"/>
+              <w:start w:w="120" w:type="dxa"/>
+              <w:bottom w:w="80" w:type="dxa"/>
+              <w:end w:w="120" w:type="dxa"/>
+            </w:tcMar>
+            <w:vAlign w:val="center"/>
+            <w:shd w:fill="FFFFFF"/>
+          </w:tcPr>
+          <w:p>
+            <w:pPr>
+              <w:keepNext w:val="0"/>
+              <w:keepLines w:val="0"/>
+              <w:spacing w:before="0" w:after="0" w:line="259" w:lineRule="auto"/>
+            </w:pPr>
+            <w:r>
+              <w:rPr>
+                <w:sz w:val="17"/>
+              </w:rPr>
+              <w:t>Mars</w:t>
+            </w:r>
+          </w:p>
+        </w:tc>
+        <w:tc>
+          <w:tcPr>
+            <w:tcW w:type="dxa" w:w="2160"/>
+            <w:tcMar>
+              <w:top w:w="80" w:type="dxa"/>
+              <w:start w:w="120" w:type="dxa"/>
+              <w:bottom w:w="80" w:type="dxa"/>
+              <w:end w:w="120" w:type="dxa"/>
+            </w:tcMar>
+            <w:vAlign w:val="center"/>
+            <w:shd w:fill="FFFFFF"/>
+          </w:tcPr>
+          <w:p>
+            <w:pPr>
+              <w:keepNext w:val="0"/>
+              <w:keepLines w:val="0"/>
+              <w:spacing w:before="0" w:after="0"/>
+            </w:pPr>
+            <w:r>
+              <w:rPr>
+                <w:sz w:val="17"/>
+              </w:rPr>
+              <w:t>Bay Expansion</w:t>
+            </w:r>
+          </w:p>
+        </w:tc>
+        <w:tc>
+          <w:tcPr>
+            <w:tcW w:type="dxa" w:w="3744"/>
+            <w:tcMar>
+              <w:top w:w="80" w:type="dxa"/>
+              <w:start w:w="120" w:type="dxa"/>
+              <w:bottom w:w="80" w:type="dxa"/>
+              <w:end w:w="120" w:type="dxa"/>
+            </w:tcMar>
+            <w:vAlign w:val="center"/>
+            <w:shd w:fill="FFFFFF"/>
+          </w:tcPr>
+          <w:p>
+            <w:pPr>
+              <w:keepNext w:val="0"/>
+              <w:keepLines w:val="0"/>
+              <w:spacing w:before="0" w:after="0" w:line="259" w:lineRule="auto"/>
+            </w:pPr>
+            <w:r>
+              <w:rPr>
+                <w:sz w:val="17"/>
+              </w:rPr>
+              <w:t>Deliver 40 Mars Common Ore and claim Slot 2 + Jupiter route. Create 5 fuel of Jupiter margin with Fuel Tanks III, a Good-or-better Mars slingshot, or both.</w:t>
+            </w:r>
+          </w:p>
+        </w:tc>
+        <w:tc>
+          <w:tcPr>
+            <w:tcW w:type="dxa" w:w="1872"/>
+            <w:tcMar>
+              <w:top w:w="80" w:type="dxa"/>
+              <w:start w:w="120" w:type="dxa"/>
+              <w:bottom w:w="80" w:type="dxa"/>
+              <w:end w:w="120" w:type="dxa"/>
+            </w:tcMar>
+            <w:vAlign w:val="center"/>
+            <w:shd w:fill="FFFFFF"/>
+          </w:tcPr>
+          <w:p>
+            <w:pPr>
+              <w:keepNext w:val="0"/>
+              <w:keepLines w:val="0"/>
+              <w:spacing w:before="0" w:after="0" w:line="259" w:lineRule="auto"/>
+            </w:pPr>
+            <w:r>
+              <w:rPr>
+                <w:sz w:val="17"/>
+              </w:rPr>
+              <w:t>Fly Mars -&gt; Jupiter/Io.</w:t>
+            </w:r>
+          </w:p>
+        </w:tc>
+      </w:tr>
+      <w:tr>
+        <w:trPr>
+          <w:cantSplit/>
+        </w:trPr>
+        <w:tc>
+          <w:tcPr>
+            <w:tcW w:type="dxa" w:w="1584"/>
+            <w:tcMar>
+              <w:top w:w="80" w:type="dxa"/>
+              <w:start w:w="120" w:type="dxa"/>
+              <w:bottom w:w="80" w:type="dxa"/>
+              <w:end w:w="120" w:type="dxa"/>
+            </w:tcMar>
+            <w:vAlign w:val="center"/>
+            <w:shd w:fill="FFFFFF"/>
+          </w:tcPr>
+          <w:p>
+            <w:pPr>
+              <w:keepNext w:val="0"/>
+              <w:keepLines w:val="0"/>
+              <w:spacing w:before="0" w:after="0" w:line="259" w:lineRule="auto"/>
+            </w:pPr>
+            <w:r>
+              <w:rPr>
+                <w:sz w:val="17"/>
+              </w:rPr>
+              <w:t>Jupiter / Io</w:t>
+            </w:r>
+          </w:p>
+        </w:tc>
+        <w:tc>
+          <w:tcPr>
+            <w:tcW w:type="dxa" w:w="2160"/>
+            <w:tcMar>
+              <w:top w:w="80" w:type="dxa"/>
+              <w:start w:w="120" w:type="dxa"/>
+              <w:bottom w:w="80" w:type="dxa"/>
+              <w:end w:w="120" w:type="dxa"/>
+            </w:tcMar>
+            <w:vAlign w:val="center"/>
+            <w:shd w:fill="FFFFFF"/>
+          </w:tcPr>
+          <w:p>
+            <w:pPr>
+              <w:keepNext w:val="0"/>
+              <w:keepLines w:val="0"/>
+              <w:spacing w:before="0" w:after="0"/>
+            </w:pPr>
+            <w:r>
+              <w:rPr>
+                <w:sz w:val="17"/>
+              </w:rPr>
+              <w:t>Volcanic Descent</w:t>
+            </w:r>
+          </w:p>
+        </w:tc>
+        <w:tc>
+          <w:tcPr>
+            <w:tcW w:type="dxa" w:w="3744"/>
+            <w:tcMar>
+              <w:top w:w="80" w:type="dxa"/>
+              <w:start w:w="120" w:type="dxa"/>
+              <w:bottom w:w="80" w:type="dxa"/>
+              <w:end w:w="120" w:type="dxa"/>
+            </w:tcMar>
+            <w:vAlign w:val="center"/>
+            <w:shd w:fill="FFFFFF"/>
+          </w:tcPr>
+          <w:p>
+            <w:pPr>
+              <w:keepNext w:val="0"/>
+              <w:keepLines w:val="0"/>
+              <w:spacing w:before="0" w:after="0" w:line="259" w:lineRule="auto"/>
+            </w:pPr>
+            <w:r>
+              <w:rPr>
+                <w:sz w:val="17"/>
+              </w:rPr>
+              <w:t>Commission Hazard Mk I. Expose one four-segment thermal seal and safely return the artifact.</w:t>
+            </w:r>
+          </w:p>
+        </w:tc>
+        <w:tc>
+          <w:tcPr>
+            <w:tcW w:type="dxa" w:w="1872"/>
+            <w:tcMar>
+              <w:top w:w="80" w:type="dxa"/>
+              <w:start w:w="120" w:type="dxa"/>
+              <w:bottom w:w="80" w:type="dxa"/>
+              <w:end w:w="120" w:type="dxa"/>
+            </w:tcMar>
+            <w:vAlign w:val="center"/>
+            <w:shd w:fill="FFFFFF"/>
+          </w:tcPr>
+          <w:p>
+            <w:pPr>
+              <w:keepNext w:val="0"/>
+              <w:keepLines w:val="0"/>
+              <w:spacing w:before="0" w:after="0" w:line="259" w:lineRule="auto"/>
+            </w:pPr>
+            <w:r>
+              <w:rPr>
+                <w:sz w:val="17"/>
+              </w:rPr>
+              <w:t>Run the dedicated Jupiter Departure slingshot.</w:t>
+            </w:r>
+          </w:p>
+        </w:tc>
+      </w:tr>
+      <w:tr>
+        <w:trPr>
+          <w:cantSplit/>
+        </w:trPr>
+        <w:tc>
+          <w:tcPr>
+            <w:tcW w:type="dxa" w:w="1584"/>
+            <w:tcMar>
+              <w:top w:w="80" w:type="dxa"/>
+              <w:start w:w="120" w:type="dxa"/>
+              <w:bottom w:w="80" w:type="dxa"/>
+              <w:end w:w="120" w:type="dxa"/>
+            </w:tcMar>
+            <w:vAlign w:val="center"/>
+            <w:shd w:fill="FFFFFF"/>
+          </w:tcPr>
+          <w:p>
+            <w:pPr>
+              <w:keepNext w:val="0"/>
+              <w:keepLines w:val="0"/>
+              <w:spacing w:before="0" w:after="0" w:line="259" w:lineRule="auto"/>
+            </w:pPr>
+            <w:r>
+              <w:rPr>
+                <w:sz w:val="17"/>
+              </w:rPr>
+              <w:t>Jupiter departure</w:t>
+            </w:r>
+          </w:p>
+        </w:tc>
+        <w:tc>
+          <w:tcPr>
+            <w:tcW w:type="dxa" w:w="2160"/>
+            <w:tcMar>
+              <w:top w:w="80" w:type="dxa"/>
+              <w:start w:w="120" w:type="dxa"/>
+              <w:bottom w:w="80" w:type="dxa"/>
+              <w:end w:w="120" w:type="dxa"/>
+            </w:tcMar>
+            <w:vAlign w:val="center"/>
+            <w:shd w:fill="FFFFFF"/>
+          </w:tcPr>
+          <w:p>
+            <w:pPr>
+              <w:keepNext w:val="0"/>
+              <w:keepLines w:val="0"/>
+              <w:spacing w:before="0" w:after="0"/>
+            </w:pPr>
+            <w:r>
+              <w:rPr>
+                <w:sz w:val="17"/>
+              </w:rPr>
+              <w:t>Perfect Slingshot</w:t>
+            </w:r>
+          </w:p>
+        </w:tc>
+        <w:tc>
+          <w:tcPr>
+            <w:tcW w:type="dxa" w:w="3744"/>
+            <w:tcMar>
+              <w:top w:w="80" w:type="dxa"/>
+              <w:start w:w="120" w:type="dxa"/>
+              <w:bottom w:w="80" w:type="dxa"/>
+              <w:end w:w="120" w:type="dxa"/>
+            </w:tcMar>
+            <w:vAlign w:val="center"/>
+            <w:shd w:fill="FFFFFF"/>
+          </w:tcPr>
+          <w:p>
+            <w:pPr>
+              <w:keepNext w:val="0"/>
+              <w:keepLines w:val="0"/>
+              <w:spacing w:before="0" w:after="0" w:line="259" w:lineRule="auto"/>
+            </w:pPr>
+            <w:r>
+              <w:rPr>
+                <w:sz w:val="17"/>
+              </w:rPr>
+              <w:t>Earn Perfect, then explicitly Lock Saturn Course.</w:t>
+            </w:r>
+          </w:p>
+        </w:tc>
+        <w:tc>
+          <w:tcPr>
+            <w:tcW w:type="dxa" w:w="1872"/>
+            <w:tcMar>
+              <w:top w:w="80" w:type="dxa"/>
+              <w:start w:w="120" w:type="dxa"/>
+              <w:bottom w:w="80" w:type="dxa"/>
+              <w:end w:w="120" w:type="dxa"/>
+            </w:tcMar>
+            <w:vAlign w:val="center"/>
+            <w:shd w:fill="FFFFFF"/>
+          </w:tcPr>
+          <w:p>
+            <w:pPr>
+              <w:keepNext w:val="0"/>
+              <w:keepLines w:val="0"/>
+              <w:spacing w:before="0" w:after="0" w:line="259" w:lineRule="auto"/>
+            </w:pPr>
+            <w:r>
+              <w:rPr>
+                <w:sz w:val="17"/>
+              </w:rPr>
+              <w:t>Queue and fly Jupiter -&gt; Saturn; the frontier advances only on arrival.</w:t>
+            </w:r>
+          </w:p>
+        </w:tc>
+      </w:tr>
+      <w:tr>
+        <w:trPr>
+          <w:cantSplit/>
+        </w:trPr>
+        <w:tc>
+          <w:tcPr>
+            <w:tcW w:type="dxa" w:w="1584"/>
+            <w:tcMar>
+              <w:top w:w="80" w:type="dxa"/>
+              <w:start w:w="120" w:type="dxa"/>
+              <w:bottom w:w="80" w:type="dxa"/>
+              <w:end w:w="120" w:type="dxa"/>
+            </w:tcMar>
+            <w:vAlign w:val="center"/>
+            <w:shd w:fill="FFFFFF"/>
+          </w:tcPr>
+          <w:p>
+            <w:pPr>
+              <w:keepNext w:val="0"/>
+              <w:keepLines w:val="0"/>
+              <w:spacing w:before="0" w:after="0" w:line="259" w:lineRule="auto"/>
+            </w:pPr>
+            <w:r>
+              <w:rPr>
+                <w:sz w:val="17"/>
+              </w:rPr>
+              <w:t>Saturn</w:t>
+            </w:r>
+          </w:p>
+        </w:tc>
+        <w:tc>
+          <w:tcPr>
+            <w:tcW w:type="dxa" w:w="2160"/>
+            <w:tcMar>
+              <w:top w:w="80" w:type="dxa"/>
+              <w:start w:w="120" w:type="dxa"/>
+              <w:bottom w:w="80" w:type="dxa"/>
+              <w:end w:w="120" w:type="dxa"/>
+            </w:tcMar>
+            <w:vAlign w:val="center"/>
+            <w:shd w:fill="FFFFFF"/>
+          </w:tcPr>
+          <w:p>
+            <w:pPr>
+              <w:keepNext w:val="0"/>
+              <w:keepLines w:val="0"/>
+              <w:spacing w:before="0" w:after="0"/>
+            </w:pPr>
+            <w:r>
+              <w:rPr>
+                <w:sz w:val="17"/>
+              </w:rPr>
+              <w:t>Artifact Secured</w:t>
+            </w:r>
+          </w:p>
+        </w:tc>
+        <w:tc>
+          <w:tcPr>
+            <w:tcW w:type="dxa" w:w="3744"/>
+            <w:tcMar>
+              <w:top w:w="80" w:type="dxa"/>
+              <w:start w:w="120" w:type="dxa"/>
+              <w:bottom w:w="80" w:type="dxa"/>
+              <w:end w:w="120" w:type="dxa"/>
+            </w:tcMar>
+            <w:vAlign w:val="center"/>
+            <w:shd w:fill="FFFFFF"/>
+          </w:tcPr>
+          <w:p>
+            <w:pPr>
+              <w:keepNext w:val="0"/>
+              <w:keepLines w:val="0"/>
+              <w:spacing w:before="0" w:after="0" w:line="259" w:lineRule="auto"/>
+            </w:pPr>
+            <w:r>
+              <w:rPr>
+                <w:sz w:val="17"/>
+              </w:rPr>
+              <w:t>Safely return one Saturn artifact to permanent inventory, then Lock Uranus Course.</w:t>
+            </w:r>
+          </w:p>
+        </w:tc>
+        <w:tc>
+          <w:tcPr>
+            <w:tcW w:type="dxa" w:w="1872"/>
+            <w:tcMar>
+              <w:top w:w="80" w:type="dxa"/>
+              <w:start w:w="120" w:type="dxa"/>
+              <w:bottom w:w="80" w:type="dxa"/>
+              <w:end w:w="120" w:type="dxa"/>
+            </w:tcMar>
+            <w:vAlign w:val="center"/>
+            <w:shd w:fill="FFFFFF"/>
+          </w:tcPr>
+          <w:p>
+            <w:pPr>
+              <w:keepNext w:val="0"/>
+              <w:keepLines w:val="0"/>
+              <w:spacing w:before="0" w:after="0" w:line="259" w:lineRule="auto"/>
+            </w:pPr>
+            <w:r>
+              <w:rPr>
+                <w:sz w:val="17"/>
+              </w:rPr>
+              <w:t>Queue and fly Saturn -&gt; Uranus.</w:t>
+            </w:r>
+          </w:p>
+        </w:tc>
+      </w:tr>
+      <w:tr>
+        <w:trPr>
+          <w:cantSplit/>
+        </w:trPr>
+        <w:tc>
+          <w:tcPr>
+            <w:tcW w:type="dxa" w:w="1584"/>
+            <w:tcMar>
+              <w:top w:w="80" w:type="dxa"/>
+              <w:start w:w="120" w:type="dxa"/>
+              <w:bottom w:w="80" w:type="dxa"/>
+              <w:end w:w="120" w:type="dxa"/>
+            </w:tcMar>
+            <w:vAlign w:val="center"/>
+            <w:shd w:fill="FFFFFF"/>
+          </w:tcPr>
+          <w:p>
+            <w:pPr>
+              <w:keepNext w:val="0"/>
+              <w:keepLines w:val="0"/>
+              <w:spacing w:before="0" w:after="0" w:line="259" w:lineRule="auto"/>
+            </w:pPr>
+            <w:r>
+              <w:rPr>
+                <w:sz w:val="17"/>
+              </w:rPr>
+              <w:t>Uranus</w:t>
+            </w:r>
+          </w:p>
+        </w:tc>
+        <w:tc>
+          <w:tcPr>
+            <w:tcW w:type="dxa" w:w="2160"/>
+            <w:tcMar>
+              <w:top w:w="80" w:type="dxa"/>
+              <w:start w:w="120" w:type="dxa"/>
+              <w:bottom w:w="80" w:type="dxa"/>
+              <w:end w:w="120" w:type="dxa"/>
+            </w:tcMar>
+            <w:vAlign w:val="center"/>
+            <w:shd w:fill="FFFFFF"/>
+          </w:tcPr>
+          <w:p>
+            <w:pPr>
+              <w:keepNext w:val="0"/>
+              <w:keepLines w:val="0"/>
+              <w:spacing w:before="0" w:after="0"/>
+            </w:pPr>
+            <w:r>
+              <w:rPr>
+                <w:sz w:val="17"/>
+              </w:rPr>
+              <w:t>Route Preparation</w:t>
+            </w:r>
+          </w:p>
+        </w:tc>
+        <w:tc>
+          <w:tcPr>
+            <w:tcW w:type="dxa" w:w="3744"/>
+            <w:tcMar>
+              <w:top w:w="80" w:type="dxa"/>
+              <w:start w:w="120" w:type="dxa"/>
+              <w:bottom w:w="80" w:type="dxa"/>
+              <w:end w:w="120" w:type="dxa"/>
+            </w:tcMar>
+            <w:vAlign w:val="center"/>
+            <w:shd w:fill="FFFFFF"/>
+          </w:tcPr>
+          <w:p>
+            <w:pPr>
+              <w:keepNext w:val="0"/>
+              <w:keepLines w:val="0"/>
+              <w:spacing w:before="0" w:after="0" w:line="259" w:lineRule="auto"/>
+            </w:pPr>
+            <w:r>
+              <w:rPr>
+                <w:sz w:val="17"/>
+              </w:rPr>
+              <w:t>Bank 8 Flight Data. Good/Perfect Pass Through clears the requirement in one visit; Landing adds 1. A dedicated authored briefing remains a UX task.</w:t>
+            </w:r>
+          </w:p>
+        </w:tc>
+        <w:tc>
+          <w:tcPr>
+            <w:tcW w:type="dxa" w:w="1872"/>
+            <w:tcMar>
+              <w:top w:w="80" w:type="dxa"/>
+              <w:start w:w="120" w:type="dxa"/>
+              <w:bottom w:w="80" w:type="dxa"/>
+              <w:end w:w="120" w:type="dxa"/>
+            </w:tcMar>
+            <w:vAlign w:val="center"/>
+            <w:shd w:fill="FFFFFF"/>
+          </w:tcPr>
+          <w:p>
+            <w:pPr>
+              <w:keepNext w:val="0"/>
+              <w:keepLines w:val="0"/>
+              <w:spacing w:before="0" w:after="0" w:line="259" w:lineRule="auto"/>
+            </w:pPr>
+            <w:r>
+              <w:rPr>
+                <w:sz w:val="17"/>
+              </w:rPr>
+              <w:t>Fly Uranus -&gt; Neptune.</w:t>
+            </w:r>
+          </w:p>
+        </w:tc>
+      </w:tr>
+      <w:tr>
+        <w:trPr>
+          <w:cantSplit/>
+        </w:trPr>
+        <w:tc>
+          <w:tcPr>
+            <w:tcW w:type="dxa" w:w="1584"/>
+            <w:tcMar>
+              <w:top w:w="80" w:type="dxa"/>
+              <w:start w:w="120" w:type="dxa"/>
+              <w:bottom w:w="80" w:type="dxa"/>
+              <w:end w:w="120" w:type="dxa"/>
+            </w:tcMar>
+            <w:vAlign w:val="center"/>
+            <w:shd w:fill="FFFFFF"/>
+          </w:tcPr>
+          <w:p>
+            <w:pPr>
+              <w:keepNext w:val="0"/>
+              <w:keepLines w:val="0"/>
+              <w:spacing w:before="0" w:after="0" w:line="259" w:lineRule="auto"/>
+            </w:pPr>
+            <w:r>
+              <w:rPr>
+                <w:sz w:val="17"/>
+              </w:rPr>
+              <w:t>Neptune</w:t>
+            </w:r>
+          </w:p>
+        </w:tc>
+        <w:tc>
+          <w:tcPr>
+            <w:tcW w:type="dxa" w:w="2160"/>
+            <w:tcMar>
+              <w:top w:w="80" w:type="dxa"/>
+              <w:start w:w="120" w:type="dxa"/>
+              <w:bottom w:w="80" w:type="dxa"/>
+              <w:end w:w="120" w:type="dxa"/>
+            </w:tcMar>
+            <w:vAlign w:val="center"/>
+            <w:shd w:fill="FFFFFF"/>
+          </w:tcPr>
+          <w:p>
+            <w:pPr>
+              <w:keepNext w:val="0"/>
+              <w:keepLines w:val="0"/>
+              <w:spacing w:before="0" w:after="0"/>
+            </w:pPr>
+            <w:r>
+              <w:rPr>
+                <w:sz w:val="17"/>
+              </w:rPr>
+              <w:t>Reach Neptune</w:t>
+            </w:r>
+          </w:p>
+        </w:tc>
+        <w:tc>
+          <w:tcPr>
+            <w:tcW w:type="dxa" w:w="3744"/>
+            <w:tcMar>
+              <w:top w:w="80" w:type="dxa"/>
+              <w:start w:w="120" w:type="dxa"/>
+              <w:bottom w:w="80" w:type="dxa"/>
+              <w:end w:w="120" w:type="dxa"/>
+            </w:tcMar>
+            <w:vAlign w:val="center"/>
+            <w:shd w:fill="FFFFFF"/>
+          </w:tcPr>
+          <w:p>
+            <w:pPr>
+              <w:keepNext w:val="0"/>
+              <w:keepLines w:val="0"/>
+              <w:spacing w:before="0" w:after="0" w:line="259" w:lineRule="auto"/>
+            </w:pPr>
+            <w:r>
+              <w:rPr>
+                <w:sz w:val="17"/>
+              </w:rPr>
+              <w:t>Successful arrival triggers the saved Straylight discovery; no Neptune artifact is required.</w:t>
+            </w:r>
+          </w:p>
+        </w:tc>
+        <w:tc>
+          <w:tcPr>
+            <w:tcW w:type="dxa" w:w="1872"/>
+            <w:tcMar>
+              <w:top w:w="80" w:type="dxa"/>
+              <w:start w:w="120" w:type="dxa"/>
+              <w:bottom w:w="80" w:type="dxa"/>
+              <w:end w:w="120" w:type="dxa"/>
+            </w:tcMar>
+            <w:vAlign w:val="center"/>
+            <w:shd w:fill="FFFFFF"/>
+          </w:tcPr>
+          <w:p>
+            <w:pPr>
+              <w:keepNext w:val="0"/>
+              <w:keepLines w:val="0"/>
+              <w:spacing w:before="0" w:after="0" w:line="259" w:lineRule="auto"/>
+            </w:pPr>
+            <w:r>
+              <w:rPr>
+                <w:sz w:val="17"/>
+              </w:rPr>
+              <w:t>Choose Approach the Straylight; the Ark campaign begins.</w:t>
+            </w:r>
+          </w:p>
+        </w:tc>
+      </w:tr>
+    </w:tbl>
     <w:p>
       <w:pPr>
         <w:pStyle w:val="Heading1"/>
@@ -4420,7 +5324,7 @@
         <w:pStyle w:val="ListNumber"/>
       </w:pPr>
       <w:r>
-        <w:t>When reaching the Moon or beyond, resolve arrival operations, the current mandatory campaign objective, surface decisions, mining, and extraction; broader research begins at Mars.</w:t>
+        <w:t>When reaching the Moon or beyond, commit to one Arrival path, resolve the current mandatory campaign objective, make Surface decisions, mine and extract, and bank Research Data or Flight Data where the chosen activity grants it.</w:t>
       </w:r>
     </w:p>
     <w:p>
@@ -4436,7 +5340,7 @@
         <w:pStyle w:val="ListNumber"/>
       </w:pPr>
       <w:r>
-        <w:t>Progress from Moon to Mars, Jupiter/Io, Saturn, Uranus, and Neptune in order. Earth Orbit remains only as a hidden version-9 save origin. Moon, Mars, Io, and the Saturn transfer are authored scenario definitions: each owns its briefing, visible objective, explicit claim, reward preview, and route key. The delivery, reward, cocoon, Flyby, and route systems remain generic so future authored or procedural scenarios can compose the same mechanics without a new campaign-specific code path.</w:t>
+        <w:t>Progress from Moon to Mars, Jupiter/Io, Saturn, Uranus, and Neptune in order. Authored scenario gates own the Moon and Mars deliveries, Io artifact, Jupiter Perfect departure, Saturn artifact, and Uranus Neptune-vector solution. Claimed route rewards queue a saved physical source-to-target transit; the frontier advances only after successful arrival, and failed travel remains retryable from the correct origin.</w:t>
       </w:r>
     </w:p>
     <w:p>
@@ -5131,7 +6035,7 @@
         <w:spacing w:before="0" w:after="120" w:line="264" w:lineRule="auto"/>
       </w:pPr>
       <w:r>
-        <w:t>Successful transfers open flyby, orbit, and landing operations without discarding the exact transfer fuel remaining or installed capacity. Arrival Ops previews Transfer fuel remaining, Rig fuel after landing, and Return stage readiness. Optional activities retain saved first-use help, while authored campaign steps use mandatory non-dismissible briefings, visible LOCKED/ACTIVE/READY TO CLAIM/COMPLETE objectives, and named claim actions. The Moon requires 30 safely delivered local Common Ore before Install Prospector Mk I grants the first Mining Support Drone, Slot 1, and the Mars route key. Mars requires 40 local Common Ore before Fabricate Drone Bay Slot 2 opens an empty specialist slot and grants the Jupiter route key; its briefing explicitly introduces oxygen, drill heat, integrity wear, field repairs, cargo, and the return decision. Io commissions Hazard Mk I, launches a configured two-layer lava cocoon around a protected objective, and awards one player-selected Support Drone upgrade credit after safe extraction. A dedicated Perfect Jupiter Flyby scenario then makes the Saturn route claimable. Mars remains the first broad research frontier.</w:t>
+        <w:t>Successful transfers open one committed Arrival path without discarding exact transfer fuel. Pass Through ends the visit, Orbit Capture opens mapped landing or science departure, and Direct Descent accepts +20 surface hazard. Moon requires 30 safely delivered local Common Ore before its explicit claim opens Drone Ops, Slot 1, 20 Common for the first Prospector fabrication, and the Mars route. Mars requires 40 local Common Ore before its claim opens empty Slot 2 and Jupiter. Io commissions Hazard Mk I and teaches one four-segment thermal seal around the first progression artifact. Safe Io extraction opens a dedicated Perfect Jupiter departure; its claim queues Jupiter -&gt; Saturn. A permanently recovered Saturn artifact makes Lock Uranus Course claimable and queues Saturn -&gt; Uranus. At Uranus, Signal Beyond Neptune introduces the last charted departure and the saved Neptune Vector objective. Bank 8 Flight Data: each safe Landing adds 1, a Good or Perfect Pass Through completes the solution, and Orbit alone adds none. Lock Neptune Course queues Uranus -&gt; Neptune without moving the frontier early. Successful Neptune arrival then presents the blocking Straylight discovery.</w:t>
       </w:r>
     </w:p>
     <w:tbl>
@@ -5343,7 +6247,7 @@
                 <w:rFonts w:ascii="Calibri" w:hAnsi="Calibri"/>
                 <w:sz w:val="18"/>
               </w:rPr>
-              <w:t>Saved first-use brief connects the minigame's rewards to blueprint progression and permanent shipyard upgrades.</w:t>
+              <w:t>Saved first-use brief connects the minigame's rewards to Research Data progression and permanent shipyard upgrades.</w:t>
             </w:r>
             <w:r>
               <w:rPr>
@@ -5441,7 +6345,7 @@
                 <w:rFonts w:ascii="Calibri" w:hAnsi="Calibri"/>
                 <w:sz w:val="18"/>
               </w:rPr>
-              <w:t>Saved first-use brief connects orbit rewards to blueprint progression; perfect orbits show science and mission credits.</w:t>
+              <w:t>Saved first-use brief connects orbit rewards to Research Data progression; perfect orbits show science and mission credits.</w:t>
             </w:r>
             <w:r>
               <w:rPr>
@@ -5612,7 +6516,7 @@
                 <w:rFonts w:ascii="Calibri" w:hAnsi="Calibri"/>
                 <w:sz w:val="18"/>
               </w:rPr>
-              <w:t>Which new options should materials, blueprints, and artifacts unlock?</w:t>
+              <w:t>Which new options should materials, Research Data, and artifacts unlock?</w:t>
             </w:r>
           </w:p>
         </w:tc>
@@ -5761,7 +6665,7 @@
         <w:spacing w:before="0" w:after="120" w:line="264" w:lineRule="auto"/>
       </w:pPr>
       <w:r>
-        <w:t>Mining remains one rig-fuel deployment per surface loop and begins in the player-controlled Mining Rig; autonomous bay units are Support Drones. Each pre-Ark landing combines an isolated 3-unit expedition pack with the exact transfer fuel remaining at touchdown. Ark-era landings debit up to 3 pack units from the Ark reserve once, then add the transfer remainder. Deployment spends 1 rig fuel and each completed 15-second operating cycle spends 1 more; depletion away from the ship triggers emergency recall without touching the protected return stage. Ordinary Regolith breaks only to make a path and never yields material. Common Ore uses a gray/silver body and shimmer, while gold marks Rare Ore. The Io scenario configures a Thermal-lava site with a 60-second oxygen baseline while normal missions retain 30 seconds. Both rig and operator use inertial fixed-step movement under vector-valued destination gravity.</w:t>
+        <w:t>Mining remains one rig-fuel deployment per Surface loop and begins in the player-controlled Mining Rig. Pre-Ark landings combine the isolated 3-unit expedition pack with transfer fuel preserved at touchdown; Ark-era landings debit that pack from the Ark reserve once. Deployment costs exactly 1 Rig fuel. Operating fuel follows the permanent Rig Fuel Loop cycle (15 / 18 / 21 / 24 seconds before load multipliers), while the protected return stage is never spendable. Regolith is path material, Common Ore is gray/silver, and Rare Ore is gold. Hidden cocoon hazards remain inert until their authored reveal rule exposes them.</w:t>
       </w:r>
     </w:p>
     <w:p>
@@ -5919,12 +6823,6 @@
               </w:rPr>
               <w:t>Transfer fuel / Rig fuel / Return stage</w:t>
             </w:r>
-            <w:r>
-              <w:rPr>
-                <w:rFonts w:ascii="Calibri" w:hAnsi="Calibri"/>
-                <w:sz w:val="18"/>
-              </w:rPr>
-            </w:r>
           </w:p>
         </w:tc>
         <w:tc>
@@ -5948,13 +6846,7 @@
                 <w:rFonts w:ascii="Calibri" w:hAnsi="Calibri"/>
                 <w:sz w:val="18"/>
               </w:rPr>
-              <w:t>Arrival surplus, 1-unit deployment, and 15-second operating-cycle cadence.</w:t>
-            </w:r>
-            <w:r>
-              <w:rPr>
-                <w:rFonts w:ascii="Calibri" w:hAnsi="Calibri"/>
-                <w:sz w:val="18"/>
-              </w:rPr>
+              <w:t>Arrival surplus, exact 1-unit deployment, and the 15 / 18 / 21 / 24-second Rig Fuel Loop cadence before load multipliers.</w:t>
             </w:r>
           </w:p>
         </w:tc>
@@ -5980,12 +6872,6 @@
                 <w:sz w:val="18"/>
               </w:rPr>
               <w:t>Arrival Ops previews all three pools; Surface Ops and Mining show fractional Rig fuel while the return stage remains READY/RESERVED.</w:t>
-            </w:r>
-            <w:r>
-              <w:rPr>
-                <w:rFonts w:ascii="Calibri" w:hAnsi="Calibri"/>
-                <w:sz w:val="18"/>
-              </w:rPr>
             </w:r>
           </w:p>
         </w:tc>
@@ -6015,13 +6901,7 @@
                 <w:rFonts w:ascii="Calibri" w:hAnsi="Calibri"/>
                 <w:sz w:val="18"/>
               </w:rPr>
-            </w:r>
-            <w:r>
-              <w:rPr>
-                <w:rFonts w:ascii="Calibri" w:hAnsi="Calibri"/>
-                <w:sz w:val="18"/>
-              </w:rPr>
-              <w:t>Oxygen</w:t>
+              <w:t>Rig O2 / Suit O2</w:t>
             </w:r>
           </w:p>
         </w:tc>
@@ -6046,13 +6926,7 @@
                 <w:rFonts w:ascii="Calibri" w:hAnsi="Calibri"/>
                 <w:sz w:val="18"/>
               </w:rPr>
-              <w:t>Short-run timer; baseline is 30 seconds before upgrades.</w:t>
-            </w:r>
-            <w:r>
-              <w:rPr>
-                <w:rFonts w:ascii="Calibri" w:hAnsi="Calibri"/>
-                <w:sz w:val="18"/>
-              </w:rPr>
+              <w:t>Independent reserves: upgrade-driven Rig oxygen and a fixed 15-second EVA emergency reserve.</w:t>
             </w:r>
           </w:p>
         </w:tc>
@@ -6077,13 +6951,7 @@
                 <w:rFonts w:ascii="Calibri" w:hAnsi="Calibri"/>
                 <w:sz w:val="18"/>
               </w:rPr>
-              <w:t>Crew, Resource Drones, and field upgrades can extend it, but total capacity is capped at 120 seconds.</w:t>
-            </w:r>
-            <w:r>
-              <w:rPr>
-                <w:rFonts w:ascii="Calibri" w:hAnsi="Calibri"/>
-                <w:sz w:val="18"/>
-              </w:rPr>
+              <w:t>Only the active actor drains. Ship service refills eligible reserves for free; pockets, crew, Drones, site baselines, and upgrades affect Rig O2 only.</w:t>
             </w:r>
           </w:p>
         </w:tc>
@@ -6309,12 +7177,6 @@
                 <w:rFonts w:ascii="Calibri" w:hAnsi="Calibri"/>
                 <w:sz w:val="18"/>
               </w:rPr>
-            </w:r>
-            <w:r>
-              <w:rPr>
-                <w:rFonts w:ascii="Calibri" w:hAnsi="Calibri"/>
-                <w:sz w:val="18"/>
-              </w:rPr>
               <w:t>Scanner</w:t>
             </w:r>
           </w:p>
@@ -6340,13 +7202,7 @@
                 <w:rFonts w:ascii="Calibri" w:hAnsi="Calibri"/>
                 <w:sz w:val="18"/>
               </w:rPr>
-            </w:r>
-            <w:r>
-              <w:rPr>
-                <w:rFonts w:ascii="Calibri" w:hAnsi="Calibri"/>
-                <w:sz w:val="18"/>
-              </w:rPr>
-              <w:t>Reveals fog-of-war, ore, artifacts, and later enemy silhouettes.</w:t>
+              <w:t>Reveals fog, ore, threats, and authored signals through deliberate pulses.</w:t>
             </w:r>
           </w:p>
         </w:tc>
@@ -6371,13 +7227,7 @@
                 <w:rFonts w:ascii="Calibri" w:hAnsi="Calibri"/>
                 <w:sz w:val="18"/>
               </w:rPr>
-            </w:r>
-            <w:r>
-              <w:rPr>
-                <w:rFonts w:ascii="Calibri" w:hAnsi="Calibri"/>
-                <w:sz w:val="18"/>
-              </w:rPr>
-              <w:t>Cooldown must make information a decision, not a free map.</w:t>
+              <w:t>Survey Triangulation hides all signal coordinates and the artifact until three scanner-covered slices are complete; cooldown time alone never advances it.</w:t>
             </w:r>
           </w:p>
         </w:tc>
@@ -6475,7 +7325,7 @@
     <w:p>
       <w:pPr/>
       <w:r>
-        <w:t>The suit has fixed equipment and no upgrades, ammunition, propellant, or fall damage. Its 1.2-cell hand drill uses 45% of base rig power and the existing heat model; scanner and tether use base radius and range without rig bonuses. The infinite sidearm deals 2.4 damage to the first valid hit within 8 cells, fires immediately and every 0.18 seconds, never pierces or critically hits, and caps terrain output at 30% of the hand drill. It cannot damage the rig, shuttle, artifact, or mini drones.</w:t>
+        <w:t>The suit has fixed equipment and a separate 15-second emergency oxygen reserve with no upgrade path. Rig mode drains only Rig oxygen; EVA drains only Suit oxygen. Re-entering the Rig away from the ship refills neither reserve, and emergency ejection begins with whatever Suit oxygen remains. The active reserve alone drives warnings and owner damage: empty Rig oxygen damages Rig integrity and can eject the operator, while empty Suit oxygen drains Suit integrity through the EVA-death flow.</w:t>
       </w:r>
     </w:p>
     <w:p>
@@ -6493,7 +7343,7 @@
     <w:p>
       <w:pPr/>
       <w:r>
-        <w:t>Normal extraction requires a functioning rig and operator in the return zone. After emergency ejection, the shuttle ends the deployment safely and may secure a physically delivered artifact. Zero suit integrity releases the tether, recalls the drone companions, and ends the run; shuttle repair spends stowed Common material.</w:t>
+        <w:t>Ship service is free and independent of cargo inside the visible entry-layer service field. A docked Rig refills Rig oxygen; an EVA operator at the ship refills Suit oxygen; an occupied docked Rig refills both; and a docked Rig whose operator is elsewhere refills only itself. Normal extraction requires a functioning Rig and operator in the return zone. After emergency ejection, the shuttle may still secure a physically delivered artifact. The first real tethered-terrain slam threshold prevents unavoidable dragging and ordinary ground contact from damaging artifacts.</w:t>
       </w:r>
     </w:p>
     <w:p>
@@ -6514,6 +7364,7 @@
     </w:p>
     <w:p>
       <w:pPr>
+        <w:spacing w:before="0" w:after="0" w:lineRule="exact" w:line="20"/>
         <w:sectPr>
           <w:headerReference w:type="default" r:id="rId13"/>
           <w:footerReference w:type="default" r:id="rId14"/>
@@ -6524,6 +7375,11 @@
           <w:docGrid w:linePitch="360"/>
         </w:sectPr>
       </w:pPr>
+      <w:r>
+        <w:rPr>
+          <w:sz w:val="2"/>
+        </w:rPr>
+      </w:r>
     </w:p>
     <w:p>
       <w:pPr>
@@ -7812,7 +8668,7 @@
         <w:spacing w:before="0" w:after="120" w:line="264" w:lineRule="auto"/>
       </w:pPr>
       <w:r>
-        <w:t>Research unlocks decisions, not just bigger numbers. Materials, blueprints, and artifacts open permanent system families, crew facilities, surface tools, Support Drone systems, and Ark repair hooks. A protected-objective adapter determines a payload's reward: the current Io minor artifact is explicitly not Ark-repair progress and safe extraction grants one persistent Drone Upgrade Credit that the player applies to an owned Mk I or Mk II Support Drone. Other protected objectives can award different rewards without changing cocoon discovery, mining, or extraction mechanics.</w:t>
+        <w:t>Research Data and recovered materials unlock future Refit families and long-term decisions. Artifacts enter permanent inventory only after safe return; an artifact aboard the ship may display as pending but does not satisfy a permanent recovery gate until the expedition settles it. Authored artifact objectives can grant route access, Expedition XP, Drone support, or later Ark-repair hooks without changing the generic protection, tethering, delivery, and scenario-event systems.</w:t>
       </w:r>
     </w:p>
     <w:tbl>
@@ -8158,13 +9014,7 @@
                 <w:rFonts w:ascii="Calibri" w:hAnsi="Calibri"/>
                 <w:sz w:val="18"/>
               </w:rPr>
-            </w:r>
-            <w:r>
-              <w:rPr>
-                <w:rFonts w:ascii="Calibri" w:hAnsi="Calibri"/>
-                <w:sz w:val="18"/>
-              </w:rPr>
-              <w:t>Blueprints</w:t>
+              <w:t>Research Data</w:t>
             </w:r>
           </w:p>
         </w:tc>
@@ -8189,13 +9039,7 @@
                 <w:rFonts w:ascii="Calibri" w:hAnsi="Calibri"/>
                 <w:sz w:val="18"/>
               </w:rPr>
-            </w:r>
-            <w:r>
-              <w:rPr>
-                <w:rFonts w:ascii="Calibri" w:hAnsi="Calibri"/>
-                <w:sz w:val="18"/>
-              </w:rPr>
-              <w:t>Overburns, research, artifacts, surface discoveries.</w:t>
+              <w:t>Pass Through, Orbit, artifacts, and authored rewards.</w:t>
             </w:r>
           </w:p>
         </w:tc>
@@ -8216,7 +9060,7 @@
               <w:spacing w:before="0" w:after="60" w:line="259" w:lineRule="auto"/>
             </w:pPr>
             <w:r>
-              <w:t>Research unlocks and long-term player choices.</w:t>
+              <w:t>Saved thresholds 2 / 8 / 12 / 18 / 24 add new module families to future Refit offers; a breakthrough review does not grant the module itself.</w:t>
             </w:r>
           </w:p>
         </w:tc>
@@ -8344,12 +9188,6 @@
                 <w:rFonts w:ascii="Calibri" w:hAnsi="Calibri"/>
                 <w:sz w:val="18"/>
               </w:rPr>
-            </w:r>
-            <w:r>
-              <w:rPr>
-                <w:rFonts w:ascii="Calibri" w:hAnsi="Calibri"/>
-                <w:sz w:val="18"/>
-              </w:rPr>
               <w:t>Artifacts</w:t>
             </w:r>
           </w:p>
@@ -8375,13 +9213,7 @@
                 <w:rFonts w:ascii="Calibri" w:hAnsi="Calibri"/>
                 <w:sz w:val="18"/>
               </w:rPr>
-            </w:r>
-            <w:r>
-              <w:rPr>
-                <w:rFonts w:ascii="Calibri" w:hAnsi="Calibri"/>
-                <w:sz w:val="18"/>
-              </w:rPr>
-              <w:t>Deeper surface and mining cache recovery.</w:t>
+              <w:t>Safely settled authored and incidental recoveries.</w:t>
             </w:r>
           </w:p>
         </w:tc>
@@ -8406,13 +9238,7 @@
                 <w:rFonts w:ascii="Calibri" w:hAnsi="Calibri"/>
                 <w:sz w:val="18"/>
               </w:rPr>
-            </w:r>
-            <w:r>
-              <w:rPr>
-                <w:rFonts w:ascii="Calibri" w:hAnsi="Calibri"/>
-                <w:sz w:val="18"/>
-              </w:rPr>
-              <w:t>Identification, blueprint insight, future Ark repair/story threads.</w:t>
+              <w:t>Permanent inventory, scenario route keys, Research Data, Expedition XP, and future Ark repair/story hooks. Pending shipboard artifacts are not yet permanent.</w:t>
             </w:r>
           </w:p>
         </w:tc>
@@ -8515,8 +9341,99 @@
           </w:p>
         </w:tc>
       </w:tr>
+      <w:tr>
+        <w:trPr>
+          <w:cantSplit/>
+        </w:trPr>
+        <w:tc>
+          <w:tcPr>
+            <w:tcW w:type="dxa" w:w="2200"/>
+            <w:tcMar>
+              <w:top w:w="80" w:type="dxa"/>
+              <w:start w:w="120" w:type="dxa"/>
+              <w:bottom w:w="80" w:type="dxa"/>
+              <w:end w:w="120" w:type="dxa"/>
+            </w:tcMar>
+            <w:vAlign w:val="center"/>
+            <w:shd w:fill="FFFFFF"/>
+          </w:tcPr>
+          <w:p>
+            <w:pPr>
+              <w:spacing w:before="0" w:after="60" w:line="259" w:lineRule="auto"/>
+            </w:pPr>
+            <w:r>
+              <w:rPr>
+                <w:rFonts w:ascii="Calibri" w:hAnsi="Calibri"/>
+                <w:sz w:val="18"/>
+              </w:rPr>
+              <w:t>Expedition XP</w:t>
+            </w:r>
+          </w:p>
+        </w:tc>
+        <w:tc>
+          <w:tcPr>
+            <w:tcW w:type="dxa" w:w="3400"/>
+            <w:tcMar>
+              <w:top w:w="80" w:type="dxa"/>
+              <w:start w:w="120" w:type="dxa"/>
+              <w:bottom w:w="80" w:type="dxa"/>
+              <w:end w:w="120" w:type="dxa"/>
+            </w:tcMar>
+            <w:vAlign w:val="center"/>
+            <w:shd w:fill="FFFFFF"/>
+          </w:tcPr>
+          <w:p>
+            <w:pPr>
+              <w:spacing w:before="0" w:after="60" w:line="259" w:lineRule="auto"/>
+            </w:pPr>
+            <w:r>
+              <w:rPr>
+                <w:rFonts w:ascii="Calibri" w:hAnsi="Calibri"/>
+                <w:sz w:val="18"/>
+              </w:rPr>
+              <w:t>Ore, enemy, artifact, and authored-objective events during a Surface expedition.</w:t>
+            </w:r>
+          </w:p>
+        </w:tc>
+        <w:tc>
+          <w:tcPr>
+            <w:tcW w:type="dxa" w:w="3760"/>
+            <w:tcMar>
+              <w:top w:w="80" w:type="dxa"/>
+              <w:start w:w="120" w:type="dxa"/>
+              <w:bottom w:w="80" w:type="dxa"/>
+              <w:end w:w="120" w:type="dxa"/>
+            </w:tcMar>
+            <w:vAlign w:val="center"/>
+            <w:shd w:fill="FFFFFF"/>
+          </w:tcPr>
+          <w:p>
+            <w:pPr>
+              <w:spacing w:before="0" w:after="60" w:line="259" w:lineRule="auto"/>
+            </w:pPr>
+            <w:r>
+              <w:rPr>
+                <w:rFonts w:ascii="Calibri" w:hAnsi="Calibri"/>
+                <w:sz w:val="18"/>
+              </w:rPr>
+              <w:t>Run-scoped Rig ranks, Drone-type ranks, slot grafts, and synergies selected from Level Up drafts.</w:t>
+            </w:r>
+          </w:p>
+        </w:tc>
+      </w:tr>
     </w:tbl>
-    <w:p/>
+    <w:p>
+      <w:pPr/>
+      <w:r>
+        <w:t>Progression artifacts use one deterministic placement curve. The ordinal counts unique authored artifact-bearing destinations already represented in permanent inventory; incidental artifacts, duplicate destination artifacts, temporary payloads, and failed recoveries do not advance it. Three progression artifacts share each depth: slot 0 is centered exactly ten cells below entry, slots 1 and 2 use seeded 11-14 and 15-20 cell Manhattan displacement with 1-10 cells down and no more than 10 left or right, and the next trio resets to the centered layout one depth deeper. Cached target layers preserve the result across recall, failure, reload, and redeployment.</w:t>
+      </w:r>
+    </w:p>
+    <w:p>
+      <w:pPr/>
+      <w:r>
+        <w:t>Survey Triangulation keeps the artifact tile, sprite, purple glow, label, guidance, and tether target completely hidden until three invisible signal points are covered by actual scanner pulses. One large aura around the concealed site is divided into three equal 120-degree slices: incomplete slices are bright cyan/teal and completed slices turn green. A player or Survey Drone pulse may complete multiple slices. At 3/3 the gate opens in the same reconciliation, the aura disappears, and the exposed artifact returns with its prominent purple glow. Non-triangulation sites such as Io retain the purple undiscovered-tile and cocoon presentation.</w:t>
+      </w:r>
+    </w:p>
     <w:p>
       <w:pPr>
         <w:pStyle w:val="Heading2"/>
@@ -8530,7 +9447,7 @@
         <w:spacing w:before="0" w:after="120" w:line="264" w:lineRule="auto"/>
       </w:pPr>
       <w:r>
-        <w:t>The Moon mining contract reserves 30 safely delivered lunar Common Ore until the player explicitly installs Prospector Mk I, permanently owns the first Mining Support Drone, opens Slot 1, and receives the Mars route key. Mars reserves 40 local Common Ore until the player explicitly fabricates empty Slot 2 and receives the Jupiter route key. Moon remains a simple excavation-and-return lesson; Mars turns the extended contract into repeated oxygen, heat, integrity, repair, cargo, and return cycles. Resource and Survey remain research unlocks; Hazard is commissioned by the Io scenario. A bay can equip multiple owned frames of the same role when the player has paid to build those copies; slots preserve individual frame identity and upgrade level. Hazard Drones cross terrain directly to avoid route traps, but they only target cells the player has revealed.</w:t>
+        <w:t>Expedition XP creates survivor-style Level Up drafts during a Surface run. Picks can rank the Mining Rig, rank every equipped copy of one Support Drone type, graft a module to one occupied slot, or activate a named loadout synergy; these benefits last for the Transport expedition rather than becoming permanent material purchases. Combat-tagged choices such as Resonant Discharge are excluded, and stale combat drafts are rerolled without consuming the pick, until the campaign has recorded its first hostile encounter.</w:t>
       </w:r>
     </w:p>
     <w:tbl>
@@ -8778,12 +9695,6 @@
                 <w:rFonts w:ascii="Calibri" w:hAnsi="Calibri"/>
                 <w:sz w:val="18"/>
               </w:rPr>
-            </w:r>
-            <w:r>
-              <w:rPr>
-                <w:rFonts w:ascii="Calibri" w:hAnsi="Calibri"/>
-                <w:sz w:val="18"/>
-              </w:rPr>
               <w:t>Resource Drone</w:t>
             </w:r>
           </w:p>
@@ -8811,12 +9722,6 @@
               </w:rPr>
               <w:t>Drone Support Program</w:t>
             </w:r>
-            <w:r>
-              <w:rPr>
-                <w:rFonts w:ascii="Calibri" w:hAnsi="Calibri"/>
-                <w:sz w:val="18"/>
-              </w:rPr>
-            </w:r>
           </w:p>
         </w:tc>
         <w:tc>
@@ -8840,13 +9745,7 @@
                 <w:rFonts w:ascii="Calibri" w:hAnsi="Calibri"/>
                 <w:sz w:val="18"/>
               </w:rPr>
-            </w:r>
-            <w:r>
-              <w:rPr>
-                <w:rFonts w:ascii="Calibri" w:hAnsi="Calibri"/>
-                <w:sz w:val="18"/>
-              </w:rPr>
-              <w:t>Adds oxygen/fuel endurance and lowers extraction strain.</w:t>
+              <w:t>Adds Rig oxygen/fuel endurance and lowers extraction strain; it never expands or refills the fixed Suit reserve.</w:t>
             </w:r>
           </w:p>
         </w:tc>
@@ -9023,12 +9922,6 @@
                 <w:rFonts w:ascii="Calibri" w:hAnsi="Calibri"/>
                 <w:sz w:val="18"/>
               </w:rPr>
-            </w:r>
-            <w:r>
-              <w:rPr>
-                <w:rFonts w:ascii="Calibri" w:hAnsi="Calibri"/>
-                <w:sz w:val="18"/>
-              </w:rPr>
               <w:t>Attack Drone</w:t>
             </w:r>
           </w:p>
@@ -9054,13 +9947,7 @@
                 <w:rFonts w:ascii="Calibri" w:hAnsi="Calibri"/>
                 <w:sz w:val="18"/>
               </w:rPr>
-              <w:t>Arkfall Mk I; Coordination Mk II-III</w:t>
-            </w:r>
-            <w:r>
-              <w:rPr>
-                <w:rFonts w:ascii="Calibri" w:hAnsi="Calibri"/>
-                <w:sz w:val="18"/>
-              </w:rPr>
+              <w:t>Arkfall Mk I; post-contact Level Ups</w:t>
             </w:r>
           </w:p>
         </w:tc>
@@ -9085,7 +9972,7 @@
                 <w:rFonts w:ascii="Calibri" w:hAnsi="Calibri"/>
                 <w:sz w:val="18"/>
               </w:rPr>
-              <w:t>Fights beside the controlled character with target priority, critical-hit tuning, area control, and enemy slowdown after Arkfall.</w:t>
+              <w:t>Fights beside the controlled character. Advanced combat ranks, grafts, and synergies enter drafts only after the first hostile encounter.</w:t>
             </w:r>
           </w:p>
         </w:tc>
@@ -9115,12 +10002,6 @@
                 <w:rFonts w:ascii="Calibri" w:hAnsi="Calibri"/>
                 <w:sz w:val="18"/>
               </w:rPr>
-            </w:r>
-            <w:r>
-              <w:rPr>
-                <w:rFonts w:ascii="Calibri" w:hAnsi="Calibri"/>
-                <w:sz w:val="18"/>
-              </w:rPr>
               <w:t>Defense Drone</w:t>
             </w:r>
           </w:p>
@@ -9146,13 +10027,7 @@
                 <w:rFonts w:ascii="Calibri" w:hAnsi="Calibri"/>
                 <w:sz w:val="18"/>
               </w:rPr>
-              <w:t>Arkfall Mk I; Coordination Mk II-III</w:t>
-            </w:r>
-            <w:r>
-              <w:rPr>
-                <w:rFonts w:ascii="Calibri" w:hAnsi="Calibri"/>
-                <w:sz w:val="18"/>
-              </w:rPr>
+              <w:t>Arkfall Mk I; post-contact Level Ups</w:t>
             </w:r>
           </w:p>
         </w:tc>
@@ -9177,7 +10052,7 @@
                 <w:rFonts w:ascii="Calibri" w:hAnsi="Calibri"/>
                 <w:sz w:val="18"/>
               </w:rPr>
-              <w:t>Orbits and intercepts damage around the controlled actor, with shields, reactive armor, counter-hits, and hazard/enemy damage relief.</w:t>
+              <w:t>Intercepts damage around the controlled actor. Advanced shields, reactive armor, and counter packages remain unavailable before first contact.</w:t>
             </w:r>
           </w:p>
         </w:tc>
@@ -9221,11 +10096,12 @@
         <w:spacing w:before="0" w:after="120" w:line="264" w:lineRule="auto"/>
       </w:pPr>
       <w:r>
-        <w:t>The game can hurt the player without dead-ending the campaign. Ships can be lost and installed systems can go offline for the expedition, but permanent ownership survives replacement. Crew members can die or come home injured. Memorials persist. Rescue costs bite. Records, unlocks, blueprints, facilities, artifacts, drones, and saved onboarding state keep the program moving.</w:t>
+        <w:t>The game can hurt the player without dead-ending the campaign. Ships can be lost and installed systems can go offline for the expedition, but permanent ownership survives replacement. Crew members can die or come home injured. Memorials persist. Rescue costs bite. Records, unlocks, Research Data, facilities, artifacts, drones, and saved onboarding state keep the program moving.</w:t>
       </w:r>
     </w:p>
     <w:p>
       <w:pPr>
+        <w:spacing w:before="0" w:after="0" w:lineRule="exact" w:line="20"/>
         <w:sectPr>
           <w:headerReference w:type="default" r:id="rId15"/>
           <w:footerReference w:type="default" r:id="rId16"/>
@@ -9236,6 +10112,11 @@
           <w:docGrid w:linePitch="360"/>
         </w:sectPr>
       </w:pPr>
+      <w:r>
+        <w:rPr>
+          <w:sz w:val="2"/>
+        </w:rPr>
+      </w:r>
     </w:p>
     <w:p>
       <w:pPr>
@@ -9602,7 +10483,7 @@
               <w:spacing w:before="0" w:after="60" w:line="259" w:lineRule="auto"/>
             </w:pPr>
             <w:r>
-              <w:t>Asteroid-belt qualification leads to the configured Io recovery scenario; a claimed Perfect slingshot opens Saturn.</w:t>
+              <w:t>Asteroid qualification leads to Io's one-seal artifact recovery; a separately claimed Perfect departure queues Saturn.</w:t>
             </w:r>
           </w:p>
         </w:tc>
@@ -9691,7 +10572,7 @@
               <w:spacing w:before="0" w:after="60" w:line="259" w:lineRule="auto"/>
             </w:pPr>
             <w:r>
-              <w:t>Second explicit outer-planet transfer; unlocks Uranus on successful arrival.</w:t>
+              <w:t>First one-way outer destination. A permanently recovered Saturn artifact makes Lock Uranus Course claimable and queues the next flight.</w:t>
             </w:r>
           </w:p>
         </w:tc>
@@ -9780,7 +10661,7 @@
               <w:spacing w:before="0" w:after="60" w:line="259" w:lineRule="auto"/>
             </w:pPr>
             <w:r>
-              <w:t>Third explicit outer-planet transfer; unlocks Neptune on successful arrival.</w:t>
+              <w:t>Banks the generic 8 Flight Data required for Neptune; Pass Through clears it in one visit, Landing adds one. Needs a dedicated authored departure explanation.</w:t>
             </w:r>
           </w:p>
         </w:tc>
@@ -9869,7 +10750,7 @@
               <w:spacing w:before="0" w:after="60" w:line="259" w:lineRule="auto"/>
             </w:pPr>
             <w:r>
-              <w:t>Final solar transfer. Success queues the blocking Straylight discovery; no Straylight content exists before it.</w:t>
+              <w:t>Final solar transfer. Successful arrival queues the blocking Straylight discovery; no Neptune artifact is required first.</w:t>
             </w:r>
           </w:p>
         </w:tc>
@@ -9955,7 +10836,7 @@
               <w:spacing w:before="0" w:after="60" w:line="259" w:lineRule="auto"/>
             </w:pPr>
             <w:r>
-              <w:t>Friendly resource system reached after the Straylight discovery; teaches Ark-scale search and mining without combat.</w:t>
+              <w:t>Friendly post-solar system with a deterministic persisted roster of 4-6 primary bodies and 3-7 moons; the first three primaries are landable.</w:t>
             </w:r>
           </w:p>
         </w:tc>
@@ -10044,7 +10925,7 @@
               <w:spacing w:before="0" w:after="60" w:line="259" w:lineRule="auto"/>
             </w:pPr>
             <w:r>
-              <w:t>First hostile-system sortie from damaged Straylight after Arkfall.</w:t>
+              <w:t>First hostile post-Arkfall system with a deterministic persisted body roster and themed hostile mining ecologies.</w:t>
             </w:r>
           </w:p>
         </w:tc>
@@ -10065,7 +10946,7 @@
               <w:spacing w:before="0" w:after="60" w:line="259" w:lineRule="auto"/>
             </w:pPr>
             <w:r>
-              <w:t>Hostile contacts and passive defense allowed.</w:t>
+              <w:t>Hostile contacts and passive defense.</w:t>
             </w:r>
           </w:p>
         </w:tc>
@@ -10100,7 +10981,7 @@
           </w:tcPr>
           <w:p>
             <w:r>
-              <w:t>Void Compass placeholder for deeper-route content.</w:t>
+              <w:t>Void Compass region with 4-8 deterministic mineable fragments and deep-route geology.</w:t>
             </w:r>
           </w:p>
         </w:tc>
@@ -10146,7 +11027,7 @@
         <w:spacing w:before="0" w:after="120" w:line="264" w:lineRule="auto"/>
       </w:pPr>
       <w:r>
-        <w:t>Art uses #ff00aa sources, tolerant cleanup, verified alpha, and deterministic packing. The manifest has 37 runtime textures, including the Jetpack Capybara, POI guidance arrow, and reusable asteroid; missing art or registration fails without fallback. Vulkan and WebGL2 share every metadata-declared atlas page and generated header.</w:t>
+        <w:t>Art uses #ff00aa-family source cleanup, verified alpha, and deterministic packing. The manifest now declares 78 runtime textures across four atlas pages. It includes destination-specific mining sheets, the dedicated artifact, attached red/orange ship thrust, six Support Drone roles, six enemy families in five environmental variants, and a 32-family post-solar geology library shared by Vulkan and WebGL2.</w:t>
       </w:r>
     </w:p>
     <w:tbl>
@@ -10188,7 +11069,7 @@
           </w:tcPr>
           <w:p>
             <w:pPr>
-              <w:spacing w:before="0" w:after="20" w:line="240" w:lineRule="auto"/>
+              <w:spacing w:before="0" w:after="0" w:line="240" w:lineRule="auto"/>
             </w:pPr>
             <w:r>
               <w:rPr>
@@ -10223,7 +11104,7 @@
           </w:tcPr>
           <w:p>
             <w:pPr>
-              <w:spacing w:before="0" w:after="20" w:line="240" w:lineRule="auto"/>
+              <w:spacing w:before="0" w:after="0" w:line="240" w:lineRule="auto"/>
             </w:pPr>
             <w:r>
               <w:rPr>
@@ -10258,7 +11139,7 @@
           </w:tcPr>
           <w:p>
             <w:pPr>
-              <w:spacing w:before="0" w:after="20" w:line="240" w:lineRule="auto"/>
+              <w:spacing w:before="0" w:after="0" w:line="240" w:lineRule="auto"/>
             </w:pPr>
             <w:r>
               <w:rPr>
@@ -10297,7 +11178,13 @@
             <w:shd w:fill="FFFFFF"/>
           </w:tcPr>
           <w:p>
-            <w:r>
+            <w:pPr>
+              <w:spacing w:before="0" w:after="0"/>
+            </w:pPr>
+            <w:r>
+              <w:rPr>
+                <w:sz w:val="17"/>
+              </w:rPr>
               <w:t>Solar-system bodies</w:t>
             </w:r>
           </w:p>
@@ -10315,7 +11202,13 @@
             <w:shd w:fill="FFFFFF"/>
           </w:tcPr>
           <w:p>
-            <w:r>
+            <w:pPr>
+              <w:spacing w:before="0" w:after="0"/>
+            </w:pPr>
+            <w:r>
+              <w:rPr>
+                <w:sz w:val="17"/>
+              </w:rPr>
               <w:t>earth.png, moon.png, mars.png, mercury.png, venus.png, jupiter.png, saturn.png, uranus.png, neptune.png</w:t>
             </w:r>
           </w:p>
@@ -10333,7 +11226,13 @@
             <w:shd w:fill="FFFFFF"/>
           </w:tcPr>
           <w:p>
-            <w:r>
+            <w:pPr>
+              <w:spacing w:before="0" w:after="0"/>
+            </w:pPr>
+            <w:r>
+              <w:rPr>
+                <w:sz w:val="17"/>
+              </w:rPr>
               <w:t>Frontier ladder and destination presentation.</w:t>
             </w:r>
           </w:p>
@@ -10356,7 +11255,13 @@
             <w:shd w:fill="FFFFFF"/>
           </w:tcPr>
           <w:p>
-            <w:r>
+            <w:pPr>
+              <w:spacing w:before="0" w:after="0"/>
+            </w:pPr>
+            <w:r>
+              <w:rPr>
+                <w:sz w:val="17"/>
+              </w:rPr>
               <w:t>Solar backdrop</w:t>
             </w:r>
           </w:p>
@@ -10374,7 +11279,13 @@
             <w:shd w:fill="FFFFFF"/>
           </w:tcPr>
           <w:p>
-            <w:r>
+            <w:pPr>
+              <w:spacing w:before="0" w:after="0"/>
+            </w:pPr>
+            <w:r>
+              <w:rPr>
+                <w:sz w:val="17"/>
+              </w:rPr>
               <w:t>local-solar-bg-sheet.png</w:t>
             </w:r>
           </w:p>
@@ -10392,7 +11303,13 @@
             <w:shd w:fill="FFFFFF"/>
           </w:tcPr>
           <w:p>
-            <w:r>
+            <w:pPr>
+              <w:spacing w:before="0" w:after="0"/>
+            </w:pPr>
+            <w:r>
+              <w:rPr>
+                <w:sz w:val="17"/>
+              </w:rPr>
               <w:t>Animated local-system map backdrop.</w:t>
             </w:r>
           </w:p>
@@ -10415,7 +11332,13 @@
             <w:shd w:fill="FFFFFF"/>
           </w:tcPr>
           <w:p>
-            <w:r>
+            <w:pPr>
+              <w:spacing w:before="0" w:after="0"/>
+            </w:pPr>
+            <w:r>
+              <w:rPr>
+                <w:sz w:val="17"/>
+              </w:rPr>
               <w:t>Straylight states</w:t>
             </w:r>
           </w:p>
@@ -10433,7 +11356,13 @@
             <w:shd w:fill="FFFFFF"/>
           </w:tcPr>
           <w:p>
-            <w:r>
+            <w:pPr>
+              <w:spacing w:before="0" w:after="0"/>
+            </w:pPr>
+            <w:r>
+              <w:rPr>
+                <w:sz w:val="17"/>
+              </w:rPr>
               <w:t>straylight-ark-operational.png, straylight-ark-damaged.png</w:t>
             </w:r>
           </w:p>
@@ -10451,7 +11380,13 @@
             <w:shd w:fill="FFFFFF"/>
           </w:tcPr>
           <w:p>
-            <w:r>
+            <w:pPr>
+              <w:spacing w:before="0" w:after="0"/>
+            </w:pPr>
+            <w:r>
+              <w:rPr>
+                <w:sz w:val="17"/>
+              </w:rPr>
               <w:t>Operational home state and post-Arkfall damaged state.</w:t>
             </w:r>
           </w:p>
@@ -10474,7 +11409,13 @@
             <w:shd w:fill="FFFFFF"/>
           </w:tcPr>
           <w:p>
-            <w:r>
+            <w:pPr>
+              <w:spacing w:before="0" w:after="0"/>
+            </w:pPr>
+            <w:r>
+              <w:rPr>
+                <w:sz w:val="17"/>
+              </w:rPr>
               <w:t>Shuttle and effects</w:t>
             </w:r>
           </w:p>
@@ -10492,8 +11433,14 @@
             <w:shd w:fill="FFFFFF"/>
           </w:tcPr>
           <w:p>
-            <w:r>
-              <w:t>rocket-bay-closed.png, rocket-bay-open.png, thrust-sheet.png, explosion-sheet.png, asteroid.png</w:t>
+            <w:pPr>
+              <w:spacing w:before="0" w:after="0"/>
+            </w:pPr>
+            <w:r>
+              <w:rPr>
+                <w:sz w:val="17"/>
+              </w:rPr>
+              <w:t>rocket-bay-closed.png, rocket-bay-open.png, thrust-sheet.png, explosion-sheet.png, asteroid.png, flight-instrument-cluster.png</w:t>
             </w:r>
           </w:p>
         </w:tc>
@@ -10510,8 +11457,14 @@
             <w:shd w:fill="FFFFFF"/>
           </w:tcPr>
           <w:p>
-            <w:r>
-              <w:t>Launch, return, bay state, thrust, failure feedback, and scaled/rotated Jupiter-belt obstacles.</w:t>
+            <w:pPr>
+              <w:spacing w:before="0" w:after="0"/>
+            </w:pPr>
+            <w:r>
+              <w:rPr>
+                <w:sz w:val="17"/>
+              </w:rPr>
+              <w:t>Launch, mining departure/return, attached red/orange thrust, failure feedback, Jupiter-belt obstacles, and readable flight telemetry.</w:t>
             </w:r>
           </w:p>
         </w:tc>
@@ -10533,8 +11486,14 @@
             <w:shd w:fill="FFFFFF"/>
           </w:tcPr>
           <w:p>
-            <w:r>
-              <w:t>Mining and support drones</w:t>
+            <w:pPr>
+              <w:spacing w:before="0" w:after="0"/>
+            </w:pPr>
+            <w:r>
+              <w:rPr>
+                <w:sz w:val="17"/>
+              </w:rPr>
+              <w:t>Mining, artifact, and support</w:t>
             </w:r>
           </w:p>
         </w:tc>
@@ -10551,8 +11510,14 @@
             <w:shd w:fill="FFFFFF"/>
           </w:tcPr>
           <w:p>
-            <w:r>
-              <w:t>mining-drone.png, drill-bit-sheet.png, mini-drone-{mining, resource, survey, hazard, attack, defense}.png</w:t>
+            <w:pPr>
+              <w:spacing w:before="0" w:after="0"/>
+            </w:pPr>
+            <w:r>
+              <w:rPr>
+                <w:sz w:val="17"/>
+              </w:rPr>
+              <w:t>destination mining sheets, mining-artifact.png, mining-drone.png, drill-bit-sheet.png, mini-drone-{mining, resource, survey, hazard, attack, defense}.png</w:t>
             </w:r>
           </w:p>
         </w:tc>
@@ -10569,8 +11534,14 @@
             <w:shd w:fill="FFFFFF"/>
           </w:tcPr>
           <w:p>
-            <w:r>
-              <w:t>Direct-control mining plus distinct autonomous support roles.</w:t>
+            <w:pPr>
+              <w:spacing w:before="0" w:after="0"/>
+            </w:pPr>
+            <w:r>
+              <w:rPr>
+                <w:sz w:val="17"/>
+              </w:rPr>
+              <w:t>Distinct geology, direct-control mining, protected-objective recovery, and autonomous Support Drone roles.</w:t>
             </w:r>
           </w:p>
         </w:tc>
@@ -10584,8 +11555,14 @@
             <w:tcW w:type="dxa" w:w="1900"/>
           </w:tcPr>
           <w:p>
-            <w:r>
-              <w:t>Post-solar and character sources</w:t>
+            <w:pPr>
+              <w:spacing w:before="0" w:after="0"/>
+            </w:pPr>
+            <w:r>
+              <w:rPr>
+                <w:sz w:val="17"/>
+              </w:rPr>
+              <w:t>Post-solar geology and characters</w:t>
             </w:r>
           </w:p>
         </w:tc>
@@ -10594,8 +11571,14 @@
             <w:tcW w:type="dxa" w:w="3680"/>
           </w:tcPr>
           <w:p>
-            <w:r>
-              <w:t>outer-system art; Ark/rocket/bg/chroma sources; heroic-capybara.png; jetpack-capybara.png</w:t>
+            <w:pPr>
+              <w:spacing w:before="0" w:after="0"/>
+            </w:pPr>
+            <w:r>
+              <w:rPr>
+                <w:sz w:val="17"/>
+              </w:rPr>
+              <w:t>32 geology-family sheets, post-solar contact sheet/profile data, outer-system portraits, Ark states, heroic-capybara.png, jetpack-capybara.png</w:t>
             </w:r>
           </w:p>
         </w:tc>
@@ -10604,8 +11587,67 @@
             <w:tcW w:type="dxa" w:w="3780"/>
           </w:tcPr>
           <w:p>
-            <w:r>
-              <w:t>Runtime/future post-solar art, source references, portrait, and static EVA operator; animation remains future work.</w:t>
+            <w:pPr>
+              <w:spacing w:before="0" w:after="0"/>
+            </w:pPr>
+            <w:r>
+              <w:rPr>
+                <w:sz w:val="17"/>
+              </w:rPr>
+              <w:t>Deterministic body identity and depth geology, Ark story states, crew portrait, and EVA operator.</w:t>
+            </w:r>
+          </w:p>
+        </w:tc>
+      </w:tr>
+      <w:tr>
+        <w:trPr>
+          <w:cantSplit/>
+        </w:trPr>
+        <w:tc>
+          <w:tcPr>
+            <w:tcW w:type="dxa" w:w="1900"/>
+          </w:tcPr>
+          <w:p>
+            <w:pPr>
+              <w:spacing w:before="0" w:after="0"/>
+            </w:pPr>
+            <w:r>
+              <w:rPr>
+                <w:sz w:val="17"/>
+              </w:rPr>
+              <w:t>Enemy ecologies</w:t>
+            </w:r>
+          </w:p>
+        </w:tc>
+        <w:tc>
+          <w:tcPr>
+            <w:tcW w:type="dxa" w:w="3680"/>
+          </w:tcPr>
+          <w:p>
+            <w:pPr>
+              <w:spacing w:before="0" w:after="0"/>
+            </w:pPr>
+            <w:r>
+              <w:rPr>
+                <w:sz w:val="17"/>
+              </w:rPr>
+              <w:t>Ant, beetle, elemental, flying, mammal, and spawner sheets in neutral, ice, lava, toxic, and radioactive variants</w:t>
+            </w:r>
+          </w:p>
+        </w:tc>
+        <w:tc>
+          <w:tcPr>
+            <w:tcW w:type="dxa" w:w="3780"/>
+          </w:tcPr>
+          <w:p>
+            <w:pPr>
+              <w:spacing w:before="0" w:after="0"/>
+            </w:pPr>
+            <w:r>
+              <w:rPr>
+                <w:sz w:val="17"/>
+              </w:rPr>
+              <w:t>Biome-readable hostile encounters after Arkfall without introducing enemies to the solar system or Aaru Vale.</w:t>
             </w:r>
           </w:p>
         </w:tc>
@@ -10614,6 +11656,7 @@
     <w:p/>
     <w:p>
       <w:pPr>
+        <w:spacing w:before="0" w:after="0" w:lineRule="exact" w:line="20"/>
         <w:sectPr>
           <w:headerReference w:type="default" r:id="rId17"/>
           <w:footerReference w:type="default" r:id="rId18"/>
@@ -10624,6 +11667,11 @@
           <w:docGrid w:linePitch="360"/>
         </w:sectPr>
       </w:pPr>
+      <w:r>
+        <w:rPr>
+          <w:sz w:val="2"/>
+        </w:rPr>
+      </w:r>
     </w:p>
     <w:p>
       <w:pPr>
@@ -10655,7 +11703,7 @@
         <w:pStyle w:val="ListBullet"/>
       </w:pPr>
       <w:r>
-        <w:t>Do not hide tradeoffs or goals: Transfer fuel, the 3-unit expedition pack, Rig fuel, the reserved return stage, Ark reserve fuel, oxygen, extraction pressure, Support Drone availability, carried/aboard/delivered contract ore, configured cocoon layers, protected-objective recovery, and the Perfect-required Saturn slingshot stay visible. The shared objective strip always identifies the authored scenario step, numeric or segmented progress, next action, and reward preview; text and icons communicate state in addition to color.</w:t>
+        <w:t>Do not hide tradeoffs or goals: active RIG O2 / SUIT O2, Rig fuel, protected return readiness, carried/aboard/delivered/pending artifacts, exact route gates, cocoon segments, triangulation 0/3-3/3, Expedition XP picks, and claimable route actions stay visible. Buttons use concise verbs; explanatory sentences belong in the surrounding card. The shared objective strip identifies the authored step, progress, next action, and reward preview with text and icons in addition to color.</w:t>
       </w:r>
     </w:p>
     <w:p>
@@ -10701,7 +11749,7 @@
     <w:p>
       <w:pPr/>
       <w:r>
-        <w:t>Mining presentation shows the parked rig, static operator, independently moving mini drones, reticle, tracer, tether, thrust, and anchor-centered shield/scanner effects. Shared HUD fields include controlled mode, gravity, suit integrity, drill heat, tether burden, loose-chunk count, drone parent status, and 'Suit carry: 0'. Native RmlUi and web prompts use the same vocabulary and action state.</w:t>
+        <w:t>Mining presentation shows the parked Rig, EVA operator, independent Support Drones, reticle, tracer, tether, thrust, and active-actor shield/scanner effects. Undiscovered non-triangulation artifact tiles use a light purple glow; exposed artifacts use a larger brighter purple aura; tether denial flashes that aura red twice. Triangulation uses one large three-slice cyan/green aura and never renders the hidden ping coordinates. Ship departure uses the existing red/orange flame attached to the hull rather than a placeholder triangle. Native RmlUi and web prompts share the same vocabulary and action state.</w:t>
       </w:r>
     </w:p>
     <w:p>
@@ -10722,6 +11770,7 @@
     </w:p>
     <w:p>
       <w:pPr>
+        <w:spacing w:before="0" w:after="0" w:lineRule="exact" w:line="20"/>
         <w:sectPr>
           <w:headerReference w:type="default" r:id="rId19"/>
           <w:footerReference w:type="default" r:id="rId20"/>
@@ -10732,6 +11781,11 @@
           <w:docGrid w:linePitch="360"/>
         </w:sectPr>
       </w:pPr>
+      <w:r>
+        <w:rPr>
+          <w:sz w:val="2"/>
+        </w:rPr>
+      </w:r>
     </w:p>
     <w:p>
       <w:pPr>
@@ -10874,7 +11928,7 @@
           </w:tcPr>
           <w:p>
             <w:r>
-              <w:t>Portable deterministic C++20 rules: versioned content, authored/procedural scenarios, RNG, progression, saves, flight, research, mining, objective/reward routing, presentation helpers, and tuning. No platform APIs.</w:t>
+              <w:t>Portable deterministic C++20 rules: versioned content, authored/procedural scenarios, physical route transits, ArtifactProgression, PostSolarSystem generation, saves, flight, research, mining, objective/reward routing, presentation helpers, and tuning. No platform APIs.</w:t>
             </w:r>
           </w:p>
         </w:tc>
@@ -11139,7 +12193,7 @@
     <w:p>
       <w:pPr/>
       <w:r>
-        <w:t>Mining uses MiningOperatorMode with separate rig/operator state, MiningLooseChunk records, actor mobility profiles, and vector gravity. Each MiningMiniDroneAgent stores an additive anchor target, stable formation slot, and orbit phase. A centralized resolver produces a transient MiniDroneAnchorFrame containing actor identity, position, velocity, facing, collider, depth, and validity. Coordinators and SceneComposer receive that frame instead of reading rig coordinates. Scenario instances select a generic mining-site definition and protected-objective adapter; the mining engine receives resolved site data rather than a campaign or destination name.</w:t>
+        <w:t>Mining uses MiningOperatorMode with separate Rig/EVA position, integrity, and oxygen state, plus MiningLooseChunk records, actor mobility profiles, vector gravity, cached depth layers, and deterministic artifact placement. Shared active-oxygen accessors drive simulation, HUD warnings, and guidance. Render-facing triangulation exposes only aura center/radius and three completion flags; hidden marker coordinates remain simulation state. Artifact placement and post-solar bodies are resolved from stable campaign/content seeds rather than UI state.</w:t>
       </w:r>
     </w:p>
     <w:p>
@@ -11153,7 +12207,7 @@
     <w:p>
       <w:pPr/>
       <w:r>
-        <w:t>ScenarioDefinition is a versioned content record with eligibility, presentation, ordered or dependency-linked steps, activity configuration, completion rules, claim policy, and rewards. ScenarioInstance persists its authored or procedural source, definition ID/version, deterministic seed, resolved parameters, acknowledgements, progress, claims, and awarded reward IDs. ScenarioEvent records authoritative delivery, activity completion, protected-payload extraction, Flyby grade, equipment assignment, and abort results. ScenarioReward grants Support Drone frames, bay slots, upgrade credits, inventory resources, unlock keys, or route access. Both native RmlUi and WebAssembly consume the same scenario presentation/actions. Future content selects an existing activity and objective adapter; it must not add code branches that compare story copy, scenario IDs, or destination IDs inside reusable mining, Flyby, reward, or route mechanics.</w:t>
+        <w:t>ScenarioDefinition is versioned authored content with eligibility, ordered/dependent steps, activity configuration, completion rules, claim policy, and rewards. ScenarioEvent includes safe delivery, protected-objective extraction, ArtifactRecovered, Flyby grade, equipment assignment, and abort results. Generic route rewards queue an outbound RouteTransitState with authored origin and target; they never teleport destinationIndex. ScenarioInstance, route transit, artifact positions, cached layers, triangulation progress, and awarded reward IDs persist and feed the same native RmlUi and WebAssembly presentation/actions.</w:t>
       </w:r>
     </w:p>
     <w:p>
@@ -11170,7 +12224,7 @@
         <w:spacing w:before="0" w:after="120" w:line="264" w:lineRule="auto"/>
       </w:pPr>
       <w:r>
-        <w:t>The current save format is version 11, line-based, and dependency-free. It retains version 10 scenario, mining-site, cocoon, protected-objective, Support Drone, launch-upgrade, and lesson state while adding double-precision Arrival Ops transfer fuel/capacity and Surface Ops rig-fuel capacity, remaining fuel, recovered transfer fuel, and expedition-pack fuel. Version 10 active expeditions migrate from the former 30-unit surface pool to nominal route-derived rig fuel while preserving the percentage consumed; active Mining runs remain active. Version 10 Arrival Ops receives the calibrated route remainder and installed transfer capacity. Earlier migrations continue to run in order before the version 11 fuel conversion.</w:t>
+        <w:t>The current campaign save format is version 15, line-based, dependency-free, and accepted only on an exact version match. At native and web startup, any non-empty older, future-version, or malformed campaign payload is cleared before restoration, a fresh version-15 campaign is created and immediately persisted, and the title shows 'Previous campaign cleared for this revision.' If clear fails, the game attempts to overwrite; if persistence also fails, it continues with the fresh in-memory campaign and a storage notice. No legacy campaign migration or repair path is reachable. Preferences and controller/display settings remain separate.</w:t>
       </w:r>
     </w:p>
     <w:p>
@@ -11186,7 +12240,7 @@
         <w:spacing w:before="0" w:after="120" w:line="264" w:lineRule="auto"/>
       </w:pPr>
       <w:r>
-        <w:t>Core tests are design contracts for exact survey fuel, zero-at-touchdown success, early transfer-fuel exhaustion, Arrival Ops save/load and flyby/orbit preservation, 3/5/8-unit rig-fuel derivation, deployment and 15-second cycle consumption, tank-driven endurance, Ark pack debit, protected return readiness, version-11 round trips, active version-10 Surface/Mining migration, generic scenario events/actions/rewards, route-key evaluation, deterministic mining, Rig/EVA physics, and Support Drone behavior. Large seeded policies must prove no random or impossible early-route deaths while ignored warnings, unmanaged controls, full-throttle heat, and repeated impacts still fail.</w:t>
+        <w:t>Core and application-service tests are design contracts for committed Arrival paths, saved route origin/target/intent, recovery/reapproach, Jupiter and Saturn claims, Uranus Flight Data, independent Rig/Suit oxygen and ship service, owner-specific depletion damage, progression-artifact ordinal/depth/position, partial triangulation saves, hidden-artifact presentation, combat-offer gating, Expedition XP drafts, strict version-15 rejection/replacement, deterministic post-solar rosters/geology, enemy ecologies, and native/web action parity.</w:t>
       </w:r>
     </w:p>
     <w:tbl>
@@ -11309,12 +12363,6 @@
                 <w:rFonts w:ascii="Calibri" w:hAnsi="Calibri"/>
                 <w:sz w:val="17"/>
               </w:rPr>
-            </w:r>
-            <w:r>
-              <w:rPr>
-                <w:rFonts w:ascii="Calibri" w:hAnsi="Calibri"/>
-                <w:sz w:val="17"/>
-              </w:rPr>
               <w:t>Chapter progression</w:t>
             </w:r>
           </w:p>
@@ -11340,13 +12388,7 @@
                 <w:rFonts w:ascii="Calibri" w:hAnsi="Calibri"/>
                 <w:sz w:val="17"/>
               </w:rPr>
-              <w:t>New games start Moon-bound with zero credits; four lesson milestones, permanent Refit purchases, route gates, version-10 migration, and no chapter rollback are covered.</w:t>
-            </w:r>
-            <w:r>
-              <w:rPr>
-                <w:rFonts w:ascii="Calibri" w:hAnsi="Calibri"/>
-                <w:sz w:val="17"/>
-              </w:rPr>
+              <w:t>New games start Moon-bound with zero credits; lesson milestones, Moon/Mars deliveries, Io recovery, Jupiter Perfect, Saturn artifact, queued physical transits, Uranus Flight Data, Neptune-only Straylight, retries, and no chapter rollback are covered.</w:t>
             </w:r>
           </w:p>
         </w:tc>
@@ -11376,12 +12418,6 @@
                 <w:rFonts w:ascii="Calibri" w:hAnsi="Calibri"/>
                 <w:sz w:val="17"/>
               </w:rPr>
-            </w:r>
-            <w:r>
-              <w:rPr>
-                <w:rFonts w:ascii="Calibri" w:hAnsi="Calibri"/>
-                <w:sz w:val="17"/>
-              </w:rPr>
               <w:t>Surface and mining</w:t>
             </w:r>
           </w:p>
@@ -11407,7 +12443,7 @@
                 <w:rFonts w:ascii="Calibri" w:hAnsi="Calibri"/>
                 <w:sz w:val="17"/>
               </w:rPr>
-              <w:t>Mining requires prepared Surface Ops and at least 1 rig fuel; tests cover transfer-to-rig derivation, protected return readiness, oxygen/heat, rig and suit mobility, vector gravity, twin-stick aim, sidearm/drill/scanner/tether behavior, loose chunks, suit-only passages, depth transitions, recovery, extraction, resolved authored/procedural mining sites, layered cocoon reveal/excavation, and protected-objective gates.</w:t>
+              <w:t>Tests cover exact depth-system limits, transfer-to-Rig fuel, independent Rig/Suit oxygen, ship service, owner damage/ejection, hidden hazards, artifact bump thresholds, deterministic progression placement, cached layers, one-seal Io recovery, three-slice triangulation, tethering, delivery, and save/load.</w:t>
             </w:r>
           </w:p>
         </w:tc>
@@ -11437,13 +12473,7 @@
                 <w:rFonts w:ascii="Calibri" w:hAnsi="Calibri"/>
                 <w:sz w:val="17"/>
               </w:rPr>
-            </w:r>
-            <w:r>
-              <w:rPr>
-                <w:rFonts w:ascii="Calibri" w:hAnsi="Calibri"/>
-                <w:sz w:val="17"/>
-              </w:rPr>
-              <w:t>Drone Bay</w:t>
+              <w:t>Drone Bay and Expedition XP</w:t>
             </w:r>
           </w:p>
         </w:tc>
@@ -11468,7 +12498,7 @@
                 <w:rFonts w:ascii="Calibri" w:hAnsi="Calibri"/>
                 <w:sz w:val="17"/>
               </w:rPr>
-              <w:t>Prospector progression, persistent loadouts, paid duplicate frames, unique orbit slots, smooth Rig-Operator-Rig transfer, task cancellation, haul/shield/cooldown preservation, active-actor Attack/Defense behavior, catch-up/leashes, collision separation, collisionless Hazard travel with revealed-only targeting, shuttle delivery, cross-depth transfer, and ejection from a wreck.</w:t>
+              <w:t>Prospector funding/fabrication, persistent loadouts, run-scoped Rig/Drone ranks, slot grafts, synergies, pre-contact combat-offer exclusion, active-actor behavior, haul/shield/cooldown preservation, collisionless revealed-only Hazard travel, and cross-depth transfer are covered.</w:t>
             </w:r>
           </w:p>
         </w:tc>
@@ -11565,12 +12595,6 @@
                 <w:rFonts w:ascii="Calibri" w:hAnsi="Calibri"/>
                 <w:sz w:val="17"/>
               </w:rPr>
-            </w:r>
-            <w:r>
-              <w:rPr>
-                <w:rFonts w:ascii="Calibri" w:hAnsi="Calibri"/>
-                <w:sz w:val="17"/>
-              </w:rPr>
               <w:t>UI parity</w:t>
             </w:r>
           </w:p>
@@ -11589,7 +12613,7 @@
           </w:tcPr>
           <w:p>
             <w:r>
-              <w:t>Shared scenario presentation behavior covers native RmlUi and web UI parity, mandatory modals, stable scenario/action/focus IDs, one mining viewport transform, active-actor HUD/effects, controller hold/tap semantics, and top-level metrics.</w:t>
+              <w:t>Native RmlUi and web share stable scenario/route actions, concise buttons, modal/focus rules, active oxygen labels, pending artifact state, triangulation aura presentation, controller hold/tap semantics, and top-level metrics.</w:t>
             </w:r>
           </w:p>
         </w:tc>
@@ -11604,7 +12628,7 @@
           </w:tcPr>
           <w:p>
             <w:r>
-              <w:t>Application services</w:t>
+              <w:t>Application services and saves</w:t>
             </w:r>
           </w:p>
         </w:tc>
@@ -11614,7 +12638,7 @@
           </w:tcPr>
           <w:p>
             <w:r>
-              <w:t>Fake services exercise RocketGameApp and GameRunner without browser globals, including fixed steps, game speed, saves, preferences, metrics, fullscreen, haptics, and shutdown.</w:t>
+              <w:t>Fixtures verify valid v15 round trips plus v14, malformed, and future-version clear-and-replace behavior, overwrite fallback, storage failure messaging, web/native persistence, preferences, metrics, fullscreen, haptics, and shutdown.</w:t>
             </w:r>
           </w:p>
         </w:tc>
@@ -11673,6 +12697,7 @@
     <w:p/>
     <w:p>
       <w:pPr>
+        <w:spacing w:before="0" w:after="0" w:lineRule="exact" w:line="20"/>
         <w:sectPr>
           <w:headerReference w:type="default" r:id="rId21"/>
           <w:footerReference w:type="default" r:id="rId22"/>
@@ -11683,6 +12708,11 @@
           <w:docGrid w:linePitch="360"/>
         </w:sectPr>
       </w:pPr>
+      <w:r>
+        <w:rPr>
+          <w:sz w:val="2"/>
+        </w:rPr>
+      </w:r>
     </w:p>
     <w:p>
       <w:pPr>
@@ -11848,13 +12878,7 @@
                 <w:rFonts w:ascii="Calibri" w:hAnsi="Calibri"/>
                 <w:sz w:val="18"/>
               </w:rPr>
-            </w:r>
-            <w:r>
-              <w:rPr>
-                <w:rFonts w:ascii="Calibri" w:hAnsi="Calibri"/>
-                <w:sz w:val="18"/>
-              </w:rPr>
-              <w:t>A. Chapter polish</w:t>
+              <w:t>A. Solar continuity clarity</w:t>
             </w:r>
           </w:p>
         </w:tc>
@@ -11875,7 +12899,7 @@
               <w:spacing w:before="0" w:after="60" w:line="259" w:lineRule="auto"/>
             </w:pPr>
             <w:r>
-              <w:t>Make Chapters 1-7 clear in UI/docs and fixture saves.</w:t>
+              <w:t>Finish the Uranus-to-Neptune handoff and keep every gate/action explicit.</w:t>
             </w:r>
           </w:p>
         </w:tc>
@@ -11896,7 +12920,7 @@
               <w:spacing w:before="0" w:after="60" w:line="259" w:lineRule="auto"/>
             </w:pPr>
             <w:r>
-              <w:t>Chapter display, gates, test fixtures, and player-facing copy match.</w:t>
+              <w:t>An authored Uranus departure beat explains the 8 Flight Data requirement, available keys, and Neptune launch; native/web/map/Details copy agrees.</w:t>
             </w:r>
           </w:p>
         </w:tc>
@@ -11919,7 +12943,7 @@
           </w:tcPr>
           <w:p>
             <w:r>
-              <w:t>B. Aaru Vale friendly system</w:t>
+              <w:t>B. Aaru Vale authored overlay</w:t>
             </w:r>
           </w:p>
         </w:tc>
@@ -11937,7 +12961,7 @@
           </w:tcPr>
           <w:p>
             <w:r>
-              <w:t>Turn Chapter 5 into Aaru Vale: a friendly fuel-navigation chapter centered on Straylight as the Ark home.</w:t>
+              <w:t>Layer a clear first objective over the implemented deterministic friendly-system roster.</w:t>
             </w:r>
           </w:p>
         </w:tc>
@@ -11955,7 +12979,7 @@
           </w:tcPr>
           <w:p>
             <w:r>
-              <w:t>Aaru Vale destinations, fuel objectives, search/discovery onboarding, Ark operational visuals, and New Earth route hints.</w:t>
+              <w:t>Generated bodies remain stable while an authored search, mining, fuel, and New Earth hint sequence tells the player what to do next.</w:t>
             </w:r>
           </w:p>
         </w:tc>
@@ -12347,7 +13371,7 @@
         <w:pStyle w:val="ListBullet"/>
       </w:pPr>
       <w:r>
-        <w:t>Should Aaru Vale be one authored friendly resource system, a small generated cluster, or a guided first route for Ark-scale navigation from Straylight?</w:t>
+        <w:t>How much bespoke mission structure should the game layer over Aaru Vale's implemented deterministic 4-6-primary-body roster while keeping the first Ark-scale objective clear?</w:t>
       </w:r>
     </w:p>
     <w:p>
@@ -12788,13 +13812,7 @@
                 <w:rFonts w:ascii="Calibri" w:hAnsi="Calibri"/>
                 <w:sz w:val="18"/>
               </w:rPr>
-              <w:t>docs/MINING_MINIGAME_PLAN.md + MINING_COMBAT_PROGRESSION.md</w:t>
-            </w:r>
-            <w:r>
-              <w:rPr>
-                <w:rFonts w:ascii="Calibri" w:hAnsi="Calibri"/>
-                <w:sz w:val="18"/>
-              </w:rPr>
+              <w:t>docs/MINING_MINIGAME_PLAN.md + MINING_COMBAT_PROGRESSION.md + POST_SOLAR_PROCEDURAL_BODIES.md</w:t>
             </w:r>
           </w:p>
         </w:tc>
@@ -12819,13 +13837,7 @@
                 <w:rFonts w:ascii="Calibri" w:hAnsi="Calibri"/>
                 <w:sz w:val="18"/>
               </w:rPr>
-              <w:t>Mining entry flow, act/band gates, fuel/oxygen rules, rich caps, hostile progression, Arena Lab, and agent contracts.</w:t>
-            </w:r>
-            <w:r>
-              <w:rPr>
-                <w:rFonts w:ascii="Calibri" w:hAnsi="Calibri"/>
-                <w:sz w:val="18"/>
-              </w:rPr>
+              <w:t>Mining entry/fuel/oxygen, depth systems, artifact gates, Expedition XP, hostile progression, deterministic body rosters/geology, Arena Lab, and agent contracts.</w:t>
             </w:r>
           </w:p>
         </w:tc>
@@ -13095,13 +14107,7 @@
                 <w:rFonts w:ascii="Calibri" w:hAnsi="Calibri"/>
                 <w:sz w:val="18"/>
               </w:rPr>
-            </w:r>
-            <w:r>
-              <w:rPr>
-                <w:rFonts w:ascii="Calibri" w:hAnsi="Calibri"/>
-                <w:sz w:val="18"/>
-              </w:rPr>
-              <w:t>src/core and tests/core_tests.cpp</w:t>
+              <w:t>src/core and test suites</w:t>
             </w:r>
           </w:p>
         </w:tc>
@@ -13126,7 +14132,7 @@
                 <w:rFonts w:ascii="Calibri" w:hAnsi="Calibri"/>
                 <w:sz w:val="18"/>
               </w:rPr>
-              <w:t>Implemented versioned content, scenario framework, route-key evaluation, Rig/EVA mining, reusable cocoon/protected-objective adapters, transferable Support Drone anchors, save-v11 transfer/rig-fuel migration, presentation helpers, and regression coverage.</w:t>
+              <w:t>Versioned content, route transit/recovery, ArtifactProgression, PostSolarSystem, independent oxygen, scenario events/rewards, Expedition XP, strict save-v15 boundary, presentation helpers, and regression coverage.</w:t>
             </w:r>
           </w:p>
         </w:tc>
@@ -13156,12 +14162,6 @@
                 <w:rFonts w:ascii="Calibri" w:hAnsi="Calibri"/>
                 <w:sz w:val="18"/>
               </w:rPr>
-            </w:r>
-            <w:r>
-              <w:rPr>
-                <w:rFonts w:ascii="Calibri" w:hAnsi="Calibri"/>
-                <w:sz w:val="18"/>
-              </w:rPr>
               <w:t>assets/art/README.md</w:t>
             </w:r>
           </w:p>
@@ -13187,7 +14187,7 @@
                 <w:rFonts w:ascii="Calibri" w:hAnsi="Calibri"/>
                 <w:sz w:val="18"/>
               </w:rPr>
-              <w:t>Art pipeline, Ark/planet/rocket/mining sprites, jetpack Capybara operator art, runtime manifest, atlas generation, and #ff00aa source cleanup convention.</w:t>
+              <w:t>78-texture runtime manifest, four-page atlas, Ark/planet/rocket/mining/artifact assets, six enemy families and biome variants, post-solar geology library, and #ff00aa cleanup convention.</w:t>
             </w:r>
           </w:p>
         </w:tc>
@@ -13243,7 +14243,16 @@
         </w:tc>
       </w:tr>
     </w:tbl>
-    <w:p/>
+    <w:p>
+      <w:pPr>
+        <w:spacing w:before="0" w:after="0" w:lineRule="exact" w:line="20"/>
+      </w:pPr>
+      <w:r>
+        <w:rPr>
+          <w:sz w:val="2"/>
+        </w:rPr>
+      </w:r>
+    </w:p>
     <w:sectPr>
       <w:headerReference w:type="default" r:id="rId23"/>
       <w:footerReference w:type="default" r:id="rId24"/>

</xml_diff>